<commit_message>
Post-mortem: add Phase 4, keep headings with their content
Co-Authored-By: Claude Opus 5.5 <noreply@anthropic.com>
</commit_message>
<xml_diff>
--- a/docs/KAMUI-postmortem.docx
+++ b/docs/KAMUI-postmortem.docx
@@ -21,7 +21,7 @@
         <w:rPr>
           <w:color w:val="666666"/>
         </w:rPr>
-        <w:t xml:space="preserve">Last updated 2026-09-24, after Phase 3.</w:t>
+        <w:t xml:space="preserve">Last updated 2026-09-24, after Phase 4.</w:t>
       </w:r>
     </w:p>
     <w:p>
@@ -84,7 +84,7 @@
         <w:pStyle w:val="Heading1"/>
       </w:pPr>
       <w:r>
-        <w:t xml:space="preserve">The system after Phase 3</w:t>
+        <w:t xml:space="preserve">The system after Phase 4</w:t>
       </w:r>
     </w:p>
     <w:p>
@@ -137,6 +137,19 @@
       </w:pPr>
       <w:r>
         <w:t xml:space="preserve">Battlefields are the organising unit: each has its own keywords, excludes, locations, caps, versioned rubric and jobs. Pages select one with ?battlefield=&lt;slug&gt;.</w:t>
+      </w:r>
+    </w:p>
+    <w:p>
+      <w:pPr>
+        <w:pStyle w:val="ListParagraph"/>
+        <w:numPr>
+          <w:ilvl w:val="0"/>
+          <w:numId w:val="2"/>
+        </w:numPr>
+        <w:spacing w:after="60"/>
+      </w:pPr>
+      <w:r>
+        <w:t xml:space="preserve">Explore (/explore) runs one-off searches that are saved as SearchWaves (jobs with no Battlefield). A wave can be promoted into a Battlefield; promoted jobs are unranked copies.</w:t>
       </w:r>
     </w:p>
     <w:p>
@@ -851,7 +864,7 @@
         <w:spacing w:after="60"/>
       </w:pPr>
       <w:r>
-        <w:t xml:space="preserve">B2B sourcing is thin: 3 jobs from about 460 sites. The content keywords match almost nothing in the actor's index.</w:t>
+        <w:t xml:space="preserve">B2B sourcing is thin: 3 jobs from about 460 sites for the B2B Battlefield, and an Explore search for "content writer" found only 2. The actor's index has few content roles.</w:t>
       </w:r>
     </w:p>
     <w:p>
@@ -955,7 +968,7 @@
         <w:spacing w:after="60"/>
       </w:pPr>
       <w:r>
-        <w:t xml:space="preserve">Phase 4 (Explore page and holding bay UI) is not built; its API routes exist.</w:t>
+        <w:t xml:space="preserve">Search New and Rank have not been clicked from the UI yet (their routes were tested directly in Phase 2).</w:t>
       </w:r>
     </w:p>
     <w:p>
@@ -5246,6 +5259,891 @@
       </w:pPr>
       <w:r>
         <w:t xml:space="preserve">None kept. The test Battlefield "UI Smoke Test" and its 2 rubric versions were deleted, and the one job dismissed during the test was restored.</w:t>
+      </w:r>
+    </w:p>
+    <w:p>
+      <w:pPr>
+        <w:pStyle w:val="Heading1"/>
+      </w:pPr>
+      <w:r>
+        <w:t xml:space="preserve">Phase 4: Explore and the holding bay</w:t>
+      </w:r>
+    </w:p>
+    <w:p>
+      <w:pPr>
+        <w:spacing w:after="120"/>
+        <w:rPr>
+          <w:color w:val="666666"/>
+          <w:sz w:val="20"/>
+          <w:szCs w:val="20"/>
+        </w:rPr>
+      </w:pPr>
+      <w:r>
+        <w:rPr>
+          <w:color w:val="666666"/>
+          <w:sz w:val="20"/>
+          <w:szCs w:val="20"/>
+        </w:rPr>
+        <w:t xml:space="preserve">2026-09-24  ·  commit ca85d2b</w:t>
+      </w:r>
+    </w:p>
+    <w:p>
+      <w:pPr>
+        <w:spacing w:after="120"/>
+      </w:pPr>
+      <w:r>
+        <w:t xml:space="preserve">Built the Explore page (keyword and location search that saves an unranked SearchWave), the holding bay of past waves that reopen from the database at no cost, and promotion of a wave into an existing or new Battlefield.</w:t>
+      </w:r>
+    </w:p>
+    <w:p>
+      <w:pPr>
+        <w:pStyle w:val="Heading2"/>
+      </w:pPr>
+      <w:r>
+        <w:t xml:space="preserve">What changed</w:t>
+      </w:r>
+    </w:p>
+    <w:p>
+      <w:pPr>
+        <w:pStyle w:val="ListParagraph"/>
+        <w:numPr>
+          <w:ilvl w:val="0"/>
+          <w:numId w:val="2"/>
+        </w:numPr>
+        <w:spacing w:after="60"/>
+      </w:pPr>
+      <w:r>
+        <w:t xml:space="preserve">web/app/explore/page.tsx and Explore.tsx: search form, holding bay list (100 most recent waves), the selected wave's jobs (?wave=&lt;id&gt;, defaulting to the newest), and the promote controls.</w:t>
+      </w:r>
+    </w:p>
+    <w:p>
+      <w:pPr>
+        <w:pStyle w:val="ListParagraph"/>
+        <w:numPr>
+          <w:ilvl w:val="0"/>
+          <w:numId w:val="2"/>
+        </w:numPr>
+        <w:spacing w:after="60"/>
+      </w:pPr>
+      <w:r>
+        <w:t xml:space="preserve">web/lib/waves.ts: waveJobs (a wave's own rows: searchWaveId set and battlefieldId null) and copyWaveJobs, moved out of the promote route so the create form can use it too.</w:t>
+      </w:r>
+    </w:p>
+    <w:p>
+      <w:pPr>
+        <w:pStyle w:val="ListParagraph"/>
+        <w:numPr>
+          <w:ilvl w:val="0"/>
+          <w:numId w:val="2"/>
+        </w:numPr>
+        <w:spacing w:after="60"/>
+      </w:pPr>
+      <w:r>
+        <w:t xml:space="preserve">web/app/battlefields/new/page.tsx accepts ?fromWave=&lt;id&gt; and pre-fills name, keywords and locations from the wave. createBattlefield copies the wave's jobs in when a hidden fromWave field is present.</w:t>
+      </w:r>
+    </w:p>
+    <w:p>
+      <w:pPr>
+        <w:pStyle w:val="ListParagraph"/>
+        <w:numPr>
+          <w:ilvl w:val="0"/>
+          <w:numId w:val="2"/>
+        </w:numPr>
+        <w:spacing w:after="60"/>
+      </w:pPr>
+      <w:r>
+        <w:t xml:space="preserve">Discovery's header links to Explore.</w:t>
+      </w:r>
+    </w:p>
+    <w:p>
+      <w:pPr>
+        <w:pStyle w:val="Heading2"/>
+      </w:pPr>
+      <w:r>
+        <w:t xml:space="preserve">Decisions and deviations from the spec</w:t>
+      </w:r>
+    </w:p>
+    <w:tbl>
+      <w:tblPr>
+        <w:tblW w:type="dxa" w:w="9026"/>
+        <w:tblBorders>
+          <w:top w:val="single" w:color="auto" w:sz="4"/>
+          <w:left w:val="single" w:color="auto" w:sz="4"/>
+          <w:bottom w:val="single" w:color="auto" w:sz="4"/>
+          <w:right w:val="single" w:color="auto" w:sz="4"/>
+          <w:insideH w:val="single" w:color="auto" w:sz="4"/>
+          <w:insideV w:val="single" w:color="auto" w:sz="4"/>
+        </w:tblBorders>
+      </w:tblPr>
+      <w:tblGrid>
+        <w:gridCol w:w="2600"/>
+        <w:gridCol w:w="3400"/>
+        <w:gridCol w:w="3026"/>
+      </w:tblGrid>
+      <w:tr>
+        <w:trPr>
+          <w:tblHeader/>
+        </w:trPr>
+        <w:tc>
+          <w:tcPr>
+            <w:tcW w:type="dxa" w:w="2600"/>
+            <w:tcBorders>
+              <w:top w:val="single" w:color="BFBFBF" w:sz="4"/>
+              <w:left w:val="single" w:color="BFBFBF" w:sz="4"/>
+              <w:bottom w:val="single" w:color="BFBFBF" w:sz="4"/>
+              <w:right w:val="single" w:color="BFBFBF" w:sz="4"/>
+            </w:tcBorders>
+            <w:shd w:fill="EDEDED" w:color="auto" w:val="clear"/>
+            <w:tcMar>
+              <w:top w:type="dxa" w:w="60"/>
+              <w:left w:type="dxa" w:w="100"/>
+              <w:bottom w:type="dxa" w:w="60"/>
+              <w:right w:type="dxa" w:w="100"/>
+            </w:tcMar>
+          </w:tcPr>
+          <w:p>
+            <w:r>
+              <w:rPr>
+                <w:b/>
+                <w:bCs/>
+                <w:sz w:val="19"/>
+                <w:szCs w:val="19"/>
+              </w:rPr>
+              <w:t xml:space="preserve">Decision</w:t>
+            </w:r>
+          </w:p>
+        </w:tc>
+        <w:tc>
+          <w:tcPr>
+            <w:tcW w:type="dxa" w:w="3400"/>
+            <w:tcBorders>
+              <w:top w:val="single" w:color="BFBFBF" w:sz="4"/>
+              <w:left w:val="single" w:color="BFBFBF" w:sz="4"/>
+              <w:bottom w:val="single" w:color="BFBFBF" w:sz="4"/>
+              <w:right w:val="single" w:color="BFBFBF" w:sz="4"/>
+            </w:tcBorders>
+            <w:shd w:fill="EDEDED" w:color="auto" w:val="clear"/>
+            <w:tcMar>
+              <w:top w:type="dxa" w:w="60"/>
+              <w:left w:type="dxa" w:w="100"/>
+              <w:bottom w:type="dxa" w:w="60"/>
+              <w:right w:type="dxa" w:w="100"/>
+            </w:tcMar>
+          </w:tcPr>
+          <w:p>
+            <w:r>
+              <w:rPr>
+                <w:b/>
+                <w:bCs/>
+                <w:sz w:val="19"/>
+                <w:szCs w:val="19"/>
+              </w:rPr>
+              <w:t xml:space="preserve">Why</w:t>
+            </w:r>
+          </w:p>
+        </w:tc>
+        <w:tc>
+          <w:tcPr>
+            <w:tcW w:type="dxa" w:w="3026"/>
+            <w:tcBorders>
+              <w:top w:val="single" w:color="BFBFBF" w:sz="4"/>
+              <w:left w:val="single" w:color="BFBFBF" w:sz="4"/>
+              <w:bottom w:val="single" w:color="BFBFBF" w:sz="4"/>
+              <w:right w:val="single" w:color="BFBFBF" w:sz="4"/>
+            </w:tcBorders>
+            <w:shd w:fill="EDEDED" w:color="auto" w:val="clear"/>
+            <w:tcMar>
+              <w:top w:type="dxa" w:w="60"/>
+              <w:left w:type="dxa" w:w="100"/>
+              <w:bottom w:type="dxa" w:w="60"/>
+              <w:right w:type="dxa" w:w="100"/>
+            </w:tcMar>
+          </w:tcPr>
+          <w:p>
+            <w:r>
+              <w:rPr>
+                <w:b/>
+                <w:bCs/>
+                <w:sz w:val="19"/>
+                <w:szCs w:val="19"/>
+              </w:rPr>
+              <w:t xml:space="preserve">Consequence / where</w:t>
+            </w:r>
+          </w:p>
+        </w:tc>
+      </w:tr>
+      <w:tr>
+        <w:tc>
+          <w:tcPr>
+            <w:tcW w:type="dxa" w:w="2600"/>
+            <w:tcBorders>
+              <w:top w:val="single" w:color="BFBFBF" w:sz="4"/>
+              <w:left w:val="single" w:color="BFBFBF" w:sz="4"/>
+              <w:bottom w:val="single" w:color="BFBFBF" w:sz="4"/>
+              <w:right w:val="single" w:color="BFBFBF" w:sz="4"/>
+            </w:tcBorders>
+            <w:tcMar>
+              <w:top w:type="dxa" w:w="60"/>
+              <w:left w:type="dxa" w:w="100"/>
+              <w:bottom w:type="dxa" w:w="60"/>
+              <w:right w:type="dxa" w:w="100"/>
+            </w:tcMar>
+          </w:tcPr>
+          <w:p>
+            <w:r>
+              <w:rPr>
+                <w:b w:val="false"/>
+                <w:bCs w:val="false"/>
+                <w:sz w:val="19"/>
+                <w:szCs w:val="19"/>
+              </w:rPr>
+              <w:t xml:space="preserve">"New Battlefield from this search" goes through the create form instead of creating one in a single click</w:t>
+            </w:r>
+          </w:p>
+        </w:tc>
+        <w:tc>
+          <w:tcPr>
+            <w:tcW w:type="dxa" w:w="3400"/>
+            <w:tcBorders>
+              <w:top w:val="single" w:color="BFBFBF" w:sz="4"/>
+              <w:left w:val="single" w:color="BFBFBF" w:sz="4"/>
+              <w:bottom w:val="single" w:color="BFBFBF" w:sz="4"/>
+              <w:right w:val="single" w:color="BFBFBF" w:sz="4"/>
+            </w:tcBorders>
+            <w:tcMar>
+              <w:top w:type="dxa" w:w="60"/>
+              <w:left w:type="dxa" w:w="100"/>
+              <w:bottom w:type="dxa" w:w="60"/>
+              <w:right w:type="dxa" w:w="100"/>
+            </w:tcMar>
+          </w:tcPr>
+          <w:p>
+            <w:r>
+              <w:rPr>
+                <w:b w:val="false"/>
+                <w:bCs w:val="false"/>
+                <w:sz w:val="19"/>
+                <w:szCs w:val="19"/>
+              </w:rPr>
+              <w:t xml:space="preserve">The spec asks for the new Battlefield's keywords to be pre-filled from the wave. A pre-filled form lets the user check keywords and caps before anything exists.</w:t>
+            </w:r>
+          </w:p>
+        </w:tc>
+        <w:tc>
+          <w:tcPr>
+            <w:tcW w:type="dxa" w:w="3026"/>
+            <w:tcBorders>
+              <w:top w:val="single" w:color="BFBFBF" w:sz="4"/>
+              <w:left w:val="single" w:color="BFBFBF" w:sz="4"/>
+              <w:bottom w:val="single" w:color="BFBFBF" w:sz="4"/>
+              <w:right w:val="single" w:color="BFBFBF" w:sz="4"/>
+            </w:tcBorders>
+            <w:tcMar>
+              <w:top w:type="dxa" w:w="60"/>
+              <w:left w:type="dxa" w:w="100"/>
+              <w:bottom w:type="dxa" w:w="60"/>
+              <w:right w:type="dxa" w:w="100"/>
+            </w:tcMar>
+          </w:tcPr>
+          <w:p>
+            <w:r>
+              <w:rPr>
+                <w:b w:val="false"/>
+                <w:bCs w:val="false"/>
+                <w:sz w:val="19"/>
+                <w:szCs w:val="19"/>
+              </w:rPr>
+              <w:t xml:space="preserve">The promote route's newBattlefield option still exists but the UI does not use it.</w:t>
+            </w:r>
+          </w:p>
+        </w:tc>
+      </w:tr>
+      <w:tr>
+        <w:tc>
+          <w:tcPr>
+            <w:tcW w:type="dxa" w:w="2600"/>
+            <w:tcBorders>
+              <w:top w:val="single" w:color="BFBFBF" w:sz="4"/>
+              <w:left w:val="single" w:color="BFBFBF" w:sz="4"/>
+              <w:bottom w:val="single" w:color="BFBFBF" w:sz="4"/>
+              <w:right w:val="single" w:color="BFBFBF" w:sz="4"/>
+            </w:tcBorders>
+            <w:tcMar>
+              <w:top w:type="dxa" w:w="60"/>
+              <w:left w:type="dxa" w:w="100"/>
+              <w:bottom w:type="dxa" w:w="60"/>
+              <w:right w:type="dxa" w:w="100"/>
+            </w:tcMar>
+          </w:tcPr>
+          <w:p>
+            <w:r>
+              <w:rPr>
+                <w:b w:val="false"/>
+                <w:bCs w:val="false"/>
+                <w:sz w:val="19"/>
+                <w:szCs w:val="19"/>
+              </w:rPr>
+              <w:t xml:space="preserve">The new-Battlefield form keeps the spec caps (2000 / 200 / 25), not Explore's small caps</w:t>
+            </w:r>
+          </w:p>
+        </w:tc>
+        <w:tc>
+          <w:tcPr>
+            <w:tcW w:type="dxa" w:w="3400"/>
+            <w:tcBorders>
+              <w:top w:val="single" w:color="BFBFBF" w:sz="4"/>
+              <w:left w:val="single" w:color="BFBFBF" w:sz="4"/>
+              <w:bottom w:val="single" w:color="BFBFBF" w:sz="4"/>
+              <w:right w:val="single" w:color="BFBFBF" w:sz="4"/>
+            </w:tcBorders>
+            <w:tcMar>
+              <w:top w:type="dxa" w:w="60"/>
+              <w:left w:type="dxa" w:w="100"/>
+              <w:bottom w:type="dxa" w:w="60"/>
+              <w:right w:type="dxa" w:w="100"/>
+            </w:tcMar>
+          </w:tcPr>
+          <w:p>
+            <w:r>
+              <w:rPr>
+                <w:b w:val="false"/>
+                <w:bCs w:val="false"/>
+                <w:sz w:val="19"/>
+                <w:szCs w:val="19"/>
+              </w:rPr>
+              <w:t xml:space="preserve">Consistent with any other new Battlefield.</w:t>
+            </w:r>
+          </w:p>
+        </w:tc>
+        <w:tc>
+          <w:tcPr>
+            <w:tcW w:type="dxa" w:w="3026"/>
+            <w:tcBorders>
+              <w:top w:val="single" w:color="BFBFBF" w:sz="4"/>
+              <w:left w:val="single" w:color="BFBFBF" w:sz="4"/>
+              <w:bottom w:val="single" w:color="BFBFBF" w:sz="4"/>
+              <w:right w:val="single" w:color="BFBFBF" w:sz="4"/>
+            </w:tcBorders>
+            <w:tcMar>
+              <w:top w:type="dxa" w:w="60"/>
+              <w:left w:type="dxa" w:w="100"/>
+              <w:bottom w:type="dxa" w:w="60"/>
+              <w:right w:type="dxa" w:w="100"/>
+            </w:tcMar>
+          </w:tcPr>
+          <w:p>
+            <w:r>
+              <w:rPr>
+                <w:b w:val="false"/>
+                <w:bCs w:val="false"/>
+                <w:sz w:val="19"/>
+                <w:szCs w:val="19"/>
+              </w:rPr>
+              <w:t xml:space="preserve">Its first Search New can return up to 200 jobs per location. The caps are visible and editable on the form.</w:t>
+            </w:r>
+          </w:p>
+        </w:tc>
+      </w:tr>
+      <w:tr>
+        <w:tc>
+          <w:tcPr>
+            <w:tcW w:type="dxa" w:w="2600"/>
+            <w:tcBorders>
+              <w:top w:val="single" w:color="BFBFBF" w:sz="4"/>
+              <w:left w:val="single" w:color="BFBFBF" w:sz="4"/>
+              <w:bottom w:val="single" w:color="BFBFBF" w:sz="4"/>
+              <w:right w:val="single" w:color="BFBFBF" w:sz="4"/>
+            </w:tcBorders>
+            <w:tcMar>
+              <w:top w:type="dxa" w:w="60"/>
+              <w:left w:type="dxa" w:w="100"/>
+              <w:bottom w:type="dxa" w:w="60"/>
+              <w:right w:type="dxa" w:w="100"/>
+            </w:tcMar>
+          </w:tcPr>
+          <w:p>
+            <w:r>
+              <w:rPr>
+                <w:b w:val="false"/>
+                <w:bCs w:val="false"/>
+                <w:sz w:val="19"/>
+                <w:szCs w:val="19"/>
+              </w:rPr>
+              <w:t xml:space="preserve">Explore rows have no closed check, no dismiss and no detail panel</w:t>
+            </w:r>
+          </w:p>
+        </w:tc>
+        <w:tc>
+          <w:tcPr>
+            <w:tcW w:type="dxa" w:w="3400"/>
+            <w:tcBorders>
+              <w:top w:val="single" w:color="BFBFBF" w:sz="4"/>
+              <w:left w:val="single" w:color="BFBFBF" w:sz="4"/>
+              <w:bottom w:val="single" w:color="BFBFBF" w:sz="4"/>
+              <w:right w:val="single" w:color="BFBFBF" w:sz="4"/>
+            </w:tcBorders>
+            <w:tcMar>
+              <w:top w:type="dxa" w:w="60"/>
+              <w:left w:type="dxa" w:w="100"/>
+              <w:bottom w:type="dxa" w:w="60"/>
+              <w:right w:type="dxa" w:w="100"/>
+            </w:tcMar>
+          </w:tcPr>
+          <w:p>
+            <w:r>
+              <w:rPr>
+                <w:b w:val="false"/>
+                <w:bCs w:val="false"/>
+                <w:sz w:val="19"/>
+                <w:szCs w:val="19"/>
+              </w:rPr>
+              <w:t xml:space="preserve">A wave is a snapshot of one paid search, not a working list. The description expands inline and Open posting links out.</w:t>
+            </w:r>
+          </w:p>
+        </w:tc>
+        <w:tc>
+          <w:tcPr>
+            <w:tcW w:type="dxa" w:w="3026"/>
+            <w:tcBorders>
+              <w:top w:val="single" w:color="BFBFBF" w:sz="4"/>
+              <w:left w:val="single" w:color="BFBFBF" w:sz="4"/>
+              <w:bottom w:val="single" w:color="BFBFBF" w:sz="4"/>
+              <w:right w:val="single" w:color="BFBFBF" w:sz="4"/>
+            </w:tcBorders>
+            <w:tcMar>
+              <w:top w:type="dxa" w:w="60"/>
+              <w:left w:type="dxa" w:w="100"/>
+              <w:bottom w:type="dxa" w:w="60"/>
+              <w:right w:type="dxa" w:w="100"/>
+            </w:tcMar>
+          </w:tcPr>
+          <w:p>
+            <w:r>
+              <w:rPr>
+                <w:b w:val="false"/>
+                <w:bCs w:val="false"/>
+                <w:sz w:val="19"/>
+                <w:szCs w:val="19"/>
+              </w:rPr>
+              <w:t xml:space="preserve">Closure and dismissal apply once jobs are promoted into a Battlefield.</w:t>
+            </w:r>
+          </w:p>
+        </w:tc>
+      </w:tr>
+      <w:tr>
+        <w:tc>
+          <w:tcPr>
+            <w:tcW w:type="dxa" w:w="2600"/>
+            <w:tcBorders>
+              <w:top w:val="single" w:color="BFBFBF" w:sz="4"/>
+              <w:left w:val="single" w:color="BFBFBF" w:sz="4"/>
+              <w:bottom w:val="single" w:color="BFBFBF" w:sz="4"/>
+              <w:right w:val="single" w:color="BFBFBF" w:sz="4"/>
+            </w:tcBorders>
+            <w:tcMar>
+              <w:top w:type="dxa" w:w="60"/>
+              <w:left w:type="dxa" w:w="100"/>
+              <w:bottom w:type="dxa" w:w="60"/>
+              <w:right w:type="dxa" w:w="100"/>
+            </w:tcMar>
+          </w:tcPr>
+          <w:p>
+            <w:r>
+              <w:rPr>
+                <w:b w:val="false"/>
+                <w:bCs w:val="false"/>
+                <w:sz w:val="19"/>
+                <w:szCs w:val="19"/>
+              </w:rPr>
+              <w:t xml:space="preserve">Wave times are shown in UTC</w:t>
+            </w:r>
+          </w:p>
+        </w:tc>
+        <w:tc>
+          <w:tcPr>
+            <w:tcW w:type="dxa" w:w="3400"/>
+            <w:tcBorders>
+              <w:top w:val="single" w:color="BFBFBF" w:sz="4"/>
+              <w:left w:val="single" w:color="BFBFBF" w:sz="4"/>
+              <w:bottom w:val="single" w:color="BFBFBF" w:sz="4"/>
+              <w:right w:val="single" w:color="BFBFBF" w:sz="4"/>
+            </w:tcBorders>
+            <w:tcMar>
+              <w:top w:type="dxa" w:w="60"/>
+              <w:left w:type="dxa" w:w="100"/>
+              <w:bottom w:type="dxa" w:w="60"/>
+              <w:right w:type="dxa" w:w="100"/>
+            </w:tcMar>
+          </w:tcPr>
+          <w:p>
+            <w:r>
+              <w:rPr>
+                <w:b w:val="false"/>
+                <w:bCs w:val="false"/>
+                <w:sz w:val="19"/>
+                <w:szCs w:val="19"/>
+              </w:rPr>
+              <w:t xml:space="preserve">Formatted on the server, so server and browser render the same text.</w:t>
+            </w:r>
+          </w:p>
+        </w:tc>
+        <w:tc>
+          <w:tcPr>
+            <w:tcW w:type="dxa" w:w="3026"/>
+            <w:tcBorders>
+              <w:top w:val="single" w:color="BFBFBF" w:sz="4"/>
+              <w:left w:val="single" w:color="BFBFBF" w:sz="4"/>
+              <w:bottom w:val="single" w:color="BFBFBF" w:sz="4"/>
+              <w:right w:val="single" w:color="BFBFBF" w:sz="4"/>
+            </w:tcBorders>
+            <w:tcMar>
+              <w:top w:type="dxa" w:w="60"/>
+              <w:left w:type="dxa" w:w="100"/>
+              <w:bottom w:type="dxa" w:w="60"/>
+              <w:right w:type="dxa" w:w="100"/>
+            </w:tcMar>
+          </w:tcPr>
+          <w:p>
+            <w:r>
+              <w:rPr>
+                <w:b w:val="false"/>
+                <w:bCs w:val="false"/>
+                <w:sz w:val="19"/>
+                <w:szCs w:val="19"/>
+              </w:rPr>
+              <w:t xml:space="preserve"/>
+            </w:r>
+          </w:p>
+        </w:tc>
+      </w:tr>
+    </w:tbl>
+    <w:p>
+      <w:pPr>
+        <w:spacing w:after="120"/>
+      </w:pPr>
+    </w:p>
+    <w:p>
+      <w:pPr>
+        <w:pStyle w:val="Heading2"/>
+      </w:pPr>
+      <w:r>
+        <w:t xml:space="preserve">Problems found</w:t>
+      </w:r>
+    </w:p>
+    <w:tbl>
+      <w:tblPr>
+        <w:tblW w:type="dxa" w:w="9026"/>
+        <w:tblBorders>
+          <w:top w:val="single" w:color="auto" w:sz="4"/>
+          <w:left w:val="single" w:color="auto" w:sz="4"/>
+          <w:bottom w:val="single" w:color="auto" w:sz="4"/>
+          <w:right w:val="single" w:color="auto" w:sz="4"/>
+          <w:insideH w:val="single" w:color="auto" w:sz="4"/>
+          <w:insideV w:val="single" w:color="auto" w:sz="4"/>
+        </w:tblBorders>
+      </w:tblPr>
+      <w:tblGrid>
+        <w:gridCol w:w="2800"/>
+        <w:gridCol w:w="3300"/>
+        <w:gridCol w:w="2926"/>
+      </w:tblGrid>
+      <w:tr>
+        <w:trPr>
+          <w:tblHeader/>
+        </w:trPr>
+        <w:tc>
+          <w:tcPr>
+            <w:tcW w:type="dxa" w:w="2800"/>
+            <w:tcBorders>
+              <w:top w:val="single" w:color="BFBFBF" w:sz="4"/>
+              <w:left w:val="single" w:color="BFBFBF" w:sz="4"/>
+              <w:bottom w:val="single" w:color="BFBFBF" w:sz="4"/>
+              <w:right w:val="single" w:color="BFBFBF" w:sz="4"/>
+            </w:tcBorders>
+            <w:shd w:fill="EDEDED" w:color="auto" w:val="clear"/>
+            <w:tcMar>
+              <w:top w:type="dxa" w:w="60"/>
+              <w:left w:type="dxa" w:w="100"/>
+              <w:bottom w:type="dxa" w:w="60"/>
+              <w:right w:type="dxa" w:w="100"/>
+            </w:tcMar>
+          </w:tcPr>
+          <w:p>
+            <w:r>
+              <w:rPr>
+                <w:b/>
+                <w:bCs/>
+                <w:sz w:val="19"/>
+                <w:szCs w:val="19"/>
+              </w:rPr>
+              <w:t xml:space="preserve">Symptom</w:t>
+            </w:r>
+          </w:p>
+        </w:tc>
+        <w:tc>
+          <w:tcPr>
+            <w:tcW w:type="dxa" w:w="3300"/>
+            <w:tcBorders>
+              <w:top w:val="single" w:color="BFBFBF" w:sz="4"/>
+              <w:left w:val="single" w:color="BFBFBF" w:sz="4"/>
+              <w:bottom w:val="single" w:color="BFBFBF" w:sz="4"/>
+              <w:right w:val="single" w:color="BFBFBF" w:sz="4"/>
+            </w:tcBorders>
+            <w:shd w:fill="EDEDED" w:color="auto" w:val="clear"/>
+            <w:tcMar>
+              <w:top w:type="dxa" w:w="60"/>
+              <w:left w:type="dxa" w:w="100"/>
+              <w:bottom w:type="dxa" w:w="60"/>
+              <w:right w:type="dxa" w:w="100"/>
+            </w:tcMar>
+          </w:tcPr>
+          <w:p>
+            <w:r>
+              <w:rPr>
+                <w:b/>
+                <w:bCs/>
+                <w:sz w:val="19"/>
+                <w:szCs w:val="19"/>
+              </w:rPr>
+              <w:t xml:space="preserve">Cause</w:t>
+            </w:r>
+          </w:p>
+        </w:tc>
+        <w:tc>
+          <w:tcPr>
+            <w:tcW w:type="dxa" w:w="2926"/>
+            <w:tcBorders>
+              <w:top w:val="single" w:color="BFBFBF" w:sz="4"/>
+              <w:left w:val="single" w:color="BFBFBF" w:sz="4"/>
+              <w:bottom w:val="single" w:color="BFBFBF" w:sz="4"/>
+              <w:right w:val="single" w:color="BFBFBF" w:sz="4"/>
+            </w:tcBorders>
+            <w:shd w:fill="EDEDED" w:color="auto" w:val="clear"/>
+            <w:tcMar>
+              <w:top w:type="dxa" w:w="60"/>
+              <w:left w:type="dxa" w:w="100"/>
+              <w:bottom w:type="dxa" w:w="60"/>
+              <w:right w:type="dxa" w:w="100"/>
+            </w:tcMar>
+          </w:tcPr>
+          <w:p>
+            <w:r>
+              <w:rPr>
+                <w:b/>
+                <w:bCs/>
+                <w:sz w:val="19"/>
+                <w:szCs w:val="19"/>
+              </w:rPr>
+              <w:t xml:space="preserve">Resolution</w:t>
+            </w:r>
+          </w:p>
+        </w:tc>
+      </w:tr>
+      <w:tr>
+        <w:tc>
+          <w:tcPr>
+            <w:tcW w:type="dxa" w:w="2800"/>
+            <w:tcBorders>
+              <w:top w:val="single" w:color="BFBFBF" w:sz="4"/>
+              <w:left w:val="single" w:color="BFBFBF" w:sz="4"/>
+              <w:bottom w:val="single" w:color="BFBFBF" w:sz="4"/>
+              <w:right w:val="single" w:color="BFBFBF" w:sz="4"/>
+            </w:tcBorders>
+            <w:tcMar>
+              <w:top w:type="dxa" w:w="60"/>
+              <w:left w:type="dxa" w:w="100"/>
+              <w:bottom w:type="dxa" w:w="60"/>
+              <w:right w:type="dxa" w:w="100"/>
+            </w:tcMar>
+          </w:tcPr>
+          <w:p>
+            <w:r>
+              <w:rPr>
+                <w:b w:val="false"/>
+                <w:bCs w:val="false"/>
+                <w:sz w:val="19"/>
+                <w:szCs w:val="19"/>
+              </w:rPr>
+              <w:t xml:space="preserve">The search box is empty again after a search completes.</w:t>
+            </w:r>
+          </w:p>
+        </w:tc>
+        <w:tc>
+          <w:tcPr>
+            <w:tcW w:type="dxa" w:w="3300"/>
+            <w:tcBorders>
+              <w:top w:val="single" w:color="BFBFBF" w:sz="4"/>
+              <w:left w:val="single" w:color="BFBFBF" w:sz="4"/>
+              <w:bottom w:val="single" w:color="BFBFBF" w:sz="4"/>
+              <w:right w:val="single" w:color="BFBFBF" w:sz="4"/>
+            </w:tcBorders>
+            <w:tcMar>
+              <w:top w:type="dxa" w:w="60"/>
+              <w:left w:type="dxa" w:w="100"/>
+              <w:bottom w:type="dxa" w:w="60"/>
+              <w:right w:type="dxa" w:w="100"/>
+            </w:tcMar>
+          </w:tcPr>
+          <w:p>
+            <w:r>
+              <w:rPr>
+                <w:b w:val="false"/>
+                <w:bCs w:val="false"/>
+                <w:sz w:val="19"/>
+                <w:szCs w:val="19"/>
+              </w:rPr>
+              <w:t xml:space="preserve">The page is keyed by wave id, so it remounts when it navigates to the new wave.</w:t>
+            </w:r>
+          </w:p>
+        </w:tc>
+        <w:tc>
+          <w:tcPr>
+            <w:tcW w:type="dxa" w:w="2926"/>
+            <w:tcBorders>
+              <w:top w:val="single" w:color="BFBFBF" w:sz="4"/>
+              <w:left w:val="single" w:color="BFBFBF" w:sz="4"/>
+              <w:bottom w:val="single" w:color="BFBFBF" w:sz="4"/>
+              <w:right w:val="single" w:color="BFBFBF" w:sz="4"/>
+            </w:tcBorders>
+            <w:tcMar>
+              <w:top w:type="dxa" w:w="60"/>
+              <w:left w:type="dxa" w:w="100"/>
+              <w:bottom w:type="dxa" w:w="60"/>
+              <w:right w:type="dxa" w:w="100"/>
+            </w:tcMar>
+          </w:tcPr>
+          <w:p>
+            <w:r>
+              <w:rPr>
+                <w:b w:val="false"/>
+                <w:bCs w:val="false"/>
+                <w:sz w:val="19"/>
+                <w:szCs w:val="19"/>
+              </w:rPr>
+              <w:t xml:space="preserve">Left as is: the query is shown as the wave's heading and in the holding bay.</w:t>
+            </w:r>
+          </w:p>
+        </w:tc>
+      </w:tr>
+    </w:tbl>
+    <w:p>
+      <w:pPr>
+        <w:spacing w:after="120"/>
+      </w:pPr>
+    </w:p>
+    <w:p>
+      <w:pPr>
+        <w:pStyle w:val="Heading2"/>
+      </w:pPr>
+      <w:r>
+        <w:t xml:space="preserve">Verification</w:t>
+      </w:r>
+    </w:p>
+    <w:p>
+      <w:pPr>
+        <w:pStyle w:val="ListParagraph"/>
+        <w:numPr>
+          <w:ilvl w:val="0"/>
+          <w:numId w:val="2"/>
+        </w:numPr>
+        <w:spacing w:after="60"/>
+      </w:pPr>
+      <w:r>
+        <w:t xml:space="preserve">tsc and eslint clean.</w:t>
+      </w:r>
+    </w:p>
+    <w:p>
+      <w:pPr>
+        <w:pStyle w:val="ListParagraph"/>
+        <w:numPr>
+          <w:ilvl w:val="0"/>
+          <w:numId w:val="2"/>
+        </w:numPr>
+        <w:spacing w:after="60"/>
+      </w:pPr>
+      <w:r>
+        <w:t xml:space="preserve">Headless Edge walkthrough, no console errors: Explore opens from Discovery and shows the saved wave; its description expands; "start a new Battlefield" pre-fills name, keywords and locations and states the job count; creating it lands on a Battlefield holding the wave's job, unranked; sending the same wave to that Battlefield reports 0 copied and 1 already there; a real Explore search appears at the top of the holding bay with its jobs; reopening the older wave shows its job from the database.</w:t>
+      </w:r>
+    </w:p>
+    <w:p>
+      <w:pPr>
+        <w:pStyle w:val="ListParagraph"/>
+        <w:numPr>
+          <w:ilvl w:val="0"/>
+          <w:numId w:val="2"/>
+        </w:numPr>
+        <w:spacing w:after="60"/>
+      </w:pPr>
+      <w:r>
+        <w:t xml:space="preserve">The real search for "content writer" in the United States returned 2 jobs: RBC Marketing Content Writer &amp; Strategist, and Medtronic Senior Technical Writer (labeling). Cost: 1 Apify run.</w:t>
+      </w:r>
+    </w:p>
+    <w:p>
+      <w:pPr>
+        <w:pStyle w:val="Heading2"/>
+      </w:pPr>
+      <w:r>
+        <w:t xml:space="preserve">Known risks left behind</w:t>
+      </w:r>
+    </w:p>
+    <w:p>
+      <w:pPr>
+        <w:pStyle w:val="ListParagraph"/>
+        <w:numPr>
+          <w:ilvl w:val="0"/>
+          <w:numId w:val="2"/>
+        </w:numPr>
+        <w:spacing w:after="60"/>
+      </w:pPr>
+      <w:r>
+        <w:t xml:space="preserve">An Explore search blocks its browser tab for several minutes. If the tab is closed or navigates away, the wave is still saved and appears in the holding bay after a refresh.</w:t>
+      </w:r>
+    </w:p>
+    <w:p>
+      <w:pPr>
+        <w:pStyle w:val="ListParagraph"/>
+        <w:numPr>
+          <w:ilvl w:val="0"/>
+          <w:numId w:val="2"/>
+        </w:numPr>
+        <w:spacing w:after="60"/>
+      </w:pPr>
+      <w:r>
+        <w:t xml:space="preserve">Jobs are not deduplicated across waves: the same posting found by two Explore searches is stored twice (once per wave).</w:t>
+      </w:r>
+    </w:p>
+    <w:p>
+      <w:pPr>
+        <w:pStyle w:val="Heading2"/>
+      </w:pPr>
+      <w:r>
+        <w:t xml:space="preserve">Production data changes</w:t>
+      </w:r>
+    </w:p>
+    <w:p>
+      <w:pPr>
+        <w:pStyle w:val="ListParagraph"/>
+        <w:numPr>
+          <w:ilvl w:val="0"/>
+          <w:numId w:val="2"/>
+        </w:numPr>
+        <w:spacing w:after="60"/>
+      </w:pPr>
+      <w:r>
+        <w:t xml:space="preserve">Kept: SearchWave "content writer" (2 jobs, no Battlefield) and its Run row.</w:t>
+      </w:r>
+    </w:p>
+    <w:p>
+      <w:pPr>
+        <w:pStyle w:val="ListParagraph"/>
+        <w:numPr>
+          <w:ilvl w:val="0"/>
+          <w:numId w:val="2"/>
+        </w:numPr>
+        <w:spacing w:after="60"/>
+      </w:pPr>
+      <w:r>
+        <w:t xml:space="preserve">Removed: the test Battlefield "Explore Promote Test" and the 1 job copied into it.</w:t>
       </w:r>
     </w:p>
     <w:sectPr>
@@ -5675,6 +6573,7 @@
     <w:next w:val="Normal"/>
     <w:qFormat/>
     <w:pPr>
+      <w:keepNext/>
       <w:spacing w:after="120" w:before="360"/>
       <w:outlineLvl w:val="0"/>
     </w:pPr>
@@ -5693,6 +6592,7 @@
     <w:next w:val="Normal"/>
     <w:qFormat/>
     <w:pPr>
+      <w:keepNext/>
       <w:spacing w:after="80" w:before="220"/>
       <w:outlineLvl w:val="1"/>
     </w:pPr>

</xml_diff>

<commit_message>
Fix Railway deploy: root build and start scripts for web/
Railway builds from the repo root, whose package.json had no start
script, so it ran `node index.js` and crashed with "Cannot find module
'/app/index.js'". The root build script now installs web/ dependencies
(including devDependencies, which the build needs) and runs web's build;
start runs `next start` in web/, which listens on PORT.

Co-Authored-By: Claude Opus 5.5 <noreply@anthropic.com>
</commit_message>
<xml_diff>
--- a/docs/KAMUI-postmortem.docx
+++ b/docs/KAMUI-postmortem.docx
@@ -783,6 +783,122 @@
                 <w:szCs w:val="19"/>
               </w:rPr>
               <w:t xml:space="preserve">Turbopack could not spawn its PostCSS worker. Use npx next dev --webpack.</w:t>
+            </w:r>
+          </w:p>
+        </w:tc>
+      </w:tr>
+      <w:tr>
+        <w:tc>
+          <w:tcPr>
+            <w:tcW w:type="dxa" w:w="3200"/>
+            <w:tcBorders>
+              <w:top w:val="single" w:color="BFBFBF" w:sz="4"/>
+              <w:left w:val="single" w:color="BFBFBF" w:sz="4"/>
+              <w:bottom w:val="single" w:color="BFBFBF" w:sz="4"/>
+              <w:right w:val="single" w:color="BFBFBF" w:sz="4"/>
+            </w:tcBorders>
+            <w:tcMar>
+              <w:top w:type="dxa" w:w="60"/>
+              <w:left w:type="dxa" w:w="100"/>
+              <w:bottom w:type="dxa" w:w="60"/>
+              <w:right w:type="dxa" w:w="100"/>
+            </w:tcMar>
+          </w:tcPr>
+          <w:p>
+            <w:r>
+              <w:rPr>
+                <w:b w:val="false"/>
+                <w:bCs w:val="false"/>
+                <w:sz w:val="19"/>
+                <w:szCs w:val="19"/>
+              </w:rPr>
+              <w:t xml:space="preserve">Railway deploy crashes: Cannot find module '/app/index.js'</w:t>
+            </w:r>
+          </w:p>
+        </w:tc>
+        <w:tc>
+          <w:tcPr>
+            <w:tcW w:type="dxa" w:w="5826"/>
+            <w:tcBorders>
+              <w:top w:val="single" w:color="BFBFBF" w:sz="4"/>
+              <w:left w:val="single" w:color="BFBFBF" w:sz="4"/>
+              <w:bottom w:val="single" w:color="BFBFBF" w:sz="4"/>
+              <w:right w:val="single" w:color="BFBFBF" w:sz="4"/>
+            </w:tcBorders>
+            <w:tcMar>
+              <w:top w:type="dxa" w:w="60"/>
+              <w:left w:type="dxa" w:w="100"/>
+              <w:bottom w:type="dxa" w:w="60"/>
+              <w:right w:type="dxa" w:w="100"/>
+            </w:tcMar>
+          </w:tcPr>
+          <w:p>
+            <w:r>
+              <w:rPr>
+                <w:b w:val="false"/>
+                <w:bCs w:val="false"/>
+                <w:sz w:val="19"/>
+                <w:szCs w:val="19"/>
+              </w:rPr>
+              <w:t xml:space="preserve">Railway built the repo root, whose package.json had no start script. Fixed on 2026-09-24: root build/start scripts delegate to web/. Check they still exist.</w:t>
+            </w:r>
+          </w:p>
+        </w:tc>
+      </w:tr>
+      <w:tr>
+        <w:tc>
+          <w:tcPr>
+            <w:tcW w:type="dxa" w:w="3200"/>
+            <w:tcBorders>
+              <w:top w:val="single" w:color="BFBFBF" w:sz="4"/>
+              <w:left w:val="single" w:color="BFBFBF" w:sz="4"/>
+              <w:bottom w:val="single" w:color="BFBFBF" w:sz="4"/>
+              <w:right w:val="single" w:color="BFBFBF" w:sz="4"/>
+            </w:tcBorders>
+            <w:tcMar>
+              <w:top w:type="dxa" w:w="60"/>
+              <w:left w:type="dxa" w:w="100"/>
+              <w:bottom w:type="dxa" w:w="60"/>
+              <w:right w:type="dxa" w:w="100"/>
+            </w:tcMar>
+          </w:tcPr>
+          <w:p>
+            <w:r>
+              <w:rPr>
+                <w:b w:val="false"/>
+                <w:bCs w:val="false"/>
+                <w:sz w:val="19"/>
+                <w:szCs w:val="19"/>
+              </w:rPr>
+              <w:t xml:space="preserve">Railway build fails on tailwind, typescript or prisma not found</w:t>
+            </w:r>
+          </w:p>
+        </w:tc>
+        <w:tc>
+          <w:tcPr>
+            <w:tcW w:type="dxa" w:w="5826"/>
+            <w:tcBorders>
+              <w:top w:val="single" w:color="BFBFBF" w:sz="4"/>
+              <w:left w:val="single" w:color="BFBFBF" w:sz="4"/>
+              <w:bottom w:val="single" w:color="BFBFBF" w:sz="4"/>
+              <w:right w:val="single" w:color="BFBFBF" w:sz="4"/>
+            </w:tcBorders>
+            <w:tcMar>
+              <w:top w:type="dxa" w:w="60"/>
+              <w:left w:type="dxa" w:w="100"/>
+              <w:bottom w:type="dxa" w:w="60"/>
+              <w:right w:type="dxa" w:w="100"/>
+            </w:tcMar>
+          </w:tcPr>
+          <w:p>
+            <w:r>
+              <w:rPr>
+                <w:b w:val="false"/>
+                <w:bCs w:val="false"/>
+                <w:sz w:val="19"/>
+                <w:szCs w:val="19"/>
+              </w:rPr>
+              <w:t xml:space="preserve">web/ devDependencies were skipped in a production install. The root build script must keep npm ci --include=dev.</w:t>
             </w:r>
           </w:p>
         </w:tc>

</xml_diff>

<commit_message>
Post-mortem: Railway deploy fix and asynchronous searches
Co-Authored-By: Claude Opus 5.5 <noreply@anthropic.com>
</commit_message>
<xml_diff>
--- a/docs/KAMUI-postmortem.docx
+++ b/docs/KAMUI-postmortem.docx
@@ -21,7 +21,7 @@
         <w:rPr>
           <w:color w:val="666666"/>
         </w:rPr>
-        <w:t xml:space="preserve">Last updated 2026-09-24, after Phase 4.</w:t>
+        <w:t xml:space="preserve">Last updated 2026-09-24, after the async search change.</w:t>
       </w:r>
     </w:p>
     <w:p>
@@ -84,7 +84,7 @@
         <w:pStyle w:val="Heading1"/>
       </w:pPr>
       <w:r>
-        <w:t xml:space="preserve">The system after Phase 4</w:t>
+        <w:t xml:space="preserve">The system after the async search change</w:t>
       </w:r>
     </w:p>
     <w:p>
@@ -175,7 +175,20 @@
         <w:spacing w:after="60"/>
       </w:pPr>
       <w:r>
-        <w:t xml:space="preserve">Railway auto-deploy from GitHub was disconnected by the user during Phase 1 and has not been reconnected. The deployed web service is running pre-Phase-1 code against the new schema, so it is broken.</w:t>
+        <w:t xml:space="preserve">Searches are asynchronous: the search and explore routes start Apify and return a Run id; GET /api/runs/&lt;id&gt; reports progress and ingests the jobs once Apify finishes. The UI polls it.</w:t>
+      </w:r>
+    </w:p>
+    <w:p>
+      <w:pPr>
+        <w:pStyle w:val="ListParagraph"/>
+        <w:numPr>
+          <w:ilvl w:val="0"/>
+          <w:numId w:val="2"/>
+        </w:numPr>
+        <w:spacing w:after="60"/>
+      </w:pPr>
+      <w:r>
+        <w:t xml:space="preserve">Railway builds the repo root; the root package.json build and start scripts delegate to web/. Auto-deploy from GitHub was reconnected by the user after Phase 4.</w:t>
       </w:r>
     </w:p>
     <w:p>
@@ -928,6 +941,122 @@
                 <w:sz w:val="19"/>
                 <w:szCs w:val="19"/>
               </w:rPr>
+              <w:t xml:space="preserve">A search shows Saving the results... forever</w:t>
+            </w:r>
+          </w:p>
+        </w:tc>
+        <w:tc>
+          <w:tcPr>
+            <w:tcW w:type="dxa" w:w="5826"/>
+            <w:tcBorders>
+              <w:top w:val="single" w:color="BFBFBF" w:sz="4"/>
+              <w:left w:val="single" w:color="BFBFBF" w:sz="4"/>
+              <w:bottom w:val="single" w:color="BFBFBF" w:sz="4"/>
+              <w:right w:val="single" w:color="BFBFBF" w:sz="4"/>
+            </w:tcBorders>
+            <w:tcMar>
+              <w:top w:type="dxa" w:w="60"/>
+              <w:left w:type="dxa" w:w="100"/>
+              <w:bottom w:type="dxa" w:w="60"/>
+              <w:right w:type="dxa" w:w="100"/>
+            </w:tcMar>
+          </w:tcPr>
+          <w:p>
+            <w:r>
+              <w:rPr>
+                <w:b w:val="false"/>
+                <w:bCs w:val="false"/>
+                <w:sz w:val="19"/>
+                <w:szCs w:val="19"/>
+              </w:rPr>
+              <w:t xml:space="preserve">Its Run is stuck in ingesting (the server died mid-ingest). Set the Run's status back to running; the next poll ingests again.</w:t>
+            </w:r>
+          </w:p>
+        </w:tc>
+      </w:tr>
+      <w:tr>
+        <w:tc>
+          <w:tcPr>
+            <w:tcW w:type="dxa" w:w="3200"/>
+            <w:tcBorders>
+              <w:top w:val="single" w:color="BFBFBF" w:sz="4"/>
+              <w:left w:val="single" w:color="BFBFBF" w:sz="4"/>
+              <w:bottom w:val="single" w:color="BFBFBF" w:sz="4"/>
+              <w:right w:val="single" w:color="BFBFBF" w:sz="4"/>
+            </w:tcBorders>
+            <w:tcMar>
+              <w:top w:type="dxa" w:w="60"/>
+              <w:left w:type="dxa" w:w="100"/>
+              <w:bottom w:type="dxa" w:w="60"/>
+              <w:right w:type="dxa" w:w="100"/>
+            </w:tcMar>
+          </w:tcPr>
+          <w:p>
+            <w:r>
+              <w:rPr>
+                <w:b w:val="false"/>
+                <w:bCs w:val="false"/>
+                <w:sz w:val="19"/>
+                <w:szCs w:val="19"/>
+              </w:rPr>
+              <w:t xml:space="preserve">A search finished on Apify but its jobs never appeared</w:t>
+            </w:r>
+          </w:p>
+        </w:tc>
+        <w:tc>
+          <w:tcPr>
+            <w:tcW w:type="dxa" w:w="5826"/>
+            <w:tcBorders>
+              <w:top w:val="single" w:color="BFBFBF" w:sz="4"/>
+              <w:left w:val="single" w:color="BFBFBF" w:sz="4"/>
+              <w:bottom w:val="single" w:color="BFBFBF" w:sz="4"/>
+              <w:right w:val="single" w:color="BFBFBF" w:sz="4"/>
+            </w:tcBorders>
+            <w:tcMar>
+              <w:top w:type="dxa" w:w="60"/>
+              <w:left w:type="dxa" w:w="100"/>
+              <w:bottom w:type="dxa" w:w="60"/>
+              <w:right w:type="dxa" w:w="100"/>
+            </w:tcMar>
+          </w:tcPr>
+          <w:p>
+            <w:r>
+              <w:rPr>
+                <w:b w:val="false"/>
+                <w:bCs w:val="false"/>
+                <w:sz w:val="19"/>
+                <w:szCs w:val="19"/>
+              </w:rPr>
+              <w:t xml:space="preserve">Ingest only happens when GET /api/runs/&lt;id&gt; is called. Open the Battlefield or wave page, or call the route.</w:t>
+            </w:r>
+          </w:p>
+        </w:tc>
+      </w:tr>
+      <w:tr>
+        <w:tc>
+          <w:tcPr>
+            <w:tcW w:type="dxa" w:w="3200"/>
+            <w:tcBorders>
+              <w:top w:val="single" w:color="BFBFBF" w:sz="4"/>
+              <w:left w:val="single" w:color="BFBFBF" w:sz="4"/>
+              <w:bottom w:val="single" w:color="BFBFBF" w:sz="4"/>
+              <w:right w:val="single" w:color="BFBFBF" w:sz="4"/>
+            </w:tcBorders>
+            <w:tcMar>
+              <w:top w:type="dxa" w:w="60"/>
+              <w:left w:type="dxa" w:w="100"/>
+              <w:bottom w:type="dxa" w:w="60"/>
+              <w:right w:type="dxa" w:w="100"/>
+            </w:tcMar>
+          </w:tcPr>
+          <w:p>
+            <w:r>
+              <w:rPr>
+                <w:b w:val="false"/>
+                <w:bCs w:val="false"/>
+                <w:sz w:val="19"/>
+                <w:szCs w:val="19"/>
+              </w:rPr>
               <w:t xml:space="preserve">Port 3000 already in use</w:t>
             </w:r>
           </w:p>
@@ -1032,20 +1161,33 @@
         <w:spacing w:after="60"/>
       </w:pPr>
       <w:r>
-        <w:t xml:space="preserve">Long synchronous search requests versus hosting request timeouts (unchecked on Railway).</w:t>
-      </w:r>
-    </w:p>
-    <w:p>
-      <w:pPr>
-        <w:pStyle w:val="ListParagraph"/>
-        <w:numPr>
-          <w:ilvl w:val="0"/>
-          <w:numId w:val="2"/>
-        </w:numPr>
-        <w:spacing w:after="60"/>
-      </w:pPr>
-      <w:r>
-        <w:t xml:space="preserve">The deployed Railway app is broken and GitHub auto-deploy is disconnected until the rebuild is deployed.</w:t>
+        <w:t xml:space="preserve">Manual Rank still runs inside its request; large ranks could time out on Railway.</w:t>
+      </w:r>
+    </w:p>
+    <w:p>
+      <w:pPr>
+        <w:pStyle w:val="ListParagraph"/>
+        <w:numPr>
+          <w:ilvl w:val="0"/>
+          <w:numId w:val="2"/>
+        </w:numPr>
+        <w:spacing w:after="60"/>
+      </w:pPr>
+      <w:r>
+        <w:t xml:space="preserve">Nothing resets a Run stuck in ingesting, and results nobody polls for eventually expire on Apify.</w:t>
+      </w:r>
+    </w:p>
+    <w:p>
+      <w:pPr>
+        <w:pStyle w:val="ListParagraph"/>
+        <w:numPr>
+          <w:ilvl w:val="0"/>
+          <w:numId w:val="2"/>
+        </w:numPr>
+        <w:spacing w:after="60"/>
+      </w:pPr>
+      <w:r>
+        <w:t xml:space="preserve">The deployed Railway app has not been verified after the deploy fix and the async search change.</w:t>
       </w:r>
     </w:p>
     <w:p>
@@ -1084,7 +1226,7 @@
         <w:spacing w:after="60"/>
       </w:pPr>
       <w:r>
-        <w:t xml:space="preserve">Search New and Rank have not been clicked from the UI yet (their routes were tested directly in Phase 2).</w:t>
+        <w:t xml:space="preserve">Rank has not been clicked from the UI yet (its route was tested directly in Phase 2). Search New has.</w:t>
       </w:r>
     </w:p>
     <w:p>
@@ -6260,6 +6402,1399 @@
       </w:pPr>
       <w:r>
         <w:t xml:space="preserve">Removed: the test Battlefield "Explore Promote Test" and the 1 job copied into it.</w:t>
+      </w:r>
+    </w:p>
+    <w:p>
+      <w:pPr>
+        <w:pStyle w:val="Heading1"/>
+      </w:pPr>
+      <w:r>
+        <w:t xml:space="preserve">After Phase 4: Railway deploy fix and asynchronous searches</w:t>
+      </w:r>
+    </w:p>
+    <w:p>
+      <w:pPr>
+        <w:spacing w:after="120"/>
+        <w:rPr>
+          <w:color w:val="666666"/>
+          <w:sz w:val="20"/>
+          <w:szCs w:val="20"/>
+        </w:rPr>
+      </w:pPr>
+      <w:r>
+        <w:rPr>
+          <w:color w:val="666666"/>
+          <w:sz w:val="20"/>
+          <w:szCs w:val="20"/>
+        </w:rPr>
+        <w:t xml:space="preserve">2026-09-24  ·  commit 140be22, 034cc7d</w:t>
+      </w:r>
+    </w:p>
+    <w:p>
+      <w:pPr>
+        <w:spacing w:after="120"/>
+      </w:pPr>
+      <w:r>
+        <w:t xml:space="preserve">The first Railway deploy after the rebuild crashed, and once it ran, searches timed out because each request waited for the Apify sweep. The deploy was fixed with root build and start scripts. Searches were split in two: the search and explore routes start Apify and return at once, and a status route reports progress and saves the jobs when Apify finishes.</w:t>
+      </w:r>
+    </w:p>
+    <w:p>
+      <w:pPr>
+        <w:pStyle w:val="Heading2"/>
+      </w:pPr>
+      <w:r>
+        <w:t xml:space="preserve">What changed</w:t>
+      </w:r>
+    </w:p>
+    <w:p>
+      <w:pPr>
+        <w:pStyle w:val="ListParagraph"/>
+        <w:numPr>
+          <w:ilvl w:val="0"/>
+          <w:numId w:val="2"/>
+        </w:numPr>
+        <w:spacing w:after="60"/>
+      </w:pPr>
+      <w:r>
+        <w:t xml:space="preserve">package.json (repo root): build installs web/ dependencies with --include=dev and runs web's build; start runs next start in web/ (140be22).</w:t>
+      </w:r>
+    </w:p>
+    <w:p>
+      <w:pPr>
+        <w:pStyle w:val="ListParagraph"/>
+        <w:numPr>
+          <w:ilvl w:val="0"/>
+          <w:numId w:val="2"/>
+        </w:numPr>
+        <w:spacing w:after="60"/>
+      </w:pPr>
+      <w:r>
+        <w:t xml:space="preserve">prisma/migrations/20260924140000_async_search_runs: additive. Run gains apifyRunIds (text[]) and searchWaveId (link to SearchWave).</w:t>
+      </w:r>
+    </w:p>
+    <w:p>
+      <w:pPr>
+        <w:pStyle w:val="ListParagraph"/>
+        <w:numPr>
+          <w:ilvl w:val="0"/>
+          <w:numId w:val="2"/>
+        </w:numPr>
+        <w:spacing w:after="60"/>
+      </w:pPr>
+      <w:r>
+        <w:t xml:space="preserve">web/lib/apify.ts rewritten on the apify-client package: startSearch (actor.start, one run per location, Promise.allSettled), getRuns, readJobs.</w:t>
+      </w:r>
+    </w:p>
+    <w:p>
+      <w:pPr>
+        <w:pStyle w:val="ListParagraph"/>
+        <w:numPr>
+          <w:ilvl w:val="0"/>
+          <w:numId w:val="2"/>
+        </w:numPr>
+        <w:spacing w:after="60"/>
+      </w:pPr>
+      <w:r>
+        <w:t xml:space="preserve">web/lib/searchRuns.ts (new): startBattlefieldSearch, startExplore, and checkRun, which reports progress or ingests once every Apify run has finished.</w:t>
+      </w:r>
+    </w:p>
+    <w:p>
+      <w:pPr>
+        <w:pStyle w:val="ListParagraph"/>
+        <w:numPr>
+          <w:ilvl w:val="0"/>
+          <w:numId w:val="2"/>
+        </w:numPr>
+        <w:spacing w:after="60"/>
+      </w:pPr>
+      <w:r>
+        <w:t xml:space="preserve">POST /api/battlefields/[id]/search and POST /api/explore now return 202 with a runId (and waveId for Explore). New GET /api/runs/[id].</w:t>
+      </w:r>
+    </w:p>
+    <w:p>
+      <w:pPr>
+        <w:pStyle w:val="ListParagraph"/>
+        <w:numPr>
+          <w:ilvl w:val="0"/>
+          <w:numId w:val="2"/>
+        </w:numPr>
+        <w:spacing w:after="60"/>
+      </w:pPr>
+      <w:r>
+        <w:t xml:space="preserve">UI: web/app/useRunStatus.ts polls the status route every 5 seconds. The Discovery toolbar and the Explore wave view show elapsed time and Apify's progress message, refresh when done, and resume after a reload. The holding bay marks waves that are searching or failed.</w:t>
+      </w:r>
+    </w:p>
+    <w:p>
+      <w:pPr>
+        <w:pStyle w:val="ListParagraph"/>
+        <w:numPr>
+          <w:ilvl w:val="0"/>
+          <w:numId w:val="2"/>
+        </w:numPr>
+        <w:spacing w:after="60"/>
+      </w:pPr>
+      <w:r>
+        <w:t xml:space="preserve">web/next.config.ts: apify-client in serverExternalPackages.</w:t>
+      </w:r>
+    </w:p>
+    <w:p>
+      <w:pPr>
+        <w:pStyle w:val="Heading2"/>
+      </w:pPr>
+      <w:r>
+        <w:t xml:space="preserve">Decisions and deviations from the spec</w:t>
+      </w:r>
+    </w:p>
+    <w:tbl>
+      <w:tblPr>
+        <w:tblW w:type="dxa" w:w="9026"/>
+        <w:tblBorders>
+          <w:top w:val="single" w:color="auto" w:sz="4"/>
+          <w:left w:val="single" w:color="auto" w:sz="4"/>
+          <w:bottom w:val="single" w:color="auto" w:sz="4"/>
+          <w:right w:val="single" w:color="auto" w:sz="4"/>
+          <w:insideH w:val="single" w:color="auto" w:sz="4"/>
+          <w:insideV w:val="single" w:color="auto" w:sz="4"/>
+        </w:tblBorders>
+      </w:tblPr>
+      <w:tblGrid>
+        <w:gridCol w:w="2600"/>
+        <w:gridCol w:w="3400"/>
+        <w:gridCol w:w="3026"/>
+      </w:tblGrid>
+      <w:tr>
+        <w:trPr>
+          <w:tblHeader/>
+        </w:trPr>
+        <w:tc>
+          <w:tcPr>
+            <w:tcW w:type="dxa" w:w="2600"/>
+            <w:tcBorders>
+              <w:top w:val="single" w:color="BFBFBF" w:sz="4"/>
+              <w:left w:val="single" w:color="BFBFBF" w:sz="4"/>
+              <w:bottom w:val="single" w:color="BFBFBF" w:sz="4"/>
+              <w:right w:val="single" w:color="BFBFBF" w:sz="4"/>
+            </w:tcBorders>
+            <w:shd w:fill="EDEDED" w:color="auto" w:val="clear"/>
+            <w:tcMar>
+              <w:top w:type="dxa" w:w="60"/>
+              <w:left w:type="dxa" w:w="100"/>
+              <w:bottom w:type="dxa" w:w="60"/>
+              <w:right w:type="dxa" w:w="100"/>
+            </w:tcMar>
+          </w:tcPr>
+          <w:p>
+            <w:r>
+              <w:rPr>
+                <w:b/>
+                <w:bCs/>
+                <w:sz w:val="19"/>
+                <w:szCs w:val="19"/>
+              </w:rPr>
+              <w:t xml:space="preserve">Decision</w:t>
+            </w:r>
+          </w:p>
+        </w:tc>
+        <w:tc>
+          <w:tcPr>
+            <w:tcW w:type="dxa" w:w="3400"/>
+            <w:tcBorders>
+              <w:top w:val="single" w:color="BFBFBF" w:sz="4"/>
+              <w:left w:val="single" w:color="BFBFBF" w:sz="4"/>
+              <w:bottom w:val="single" w:color="BFBFBF" w:sz="4"/>
+              <w:right w:val="single" w:color="BFBFBF" w:sz="4"/>
+            </w:tcBorders>
+            <w:shd w:fill="EDEDED" w:color="auto" w:val="clear"/>
+            <w:tcMar>
+              <w:top w:type="dxa" w:w="60"/>
+              <w:left w:type="dxa" w:w="100"/>
+              <w:bottom w:type="dxa" w:w="60"/>
+              <w:right w:type="dxa" w:w="100"/>
+            </w:tcMar>
+          </w:tcPr>
+          <w:p>
+            <w:r>
+              <w:rPr>
+                <w:b/>
+                <w:bCs/>
+                <w:sz w:val="19"/>
+                <w:szCs w:val="19"/>
+              </w:rPr>
+              <w:t xml:space="preserve">Why</w:t>
+            </w:r>
+          </w:p>
+        </w:tc>
+        <w:tc>
+          <w:tcPr>
+            <w:tcW w:type="dxa" w:w="3026"/>
+            <w:tcBorders>
+              <w:top w:val="single" w:color="BFBFBF" w:sz="4"/>
+              <w:left w:val="single" w:color="BFBFBF" w:sz="4"/>
+              <w:bottom w:val="single" w:color="BFBFBF" w:sz="4"/>
+              <w:right w:val="single" w:color="BFBFBF" w:sz="4"/>
+            </w:tcBorders>
+            <w:shd w:fill="EDEDED" w:color="auto" w:val="clear"/>
+            <w:tcMar>
+              <w:top w:type="dxa" w:w="60"/>
+              <w:left w:type="dxa" w:w="100"/>
+              <w:bottom w:type="dxa" w:w="60"/>
+              <w:right w:type="dxa" w:w="100"/>
+            </w:tcMar>
+          </w:tcPr>
+          <w:p>
+            <w:r>
+              <w:rPr>
+                <w:b/>
+                <w:bCs/>
+                <w:sz w:val="19"/>
+                <w:szCs w:val="19"/>
+              </w:rPr>
+              <w:t xml:space="preserve">Consequence / where</w:t>
+            </w:r>
+          </w:p>
+        </w:tc>
+      </w:tr>
+      <w:tr>
+        <w:tc>
+          <w:tcPr>
+            <w:tcW w:type="dxa" w:w="2600"/>
+            <w:tcBorders>
+              <w:top w:val="single" w:color="BFBFBF" w:sz="4"/>
+              <w:left w:val="single" w:color="BFBFBF" w:sz="4"/>
+              <w:bottom w:val="single" w:color="BFBFBF" w:sz="4"/>
+              <w:right w:val="single" w:color="BFBFBF" w:sz="4"/>
+            </w:tcBorders>
+            <w:tcMar>
+              <w:top w:type="dxa" w:w="60"/>
+              <w:left w:type="dxa" w:w="100"/>
+              <w:bottom w:type="dxa" w:w="60"/>
+              <w:right w:type="dxa" w:w="100"/>
+            </w:tcMar>
+          </w:tcPr>
+          <w:p>
+            <w:r>
+              <w:rPr>
+                <w:b w:val="false"/>
+                <w:bCs w:val="false"/>
+                <w:sz w:val="19"/>
+                <w:szCs w:val="19"/>
+              </w:rPr>
+              <w:t xml:space="preserve">The Run stores a list of Apify run ids, not one</w:t>
+            </w:r>
+          </w:p>
+        </w:tc>
+        <w:tc>
+          <w:tcPr>
+            <w:tcW w:type="dxa" w:w="3400"/>
+            <w:tcBorders>
+              <w:top w:val="single" w:color="BFBFBF" w:sz="4"/>
+              <w:left w:val="single" w:color="BFBFBF" w:sz="4"/>
+              <w:bottom w:val="single" w:color="BFBFBF" w:sz="4"/>
+              <w:right w:val="single" w:color="BFBFBF" w:sz="4"/>
+            </w:tcBorders>
+            <w:tcMar>
+              <w:top w:type="dxa" w:w="60"/>
+              <w:left w:type="dxa" w:w="100"/>
+              <w:bottom w:type="dxa" w:w="60"/>
+              <w:right w:type="dxa" w:w="100"/>
+            </w:tcMar>
+          </w:tcPr>
+          <w:p>
+            <w:r>
+              <w:rPr>
+                <w:b w:val="false"/>
+                <w:bCs w:val="false"/>
+                <w:sz w:val="19"/>
+                <w:szCs w:val="19"/>
+              </w:rPr>
+              <w:t xml:space="preserve">A Battlefield with several locations starts one Apify run per location.</w:t>
+            </w:r>
+          </w:p>
+        </w:tc>
+        <w:tc>
+          <w:tcPr>
+            <w:tcW w:type="dxa" w:w="3026"/>
+            <w:tcBorders>
+              <w:top w:val="single" w:color="BFBFBF" w:sz="4"/>
+              <w:left w:val="single" w:color="BFBFBF" w:sz="4"/>
+              <w:bottom w:val="single" w:color="BFBFBF" w:sz="4"/>
+              <w:right w:val="single" w:color="BFBFBF" w:sz="4"/>
+            </w:tcBorders>
+            <w:tcMar>
+              <w:top w:type="dxa" w:w="60"/>
+              <w:left w:type="dxa" w:w="100"/>
+              <w:bottom w:type="dxa" w:w="60"/>
+              <w:right w:type="dxa" w:w="100"/>
+            </w:tcMar>
+          </w:tcPr>
+          <w:p>
+            <w:r>
+              <w:rPr>
+                <w:b w:val="false"/>
+                <w:bCs w:val="false"/>
+                <w:sz w:val="19"/>
+                <w:szCs w:val="19"/>
+              </w:rPr>
+              <w:t xml:space="preserve">The status route waits for all of them before ingesting.</w:t>
+            </w:r>
+          </w:p>
+        </w:tc>
+      </w:tr>
+      <w:tr>
+        <w:tc>
+          <w:tcPr>
+            <w:tcW w:type="dxa" w:w="2600"/>
+            <w:tcBorders>
+              <w:top w:val="single" w:color="BFBFBF" w:sz="4"/>
+              <w:left w:val="single" w:color="BFBFBF" w:sz="4"/>
+              <w:bottom w:val="single" w:color="BFBFBF" w:sz="4"/>
+              <w:right w:val="single" w:color="BFBFBF" w:sz="4"/>
+            </w:tcBorders>
+            <w:tcMar>
+              <w:top w:type="dxa" w:w="60"/>
+              <w:left w:type="dxa" w:w="100"/>
+              <w:bottom w:type="dxa" w:w="60"/>
+              <w:right w:type="dxa" w:w="100"/>
+            </w:tcMar>
+          </w:tcPr>
+          <w:p>
+            <w:r>
+              <w:rPr>
+                <w:b w:val="false"/>
+                <w:bCs w:val="false"/>
+                <w:sz w:val="19"/>
+                <w:szCs w:val="19"/>
+              </w:rPr>
+              <w:t xml:space="preserve">One status route, /api/runs/[id], for Battlefield searches and Explore</w:t>
+            </w:r>
+          </w:p>
+        </w:tc>
+        <w:tc>
+          <w:tcPr>
+            <w:tcW w:type="dxa" w:w="3400"/>
+            <w:tcBorders>
+              <w:top w:val="single" w:color="BFBFBF" w:sz="4"/>
+              <w:left w:val="single" w:color="BFBFBF" w:sz="4"/>
+              <w:bottom w:val="single" w:color="BFBFBF" w:sz="4"/>
+              <w:right w:val="single" w:color="BFBFBF" w:sz="4"/>
+            </w:tcBorders>
+            <w:tcMar>
+              <w:top w:type="dxa" w:w="60"/>
+              <w:left w:type="dxa" w:w="100"/>
+              <w:bottom w:type="dxa" w:w="60"/>
+              <w:right w:type="dxa" w:w="100"/>
+            </w:tcMar>
+          </w:tcPr>
+          <w:p>
+            <w:r>
+              <w:rPr>
+                <w:b w:val="false"/>
+                <w:bCs w:val="false"/>
+                <w:sz w:val="19"/>
+                <w:szCs w:val="19"/>
+              </w:rPr>
+              <w:t xml:space="preserve">The Run row already knows its Battlefield or wave.</w:t>
+            </w:r>
+          </w:p>
+        </w:tc>
+        <w:tc>
+          <w:tcPr>
+            <w:tcW w:type="dxa" w:w="3026"/>
+            <w:tcBorders>
+              <w:top w:val="single" w:color="BFBFBF" w:sz="4"/>
+              <w:left w:val="single" w:color="BFBFBF" w:sz="4"/>
+              <w:bottom w:val="single" w:color="BFBFBF" w:sz="4"/>
+              <w:right w:val="single" w:color="BFBFBF" w:sz="4"/>
+            </w:tcBorders>
+            <w:tcMar>
+              <w:top w:type="dxa" w:w="60"/>
+              <w:left w:type="dxa" w:w="100"/>
+              <w:bottom w:type="dxa" w:w="60"/>
+              <w:right w:type="dxa" w:w="100"/>
+            </w:tcMar>
+          </w:tcPr>
+          <w:p>
+            <w:r>
+              <w:rPr>
+                <w:b w:val="false"/>
+                <w:bCs w:val="false"/>
+                <w:sz w:val="19"/>
+                <w:szCs w:val="19"/>
+              </w:rPr>
+              <w:t xml:space="preserve"/>
+            </w:r>
+          </w:p>
+        </w:tc>
+      </w:tr>
+      <w:tr>
+        <w:tc>
+          <w:tcPr>
+            <w:tcW w:type="dxa" w:w="2600"/>
+            <w:tcBorders>
+              <w:top w:val="single" w:color="BFBFBF" w:sz="4"/>
+              <w:left w:val="single" w:color="BFBFBF" w:sz="4"/>
+              <w:bottom w:val="single" w:color="BFBFBF" w:sz="4"/>
+              <w:right w:val="single" w:color="BFBFBF" w:sz="4"/>
+            </w:tcBorders>
+            <w:tcMar>
+              <w:top w:type="dxa" w:w="60"/>
+              <w:left w:type="dxa" w:w="100"/>
+              <w:bottom w:type="dxa" w:w="60"/>
+              <w:right w:type="dxa" w:w="100"/>
+            </w:tcMar>
+          </w:tcPr>
+          <w:p>
+            <w:r>
+              <w:rPr>
+                <w:b w:val="false"/>
+                <w:bCs w:val="false"/>
+                <w:sz w:val="19"/>
+                <w:szCs w:val="19"/>
+              </w:rPr>
+              <w:t xml:space="preserve">Ingestion happens when someone polls, not in a background worker</w:t>
+            </w:r>
+          </w:p>
+        </w:tc>
+        <w:tc>
+          <w:tcPr>
+            <w:tcW w:type="dxa" w:w="3400"/>
+            <w:tcBorders>
+              <w:top w:val="single" w:color="BFBFBF" w:sz="4"/>
+              <w:left w:val="single" w:color="BFBFBF" w:sz="4"/>
+              <w:bottom w:val="single" w:color="BFBFBF" w:sz="4"/>
+              <w:right w:val="single" w:color="BFBFBF" w:sz="4"/>
+            </w:tcBorders>
+            <w:tcMar>
+              <w:top w:type="dxa" w:w="60"/>
+              <w:left w:type="dxa" w:w="100"/>
+              <w:bottom w:type="dxa" w:w="60"/>
+              <w:right w:type="dxa" w:w="100"/>
+            </w:tcMar>
+          </w:tcPr>
+          <w:p>
+            <w:r>
+              <w:rPr>
+                <w:b w:val="false"/>
+                <w:bCs w:val="false"/>
+                <w:sz w:val="19"/>
+                <w:szCs w:val="19"/>
+              </w:rPr>
+              <w:t xml:space="preserve">There is no worker process. The UI polls while a search runs and resumes polling on page load.</w:t>
+            </w:r>
+          </w:p>
+        </w:tc>
+        <w:tc>
+          <w:tcPr>
+            <w:tcW w:type="dxa" w:w="3026"/>
+            <w:tcBorders>
+              <w:top w:val="single" w:color="BFBFBF" w:sz="4"/>
+              <w:left w:val="single" w:color="BFBFBF" w:sz="4"/>
+              <w:bottom w:val="single" w:color="BFBFBF" w:sz="4"/>
+              <w:right w:val="single" w:color="BFBFBF" w:sz="4"/>
+            </w:tcBorders>
+            <w:tcMar>
+              <w:top w:type="dxa" w:w="60"/>
+              <w:left w:type="dxa" w:w="100"/>
+              <w:bottom w:type="dxa" w:w="60"/>
+              <w:right w:type="dxa" w:w="100"/>
+            </w:tcMar>
+          </w:tcPr>
+          <w:p>
+            <w:r>
+              <w:rPr>
+                <w:b w:val="false"/>
+                <w:bCs w:val="false"/>
+                <w:sz w:val="19"/>
+                <w:szCs w:val="19"/>
+              </w:rPr>
+              <w:t xml:space="preserve">If nobody opens the page, results wait in Apify until someone does (see risks).</w:t>
+            </w:r>
+          </w:p>
+        </w:tc>
+      </w:tr>
+      <w:tr>
+        <w:tc>
+          <w:tcPr>
+            <w:tcW w:type="dxa" w:w="2600"/>
+            <w:tcBorders>
+              <w:top w:val="single" w:color="BFBFBF" w:sz="4"/>
+              <w:left w:val="single" w:color="BFBFBF" w:sz="4"/>
+              <w:bottom w:val="single" w:color="BFBFBF" w:sz="4"/>
+              <w:right w:val="single" w:color="BFBFBF" w:sz="4"/>
+            </w:tcBorders>
+            <w:tcMar>
+              <w:top w:type="dxa" w:w="60"/>
+              <w:left w:type="dxa" w:w="100"/>
+              <w:bottom w:type="dxa" w:w="60"/>
+              <w:right w:type="dxa" w:w="100"/>
+            </w:tcMar>
+          </w:tcPr>
+          <w:p>
+            <w:r>
+              <w:rPr>
+                <w:b w:val="false"/>
+                <w:bCs w:val="false"/>
+                <w:sz w:val="19"/>
+                <w:szCs w:val="19"/>
+              </w:rPr>
+              <w:t xml:space="preserve">The first poll after Apify finishes claims the Run (running to ingesting) before saving</w:t>
+            </w:r>
+          </w:p>
+        </w:tc>
+        <w:tc>
+          <w:tcPr>
+            <w:tcW w:type="dxa" w:w="3400"/>
+            <w:tcBorders>
+              <w:top w:val="single" w:color="BFBFBF" w:sz="4"/>
+              <w:left w:val="single" w:color="BFBFBF" w:sz="4"/>
+              <w:bottom w:val="single" w:color="BFBFBF" w:sz="4"/>
+              <w:right w:val="single" w:color="BFBFBF" w:sz="4"/>
+            </w:tcBorders>
+            <w:tcMar>
+              <w:top w:type="dxa" w:w="60"/>
+              <w:left w:type="dxa" w:w="100"/>
+              <w:bottom w:type="dxa" w:w="60"/>
+              <w:right w:type="dxa" w:w="100"/>
+            </w:tcMar>
+          </w:tcPr>
+          <w:p>
+            <w:r>
+              <w:rPr>
+                <w:b w:val="false"/>
+                <w:bCs w:val="false"/>
+                <w:sz w:val="19"/>
+                <w:szCs w:val="19"/>
+              </w:rPr>
+              <w:t xml:space="preserve">Several tabs can poll at once; without the claim an Explore wave would store its jobs twice.</w:t>
+            </w:r>
+          </w:p>
+        </w:tc>
+        <w:tc>
+          <w:tcPr>
+            <w:tcW w:type="dxa" w:w="3026"/>
+            <w:tcBorders>
+              <w:top w:val="single" w:color="BFBFBF" w:sz="4"/>
+              <w:left w:val="single" w:color="BFBFBF" w:sz="4"/>
+              <w:bottom w:val="single" w:color="BFBFBF" w:sz="4"/>
+              <w:right w:val="single" w:color="BFBFBF" w:sz="4"/>
+            </w:tcBorders>
+            <w:tcMar>
+              <w:top w:type="dxa" w:w="60"/>
+              <w:left w:type="dxa" w:w="100"/>
+              <w:bottom w:type="dxa" w:w="60"/>
+              <w:right w:type="dxa" w:w="100"/>
+            </w:tcMar>
+          </w:tcPr>
+          <w:p>
+            <w:r>
+              <w:rPr>
+                <w:b w:val="false"/>
+                <w:bCs w:val="false"/>
+                <w:sz w:val="19"/>
+                <w:szCs w:val="19"/>
+              </w:rPr>
+              <w:t xml:space="preserve">Other pollers see ingesting and keep polling.</w:t>
+            </w:r>
+          </w:p>
+        </w:tc>
+      </w:tr>
+      <w:tr>
+        <w:tc>
+          <w:tcPr>
+            <w:tcW w:type="dxa" w:w="2600"/>
+            <w:tcBorders>
+              <w:top w:val="single" w:color="BFBFBF" w:sz="4"/>
+              <w:left w:val="single" w:color="BFBFBF" w:sz="4"/>
+              <w:bottom w:val="single" w:color="BFBFBF" w:sz="4"/>
+              <w:right w:val="single" w:color="BFBFBF" w:sz="4"/>
+            </w:tcBorders>
+            <w:tcMar>
+              <w:top w:type="dxa" w:w="60"/>
+              <w:left w:type="dxa" w:w="100"/>
+              <w:bottom w:type="dxa" w:w="60"/>
+              <w:right w:type="dxa" w:w="100"/>
+            </w:tcMar>
+          </w:tcPr>
+          <w:p>
+            <w:r>
+              <w:rPr>
+                <w:b w:val="false"/>
+                <w:bCs w:val="false"/>
+                <w:sz w:val="19"/>
+                <w:szCs w:val="19"/>
+              </w:rPr>
+              <w:t xml:space="preserve">One running search per Battlefield</w:t>
+            </w:r>
+          </w:p>
+        </w:tc>
+        <w:tc>
+          <w:tcPr>
+            <w:tcW w:type="dxa" w:w="3400"/>
+            <w:tcBorders>
+              <w:top w:val="single" w:color="BFBFBF" w:sz="4"/>
+              <w:left w:val="single" w:color="BFBFBF" w:sz="4"/>
+              <w:bottom w:val="single" w:color="BFBFBF" w:sz="4"/>
+              <w:right w:val="single" w:color="BFBFBF" w:sz="4"/>
+            </w:tcBorders>
+            <w:tcMar>
+              <w:top w:type="dxa" w:w="60"/>
+              <w:left w:type="dxa" w:w="100"/>
+              <w:bottom w:type="dxa" w:w="60"/>
+              <w:right w:type="dxa" w:w="100"/>
+            </w:tcMar>
+          </w:tcPr>
+          <w:p>
+            <w:r>
+              <w:rPr>
+                <w:b w:val="false"/>
+                <w:bCs w:val="false"/>
+                <w:sz w:val="19"/>
+                <w:szCs w:val="19"/>
+              </w:rPr>
+              <w:t xml:space="preserve">A second Search New click would pay for the same sweep twice.</w:t>
+            </w:r>
+          </w:p>
+        </w:tc>
+        <w:tc>
+          <w:tcPr>
+            <w:tcW w:type="dxa" w:w="3026"/>
+            <w:tcBorders>
+              <w:top w:val="single" w:color="BFBFBF" w:sz="4"/>
+              <w:left w:val="single" w:color="BFBFBF" w:sz="4"/>
+              <w:bottom w:val="single" w:color="BFBFBF" w:sz="4"/>
+              <w:right w:val="single" w:color="BFBFBF" w:sz="4"/>
+            </w:tcBorders>
+            <w:tcMar>
+              <w:top w:type="dxa" w:w="60"/>
+              <w:left w:type="dxa" w:w="100"/>
+              <w:bottom w:type="dxa" w:w="60"/>
+              <w:right w:type="dxa" w:w="100"/>
+            </w:tcMar>
+          </w:tcPr>
+          <w:p>
+            <w:r>
+              <w:rPr>
+                <w:b w:val="false"/>
+                <w:bCs w:val="false"/>
+                <w:sz w:val="19"/>
+                <w:szCs w:val="19"/>
+              </w:rPr>
+              <w:t xml:space="preserve">The search route returns the running Run instead.</w:t>
+            </w:r>
+          </w:p>
+        </w:tc>
+      </w:tr>
+      <w:tr>
+        <w:tc>
+          <w:tcPr>
+            <w:tcW w:type="dxa" w:w="2600"/>
+            <w:tcBorders>
+              <w:top w:val="single" w:color="BFBFBF" w:sz="4"/>
+              <w:left w:val="single" w:color="BFBFBF" w:sz="4"/>
+              <w:bottom w:val="single" w:color="BFBFBF" w:sz="4"/>
+              <w:right w:val="single" w:color="BFBFBF" w:sz="4"/>
+            </w:tcBorders>
+            <w:tcMar>
+              <w:top w:type="dxa" w:w="60"/>
+              <w:left w:type="dxa" w:w="100"/>
+              <w:bottom w:type="dxa" w:w="60"/>
+              <w:right w:type="dxa" w:w="100"/>
+            </w:tcMar>
+          </w:tcPr>
+          <w:p>
+            <w:r>
+              <w:rPr>
+                <w:b w:val="false"/>
+                <w:bCs w:val="false"/>
+                <w:sz w:val="19"/>
+                <w:szCs w:val="19"/>
+              </w:rPr>
+              <w:t xml:space="preserve">Partial failure keeps what succeeded</w:t>
+            </w:r>
+          </w:p>
+        </w:tc>
+        <w:tc>
+          <w:tcPr>
+            <w:tcW w:type="dxa" w:w="3400"/>
+            <w:tcBorders>
+              <w:top w:val="single" w:color="BFBFBF" w:sz="4"/>
+              <w:left w:val="single" w:color="BFBFBF" w:sz="4"/>
+              <w:bottom w:val="single" w:color="BFBFBF" w:sz="4"/>
+              <w:right w:val="single" w:color="BFBFBF" w:sz="4"/>
+            </w:tcBorders>
+            <w:tcMar>
+              <w:top w:type="dxa" w:w="60"/>
+              <w:left w:type="dxa" w:w="100"/>
+              <w:bottom w:type="dxa" w:w="60"/>
+              <w:right w:type="dxa" w:w="100"/>
+            </w:tcMar>
+          </w:tcPr>
+          <w:p>
+            <w:r>
+              <w:rPr>
+                <w:b w:val="false"/>
+                <w:bCs w:val="false"/>
+                <w:sz w:val="19"/>
+                <w:szCs w:val="19"/>
+              </w:rPr>
+              <w:t xml:space="preserve">Results from locations whose Apify run succeeded are paid for.</w:t>
+            </w:r>
+          </w:p>
+        </w:tc>
+        <w:tc>
+          <w:tcPr>
+            <w:tcW w:type="dxa" w:w="3026"/>
+            <w:tcBorders>
+              <w:top w:val="single" w:color="BFBFBF" w:sz="4"/>
+              <w:left w:val="single" w:color="BFBFBF" w:sz="4"/>
+              <w:bottom w:val="single" w:color="BFBFBF" w:sz="4"/>
+              <w:right w:val="single" w:color="BFBFBF" w:sz="4"/>
+            </w:tcBorders>
+            <w:tcMar>
+              <w:top w:type="dxa" w:w="60"/>
+              <w:left w:type="dxa" w:w="100"/>
+              <w:bottom w:type="dxa" w:w="60"/>
+              <w:right w:type="dxa" w:w="100"/>
+            </w:tcMar>
+          </w:tcPr>
+          <w:p>
+            <w:r>
+              <w:rPr>
+                <w:b w:val="false"/>
+                <w:bCs w:val="false"/>
+                <w:sz w:val="19"/>
+                <w:szCs w:val="19"/>
+              </w:rPr>
+              <w:t xml:space="preserve">The Run is done, with the failed runs listed in its error field.</w:t>
+            </w:r>
+          </w:p>
+        </w:tc>
+      </w:tr>
+      <w:tr>
+        <w:tc>
+          <w:tcPr>
+            <w:tcW w:type="dxa" w:w="2600"/>
+            <w:tcBorders>
+              <w:top w:val="single" w:color="BFBFBF" w:sz="4"/>
+              <w:left w:val="single" w:color="BFBFBF" w:sz="4"/>
+              <w:bottom w:val="single" w:color="BFBFBF" w:sz="4"/>
+              <w:right w:val="single" w:color="BFBFBF" w:sz="4"/>
+            </w:tcBorders>
+            <w:tcMar>
+              <w:top w:type="dxa" w:w="60"/>
+              <w:left w:type="dxa" w:w="100"/>
+              <w:bottom w:type="dxa" w:w="60"/>
+              <w:right w:type="dxa" w:w="100"/>
+            </w:tcMar>
+          </w:tcPr>
+          <w:p>
+            <w:r>
+              <w:rPr>
+                <w:b w:val="false"/>
+                <w:bCs w:val="false"/>
+                <w:sz w:val="19"/>
+                <w:szCs w:val="19"/>
+              </w:rPr>
+              <w:t xml:space="preserve">Explore creates its wave when the search starts; failed waves are kept and marked failed</w:t>
+            </w:r>
+          </w:p>
+        </w:tc>
+        <w:tc>
+          <w:tcPr>
+            <w:tcW w:type="dxa" w:w="3400"/>
+            <w:tcBorders>
+              <w:top w:val="single" w:color="BFBFBF" w:sz="4"/>
+              <w:left w:val="single" w:color="BFBFBF" w:sz="4"/>
+              <w:bottom w:val="single" w:color="BFBFBF" w:sz="4"/>
+              <w:right w:val="single" w:color="BFBFBF" w:sz="4"/>
+            </w:tcBorders>
+            <w:tcMar>
+              <w:top w:type="dxa" w:w="60"/>
+              <w:left w:type="dxa" w:w="100"/>
+              <w:bottom w:type="dxa" w:w="60"/>
+              <w:right w:type="dxa" w:w="100"/>
+            </w:tcMar>
+          </w:tcPr>
+          <w:p>
+            <w:r>
+              <w:rPr>
+                <w:b w:val="false"/>
+                <w:bCs w:val="false"/>
+                <w:sz w:val="19"/>
+                <w:szCs w:val="19"/>
+              </w:rPr>
+              <w:t xml:space="preserve">The holding bay can show a search in progress, and a failure stays visible instead of vanishing.</w:t>
+            </w:r>
+          </w:p>
+        </w:tc>
+        <w:tc>
+          <w:tcPr>
+            <w:tcW w:type="dxa" w:w="3026"/>
+            <w:tcBorders>
+              <w:top w:val="single" w:color="BFBFBF" w:sz="4"/>
+              <w:left w:val="single" w:color="BFBFBF" w:sz="4"/>
+              <w:bottom w:val="single" w:color="BFBFBF" w:sz="4"/>
+              <w:right w:val="single" w:color="BFBFBF" w:sz="4"/>
+            </w:tcBorders>
+            <w:tcMar>
+              <w:top w:type="dxa" w:w="60"/>
+              <w:left w:type="dxa" w:w="100"/>
+              <w:bottom w:type="dxa" w:w="60"/>
+              <w:right w:type="dxa" w:w="100"/>
+            </w:tcMar>
+          </w:tcPr>
+          <w:p>
+            <w:r>
+              <w:rPr>
+                <w:b w:val="false"/>
+                <w:bCs w:val="false"/>
+                <w:sz w:val="19"/>
+                <w:szCs w:val="19"/>
+              </w:rPr>
+              <w:t xml:space="preserve">Waves saved before this change have no linked Run and are treated as done.</w:t>
+            </w:r>
+          </w:p>
+        </w:tc>
+      </w:tr>
+      <w:tr>
+        <w:tc>
+          <w:tcPr>
+            <w:tcW w:type="dxa" w:w="2600"/>
+            <w:tcBorders>
+              <w:top w:val="single" w:color="BFBFBF" w:sz="4"/>
+              <w:left w:val="single" w:color="BFBFBF" w:sz="4"/>
+              <w:bottom w:val="single" w:color="BFBFBF" w:sz="4"/>
+              <w:right w:val="single" w:color="BFBFBF" w:sz="4"/>
+            </w:tcBorders>
+            <w:tcMar>
+              <w:top w:type="dxa" w:w="60"/>
+              <w:left w:type="dxa" w:w="100"/>
+              <w:bottom w:type="dxa" w:w="60"/>
+              <w:right w:type="dxa" w:w="100"/>
+            </w:tcMar>
+          </w:tcPr>
+          <w:p>
+            <w:r>
+              <w:rPr>
+                <w:b w:val="false"/>
+                <w:bCs w:val="false"/>
+                <w:sz w:val="19"/>
+                <w:szCs w:val="19"/>
+              </w:rPr>
+              <w:t xml:space="preserve">Auto-Rank runs in after() from the status route</w:t>
+            </w:r>
+          </w:p>
+        </w:tc>
+        <w:tc>
+          <w:tcPr>
+            <w:tcW w:type="dxa" w:w="3400"/>
+            <w:tcBorders>
+              <w:top w:val="single" w:color="BFBFBF" w:sz="4"/>
+              <w:left w:val="single" w:color="BFBFBF" w:sz="4"/>
+              <w:bottom w:val="single" w:color="BFBFBF" w:sz="4"/>
+              <w:right w:val="single" w:color="BFBFBF" w:sz="4"/>
+            </w:tcBorders>
+            <w:tcMar>
+              <w:top w:type="dxa" w:w="60"/>
+              <w:left w:type="dxa" w:w="100"/>
+              <w:bottom w:type="dxa" w:w="60"/>
+              <w:right w:type="dxa" w:w="100"/>
+            </w:tcMar>
+          </w:tcPr>
+          <w:p>
+            <w:r>
+              <w:rPr>
+                <w:b w:val="false"/>
+                <w:bCs w:val="false"/>
+                <w:sz w:val="19"/>
+                <w:szCs w:val="19"/>
+              </w:rPr>
+              <w:t xml:space="preserve">Ranking must not hold the status request open either.</w:t>
+            </w:r>
+          </w:p>
+        </w:tc>
+        <w:tc>
+          <w:tcPr>
+            <w:tcW w:type="dxa" w:w="3026"/>
+            <w:tcBorders>
+              <w:top w:val="single" w:color="BFBFBF" w:sz="4"/>
+              <w:left w:val="single" w:color="BFBFBF" w:sz="4"/>
+              <w:bottom w:val="single" w:color="BFBFBF" w:sz="4"/>
+              <w:right w:val="single" w:color="BFBFBF" w:sz="4"/>
+            </w:tcBorders>
+            <w:tcMar>
+              <w:top w:type="dxa" w:w="60"/>
+              <w:left w:type="dxa" w:w="100"/>
+              <w:bottom w:type="dxa" w:w="60"/>
+              <w:right w:type="dxa" w:w="100"/>
+            </w:tcMar>
+          </w:tcPr>
+          <w:p>
+            <w:r>
+              <w:rPr>
+                <w:b w:val="false"/>
+                <w:bCs w:val="false"/>
+                <w:sz w:val="19"/>
+                <w:szCs w:val="19"/>
+              </w:rPr>
+              <w:t xml:space="preserve">The status response says autoRank: started; the rank writes its own Run.</w:t>
+            </w:r>
+          </w:p>
+        </w:tc>
+      </w:tr>
+    </w:tbl>
+    <w:p>
+      <w:pPr>
+        <w:spacing w:after="120"/>
+      </w:pPr>
+    </w:p>
+    <w:p>
+      <w:pPr>
+        <w:pStyle w:val="Heading2"/>
+      </w:pPr>
+      <w:r>
+        <w:t xml:space="preserve">Problems found</w:t>
+      </w:r>
+    </w:p>
+    <w:tbl>
+      <w:tblPr>
+        <w:tblW w:type="dxa" w:w="9026"/>
+        <w:tblBorders>
+          <w:top w:val="single" w:color="auto" w:sz="4"/>
+          <w:left w:val="single" w:color="auto" w:sz="4"/>
+          <w:bottom w:val="single" w:color="auto" w:sz="4"/>
+          <w:right w:val="single" w:color="auto" w:sz="4"/>
+          <w:insideH w:val="single" w:color="auto" w:sz="4"/>
+          <w:insideV w:val="single" w:color="auto" w:sz="4"/>
+        </w:tblBorders>
+      </w:tblPr>
+      <w:tblGrid>
+        <w:gridCol w:w="2800"/>
+        <w:gridCol w:w="3300"/>
+        <w:gridCol w:w="2926"/>
+      </w:tblGrid>
+      <w:tr>
+        <w:trPr>
+          <w:tblHeader/>
+        </w:trPr>
+        <w:tc>
+          <w:tcPr>
+            <w:tcW w:type="dxa" w:w="2800"/>
+            <w:tcBorders>
+              <w:top w:val="single" w:color="BFBFBF" w:sz="4"/>
+              <w:left w:val="single" w:color="BFBFBF" w:sz="4"/>
+              <w:bottom w:val="single" w:color="BFBFBF" w:sz="4"/>
+              <w:right w:val="single" w:color="BFBFBF" w:sz="4"/>
+            </w:tcBorders>
+            <w:shd w:fill="EDEDED" w:color="auto" w:val="clear"/>
+            <w:tcMar>
+              <w:top w:type="dxa" w:w="60"/>
+              <w:left w:type="dxa" w:w="100"/>
+              <w:bottom w:type="dxa" w:w="60"/>
+              <w:right w:type="dxa" w:w="100"/>
+            </w:tcMar>
+          </w:tcPr>
+          <w:p>
+            <w:r>
+              <w:rPr>
+                <w:b/>
+                <w:bCs/>
+                <w:sz w:val="19"/>
+                <w:szCs w:val="19"/>
+              </w:rPr>
+              <w:t xml:space="preserve">Symptom</w:t>
+            </w:r>
+          </w:p>
+        </w:tc>
+        <w:tc>
+          <w:tcPr>
+            <w:tcW w:type="dxa" w:w="3300"/>
+            <w:tcBorders>
+              <w:top w:val="single" w:color="BFBFBF" w:sz="4"/>
+              <w:left w:val="single" w:color="BFBFBF" w:sz="4"/>
+              <w:bottom w:val="single" w:color="BFBFBF" w:sz="4"/>
+              <w:right w:val="single" w:color="BFBFBF" w:sz="4"/>
+            </w:tcBorders>
+            <w:shd w:fill="EDEDED" w:color="auto" w:val="clear"/>
+            <w:tcMar>
+              <w:top w:type="dxa" w:w="60"/>
+              <w:left w:type="dxa" w:w="100"/>
+              <w:bottom w:type="dxa" w:w="60"/>
+              <w:right w:type="dxa" w:w="100"/>
+            </w:tcMar>
+          </w:tcPr>
+          <w:p>
+            <w:r>
+              <w:rPr>
+                <w:b/>
+                <w:bCs/>
+                <w:sz w:val="19"/>
+                <w:szCs w:val="19"/>
+              </w:rPr>
+              <w:t xml:space="preserve">Cause</w:t>
+            </w:r>
+          </w:p>
+        </w:tc>
+        <w:tc>
+          <w:tcPr>
+            <w:tcW w:type="dxa" w:w="2926"/>
+            <w:tcBorders>
+              <w:top w:val="single" w:color="BFBFBF" w:sz="4"/>
+              <w:left w:val="single" w:color="BFBFBF" w:sz="4"/>
+              <w:bottom w:val="single" w:color="BFBFBF" w:sz="4"/>
+              <w:right w:val="single" w:color="BFBFBF" w:sz="4"/>
+            </w:tcBorders>
+            <w:shd w:fill="EDEDED" w:color="auto" w:val="clear"/>
+            <w:tcMar>
+              <w:top w:type="dxa" w:w="60"/>
+              <w:left w:type="dxa" w:w="100"/>
+              <w:bottom w:type="dxa" w:w="60"/>
+              <w:right w:type="dxa" w:w="100"/>
+            </w:tcMar>
+          </w:tcPr>
+          <w:p>
+            <w:r>
+              <w:rPr>
+                <w:b/>
+                <w:bCs/>
+                <w:sz w:val="19"/>
+                <w:szCs w:val="19"/>
+              </w:rPr>
+              <w:t xml:space="preserve">Resolution</w:t>
+            </w:r>
+          </w:p>
+        </w:tc>
+      </w:tr>
+      <w:tr>
+        <w:tc>
+          <w:tcPr>
+            <w:tcW w:type="dxa" w:w="2800"/>
+            <w:tcBorders>
+              <w:top w:val="single" w:color="BFBFBF" w:sz="4"/>
+              <w:left w:val="single" w:color="BFBFBF" w:sz="4"/>
+              <w:bottom w:val="single" w:color="BFBFBF" w:sz="4"/>
+              <w:right w:val="single" w:color="BFBFBF" w:sz="4"/>
+            </w:tcBorders>
+            <w:tcMar>
+              <w:top w:type="dxa" w:w="60"/>
+              <w:left w:type="dxa" w:w="100"/>
+              <w:bottom w:type="dxa" w:w="60"/>
+              <w:right w:type="dxa" w:w="100"/>
+            </w:tcMar>
+          </w:tcPr>
+          <w:p>
+            <w:r>
+              <w:rPr>
+                <w:b w:val="false"/>
+                <w:bCs w:val="false"/>
+                <w:sz w:val="19"/>
+                <w:szCs w:val="19"/>
+              </w:rPr>
+              <w:t xml:space="preserve">Railway deploy crashed: Cannot find module '/app/index.js'.</w:t>
+            </w:r>
+          </w:p>
+        </w:tc>
+        <w:tc>
+          <w:tcPr>
+            <w:tcW w:type="dxa" w:w="3300"/>
+            <w:tcBorders>
+              <w:top w:val="single" w:color="BFBFBF" w:sz="4"/>
+              <w:left w:val="single" w:color="BFBFBF" w:sz="4"/>
+              <w:bottom w:val="single" w:color="BFBFBF" w:sz="4"/>
+              <w:right w:val="single" w:color="BFBFBF" w:sz="4"/>
+            </w:tcBorders>
+            <w:tcMar>
+              <w:top w:type="dxa" w:w="60"/>
+              <w:left w:type="dxa" w:w="100"/>
+              <w:bottom w:type="dxa" w:w="60"/>
+              <w:right w:type="dxa" w:w="100"/>
+            </w:tcMar>
+          </w:tcPr>
+          <w:p>
+            <w:r>
+              <w:rPr>
+                <w:b w:val="false"/>
+                <w:bCs w:val="false"/>
+                <w:sz w:val="19"/>
+                <w:szCs w:val="19"/>
+              </w:rPr>
+              <w:t xml:space="preserve">Railway builds the repo root. The root package.json only existed for the Prisma CLI: no start script and main set to index.js, so Railway ran node index.js.</w:t>
+            </w:r>
+          </w:p>
+        </w:tc>
+        <w:tc>
+          <w:tcPr>
+            <w:tcW w:type="dxa" w:w="2926"/>
+            <w:tcBorders>
+              <w:top w:val="single" w:color="BFBFBF" w:sz="4"/>
+              <w:left w:val="single" w:color="BFBFBF" w:sz="4"/>
+              <w:bottom w:val="single" w:color="BFBFBF" w:sz="4"/>
+              <w:right w:val="single" w:color="BFBFBF" w:sz="4"/>
+            </w:tcBorders>
+            <w:tcMar>
+              <w:top w:type="dxa" w:w="60"/>
+              <w:left w:type="dxa" w:w="100"/>
+              <w:bottom w:type="dxa" w:w="60"/>
+              <w:right w:type="dxa" w:w="100"/>
+            </w:tcMar>
+          </w:tcPr>
+          <w:p>
+            <w:r>
+              <w:rPr>
+                <w:b w:val="false"/>
+                <w:bCs w:val="false"/>
+                <w:sz w:val="19"/>
+                <w:szCs w:val="19"/>
+              </w:rPr>
+              <w:t xml:space="preserve">Root build and start scripts that delegate to web/ (140be22). Tested from a clean clone with NODE_ENV=production: npm ci, npm run build, npm start on a custom PORT.</w:t>
+            </w:r>
+          </w:p>
+        </w:tc>
+      </w:tr>
+      <w:tr>
+        <w:tc>
+          <w:tcPr>
+            <w:tcW w:type="dxa" w:w="2800"/>
+            <w:tcBorders>
+              <w:top w:val="single" w:color="BFBFBF" w:sz="4"/>
+              <w:left w:val="single" w:color="BFBFBF" w:sz="4"/>
+              <w:bottom w:val="single" w:color="BFBFBF" w:sz="4"/>
+              <w:right w:val="single" w:color="BFBFBF" w:sz="4"/>
+            </w:tcBorders>
+            <w:tcMar>
+              <w:top w:type="dxa" w:w="60"/>
+              <w:left w:type="dxa" w:w="100"/>
+              <w:bottom w:type="dxa" w:w="60"/>
+              <w:right w:type="dxa" w:w="100"/>
+            </w:tcMar>
+          </w:tcPr>
+          <w:p>
+            <w:r>
+              <w:rPr>
+                <w:b w:val="false"/>
+                <w:bCs w:val="false"/>
+                <w:sz w:val="19"/>
+                <w:szCs w:val="19"/>
+              </w:rPr>
+              <w:t xml:space="preserve">Searches timed out on Railway (reported by the user).</w:t>
+            </w:r>
+          </w:p>
+        </w:tc>
+        <w:tc>
+          <w:tcPr>
+            <w:tcW w:type="dxa" w:w="3300"/>
+            <w:tcBorders>
+              <w:top w:val="single" w:color="BFBFBF" w:sz="4"/>
+              <w:left w:val="single" w:color="BFBFBF" w:sz="4"/>
+              <w:bottom w:val="single" w:color="BFBFBF" w:sz="4"/>
+              <w:right w:val="single" w:color="BFBFBF" w:sz="4"/>
+            </w:tcBorders>
+            <w:tcMar>
+              <w:top w:type="dxa" w:w="60"/>
+              <w:left w:type="dxa" w:w="100"/>
+              <w:bottom w:type="dxa" w:w="60"/>
+              <w:right w:type="dxa" w:w="100"/>
+            </w:tcMar>
+          </w:tcPr>
+          <w:p>
+            <w:r>
+              <w:rPr>
+                <w:b w:val="false"/>
+                <w:bCs w:val="false"/>
+                <w:sz w:val="19"/>
+                <w:szCs w:val="19"/>
+              </w:rPr>
+              <w:t xml:space="preserve">The search route waited for the whole Apify sweep inside the request.</w:t>
+            </w:r>
+          </w:p>
+        </w:tc>
+        <w:tc>
+          <w:tcPr>
+            <w:tcW w:type="dxa" w:w="2926"/>
+            <w:tcBorders>
+              <w:top w:val="single" w:color="BFBFBF" w:sz="4"/>
+              <w:left w:val="single" w:color="BFBFBF" w:sz="4"/>
+              <w:bottom w:val="single" w:color="BFBFBF" w:sz="4"/>
+              <w:right w:val="single" w:color="BFBFBF" w:sz="4"/>
+            </w:tcBorders>
+            <w:tcMar>
+              <w:top w:type="dxa" w:w="60"/>
+              <w:left w:type="dxa" w:w="100"/>
+              <w:bottom w:type="dxa" w:w="60"/>
+              <w:right w:type="dxa" w:w="100"/>
+            </w:tcMar>
+          </w:tcPr>
+          <w:p>
+            <w:r>
+              <w:rPr>
+                <w:b w:val="false"/>
+                <w:bCs w:val="false"/>
+                <w:sz w:val="19"/>
+                <w:szCs w:val="19"/>
+              </w:rPr>
+              <w:t xml:space="preserve">Asynchronous searches (034cc7d).</w:t>
+            </w:r>
+          </w:p>
+        </w:tc>
+      </w:tr>
+    </w:tbl>
+    <w:p>
+      <w:pPr>
+        <w:spacing w:after="120"/>
+      </w:pPr>
+    </w:p>
+    <w:p>
+      <w:pPr>
+        <w:pStyle w:val="Heading2"/>
+      </w:pPr>
+      <w:r>
+        <w:t xml:space="preserve">Verification</w:t>
+      </w:r>
+    </w:p>
+    <w:p>
+      <w:pPr>
+        <w:pStyle w:val="ListParagraph"/>
+        <w:numPr>
+          <w:ilvl w:val="0"/>
+          <w:numId w:val="2"/>
+        </w:numPr>
+        <w:spacing w:after="60"/>
+      </w:pPr>
+      <w:r>
+        <w:t xml:space="preserve">tsc, eslint and next build clean.</w:t>
+      </w:r>
+    </w:p>
+    <w:p>
+      <w:pPr>
+        <w:pStyle w:val="ListParagraph"/>
+        <w:numPr>
+          <w:ilvl w:val="0"/>
+          <w:numId w:val="2"/>
+        </w:numPr>
+        <w:spacing w:after="60"/>
+      </w:pPr>
+      <w:r>
+        <w:t xml:space="preserve">API: POST /api/explore returned the run and wave ids immediately; the status route reported 'Scanned 202/500 career sites, 2 matching jobs so far' while Apify ran.</w:t>
+      </w:r>
+    </w:p>
+    <w:p>
+      <w:pPr>
+        <w:pStyle w:val="ListParagraph"/>
+        <w:numPr>
+          <w:ilvl w:val="0"/>
+          <w:numId w:val="2"/>
+        </w:numPr>
+        <w:spacing w:after="60"/>
+      </w:pPr>
+      <w:r>
+        <w:t xml:space="preserve">Concurrency: after Apify finished, 5 simultaneous status calls produced exactly one ingest (1 returned done with 3 jobs, 4 returned ingesting); the wave's jobCount (3) matched its stored rows (3).</w:t>
+      </w:r>
+    </w:p>
+    <w:p>
+      <w:pPr>
+        <w:pStyle w:val="ListParagraph"/>
+        <w:numPr>
+          <w:ilvl w:val="0"/>
+          <w:numId w:val="2"/>
+        </w:numPr>
+        <w:spacing w:after="60"/>
+      </w:pPr>
+      <w:r>
+        <w:t xml:space="preserve">Browser: Search New on b2b-content showed progress within seconds and locked both buttons; a reload mid-search resumed at 'Scanned 69/500'; it finished with 'Found 3, 0 new, 0 you have already applied to' and refreshed the list. An Explore search opened its wave at once, showed 'searching...' in the holding bay, and filled in 3 jobs when done. No console errors.</w:t>
+      </w:r>
+    </w:p>
+    <w:p>
+      <w:pPr>
+        <w:pStyle w:val="ListParagraph"/>
+        <w:numPr>
+          <w:ilvl w:val="0"/>
+          <w:numId w:val="2"/>
+        </w:numPr>
+        <w:spacing w:after="60"/>
+      </w:pPr>
+      <w:r>
+        <w:t xml:space="preserve">Test cost: 3 Apify runs. The deployed Railway app itself was not checked here.</w:t>
+      </w:r>
+    </w:p>
+    <w:p>
+      <w:pPr>
+        <w:pStyle w:val="Heading2"/>
+      </w:pPr>
+      <w:r>
+        <w:t xml:space="preserve">Known risks left behind</w:t>
+      </w:r>
+    </w:p>
+    <w:p>
+      <w:pPr>
+        <w:pStyle w:val="ListParagraph"/>
+        <w:numPr>
+          <w:ilvl w:val="0"/>
+          <w:numId w:val="2"/>
+        </w:numPr>
+        <w:spacing w:after="60"/>
+      </w:pPr>
+      <w:r>
+        <w:t xml:space="preserve">A Run can stay in ingesting forever if the server dies mid-ingest; nothing resets it. Fix by hand: set its status back to running and poll again.</w:t>
+      </w:r>
+    </w:p>
+    <w:p>
+      <w:pPr>
+        <w:pStyle w:val="ListParagraph"/>
+        <w:numPr>
+          <w:ilvl w:val="0"/>
+          <w:numId w:val="2"/>
+        </w:numPr>
+        <w:spacing w:after="60"/>
+      </w:pPr>
+      <w:r>
+        <w:t xml:space="preserve">Results are only saved when someone polls. Apify deletes unnamed run datasets after its retention period, so a search nobody looks at for long enough is lost. The Auto-Populate scheduler must poll the status route.</w:t>
+      </w:r>
+    </w:p>
+    <w:p>
+      <w:pPr>
+        <w:pStyle w:val="ListParagraph"/>
+        <w:numPr>
+          <w:ilvl w:val="0"/>
+          <w:numId w:val="2"/>
+        </w:numPr>
+        <w:spacing w:after="60"/>
+      </w:pPr>
+      <w:r>
+        <w:t xml:space="preserve">Manual Rank still grades inside its request (5 at a time). Ranking hundreds of jobs could hit Railway's request timeout.</w:t>
+      </w:r>
+    </w:p>
+    <w:p>
+      <w:pPr>
+        <w:pStyle w:val="Heading2"/>
+      </w:pPr>
+      <w:r>
+        <w:t xml:space="preserve">Production data changes</w:t>
+      </w:r>
+    </w:p>
+    <w:p>
+      <w:pPr>
+        <w:pStyle w:val="ListParagraph"/>
+        <w:numPr>
+          <w:ilvl w:val="0"/>
+          <w:numId w:val="2"/>
+        </w:numPr>
+        <w:spacing w:after="60"/>
+      </w:pPr>
+      <w:r>
+        <w:t xml:space="preserve">Applied migration 20260924140000_async_search_runs (additive).</w:t>
+      </w:r>
+    </w:p>
+    <w:p>
+      <w:pPr>
+        <w:pStyle w:val="ListParagraph"/>
+        <w:numPr>
+          <w:ilvl w:val="0"/>
+          <w:numId w:val="2"/>
+        </w:numPr>
+        <w:spacing w:after="60"/>
+      </w:pPr>
+      <w:r>
+        <w:t xml:space="preserve">Kept: Explore waves 'content strategist' (3 jobs) and 'content marketing' (3 jobs), a b2b-content search (3 found, 0 new, lastSeenAt bumped on 3 jobs), and their 3 Run rows.</w:t>
       </w:r>
     </w:p>
     <w:sectPr>

</xml_diff>

<commit_message>
Post-mortem: server-side sweep cron
Co-Authored-By: Claude Opus 5.5 <noreply@anthropic.com>
</commit_message>
<xml_diff>
--- a/docs/KAMUI-postmortem.docx
+++ b/docs/KAMUI-postmortem.docx
@@ -21,7 +21,7 @@
         <w:rPr>
           <w:color w:val="666666"/>
         </w:rPr>
-        <w:t xml:space="preserve">Last updated 2026-09-24, after the async search change.</w:t>
+        <w:t xml:space="preserve">Last updated 2026-09-24, after the sweep cron.</w:t>
       </w:r>
     </w:p>
     <w:p>
@@ -84,7 +84,7 @@
         <w:pStyle w:val="Heading1"/>
       </w:pPr>
       <w:r>
-        <w:t xml:space="preserve">The system after the async search change</w:t>
+        <w:t xml:space="preserve">The system after the sweep cron</w:t>
       </w:r>
     </w:p>
     <w:p>
@@ -175,7 +175,7 @@
         <w:spacing w:after="60"/>
       </w:pPr>
       <w:r>
-        <w:t xml:space="preserve">Searches are asynchronous: the search and explore routes start Apify and return a Run id; GET /api/runs/&lt;id&gt; reports progress and ingests the jobs once Apify finishes. The UI polls it.</w:t>
+        <w:t xml:space="preserve">Searches are asynchronous: the search and explore routes start Apify and return a Run id; GET /api/runs/&lt;id&gt; reports progress and ingests the jobs once Apify finishes. The UI polls it for progress; a Railway cron service calls POST /api/runs/sweep every 5 minutes so results are saved even when nobody is watching.</w:t>
       </w:r>
     </w:p>
     <w:p>
@@ -1027,7 +1027,7 @@
                 <w:sz w:val="19"/>
                 <w:szCs w:val="19"/>
               </w:rPr>
-              <w:t xml:space="preserve">Ingest only happens when GET /api/runs/&lt;id&gt; is called. Open the Battlefield or wave page, or call the route.</w:t>
+              <w:t xml:space="preserve">Check the sweep cron service's logs on Railway. Until the next sweep, opening the Battlefield or wave page (which polls GET /api/runs/&lt;id&gt;) also ingests it.</w:t>
             </w:r>
           </w:p>
         </w:tc>
@@ -1057,6 +1057,122 @@
                 <w:sz w:val="19"/>
                 <w:szCs w:val="19"/>
               </w:rPr>
+              <w:t xml:space="preserve">The sweep cron logs sweep 401</w:t>
+            </w:r>
+          </w:p>
+        </w:tc>
+        <w:tc>
+          <w:tcPr>
+            <w:tcW w:type="dxa" w:w="5826"/>
+            <w:tcBorders>
+              <w:top w:val="single" w:color="BFBFBF" w:sz="4"/>
+              <w:left w:val="single" w:color="BFBFBF" w:sz="4"/>
+              <w:bottom w:val="single" w:color="BFBFBF" w:sz="4"/>
+              <w:right w:val="single" w:color="BFBFBF" w:sz="4"/>
+            </w:tcBorders>
+            <w:tcMar>
+              <w:top w:type="dxa" w:w="60"/>
+              <w:left w:type="dxa" w:w="100"/>
+              <w:bottom w:type="dxa" w:w="60"/>
+              <w:right w:type="dxa" w:w="100"/>
+            </w:tcMar>
+          </w:tcPr>
+          <w:p>
+            <w:r>
+              <w:rPr>
+                <w:b w:val="false"/>
+                <w:bCs w:val="false"/>
+                <w:sz w:val="19"/>
+                <w:szCs w:val="19"/>
+              </w:rPr>
+              <w:t xml:space="preserve">CRON_SECRET differs between the web service and the cron service, or the header lacks the Bearer prefix.</w:t>
+            </w:r>
+          </w:p>
+        </w:tc>
+      </w:tr>
+      <w:tr>
+        <w:tc>
+          <w:tcPr>
+            <w:tcW w:type="dxa" w:w="3200"/>
+            <w:tcBorders>
+              <w:top w:val="single" w:color="BFBFBF" w:sz="4"/>
+              <w:left w:val="single" w:color="BFBFBF" w:sz="4"/>
+              <w:bottom w:val="single" w:color="BFBFBF" w:sz="4"/>
+              <w:right w:val="single" w:color="BFBFBF" w:sz="4"/>
+            </w:tcBorders>
+            <w:tcMar>
+              <w:top w:type="dxa" w:w="60"/>
+              <w:left w:type="dxa" w:w="100"/>
+              <w:bottom w:type="dxa" w:w="60"/>
+              <w:right w:type="dxa" w:w="100"/>
+            </w:tcMar>
+          </w:tcPr>
+          <w:p>
+            <w:r>
+              <w:rPr>
+                <w:b w:val="false"/>
+                <w:bCs w:val="false"/>
+                <w:sz w:val="19"/>
+                <w:szCs w:val="19"/>
+              </w:rPr>
+              <w:t xml:space="preserve">The web service stops serving and runs every 5 minutes instead</w:t>
+            </w:r>
+          </w:p>
+        </w:tc>
+        <w:tc>
+          <w:tcPr>
+            <w:tcW w:type="dxa" w:w="5826"/>
+            <w:tcBorders>
+              <w:top w:val="single" w:color="BFBFBF" w:sz="4"/>
+              <w:left w:val="single" w:color="BFBFBF" w:sz="4"/>
+              <w:bottom w:val="single" w:color="BFBFBF" w:sz="4"/>
+              <w:right w:val="single" w:color="BFBFBF" w:sz="4"/>
+            </w:tcBorders>
+            <w:tcMar>
+              <w:top w:type="dxa" w:w="60"/>
+              <w:left w:type="dxa" w:w="100"/>
+              <w:bottom w:type="dxa" w:w="60"/>
+              <w:right w:type="dxa" w:w="100"/>
+            </w:tcMar>
+          </w:tcPr>
+          <w:p>
+            <w:r>
+              <w:rPr>
+                <w:b w:val="false"/>
+                <w:bCs w:val="false"/>
+                <w:sz w:val="19"/>
+                <w:szCs w:val="19"/>
+              </w:rPr>
+              <w:t xml:space="preserve">It picked up a cron config: a railway.json at the repo root, or its config file path set to railway/sweep-cron.json. Only the cron service should use that file.</w:t>
+            </w:r>
+          </w:p>
+        </w:tc>
+      </w:tr>
+      <w:tr>
+        <w:tc>
+          <w:tcPr>
+            <w:tcW w:type="dxa" w:w="3200"/>
+            <w:tcBorders>
+              <w:top w:val="single" w:color="BFBFBF" w:sz="4"/>
+              <w:left w:val="single" w:color="BFBFBF" w:sz="4"/>
+              <w:bottom w:val="single" w:color="BFBFBF" w:sz="4"/>
+              <w:right w:val="single" w:color="BFBFBF" w:sz="4"/>
+            </w:tcBorders>
+            <w:tcMar>
+              <w:top w:type="dxa" w:w="60"/>
+              <w:left w:type="dxa" w:w="100"/>
+              <w:bottom w:type="dxa" w:w="60"/>
+              <w:right w:type="dxa" w:w="100"/>
+            </w:tcMar>
+          </w:tcPr>
+          <w:p>
+            <w:r>
+              <w:rPr>
+                <w:b w:val="false"/>
+                <w:bCs w:val="false"/>
+                <w:sz w:val="19"/>
+                <w:szCs w:val="19"/>
+              </w:rPr>
               <w:t xml:space="preserve">Port 3000 already in use</w:t>
             </w:r>
           </w:p>
@@ -1174,7 +1290,20 @@
         <w:spacing w:after="60"/>
       </w:pPr>
       <w:r>
-        <w:t xml:space="preserve">Nothing resets a Run stuck in ingesting, and results nobody polls for eventually expire on Apify.</w:t>
+        <w:t xml:space="preserve">Nothing resets a Run stuck in ingesting.</w:t>
+      </w:r>
+    </w:p>
+    <w:p>
+      <w:pPr>
+        <w:pStyle w:val="ListParagraph"/>
+        <w:numPr>
+          <w:ilvl w:val="0"/>
+          <w:numId w:val="2"/>
+        </w:numPr>
+        <w:spacing w:after="60"/>
+      </w:pPr>
+      <w:r>
+        <w:t xml:space="preserve">The Railway sweep cron service has to be created by hand (see CLAUDE.md) and has not been verified on Railway.</w:t>
       </w:r>
     </w:p>
     <w:p>
@@ -7795,6 +7924,904 @@
       </w:pPr>
       <w:r>
         <w:t xml:space="preserve">Kept: Explore waves 'content strategist' (3 jobs) and 'content marketing' (3 jobs), a b2b-content search (3 found, 0 new, lastSeenAt bumped on 3 jobs), and their 3 Run rows.</w:t>
+      </w:r>
+    </w:p>
+    <w:p>
+      <w:pPr>
+        <w:pStyle w:val="Heading1"/>
+      </w:pPr>
+      <w:r>
+        <w:t xml:space="preserve">After Phase 4: server-side sweep cron</w:t>
+      </w:r>
+    </w:p>
+    <w:p>
+      <w:pPr>
+        <w:spacing w:after="120"/>
+        <w:rPr>
+          <w:color w:val="666666"/>
+          <w:sz w:val="20"/>
+          <w:szCs w:val="20"/>
+        </w:rPr>
+      </w:pPr>
+      <w:r>
+        <w:rPr>
+          <w:color w:val="666666"/>
+          <w:sz w:val="20"/>
+          <w:szCs w:val="20"/>
+        </w:rPr>
+        <w:t xml:space="preserve">2026-09-24  ·  commit c804fa4</w:t>
+      </w:r>
+    </w:p>
+    <w:p>
+      <w:pPr>
+        <w:spacing w:after="120"/>
+      </w:pPr>
+      <w:r>
+        <w:t xml:space="preserve">Search results were saved only when a browser polled the status route, so a search nobody watched never got its jobs. Added POST /api/runs/sweep, which ingests every running search whose Apify runs have finished, protected by CRON_SECRET, and a separate Railway cron service that calls it every 5 minutes.</w:t>
+      </w:r>
+    </w:p>
+    <w:p>
+      <w:pPr>
+        <w:pStyle w:val="Heading2"/>
+      </w:pPr>
+      <w:r>
+        <w:t xml:space="preserve">What changed</w:t>
+      </w:r>
+    </w:p>
+    <w:p>
+      <w:pPr>
+        <w:pStyle w:val="ListParagraph"/>
+        <w:numPr>
+          <w:ilvl w:val="0"/>
+          <w:numId w:val="2"/>
+        </w:numPr>
+        <w:spacing w:after="60"/>
+      </w:pPr>
+      <w:r>
+        <w:t xml:space="preserve">web/app/api/runs/sweep/route.ts: POST only. Requires Authorization: Bearer &lt;CRON_SECRET&gt; (constant-time compare); returns 401 otherwise, and always when CRON_SECRET is unset.</w:t>
+      </w:r>
+    </w:p>
+    <w:p>
+      <w:pPr>
+        <w:pStyle w:val="ListParagraph"/>
+        <w:numPr>
+          <w:ilvl w:val="0"/>
+          <w:numId w:val="2"/>
+        </w:numPr>
+        <w:spacing w:after="60"/>
+      </w:pPr>
+      <w:r>
+        <w:t xml:space="preserve">web/lib/searchRuns.ts: sweepRunningSearches runs checkRun on every Run with status running (same ingest and claim as the status route). autoRankAfter moved here so the sweep and the status route both trigger Auto-Rank.</w:t>
+      </w:r>
+    </w:p>
+    <w:p>
+      <w:pPr>
+        <w:pStyle w:val="ListParagraph"/>
+        <w:numPr>
+          <w:ilvl w:val="0"/>
+          <w:numId w:val="2"/>
+        </w:numPr>
+        <w:spacing w:after="60"/>
+      </w:pPr>
+      <w:r>
+        <w:t xml:space="preserve">scripts/sweep.mjs: the cron service's command. POSTs to SWEEP_URL with the secret, logs the response, exits 0 on success and 1 on failure.</w:t>
+      </w:r>
+    </w:p>
+    <w:p>
+      <w:pPr>
+        <w:pStyle w:val="ListParagraph"/>
+        <w:numPr>
+          <w:ilvl w:val="0"/>
+          <w:numId w:val="2"/>
+        </w:numPr>
+        <w:spacing w:after="60"/>
+      </w:pPr>
+      <w:r>
+        <w:t xml:space="preserve">railway/sweep-cron.json: config for the cron service (start command node scripts/sweep.mjs, cronSchedule */5 * * * *, restart NEVER, trivial build, watchPatterns limited to the script and config).</w:t>
+      </w:r>
+    </w:p>
+    <w:p>
+      <w:pPr>
+        <w:pStyle w:val="Heading2"/>
+      </w:pPr>
+      <w:r>
+        <w:t xml:space="preserve">Decisions and deviations from the spec</w:t>
+      </w:r>
+    </w:p>
+    <w:tbl>
+      <w:tblPr>
+        <w:tblW w:type="dxa" w:w="9026"/>
+        <w:tblBorders>
+          <w:top w:val="single" w:color="auto" w:sz="4"/>
+          <w:left w:val="single" w:color="auto" w:sz="4"/>
+          <w:bottom w:val="single" w:color="auto" w:sz="4"/>
+          <w:right w:val="single" w:color="auto" w:sz="4"/>
+          <w:insideH w:val="single" w:color="auto" w:sz="4"/>
+          <w:insideV w:val="single" w:color="auto" w:sz="4"/>
+        </w:tblBorders>
+      </w:tblPr>
+      <w:tblGrid>
+        <w:gridCol w:w="2600"/>
+        <w:gridCol w:w="3400"/>
+        <w:gridCol w:w="3026"/>
+      </w:tblGrid>
+      <w:tr>
+        <w:trPr>
+          <w:tblHeader/>
+        </w:trPr>
+        <w:tc>
+          <w:tcPr>
+            <w:tcW w:type="dxa" w:w="2600"/>
+            <w:tcBorders>
+              <w:top w:val="single" w:color="BFBFBF" w:sz="4"/>
+              <w:left w:val="single" w:color="BFBFBF" w:sz="4"/>
+              <w:bottom w:val="single" w:color="BFBFBF" w:sz="4"/>
+              <w:right w:val="single" w:color="BFBFBF" w:sz="4"/>
+            </w:tcBorders>
+            <w:shd w:fill="EDEDED" w:color="auto" w:val="clear"/>
+            <w:tcMar>
+              <w:top w:type="dxa" w:w="60"/>
+              <w:left w:type="dxa" w:w="100"/>
+              <w:bottom w:type="dxa" w:w="60"/>
+              <w:right w:type="dxa" w:w="100"/>
+            </w:tcMar>
+          </w:tcPr>
+          <w:p>
+            <w:r>
+              <w:rPr>
+                <w:b/>
+                <w:bCs/>
+                <w:sz w:val="19"/>
+                <w:szCs w:val="19"/>
+              </w:rPr>
+              <w:t xml:space="preserve">Decision</w:t>
+            </w:r>
+          </w:p>
+        </w:tc>
+        <w:tc>
+          <w:tcPr>
+            <w:tcW w:type="dxa" w:w="3400"/>
+            <w:tcBorders>
+              <w:top w:val="single" w:color="BFBFBF" w:sz="4"/>
+              <w:left w:val="single" w:color="BFBFBF" w:sz="4"/>
+              <w:bottom w:val="single" w:color="BFBFBF" w:sz="4"/>
+              <w:right w:val="single" w:color="BFBFBF" w:sz="4"/>
+            </w:tcBorders>
+            <w:shd w:fill="EDEDED" w:color="auto" w:val="clear"/>
+            <w:tcMar>
+              <w:top w:type="dxa" w:w="60"/>
+              <w:left w:type="dxa" w:w="100"/>
+              <w:bottom w:type="dxa" w:w="60"/>
+              <w:right w:type="dxa" w:w="100"/>
+            </w:tcMar>
+          </w:tcPr>
+          <w:p>
+            <w:r>
+              <w:rPr>
+                <w:b/>
+                <w:bCs/>
+                <w:sz w:val="19"/>
+                <w:szCs w:val="19"/>
+              </w:rPr>
+              <w:t xml:space="preserve">Why</w:t>
+            </w:r>
+          </w:p>
+        </w:tc>
+        <w:tc>
+          <w:tcPr>
+            <w:tcW w:type="dxa" w:w="3026"/>
+            <w:tcBorders>
+              <w:top w:val="single" w:color="BFBFBF" w:sz="4"/>
+              <w:left w:val="single" w:color="BFBFBF" w:sz="4"/>
+              <w:bottom w:val="single" w:color="BFBFBF" w:sz="4"/>
+              <w:right w:val="single" w:color="BFBFBF" w:sz="4"/>
+            </w:tcBorders>
+            <w:shd w:fill="EDEDED" w:color="auto" w:val="clear"/>
+            <w:tcMar>
+              <w:top w:type="dxa" w:w="60"/>
+              <w:left w:type="dxa" w:w="100"/>
+              <w:bottom w:type="dxa" w:w="60"/>
+              <w:right w:type="dxa" w:w="100"/>
+            </w:tcMar>
+          </w:tcPr>
+          <w:p>
+            <w:r>
+              <w:rPr>
+                <w:b/>
+                <w:bCs/>
+                <w:sz w:val="19"/>
+                <w:szCs w:val="19"/>
+              </w:rPr>
+              <w:t xml:space="preserve">Consequence / where</w:t>
+            </w:r>
+          </w:p>
+        </w:tc>
+      </w:tr>
+      <w:tr>
+        <w:tc>
+          <w:tcPr>
+            <w:tcW w:type="dxa" w:w="2600"/>
+            <w:tcBorders>
+              <w:top w:val="single" w:color="BFBFBF" w:sz="4"/>
+              <w:left w:val="single" w:color="BFBFBF" w:sz="4"/>
+              <w:bottom w:val="single" w:color="BFBFBF" w:sz="4"/>
+              <w:right w:val="single" w:color="BFBFBF" w:sz="4"/>
+            </w:tcBorders>
+            <w:tcMar>
+              <w:top w:type="dxa" w:w="60"/>
+              <w:left w:type="dxa" w:w="100"/>
+              <w:bottom w:type="dxa" w:w="60"/>
+              <w:right w:type="dxa" w:w="100"/>
+            </w:tcMar>
+          </w:tcPr>
+          <w:p>
+            <w:r>
+              <w:rPr>
+                <w:b w:val="false"/>
+                <w:bCs w:val="false"/>
+                <w:sz w:val="19"/>
+                <w:szCs w:val="19"/>
+              </w:rPr>
+              <w:t xml:space="preserve">The status route still ingests when it sees a finished run</w:t>
+            </w:r>
+          </w:p>
+        </w:tc>
+        <w:tc>
+          <w:tcPr>
+            <w:tcW w:type="dxa" w:w="3400"/>
+            <w:tcBorders>
+              <w:top w:val="single" w:color="BFBFBF" w:sz="4"/>
+              <w:left w:val="single" w:color="BFBFBF" w:sz="4"/>
+              <w:bottom w:val="single" w:color="BFBFBF" w:sz="4"/>
+              <w:right w:val="single" w:color="BFBFBF" w:sz="4"/>
+            </w:tcBorders>
+            <w:tcMar>
+              <w:top w:type="dxa" w:w="60"/>
+              <w:left w:type="dxa" w:w="100"/>
+              <w:bottom w:type="dxa" w:w="60"/>
+              <w:right w:type="dxa" w:w="100"/>
+            </w:tcMar>
+          </w:tcPr>
+          <w:p>
+            <w:r>
+              <w:rPr>
+                <w:b w:val="false"/>
+                <w:bCs w:val="false"/>
+                <w:sz w:val="19"/>
+                <w:szCs w:val="19"/>
+              </w:rPr>
+              <w:t xml:space="preserve">Otherwise a watching browser would wait up to 5 minutes for the next sweep. The claim guard makes the two callers safe together.</w:t>
+            </w:r>
+          </w:p>
+        </w:tc>
+        <w:tc>
+          <w:tcPr>
+            <w:tcW w:type="dxa" w:w="3026"/>
+            <w:tcBorders>
+              <w:top w:val="single" w:color="BFBFBF" w:sz="4"/>
+              <w:left w:val="single" w:color="BFBFBF" w:sz="4"/>
+              <w:bottom w:val="single" w:color="BFBFBF" w:sz="4"/>
+              <w:right w:val="single" w:color="BFBFBF" w:sz="4"/>
+            </w:tcBorders>
+            <w:tcMar>
+              <w:top w:type="dxa" w:w="60"/>
+              <w:left w:type="dxa" w:w="100"/>
+              <w:bottom w:type="dxa" w:w="60"/>
+              <w:right w:type="dxa" w:w="100"/>
+            </w:tcMar>
+          </w:tcPr>
+          <w:p>
+            <w:r>
+              <w:rPr>
+                <w:b w:val="false"/>
+                <w:bCs w:val="false"/>
+                <w:sz w:val="19"/>
+                <w:szCs w:val="19"/>
+              </w:rPr>
+              <w:t xml:space="preserve">The sweep is the guarantee; the status route is the fast path.</w:t>
+            </w:r>
+          </w:p>
+        </w:tc>
+      </w:tr>
+      <w:tr>
+        <w:tc>
+          <w:tcPr>
+            <w:tcW w:type="dxa" w:w="2600"/>
+            <w:tcBorders>
+              <w:top w:val="single" w:color="BFBFBF" w:sz="4"/>
+              <w:left w:val="single" w:color="BFBFBF" w:sz="4"/>
+              <w:bottom w:val="single" w:color="BFBFBF" w:sz="4"/>
+              <w:right w:val="single" w:color="BFBFBF" w:sz="4"/>
+            </w:tcBorders>
+            <w:tcMar>
+              <w:top w:type="dxa" w:w="60"/>
+              <w:left w:type="dxa" w:w="100"/>
+              <w:bottom w:type="dxa" w:w="60"/>
+              <w:right w:type="dxa" w:w="100"/>
+            </w:tcMar>
+          </w:tcPr>
+          <w:p>
+            <w:r>
+              <w:rPr>
+                <w:b w:val="false"/>
+                <w:bCs w:val="false"/>
+                <w:sz w:val="19"/>
+                <w:szCs w:val="19"/>
+              </w:rPr>
+              <w:t xml:space="preserve">The cron is a separate Railway service with its own config file path</w:t>
+            </w:r>
+          </w:p>
+        </w:tc>
+        <w:tc>
+          <w:tcPr>
+            <w:tcW w:type="dxa" w:w="3400"/>
+            <w:tcBorders>
+              <w:top w:val="single" w:color="BFBFBF" w:sz="4"/>
+              <w:left w:val="single" w:color="BFBFBF" w:sz="4"/>
+              <w:bottom w:val="single" w:color="BFBFBF" w:sz="4"/>
+              <w:right w:val="single" w:color="BFBFBF" w:sz="4"/>
+            </w:tcBorders>
+            <w:tcMar>
+              <w:top w:type="dxa" w:w="60"/>
+              <w:left w:type="dxa" w:w="100"/>
+              <w:bottom w:type="dxa" w:w="60"/>
+              <w:right w:type="dxa" w:w="100"/>
+            </w:tcMar>
+          </w:tcPr>
+          <w:p>
+            <w:r>
+              <w:rPr>
+                <w:b w:val="false"/>
+                <w:bCs w:val="false"/>
+                <w:sz w:val="19"/>
+                <w:szCs w:val="19"/>
+              </w:rPr>
+              <w:t xml:space="preserve">Railway cron services must run a command and exit, so the web service cannot be the cron. A root railway.json would be picked up by the web service by default.</w:t>
+            </w:r>
+          </w:p>
+        </w:tc>
+        <w:tc>
+          <w:tcPr>
+            <w:tcW w:type="dxa" w:w="3026"/>
+            <w:tcBorders>
+              <w:top w:val="single" w:color="BFBFBF" w:sz="4"/>
+              <w:left w:val="single" w:color="BFBFBF" w:sz="4"/>
+              <w:bottom w:val="single" w:color="BFBFBF" w:sz="4"/>
+              <w:right w:val="single" w:color="BFBFBF" w:sz="4"/>
+            </w:tcBorders>
+            <w:tcMar>
+              <w:top w:type="dxa" w:w="60"/>
+              <w:left w:type="dxa" w:w="100"/>
+              <w:bottom w:type="dxa" w:w="60"/>
+              <w:right w:type="dxa" w:w="100"/>
+            </w:tcMar>
+          </w:tcPr>
+          <w:p>
+            <w:r>
+              <w:rPr>
+                <w:b w:val="false"/>
+                <w:bCs w:val="false"/>
+                <w:sz w:val="19"/>
+                <w:szCs w:val="19"/>
+              </w:rPr>
+              <w:t xml:space="preserve">The cron service's settings must point at /railway/sweep-cron.json.</w:t>
+            </w:r>
+          </w:p>
+        </w:tc>
+      </w:tr>
+      <w:tr>
+        <w:tc>
+          <w:tcPr>
+            <w:tcW w:type="dxa" w:w="2600"/>
+            <w:tcBorders>
+              <w:top w:val="single" w:color="BFBFBF" w:sz="4"/>
+              <w:left w:val="single" w:color="BFBFBF" w:sz="4"/>
+              <w:bottom w:val="single" w:color="BFBFBF" w:sz="4"/>
+              <w:right w:val="single" w:color="BFBFBF" w:sz="4"/>
+            </w:tcBorders>
+            <w:tcMar>
+              <w:top w:type="dxa" w:w="60"/>
+              <w:left w:type="dxa" w:w="100"/>
+              <w:bottom w:type="dxa" w:w="60"/>
+              <w:right w:type="dxa" w:w="100"/>
+            </w:tcMar>
+          </w:tcPr>
+          <w:p>
+            <w:r>
+              <w:rPr>
+                <w:b w:val="false"/>
+                <w:bCs w:val="false"/>
+                <w:sz w:val="19"/>
+                <w:szCs w:val="19"/>
+              </w:rPr>
+              <w:t xml:space="preserve">The cron calls the web service over HTTP instead of touching the database itself</w:t>
+            </w:r>
+          </w:p>
+        </w:tc>
+        <w:tc>
+          <w:tcPr>
+            <w:tcW w:type="dxa" w:w="3400"/>
+            <w:tcBorders>
+              <w:top w:val="single" w:color="BFBFBF" w:sz="4"/>
+              <w:left w:val="single" w:color="BFBFBF" w:sz="4"/>
+              <w:bottom w:val="single" w:color="BFBFBF" w:sz="4"/>
+              <w:right w:val="single" w:color="BFBFBF" w:sz="4"/>
+            </w:tcBorders>
+            <w:tcMar>
+              <w:top w:type="dxa" w:w="60"/>
+              <w:left w:type="dxa" w:w="100"/>
+              <w:bottom w:type="dxa" w:w="60"/>
+              <w:right w:type="dxa" w:w="100"/>
+            </w:tcMar>
+          </w:tcPr>
+          <w:p>
+            <w:r>
+              <w:rPr>
+                <w:b w:val="false"/>
+                <w:bCs w:val="false"/>
+                <w:sz w:val="19"/>
+                <w:szCs w:val="19"/>
+              </w:rPr>
+              <w:t xml:space="preserve">One copy of the ingest logic, and Auto-Rank's after() runs on the long-lived web server.</w:t>
+            </w:r>
+          </w:p>
+        </w:tc>
+        <w:tc>
+          <w:tcPr>
+            <w:tcW w:type="dxa" w:w="3026"/>
+            <w:tcBorders>
+              <w:top w:val="single" w:color="BFBFBF" w:sz="4"/>
+              <w:left w:val="single" w:color="BFBFBF" w:sz="4"/>
+              <w:bottom w:val="single" w:color="BFBFBF" w:sz="4"/>
+              <w:right w:val="single" w:color="BFBFBF" w:sz="4"/>
+            </w:tcBorders>
+            <w:tcMar>
+              <w:top w:type="dxa" w:w="60"/>
+              <w:left w:type="dxa" w:w="100"/>
+              <w:bottom w:type="dxa" w:w="60"/>
+              <w:right w:type="dxa" w:w="100"/>
+            </w:tcMar>
+          </w:tcPr>
+          <w:p>
+            <w:r>
+              <w:rPr>
+                <w:b w:val="false"/>
+                <w:bCs w:val="false"/>
+                <w:sz w:val="19"/>
+                <w:szCs w:val="19"/>
+              </w:rPr>
+              <w:t xml:space="preserve">The cron service needs SWEEP_URL and the same CRON_SECRET, and fails if the web service is down.</w:t>
+            </w:r>
+          </w:p>
+        </w:tc>
+      </w:tr>
+      <w:tr>
+        <w:tc>
+          <w:tcPr>
+            <w:tcW w:type="dxa" w:w="2600"/>
+            <w:tcBorders>
+              <w:top w:val="single" w:color="BFBFBF" w:sz="4"/>
+              <w:left w:val="single" w:color="BFBFBF" w:sz="4"/>
+              <w:bottom w:val="single" w:color="BFBFBF" w:sz="4"/>
+              <w:right w:val="single" w:color="BFBFBF" w:sz="4"/>
+            </w:tcBorders>
+            <w:tcMar>
+              <w:top w:type="dxa" w:w="60"/>
+              <w:left w:type="dxa" w:w="100"/>
+              <w:bottom w:type="dxa" w:w="60"/>
+              <w:right w:type="dxa" w:w="100"/>
+            </w:tcMar>
+          </w:tcPr>
+          <w:p>
+            <w:r>
+              <w:rPr>
+                <w:b w:val="false"/>
+                <w:bCs w:val="false"/>
+                <w:sz w:val="19"/>
+                <w:szCs w:val="19"/>
+              </w:rPr>
+              <w:t xml:space="preserve">Secret sent as Authorization: Bearer</w:t>
+            </w:r>
+          </w:p>
+        </w:tc>
+        <w:tc>
+          <w:tcPr>
+            <w:tcW w:type="dxa" w:w="3400"/>
+            <w:tcBorders>
+              <w:top w:val="single" w:color="BFBFBF" w:sz="4"/>
+              <w:left w:val="single" w:color="BFBFBF" w:sz="4"/>
+              <w:bottom w:val="single" w:color="BFBFBF" w:sz="4"/>
+              <w:right w:val="single" w:color="BFBFBF" w:sz="4"/>
+            </w:tcBorders>
+            <w:tcMar>
+              <w:top w:type="dxa" w:w="60"/>
+              <w:left w:type="dxa" w:w="100"/>
+              <w:bottom w:type="dxa" w:w="60"/>
+              <w:right w:type="dxa" w:w="100"/>
+            </w:tcMar>
+          </w:tcPr>
+          <w:p>
+            <w:r>
+              <w:rPr>
+                <w:b w:val="false"/>
+                <w:bCs w:val="false"/>
+                <w:sz w:val="19"/>
+                <w:szCs w:val="19"/>
+              </w:rPr>
+              <w:t xml:space="preserve">The usual convention for cron callers.</w:t>
+            </w:r>
+          </w:p>
+        </w:tc>
+        <w:tc>
+          <w:tcPr>
+            <w:tcW w:type="dxa" w:w="3026"/>
+            <w:tcBorders>
+              <w:top w:val="single" w:color="BFBFBF" w:sz="4"/>
+              <w:left w:val="single" w:color="BFBFBF" w:sz="4"/>
+              <w:bottom w:val="single" w:color="BFBFBF" w:sz="4"/>
+              <w:right w:val="single" w:color="BFBFBF" w:sz="4"/>
+            </w:tcBorders>
+            <w:tcMar>
+              <w:top w:type="dxa" w:w="60"/>
+              <w:left w:type="dxa" w:w="100"/>
+              <w:bottom w:type="dxa" w:w="60"/>
+              <w:right w:type="dxa" w:w="100"/>
+            </w:tcMar>
+          </w:tcPr>
+          <w:p>
+            <w:r>
+              <w:rPr>
+                <w:b w:val="false"/>
+                <w:bCs w:val="false"/>
+                <w:sz w:val="19"/>
+                <w:szCs w:val="19"/>
+              </w:rPr>
+              <w:t xml:space="preserve">A bare secret without the Bearer prefix is rejected.</w:t>
+            </w:r>
+          </w:p>
+        </w:tc>
+      </w:tr>
+    </w:tbl>
+    <w:p>
+      <w:pPr>
+        <w:spacing w:after="120"/>
+      </w:pPr>
+    </w:p>
+    <w:p>
+      <w:pPr>
+        <w:pStyle w:val="Heading2"/>
+      </w:pPr>
+      <w:r>
+        <w:t xml:space="preserve">Problems found</w:t>
+      </w:r>
+    </w:p>
+    <w:tbl>
+      <w:tblPr>
+        <w:tblW w:type="dxa" w:w="9026"/>
+        <w:tblBorders>
+          <w:top w:val="single" w:color="auto" w:sz="4"/>
+          <w:left w:val="single" w:color="auto" w:sz="4"/>
+          <w:bottom w:val="single" w:color="auto" w:sz="4"/>
+          <w:right w:val="single" w:color="auto" w:sz="4"/>
+          <w:insideH w:val="single" w:color="auto" w:sz="4"/>
+          <w:insideV w:val="single" w:color="auto" w:sz="4"/>
+        </w:tblBorders>
+      </w:tblPr>
+      <w:tblGrid>
+        <w:gridCol w:w="2800"/>
+        <w:gridCol w:w="3300"/>
+        <w:gridCol w:w="2926"/>
+      </w:tblGrid>
+      <w:tr>
+        <w:trPr>
+          <w:tblHeader/>
+        </w:trPr>
+        <w:tc>
+          <w:tcPr>
+            <w:tcW w:type="dxa" w:w="2800"/>
+            <w:tcBorders>
+              <w:top w:val="single" w:color="BFBFBF" w:sz="4"/>
+              <w:left w:val="single" w:color="BFBFBF" w:sz="4"/>
+              <w:bottom w:val="single" w:color="BFBFBF" w:sz="4"/>
+              <w:right w:val="single" w:color="BFBFBF" w:sz="4"/>
+            </w:tcBorders>
+            <w:shd w:fill="EDEDED" w:color="auto" w:val="clear"/>
+            <w:tcMar>
+              <w:top w:type="dxa" w:w="60"/>
+              <w:left w:type="dxa" w:w="100"/>
+              <w:bottom w:type="dxa" w:w="60"/>
+              <w:right w:type="dxa" w:w="100"/>
+            </w:tcMar>
+          </w:tcPr>
+          <w:p>
+            <w:r>
+              <w:rPr>
+                <w:b/>
+                <w:bCs/>
+                <w:sz w:val="19"/>
+                <w:szCs w:val="19"/>
+              </w:rPr>
+              <w:t xml:space="preserve">Symptom</w:t>
+            </w:r>
+          </w:p>
+        </w:tc>
+        <w:tc>
+          <w:tcPr>
+            <w:tcW w:type="dxa" w:w="3300"/>
+            <w:tcBorders>
+              <w:top w:val="single" w:color="BFBFBF" w:sz="4"/>
+              <w:left w:val="single" w:color="BFBFBF" w:sz="4"/>
+              <w:bottom w:val="single" w:color="BFBFBF" w:sz="4"/>
+              <w:right w:val="single" w:color="BFBFBF" w:sz="4"/>
+            </w:tcBorders>
+            <w:shd w:fill="EDEDED" w:color="auto" w:val="clear"/>
+            <w:tcMar>
+              <w:top w:type="dxa" w:w="60"/>
+              <w:left w:type="dxa" w:w="100"/>
+              <w:bottom w:type="dxa" w:w="60"/>
+              <w:right w:type="dxa" w:w="100"/>
+            </w:tcMar>
+          </w:tcPr>
+          <w:p>
+            <w:r>
+              <w:rPr>
+                <w:b/>
+                <w:bCs/>
+                <w:sz w:val="19"/>
+                <w:szCs w:val="19"/>
+              </w:rPr>
+              <w:t xml:space="preserve">Cause</w:t>
+            </w:r>
+          </w:p>
+        </w:tc>
+        <w:tc>
+          <w:tcPr>
+            <w:tcW w:type="dxa" w:w="2926"/>
+            <w:tcBorders>
+              <w:top w:val="single" w:color="BFBFBF" w:sz="4"/>
+              <w:left w:val="single" w:color="BFBFBF" w:sz="4"/>
+              <w:bottom w:val="single" w:color="BFBFBF" w:sz="4"/>
+              <w:right w:val="single" w:color="BFBFBF" w:sz="4"/>
+            </w:tcBorders>
+            <w:shd w:fill="EDEDED" w:color="auto" w:val="clear"/>
+            <w:tcMar>
+              <w:top w:type="dxa" w:w="60"/>
+              <w:left w:type="dxa" w:w="100"/>
+              <w:bottom w:type="dxa" w:w="60"/>
+              <w:right w:type="dxa" w:w="100"/>
+            </w:tcMar>
+          </w:tcPr>
+          <w:p>
+            <w:r>
+              <w:rPr>
+                <w:b/>
+                <w:bCs/>
+                <w:sz w:val="19"/>
+                <w:szCs w:val="19"/>
+              </w:rPr>
+              <w:t xml:space="preserve">Resolution</w:t>
+            </w:r>
+          </w:p>
+        </w:tc>
+      </w:tr>
+      <w:tr>
+        <w:tc>
+          <w:tcPr>
+            <w:tcW w:type="dxa" w:w="2800"/>
+            <w:tcBorders>
+              <w:top w:val="single" w:color="BFBFBF" w:sz="4"/>
+              <w:left w:val="single" w:color="BFBFBF" w:sz="4"/>
+              <w:bottom w:val="single" w:color="BFBFBF" w:sz="4"/>
+              <w:right w:val="single" w:color="BFBFBF" w:sz="4"/>
+            </w:tcBorders>
+            <w:tcMar>
+              <w:top w:type="dxa" w:w="60"/>
+              <w:left w:type="dxa" w:w="100"/>
+              <w:bottom w:type="dxa" w:w="60"/>
+              <w:right w:type="dxa" w:w="100"/>
+            </w:tcMar>
+          </w:tcPr>
+          <w:p>
+            <w:r>
+              <w:rPr>
+                <w:b w:val="false"/>
+                <w:bCs w:val="false"/>
+                <w:sz w:val="19"/>
+                <w:szCs w:val="19"/>
+              </w:rPr>
+              <w:t xml:space="preserve">Adding CRON_SECRET to web/.env glued it onto the end of the ANTHROPIC_API_KEY line.</w:t>
+            </w:r>
+          </w:p>
+        </w:tc>
+        <w:tc>
+          <w:tcPr>
+            <w:tcW w:type="dxa" w:w="3300"/>
+            <w:tcBorders>
+              <w:top w:val="single" w:color="BFBFBF" w:sz="4"/>
+              <w:left w:val="single" w:color="BFBFBF" w:sz="4"/>
+              <w:bottom w:val="single" w:color="BFBFBF" w:sz="4"/>
+              <w:right w:val="single" w:color="BFBFBF" w:sz="4"/>
+            </w:tcBorders>
+            <w:tcMar>
+              <w:top w:type="dxa" w:w="60"/>
+              <w:left w:type="dxa" w:w="100"/>
+              <w:bottom w:type="dxa" w:w="60"/>
+              <w:right w:type="dxa" w:w="100"/>
+            </w:tcMar>
+          </w:tcPr>
+          <w:p>
+            <w:r>
+              <w:rPr>
+                <w:b w:val="false"/>
+                <w:bCs w:val="false"/>
+                <w:sz w:val="19"/>
+                <w:szCs w:val="19"/>
+              </w:rPr>
+              <w:t xml:space="preserve">web/.env had been copied from the root .env, which has no final newline, and the new line was appended with echo &gt;&gt;.</w:t>
+            </w:r>
+          </w:p>
+        </w:tc>
+        <w:tc>
+          <w:tcPr>
+            <w:tcW w:type="dxa" w:w="2926"/>
+            <w:tcBorders>
+              <w:top w:val="single" w:color="BFBFBF" w:sz="4"/>
+              <w:left w:val="single" w:color="BFBFBF" w:sz="4"/>
+              <w:bottom w:val="single" w:color="BFBFBF" w:sz="4"/>
+              <w:right w:val="single" w:color="BFBFBF" w:sz="4"/>
+            </w:tcBorders>
+            <w:tcMar>
+              <w:top w:type="dxa" w:w="60"/>
+              <w:left w:type="dxa" w:w="100"/>
+              <w:bottom w:type="dxa" w:w="60"/>
+              <w:right w:type="dxa" w:w="100"/>
+            </w:tcMar>
+          </w:tcPr>
+          <w:p>
+            <w:r>
+              <w:rPr>
+                <w:b w:val="false"/>
+                <w:bCs w:val="false"/>
+                <w:sz w:val="19"/>
+                <w:szCs w:val="19"/>
+              </w:rPr>
+              <w:t xml:space="preserve">Split back onto its own line and verified the Anthropic key matches the root .env. Local file only; never committed.</w:t>
+            </w:r>
+          </w:p>
+        </w:tc>
+      </w:tr>
+    </w:tbl>
+    <w:p>
+      <w:pPr>
+        <w:spacing w:after="120"/>
+      </w:pPr>
+    </w:p>
+    <w:p>
+      <w:pPr>
+        <w:pStyle w:val="Heading2"/>
+      </w:pPr>
+      <w:r>
+        <w:t xml:space="preserve">Verification</w:t>
+      </w:r>
+    </w:p>
+    <w:p>
+      <w:pPr>
+        <w:pStyle w:val="ListParagraph"/>
+        <w:numPr>
+          <w:ilvl w:val="0"/>
+          <w:numId w:val="2"/>
+        </w:numPr>
+        <w:spacing w:after="60"/>
+      </w:pPr>
+      <w:r>
+        <w:t xml:space="preserve">tsc and eslint clean; railway/sweep-cron.json parses.</w:t>
+      </w:r>
+    </w:p>
+    <w:p>
+      <w:pPr>
+        <w:pStyle w:val="ListParagraph"/>
+        <w:numPr>
+          <w:ilvl w:val="0"/>
+          <w:numId w:val="2"/>
+        </w:numPr>
+        <w:spacing w:after="60"/>
+      </w:pPr>
+      <w:r>
+        <w:t xml:space="preserve">Authorization: no header, a wrong secret, and the secret without Bearer all return 401; GET returns 405; the right secret with nothing running returns checked 0.</w:t>
+      </w:r>
+    </w:p>
+    <w:p>
+      <w:pPr>
+        <w:pStyle w:val="ListParagraph"/>
+        <w:numPr>
+          <w:ilvl w:val="0"/>
+          <w:numId w:val="2"/>
+        </w:numPr>
+        <w:spacing w:after="60"/>
+      </w:pPr>
+      <w:r>
+        <w:t xml:space="preserve">End to end: an Explore search for 'technical content' was started and never polled. After Apify finished, the Run was still running with 0 wave rows. Running scripts/sweep.mjs ingested it (Run done, 1 job, wave jobCount 1 = 1 row) and exited 0; a second run found nothing to do; the status route then reported done. With a wrong secret the script got 401 and exited 1.</w:t>
+      </w:r>
+    </w:p>
+    <w:p>
+      <w:pPr>
+        <w:pStyle w:val="ListParagraph"/>
+        <w:numPr>
+          <w:ilvl w:val="0"/>
+          <w:numId w:val="2"/>
+        </w:numPr>
+        <w:spacing w:after="60"/>
+      </w:pPr>
+      <w:r>
+        <w:t xml:space="preserve">Test cost: 1 Apify run. The Railway cron service itself was not created or checked here.</w:t>
+      </w:r>
+    </w:p>
+    <w:p>
+      <w:pPr>
+        <w:pStyle w:val="Heading2"/>
+      </w:pPr>
+      <w:r>
+        <w:t xml:space="preserve">Known risks left behind</w:t>
+      </w:r>
+    </w:p>
+    <w:p>
+      <w:pPr>
+        <w:pStyle w:val="ListParagraph"/>
+        <w:numPr>
+          <w:ilvl w:val="0"/>
+          <w:numId w:val="2"/>
+        </w:numPr>
+        <w:spacing w:after="60"/>
+      </w:pPr>
+      <w:r>
+        <w:t xml:space="preserve">A Run stuck in ingesting (server died mid-ingest) is still not recovered by the sweep, which only looks at running Runs.</w:t>
+      </w:r>
+    </w:p>
+    <w:p>
+      <w:pPr>
+        <w:pStyle w:val="ListParagraph"/>
+        <w:numPr>
+          <w:ilvl w:val="0"/>
+          <w:numId w:val="2"/>
+        </w:numPr>
+        <w:spacing w:after="60"/>
+      </w:pPr>
+      <w:r>
+        <w:t xml:space="preserve">If CRON_SECRET differs between the two services, every sweep fails with 401 and saving falls back to browser polling only.</w:t>
+      </w:r>
+    </w:p>
+    <w:p>
+      <w:pPr>
+        <w:pStyle w:val="ListParagraph"/>
+        <w:numPr>
+          <w:ilvl w:val="0"/>
+          <w:numId w:val="2"/>
+        </w:numPr>
+        <w:spacing w:after="60"/>
+      </w:pPr>
+      <w:r>
+        <w:t xml:space="preserve">Railway skips a cron execution while the previous one is still running, so one very slow sweep delays the next.</w:t>
+      </w:r>
+    </w:p>
+    <w:p>
+      <w:pPr>
+        <w:pStyle w:val="Heading2"/>
+      </w:pPr>
+      <w:r>
+        <w:t xml:space="preserve">Production data changes</w:t>
+      </w:r>
+    </w:p>
+    <w:p>
+      <w:pPr>
+        <w:pStyle w:val="ListParagraph"/>
+        <w:numPr>
+          <w:ilvl w:val="0"/>
+          <w:numId w:val="2"/>
+        </w:numPr>
+        <w:spacing w:after="60"/>
+      </w:pPr>
+      <w:r>
+        <w:t xml:space="preserve">Kept: Explore wave 'technical content' (1 job) and its Run.</w:t>
       </w:r>
     </w:p>
     <w:sectPr>

</xml_diff>

<commit_message>
Post-mortem: heartbeat recovery for stuck ingests
Co-Authored-By: Claude Opus 5.5 <noreply@anthropic.com>
</commit_message>
<xml_diff>
--- a/docs/KAMUI-postmortem.docx
+++ b/docs/KAMUI-postmortem.docx
@@ -21,7 +21,7 @@
         <w:rPr>
           <w:color w:val="666666"/>
         </w:rPr>
-        <w:t xml:space="preserve">Last updated 2026-09-24, after the sweep cron.</w:t>
+        <w:t xml:space="preserve">Last updated 2026-09-24, after the heartbeat fix.</w:t>
       </w:r>
     </w:p>
     <w:p>
@@ -84,7 +84,7 @@
         <w:pStyle w:val="Heading1"/>
       </w:pPr>
       <w:r>
-        <w:t xml:space="preserve">The system after the sweep cron</w:t>
+        <w:t xml:space="preserve">The system after the heartbeat fix</w:t>
       </w:r>
     </w:p>
     <w:p>
@@ -941,7 +941,7 @@
                 <w:sz w:val="19"/>
                 <w:szCs w:val="19"/>
               </w:rPr>
-              <w:t xml:space="preserve">A search shows Saving the results... forever</w:t>
+              <w:t xml:space="preserve">A search shows Saving the results... for minutes</w:t>
             </w:r>
           </w:p>
         </w:tc>
@@ -969,7 +969,7 @@
                 <w:sz w:val="19"/>
                 <w:szCs w:val="19"/>
               </w:rPr>
-              <w:t xml:space="preserve">Its Run is stuck in ingesting (the server died mid-ingest). Set the Run's status back to running; the next poll ingests again.</w:t>
+              <w:t xml:space="preserve">Its saver died mid-ingest. Once heartbeatAt is over 2 minutes old, the next sweep (every 5 minutes) hands it back to running and saves it again. If it never recovers, check that the sweep cron is running.</w:t>
             </w:r>
           </w:p>
         </w:tc>
@@ -1278,19 +1278,6 @@
       </w:pPr>
       <w:r>
         <w:t xml:space="preserve">Manual Rank still runs inside its request; large ranks could time out on Railway.</w:t>
-      </w:r>
-    </w:p>
-    <w:p>
-      <w:pPr>
-        <w:pStyle w:val="ListParagraph"/>
-        <w:numPr>
-          <w:ilvl w:val="0"/>
-          <w:numId w:val="2"/>
-        </w:numPr>
-        <w:spacing w:after="60"/>
-      </w:pPr>
-      <w:r>
-        <w:t xml:space="preserve">Nothing resets a Run stuck in ingesting.</w:t>
       </w:r>
     </w:p>
     <w:p>
@@ -8822,6 +8809,805 @@
       </w:pPr>
       <w:r>
         <w:t xml:space="preserve">Kept: Explore wave 'technical content' (1 job) and its Run.</w:t>
+      </w:r>
+    </w:p>
+    <w:p>
+      <w:pPr>
+        <w:pStyle w:val="Heading1"/>
+      </w:pPr>
+      <w:r>
+        <w:t xml:space="preserve">After Phase 4: heartbeat recovery for stuck ingests</w:t>
+      </w:r>
+    </w:p>
+    <w:p>
+      <w:pPr>
+        <w:spacing w:after="120"/>
+        <w:rPr>
+          <w:color w:val="666666"/>
+          <w:sz w:val="20"/>
+          <w:szCs w:val="20"/>
+        </w:rPr>
+      </w:pPr>
+      <w:r>
+        <w:rPr>
+          <w:color w:val="666666"/>
+          <w:sz w:val="20"/>
+          <w:szCs w:val="20"/>
+        </w:rPr>
+        <w:t xml:space="preserve">2026-09-24  ·  commit e2c8ac5</w:t>
+      </w:r>
+    </w:p>
+    <w:p>
+      <w:pPr>
+        <w:spacing w:after="120"/>
+      </w:pPr>
+      <w:r>
+        <w:t xml:space="preserve">A Run could stay "ingesting" forever if the server died mid-save, because the claim that stops two callers saving also blocked any retry. Added a heartbeat: the saver stamps Run.heartbeatAt every 5 seconds, and the sweep hands a Run back to "running" only when its stamp is more than 2 minutes old, so a crashed save is retried and a slow one is left alone.</w:t>
+      </w:r>
+    </w:p>
+    <w:p>
+      <w:pPr>
+        <w:pStyle w:val="Heading2"/>
+      </w:pPr>
+      <w:r>
+        <w:t xml:space="preserve">What changed</w:t>
+      </w:r>
+    </w:p>
+    <w:p>
+      <w:pPr>
+        <w:pStyle w:val="ListParagraph"/>
+        <w:numPr>
+          <w:ilvl w:val="0"/>
+          <w:numId w:val="2"/>
+        </w:numPr>
+        <w:spacing w:after="60"/>
+      </w:pPr>
+      <w:r>
+        <w:t xml:space="preserve">prisma/migrations/20260924160000_run_heartbeat: additive. Run gains heartbeatAt (timestamp, nullable).</w:t>
+      </w:r>
+    </w:p>
+    <w:p>
+      <w:pPr>
+        <w:pStyle w:val="ListParagraph"/>
+        <w:numPr>
+          <w:ilvl w:val="0"/>
+          <w:numId w:val="2"/>
+        </w:numPr>
+        <w:spacing w:after="60"/>
+      </w:pPr>
+      <w:r>
+        <w:t xml:space="preserve">web/lib/searchRuns.ts: the claim (running to ingesting) sets heartbeatAt; startHeartbeat re-stamps it every 5 seconds (only while the Run is still ingesting) and stops when the save ends; reclaimStaleIngests resets stale Runs to running; sweepRunningSearches calls it before ingesting.</w:t>
+      </w:r>
+    </w:p>
+    <w:p>
+      <w:pPr>
+        <w:pStyle w:val="ListParagraph"/>
+        <w:numPr>
+          <w:ilvl w:val="0"/>
+          <w:numId w:val="2"/>
+        </w:numPr>
+        <w:spacing w:after="60"/>
+      </w:pPr>
+      <w:r>
+        <w:t xml:space="preserve">Explore saves replace the wave's rows (deleteMany, then createMany, in one transaction) instead of appending.</w:t>
+      </w:r>
+    </w:p>
+    <w:p>
+      <w:pPr>
+        <w:pStyle w:val="ListParagraph"/>
+        <w:numPr>
+          <w:ilvl w:val="0"/>
+          <w:numId w:val="2"/>
+        </w:numPr>
+        <w:spacing w:after="60"/>
+      </w:pPr>
+      <w:r>
+        <w:t xml:space="preserve">POST /api/runs/sweep reports how many Runs it reclaimed.</w:t>
+      </w:r>
+    </w:p>
+    <w:p>
+      <w:pPr>
+        <w:pStyle w:val="Heading2"/>
+      </w:pPr>
+      <w:r>
+        <w:t xml:space="preserve">Decisions and deviations from the spec</w:t>
+      </w:r>
+    </w:p>
+    <w:tbl>
+      <w:tblPr>
+        <w:tblW w:type="dxa" w:w="9026"/>
+        <w:tblBorders>
+          <w:top w:val="single" w:color="auto" w:sz="4"/>
+          <w:left w:val="single" w:color="auto" w:sz="4"/>
+          <w:bottom w:val="single" w:color="auto" w:sz="4"/>
+          <w:right w:val="single" w:color="auto" w:sz="4"/>
+          <w:insideH w:val="single" w:color="auto" w:sz="4"/>
+          <w:insideV w:val="single" w:color="auto" w:sz="4"/>
+        </w:tblBorders>
+      </w:tblPr>
+      <w:tblGrid>
+        <w:gridCol w:w="2600"/>
+        <w:gridCol w:w="3400"/>
+        <w:gridCol w:w="3026"/>
+      </w:tblGrid>
+      <w:tr>
+        <w:trPr>
+          <w:tblHeader/>
+        </w:trPr>
+        <w:tc>
+          <w:tcPr>
+            <w:tcW w:type="dxa" w:w="2600"/>
+            <w:tcBorders>
+              <w:top w:val="single" w:color="BFBFBF" w:sz="4"/>
+              <w:left w:val="single" w:color="BFBFBF" w:sz="4"/>
+              <w:bottom w:val="single" w:color="BFBFBF" w:sz="4"/>
+              <w:right w:val="single" w:color="BFBFBF" w:sz="4"/>
+            </w:tcBorders>
+            <w:shd w:fill="EDEDED" w:color="auto" w:val="clear"/>
+            <w:tcMar>
+              <w:top w:type="dxa" w:w="60"/>
+              <w:left w:type="dxa" w:w="100"/>
+              <w:bottom w:type="dxa" w:w="60"/>
+              <w:right w:type="dxa" w:w="100"/>
+            </w:tcMar>
+          </w:tcPr>
+          <w:p>
+            <w:r>
+              <w:rPr>
+                <w:b/>
+                <w:bCs/>
+                <w:sz w:val="19"/>
+                <w:szCs w:val="19"/>
+              </w:rPr>
+              <w:t xml:space="preserve">Decision</w:t>
+            </w:r>
+          </w:p>
+        </w:tc>
+        <w:tc>
+          <w:tcPr>
+            <w:tcW w:type="dxa" w:w="3400"/>
+            <w:tcBorders>
+              <w:top w:val="single" w:color="BFBFBF" w:sz="4"/>
+              <w:left w:val="single" w:color="BFBFBF" w:sz="4"/>
+              <w:bottom w:val="single" w:color="BFBFBF" w:sz="4"/>
+              <w:right w:val="single" w:color="BFBFBF" w:sz="4"/>
+            </w:tcBorders>
+            <w:shd w:fill="EDEDED" w:color="auto" w:val="clear"/>
+            <w:tcMar>
+              <w:top w:type="dxa" w:w="60"/>
+              <w:left w:type="dxa" w:w="100"/>
+              <w:bottom w:type="dxa" w:w="60"/>
+              <w:right w:type="dxa" w:w="100"/>
+            </w:tcMar>
+          </w:tcPr>
+          <w:p>
+            <w:r>
+              <w:rPr>
+                <w:b/>
+                <w:bCs/>
+                <w:sz w:val="19"/>
+                <w:szCs w:val="19"/>
+              </w:rPr>
+              <w:t xml:space="preserve">Why</w:t>
+            </w:r>
+          </w:p>
+        </w:tc>
+        <w:tc>
+          <w:tcPr>
+            <w:tcW w:type="dxa" w:w="3026"/>
+            <w:tcBorders>
+              <w:top w:val="single" w:color="BFBFBF" w:sz="4"/>
+              <w:left w:val="single" w:color="BFBFBF" w:sz="4"/>
+              <w:bottom w:val="single" w:color="BFBFBF" w:sz="4"/>
+              <w:right w:val="single" w:color="BFBFBF" w:sz="4"/>
+            </w:tcBorders>
+            <w:shd w:fill="EDEDED" w:color="auto" w:val="clear"/>
+            <w:tcMar>
+              <w:top w:type="dxa" w:w="60"/>
+              <w:left w:type="dxa" w:w="100"/>
+              <w:bottom w:type="dxa" w:w="60"/>
+              <w:right w:type="dxa" w:w="100"/>
+            </w:tcMar>
+          </w:tcPr>
+          <w:p>
+            <w:r>
+              <w:rPr>
+                <w:b/>
+                <w:bCs/>
+                <w:sz w:val="19"/>
+                <w:szCs w:val="19"/>
+              </w:rPr>
+              <w:t xml:space="preserve">Consequence / where</w:t>
+            </w:r>
+          </w:p>
+        </w:tc>
+      </w:tr>
+      <w:tr>
+        <w:tc>
+          <w:tcPr>
+            <w:tcW w:type="dxa" w:w="2600"/>
+            <w:tcBorders>
+              <w:top w:val="single" w:color="BFBFBF" w:sz="4"/>
+              <w:left w:val="single" w:color="BFBFBF" w:sz="4"/>
+              <w:bottom w:val="single" w:color="BFBFBF" w:sz="4"/>
+              <w:right w:val="single" w:color="BFBFBF" w:sz="4"/>
+            </w:tcBorders>
+            <w:tcMar>
+              <w:top w:type="dxa" w:w="60"/>
+              <w:left w:type="dxa" w:w="100"/>
+              <w:bottom w:type="dxa" w:w="60"/>
+              <w:right w:type="dxa" w:w="100"/>
+            </w:tcMar>
+          </w:tcPr>
+          <w:p>
+            <w:r>
+              <w:rPr>
+                <w:b w:val="false"/>
+                <w:bCs w:val="false"/>
+                <w:sz w:val="19"/>
+                <w:szCs w:val="19"/>
+              </w:rPr>
+              <w:t xml:space="preserve">Heartbeat instead of a fixed timeout</w:t>
+            </w:r>
+          </w:p>
+        </w:tc>
+        <w:tc>
+          <w:tcPr>
+            <w:tcW w:type="dxa" w:w="3400"/>
+            <w:tcBorders>
+              <w:top w:val="single" w:color="BFBFBF" w:sz="4"/>
+              <w:left w:val="single" w:color="BFBFBF" w:sz="4"/>
+              <w:bottom w:val="single" w:color="BFBFBF" w:sz="4"/>
+              <w:right w:val="single" w:color="BFBFBF" w:sz="4"/>
+            </w:tcBorders>
+            <w:tcMar>
+              <w:top w:type="dxa" w:w="60"/>
+              <w:left w:type="dxa" w:w="100"/>
+              <w:bottom w:type="dxa" w:w="60"/>
+              <w:right w:type="dxa" w:w="100"/>
+            </w:tcMar>
+          </w:tcPr>
+          <w:p>
+            <w:r>
+              <w:rPr>
+                <w:b w:val="false"/>
+                <w:bCs w:val="false"/>
+                <w:sz w:val="19"/>
+                <w:szCs w:val="19"/>
+              </w:rPr>
+              <w:t xml:space="preserve">A fixed timeout either reclaims slow saves that are still working or leaves crashed ones stuck for too long.</w:t>
+            </w:r>
+          </w:p>
+        </w:tc>
+        <w:tc>
+          <w:tcPr>
+            <w:tcW w:type="dxa" w:w="3026"/>
+            <w:tcBorders>
+              <w:top w:val="single" w:color="BFBFBF" w:sz="4"/>
+              <w:left w:val="single" w:color="BFBFBF" w:sz="4"/>
+              <w:bottom w:val="single" w:color="BFBFBF" w:sz="4"/>
+              <w:right w:val="single" w:color="BFBFBF" w:sz="4"/>
+            </w:tcBorders>
+            <w:tcMar>
+              <w:top w:type="dxa" w:w="60"/>
+              <w:left w:type="dxa" w:w="100"/>
+              <w:bottom w:type="dxa" w:w="60"/>
+              <w:right w:type="dxa" w:w="100"/>
+            </w:tcMar>
+          </w:tcPr>
+          <w:p>
+            <w:r>
+              <w:rPr>
+                <w:b w:val="false"/>
+                <w:bCs w:val="false"/>
+                <w:sz w:val="19"/>
+                <w:szCs w:val="19"/>
+              </w:rPr>
+              <w:t xml:space="preserve">A save is only reclaimed after 2 minutes without a stamp, however long it has been running.</w:t>
+            </w:r>
+          </w:p>
+        </w:tc>
+      </w:tr>
+      <w:tr>
+        <w:tc>
+          <w:tcPr>
+            <w:tcW w:type="dxa" w:w="2600"/>
+            <w:tcBorders>
+              <w:top w:val="single" w:color="BFBFBF" w:sz="4"/>
+              <w:left w:val="single" w:color="BFBFBF" w:sz="4"/>
+              <w:bottom w:val="single" w:color="BFBFBF" w:sz="4"/>
+              <w:right w:val="single" w:color="BFBFBF" w:sz="4"/>
+            </w:tcBorders>
+            <w:tcMar>
+              <w:top w:type="dxa" w:w="60"/>
+              <w:left w:type="dxa" w:w="100"/>
+              <w:bottom w:type="dxa" w:w="60"/>
+              <w:right w:type="dxa" w:w="100"/>
+            </w:tcMar>
+          </w:tcPr>
+          <w:p>
+            <w:r>
+              <w:rPr>
+                <w:b w:val="false"/>
+                <w:bCs w:val="false"/>
+                <w:sz w:val="19"/>
+                <w:szCs w:val="19"/>
+              </w:rPr>
+              <w:t xml:space="preserve">A Run ingesting with no heartbeatAt is treated as stale</w:t>
+            </w:r>
+          </w:p>
+        </w:tc>
+        <w:tc>
+          <w:tcPr>
+            <w:tcW w:type="dxa" w:w="3400"/>
+            <w:tcBorders>
+              <w:top w:val="single" w:color="BFBFBF" w:sz="4"/>
+              <w:left w:val="single" w:color="BFBFBF" w:sz="4"/>
+              <w:bottom w:val="single" w:color="BFBFBF" w:sz="4"/>
+              <w:right w:val="single" w:color="BFBFBF" w:sz="4"/>
+            </w:tcBorders>
+            <w:tcMar>
+              <w:top w:type="dxa" w:w="60"/>
+              <w:left w:type="dxa" w:w="100"/>
+              <w:bottom w:type="dxa" w:w="60"/>
+              <w:right w:type="dxa" w:w="100"/>
+            </w:tcMar>
+          </w:tcPr>
+          <w:p>
+            <w:r>
+              <w:rPr>
+                <w:b w:val="false"/>
+                <w:bCs w:val="false"/>
+                <w:sz w:val="19"/>
+                <w:szCs w:val="19"/>
+              </w:rPr>
+              <w:t xml:space="preserve">Every claim now sets the stamp, so a missing one can only come from before this change.</w:t>
+            </w:r>
+          </w:p>
+        </w:tc>
+        <w:tc>
+          <w:tcPr>
+            <w:tcW w:type="dxa" w:w="3026"/>
+            <w:tcBorders>
+              <w:top w:val="single" w:color="BFBFBF" w:sz="4"/>
+              <w:left w:val="single" w:color="BFBFBF" w:sz="4"/>
+              <w:bottom w:val="single" w:color="BFBFBF" w:sz="4"/>
+              <w:right w:val="single" w:color="BFBFBF" w:sz="4"/>
+            </w:tcBorders>
+            <w:tcMar>
+              <w:top w:type="dxa" w:w="60"/>
+              <w:left w:type="dxa" w:w="100"/>
+              <w:bottom w:type="dxa" w:w="60"/>
+              <w:right w:type="dxa" w:w="100"/>
+            </w:tcMar>
+          </w:tcPr>
+          <w:p>
+            <w:r>
+              <w:rPr>
+                <w:b w:val="false"/>
+                <w:bCs w:val="false"/>
+                <w:sz w:val="19"/>
+                <w:szCs w:val="19"/>
+              </w:rPr>
+              <w:t xml:space="preserve"/>
+            </w:r>
+          </w:p>
+        </w:tc>
+      </w:tr>
+      <w:tr>
+        <w:tc>
+          <w:tcPr>
+            <w:tcW w:type="dxa" w:w="2600"/>
+            <w:tcBorders>
+              <w:top w:val="single" w:color="BFBFBF" w:sz="4"/>
+              <w:left w:val="single" w:color="BFBFBF" w:sz="4"/>
+              <w:bottom w:val="single" w:color="BFBFBF" w:sz="4"/>
+              <w:right w:val="single" w:color="BFBFBF" w:sz="4"/>
+            </w:tcBorders>
+            <w:tcMar>
+              <w:top w:type="dxa" w:w="60"/>
+              <w:left w:type="dxa" w:w="100"/>
+              <w:bottom w:type="dxa" w:w="60"/>
+              <w:right w:type="dxa" w:w="100"/>
+            </w:tcMar>
+          </w:tcPr>
+          <w:p>
+            <w:r>
+              <w:rPr>
+                <w:b w:val="false"/>
+                <w:bCs w:val="false"/>
+                <w:sz w:val="19"/>
+                <w:szCs w:val="19"/>
+              </w:rPr>
+              <w:t xml:space="preserve">Explore saves replace the wave's rows</w:t>
+            </w:r>
+          </w:p>
+        </w:tc>
+        <w:tc>
+          <w:tcPr>
+            <w:tcW w:type="dxa" w:w="3400"/>
+            <w:tcBorders>
+              <w:top w:val="single" w:color="BFBFBF" w:sz="4"/>
+              <w:left w:val="single" w:color="BFBFBF" w:sz="4"/>
+              <w:bottom w:val="single" w:color="BFBFBF" w:sz="4"/>
+              <w:right w:val="single" w:color="BFBFBF" w:sz="4"/>
+            </w:tcBorders>
+            <w:tcMar>
+              <w:top w:type="dxa" w:w="60"/>
+              <w:left w:type="dxa" w:w="100"/>
+              <w:bottom w:type="dxa" w:w="60"/>
+              <w:right w:type="dxa" w:w="100"/>
+            </w:tcMar>
+          </w:tcPr>
+          <w:p>
+            <w:r>
+              <w:rPr>
+                <w:b w:val="false"/>
+                <w:bCs w:val="false"/>
+                <w:sz w:val="19"/>
+                <w:szCs w:val="19"/>
+              </w:rPr>
+              <w:t xml:space="preserve">If a save committed and then its process died before marking the Run done, the retry would otherwise store the jobs twice.</w:t>
+            </w:r>
+          </w:p>
+        </w:tc>
+        <w:tc>
+          <w:tcPr>
+            <w:tcW w:type="dxa" w:w="3026"/>
+            <w:tcBorders>
+              <w:top w:val="single" w:color="BFBFBF" w:sz="4"/>
+              <w:left w:val="single" w:color="BFBFBF" w:sz="4"/>
+              <w:bottom w:val="single" w:color="BFBFBF" w:sz="4"/>
+              <w:right w:val="single" w:color="BFBFBF" w:sz="4"/>
+            </w:tcBorders>
+            <w:tcMar>
+              <w:top w:type="dxa" w:w="60"/>
+              <w:left w:type="dxa" w:w="100"/>
+              <w:bottom w:type="dxa" w:w="60"/>
+              <w:right w:type="dxa" w:w="100"/>
+            </w:tcMar>
+          </w:tcPr>
+          <w:p>
+            <w:r>
+              <w:rPr>
+                <w:b w:val="false"/>
+                <w:bCs w:val="false"/>
+                <w:sz w:val="19"/>
+                <w:szCs w:val="19"/>
+              </w:rPr>
+              <w:t xml:space="preserve">Battlefield saves were already safe through the (battlefieldId, atsJobId) unique index.</w:t>
+            </w:r>
+          </w:p>
+        </w:tc>
+      </w:tr>
+    </w:tbl>
+    <w:p>
+      <w:pPr>
+        <w:spacing w:after="120"/>
+      </w:pPr>
+    </w:p>
+    <w:p>
+      <w:pPr>
+        <w:pStyle w:val="Heading2"/>
+      </w:pPr>
+      <w:r>
+        <w:t xml:space="preserve">Problems found</w:t>
+      </w:r>
+    </w:p>
+    <w:tbl>
+      <w:tblPr>
+        <w:tblW w:type="dxa" w:w="9026"/>
+        <w:tblBorders>
+          <w:top w:val="single" w:color="auto" w:sz="4"/>
+          <w:left w:val="single" w:color="auto" w:sz="4"/>
+          <w:bottom w:val="single" w:color="auto" w:sz="4"/>
+          <w:right w:val="single" w:color="auto" w:sz="4"/>
+          <w:insideH w:val="single" w:color="auto" w:sz="4"/>
+          <w:insideV w:val="single" w:color="auto" w:sz="4"/>
+        </w:tblBorders>
+      </w:tblPr>
+      <w:tblGrid>
+        <w:gridCol w:w="2800"/>
+        <w:gridCol w:w="3300"/>
+        <w:gridCol w:w="2926"/>
+      </w:tblGrid>
+      <w:tr>
+        <w:trPr>
+          <w:tblHeader/>
+        </w:trPr>
+        <w:tc>
+          <w:tcPr>
+            <w:tcW w:type="dxa" w:w="2800"/>
+            <w:tcBorders>
+              <w:top w:val="single" w:color="BFBFBF" w:sz="4"/>
+              <w:left w:val="single" w:color="BFBFBF" w:sz="4"/>
+              <w:bottom w:val="single" w:color="BFBFBF" w:sz="4"/>
+              <w:right w:val="single" w:color="BFBFBF" w:sz="4"/>
+            </w:tcBorders>
+            <w:shd w:fill="EDEDED" w:color="auto" w:val="clear"/>
+            <w:tcMar>
+              <w:top w:type="dxa" w:w="60"/>
+              <w:left w:type="dxa" w:w="100"/>
+              <w:bottom w:type="dxa" w:w="60"/>
+              <w:right w:type="dxa" w:w="100"/>
+            </w:tcMar>
+          </w:tcPr>
+          <w:p>
+            <w:r>
+              <w:rPr>
+                <w:b/>
+                <w:bCs/>
+                <w:sz w:val="19"/>
+                <w:szCs w:val="19"/>
+              </w:rPr>
+              <w:t xml:space="preserve">Symptom</w:t>
+            </w:r>
+          </w:p>
+        </w:tc>
+        <w:tc>
+          <w:tcPr>
+            <w:tcW w:type="dxa" w:w="3300"/>
+            <w:tcBorders>
+              <w:top w:val="single" w:color="BFBFBF" w:sz="4"/>
+              <w:left w:val="single" w:color="BFBFBF" w:sz="4"/>
+              <w:bottom w:val="single" w:color="BFBFBF" w:sz="4"/>
+              <w:right w:val="single" w:color="BFBFBF" w:sz="4"/>
+            </w:tcBorders>
+            <w:shd w:fill="EDEDED" w:color="auto" w:val="clear"/>
+            <w:tcMar>
+              <w:top w:type="dxa" w:w="60"/>
+              <w:left w:type="dxa" w:w="100"/>
+              <w:bottom w:type="dxa" w:w="60"/>
+              <w:right w:type="dxa" w:w="100"/>
+            </w:tcMar>
+          </w:tcPr>
+          <w:p>
+            <w:r>
+              <w:rPr>
+                <w:b/>
+                <w:bCs/>
+                <w:sz w:val="19"/>
+                <w:szCs w:val="19"/>
+              </w:rPr>
+              <w:t xml:space="preserve">Cause</w:t>
+            </w:r>
+          </w:p>
+        </w:tc>
+        <w:tc>
+          <w:tcPr>
+            <w:tcW w:type="dxa" w:w="2926"/>
+            <w:tcBorders>
+              <w:top w:val="single" w:color="BFBFBF" w:sz="4"/>
+              <w:left w:val="single" w:color="BFBFBF" w:sz="4"/>
+              <w:bottom w:val="single" w:color="BFBFBF" w:sz="4"/>
+              <w:right w:val="single" w:color="BFBFBF" w:sz="4"/>
+            </w:tcBorders>
+            <w:shd w:fill="EDEDED" w:color="auto" w:val="clear"/>
+            <w:tcMar>
+              <w:top w:type="dxa" w:w="60"/>
+              <w:left w:type="dxa" w:w="100"/>
+              <w:bottom w:type="dxa" w:w="60"/>
+              <w:right w:type="dxa" w:w="100"/>
+            </w:tcMar>
+          </w:tcPr>
+          <w:p>
+            <w:r>
+              <w:rPr>
+                <w:b/>
+                <w:bCs/>
+                <w:sz w:val="19"/>
+                <w:szCs w:val="19"/>
+              </w:rPr>
+              <w:t xml:space="preserve">Resolution</w:t>
+            </w:r>
+          </w:p>
+        </w:tc>
+      </w:tr>
+      <w:tr>
+        <w:tc>
+          <w:tcPr>
+            <w:tcW w:type="dxa" w:w="2800"/>
+            <w:tcBorders>
+              <w:top w:val="single" w:color="BFBFBF" w:sz="4"/>
+              <w:left w:val="single" w:color="BFBFBF" w:sz="4"/>
+              <w:bottom w:val="single" w:color="BFBFBF" w:sz="4"/>
+              <w:right w:val="single" w:color="BFBFBF" w:sz="4"/>
+            </w:tcBorders>
+            <w:tcMar>
+              <w:top w:type="dxa" w:w="60"/>
+              <w:left w:type="dxa" w:w="100"/>
+              <w:bottom w:type="dxa" w:w="60"/>
+              <w:right w:type="dxa" w:w="100"/>
+            </w:tcMar>
+          </w:tcPr>
+          <w:p>
+            <w:r>
+              <w:rPr>
+                <w:b w:val="false"/>
+                <w:bCs w:val="false"/>
+                <w:sz w:val="19"/>
+                <w:szCs w:val="19"/>
+              </w:rPr>
+              <w:t xml:space="preserve">During testing, a sweep reported reclaimed=1 while a deliberately slow save was running.</w:t>
+            </w:r>
+          </w:p>
+        </w:tc>
+        <w:tc>
+          <w:tcPr>
+            <w:tcW w:type="dxa" w:w="3300"/>
+            <w:tcBorders>
+              <w:top w:val="single" w:color="BFBFBF" w:sz="4"/>
+              <w:left w:val="single" w:color="BFBFBF" w:sz="4"/>
+              <w:bottom w:val="single" w:color="BFBFBF" w:sz="4"/>
+              <w:right w:val="single" w:color="BFBFBF" w:sz="4"/>
+            </w:tcBorders>
+            <w:tcMar>
+              <w:top w:type="dxa" w:w="60"/>
+              <w:left w:type="dxa" w:w="100"/>
+              <w:bottom w:type="dxa" w:w="60"/>
+              <w:right w:type="dxa" w:w="100"/>
+            </w:tcMar>
+          </w:tcPr>
+          <w:p>
+            <w:r>
+              <w:rPr>
+                <w:b w:val="false"/>
+                <w:bCs w:val="false"/>
+                <w:sz w:val="19"/>
+                <w:szCs w:val="19"/>
+              </w:rPr>
+              <w:t xml:space="preserve">The reclaimed Run was a leftover test Run from the previous scenario whose heartbeat had genuinely gone stale, not the slow save.</w:t>
+            </w:r>
+          </w:p>
+        </w:tc>
+        <w:tc>
+          <w:tcPr>
+            <w:tcW w:type="dxa" w:w="2926"/>
+            <w:tcBorders>
+              <w:top w:val="single" w:color="BFBFBF" w:sz="4"/>
+              <w:left w:val="single" w:color="BFBFBF" w:sz="4"/>
+              <w:bottom w:val="single" w:color="BFBFBF" w:sz="4"/>
+              <w:right w:val="single" w:color="BFBFBF" w:sz="4"/>
+            </w:tcBorders>
+            <w:tcMar>
+              <w:top w:type="dxa" w:w="60"/>
+              <w:left w:type="dxa" w:w="100"/>
+              <w:bottom w:type="dxa" w:w="60"/>
+              <w:right w:type="dxa" w:w="100"/>
+            </w:tcMar>
+          </w:tcPr>
+          <w:p>
+            <w:r>
+              <w:rPr>
+                <w:b w:val="false"/>
+                <w:bCs w:val="false"/>
+                <w:sz w:val="19"/>
+                <w:szCs w:val="19"/>
+              </w:rPr>
+              <w:t xml:space="preserve">Confirmed from finish times: the slow save finished on its own after 2 min 35 s; the leftover was reclaimed and re-saved. Working as designed.</w:t>
+            </w:r>
+          </w:p>
+        </w:tc>
+      </w:tr>
+    </w:tbl>
+    <w:p>
+      <w:pPr>
+        <w:spacing w:after="120"/>
+      </w:pPr>
+    </w:p>
+    <w:p>
+      <w:pPr>
+        <w:pStyle w:val="Heading2"/>
+      </w:pPr>
+      <w:r>
+        <w:t xml:space="preserve">Verification</w:t>
+      </w:r>
+    </w:p>
+    <w:p>
+      <w:pPr>
+        <w:pStyle w:val="ListParagraph"/>
+        <w:numPr>
+          <w:ilvl w:val="0"/>
+          <w:numId w:val="2"/>
+        </w:numPr>
+        <w:spacing w:after="60"/>
+      </w:pPr>
+      <w:r>
+        <w:t xml:space="preserve">tsc and eslint clean; migrate diff empty after applying.</w:t>
+      </w:r>
+    </w:p>
+    <w:p>
+      <w:pPr>
+        <w:pStyle w:val="ListParagraph"/>
+        <w:numPr>
+          <w:ilvl w:val="0"/>
+          <w:numId w:val="2"/>
+        </w:numPr>
+        <w:spacing w:after="60"/>
+      </w:pPr>
+      <w:r>
+        <w:t xml:space="preserve">Test Runs pointed at an already finished Apify run (no new Apify cost). One sweep reclaimed and re-saved a Run ingesting with a 5-minute-old stamp and a Run with no stamp, and left a Run with a 30-second-old stamp alone. The stale Run's wave already had 1 row from the dead save and ended with 1, not 2.</w:t>
+      </w:r>
+    </w:p>
+    <w:p>
+      <w:pPr>
+        <w:pStyle w:val="ListParagraph"/>
+        <w:numPr>
+          <w:ilvl w:val="0"/>
+          <w:numId w:val="2"/>
+        </w:numPr>
+        <w:spacing w:after="60"/>
+      </w:pPr>
+      <w:r>
+        <w:t xml:space="preserve">Slow save: with a temporary 150-second pause in the save (removed before commit), heartbeatAt stayed 3 to 4 seconds old throughout, a sweep 135 seconds in did not reclaim it, and it finished normally.</w:t>
+      </w:r>
+    </w:p>
+    <w:p>
+      <w:pPr>
+        <w:pStyle w:val="ListParagraph"/>
+        <w:numPr>
+          <w:ilvl w:val="0"/>
+          <w:numId w:val="2"/>
+        </w:numPr>
+        <w:spacing w:after="60"/>
+      </w:pPr>
+      <w:r>
+        <w:t xml:space="preserve">All test Runs, waves and jobs were deleted afterwards.</w:t>
+      </w:r>
+    </w:p>
+    <w:p>
+      <w:pPr>
+        <w:pStyle w:val="Heading2"/>
+      </w:pPr>
+      <w:r>
+        <w:t xml:space="preserve">Known risks left behind</w:t>
+      </w:r>
+    </w:p>
+    <w:p>
+      <w:pPr>
+        <w:pStyle w:val="ListParagraph"/>
+        <w:numPr>
+          <w:ilvl w:val="0"/>
+          <w:numId w:val="2"/>
+        </w:numPr>
+        <w:spacing w:after="60"/>
+      </w:pPr>
+      <w:r>
+        <w:t xml:space="preserve">If the database stops accepting the heartbeat writes for over 2 minutes while the saver itself is still alive, the sweep can start a second save of the same Run. Battlefield saves dedupe and Explore saves replace, so the data stays correct, but jobsNew and Auto-Rank can miss jobs the first save inserted.</w:t>
+      </w:r>
+    </w:p>
+    <w:p>
+      <w:pPr>
+        <w:pStyle w:val="ListParagraph"/>
+        <w:numPr>
+          <w:ilvl w:val="0"/>
+          <w:numId w:val="2"/>
+        </w:numPr>
+        <w:spacing w:after="60"/>
+      </w:pPr>
+      <w:r>
+        <w:t xml:space="preserve">A retried Battlefield save counts jobs the dead save already inserted as existing, so they are not reported as new or auto-ranked.</w:t>
+      </w:r>
+    </w:p>
+    <w:p>
+      <w:pPr>
+        <w:pStyle w:val="Heading2"/>
+      </w:pPr>
+      <w:r>
+        <w:t xml:space="preserve">Production data changes</w:t>
+      </w:r>
+    </w:p>
+    <w:p>
+      <w:pPr>
+        <w:pStyle w:val="ListParagraph"/>
+        <w:numPr>
+          <w:ilvl w:val="0"/>
+          <w:numId w:val="2"/>
+        </w:numPr>
+        <w:spacing w:after="60"/>
+      </w:pPr>
+      <w:r>
+        <w:t xml:space="preserve">Applied migration 20260924160000_run_heartbeat (additive). No test data kept.</w:t>
       </w:r>
     </w:p>
     <w:sectPr>

</xml_diff>

<commit_message>
CLAUDE.md and post-mortem: the design system rebuild
Co-Authored-By: Claude Opus 5.5 <noreply@anthropic.com>
</commit_message>
<xml_diff>
--- a/docs/KAMUI-postmortem.docx
+++ b/docs/KAMUI-postmortem.docx
@@ -21,7 +21,7 @@
         <w:rPr>
           <w:color w:val="666666"/>
         </w:rPr>
-        <w:t xml:space="preserve">Last updated 2026-09-24, after the heartbeat fix.</w:t>
+        <w:t xml:space="preserve">Last updated 2026-09-24, after the design system rebuild.</w:t>
       </w:r>
     </w:p>
     <w:p>
@@ -84,7 +84,7 @@
         <w:pStyle w:val="Heading1"/>
       </w:pPr>
       <w:r>
-        <w:t xml:space="preserve">The system after the heartbeat fix</w:t>
+        <w:t xml:space="preserve">The system after the design system rebuild</w:t>
       </w:r>
     </w:p>
     <w:p>
@@ -137,6 +137,19 @@
       </w:pPr>
       <w:r>
         <w:t xml:space="preserve">Battlefields are the organising unit: each has its own keywords, excludes, locations, caps, versioned rubric and jobs. Pages select one with ?battlefield=&lt;slug&gt;.</w:t>
+      </w:r>
+    </w:p>
+    <w:p>
+      <w:pPr>
+        <w:pStyle w:val="ListParagraph"/>
+        <w:numPr>
+          <w:ilvl w:val="0"/>
+          <w:numId w:val="2"/>
+        </w:numPr>
+        <w:spacing w:after="60"/>
+      </w:pPr>
+      <w:r>
+        <w:t xml:space="preserve">The UI follows kamui-design-package/DESIGN-SYSTEM.md: glass panel over a photograph, global sidebar with Frost and a background cycler, everything in rem off a fluid root size. / is the homepage; Discovery is /battlefields/&lt;slug&gt;.</w:t>
       </w:r>
     </w:p>
     <w:p>
@@ -1144,6 +1157,238 @@
                 <w:szCs w:val="19"/>
               </w:rPr>
               <w:t xml:space="preserve">It picked up a cron config: a railway.json at the repo root, or its config file path set to railway/sweep-cron.json. Only the cron service should use that file.</w:t>
+            </w:r>
+          </w:p>
+        </w:tc>
+      </w:tr>
+      <w:tr>
+        <w:tc>
+          <w:tcPr>
+            <w:tcW w:type="dxa" w:w="3200"/>
+            <w:tcBorders>
+              <w:top w:val="single" w:color="BFBFBF" w:sz="4"/>
+              <w:left w:val="single" w:color="BFBFBF" w:sz="4"/>
+              <w:bottom w:val="single" w:color="BFBFBF" w:sz="4"/>
+              <w:right w:val="single" w:color="BFBFBF" w:sz="4"/>
+            </w:tcBorders>
+            <w:tcMar>
+              <w:top w:type="dxa" w:w="60"/>
+              <w:left w:type="dxa" w:w="100"/>
+              <w:bottom w:type="dxa" w:w="60"/>
+              <w:right w:type="dxa" w:w="100"/>
+            </w:tcMar>
+          </w:tcPr>
+          <w:p>
+            <w:r>
+              <w:rPr>
+                <w:b w:val="false"/>
+                <w:bCs w:val="false"/>
+                <w:sz w:val="19"/>
+                <w:szCs w:val="19"/>
+              </w:rPr>
+              <w:t xml:space="preserve">The UI looks tiny or huge on a new screen</w:t>
+            </w:r>
+          </w:p>
+        </w:tc>
+        <w:tc>
+          <w:tcPr>
+            <w:tcW w:type="dxa" w:w="5826"/>
+            <w:tcBorders>
+              <w:top w:val="single" w:color="BFBFBF" w:sz="4"/>
+              <w:left w:val="single" w:color="BFBFBF" w:sz="4"/>
+              <w:bottom w:val="single" w:color="BFBFBF" w:sz="4"/>
+              <w:right w:val="single" w:color="BFBFBF" w:sz="4"/>
+            </w:tcBorders>
+            <w:tcMar>
+              <w:top w:type="dxa" w:w="60"/>
+              <w:left w:type="dxa" w:w="100"/>
+              <w:bottom w:type="dxa" w:w="60"/>
+              <w:right w:type="dxa" w:w="100"/>
+            </w:tcMar>
+          </w:tcPr>
+          <w:p>
+            <w:r>
+              <w:rPr>
+                <w:b w:val="false"/>
+                <w:bCs w:val="false"/>
+                <w:sz w:val="19"/>
+                <w:szCs w:val="19"/>
+              </w:rPr>
+              <w:t xml:space="preserve">The root font size is clamp(15px, min(1.111vw, 1.633vh), 36px) in web/app/globals.css; every size is in rem, so adjust that one line.</w:t>
+            </w:r>
+          </w:p>
+        </w:tc>
+      </w:tr>
+      <w:tr>
+        <w:tc>
+          <w:tcPr>
+            <w:tcW w:type="dxa" w:w="3200"/>
+            <w:tcBorders>
+              <w:top w:val="single" w:color="BFBFBF" w:sz="4"/>
+              <w:left w:val="single" w:color="BFBFBF" w:sz="4"/>
+              <w:bottom w:val="single" w:color="BFBFBF" w:sz="4"/>
+              <w:right w:val="single" w:color="BFBFBF" w:sz="4"/>
+            </w:tcBorders>
+            <w:tcMar>
+              <w:top w:type="dxa" w:w="60"/>
+              <w:left w:type="dxa" w:w="100"/>
+              <w:bottom w:type="dxa" w:w="60"/>
+              <w:right w:type="dxa" w:w="100"/>
+            </w:tcMar>
+          </w:tcPr>
+          <w:p>
+            <w:r>
+              <w:rPr>
+                <w:b w:val="false"/>
+                <w:bCs w:val="false"/>
+                <w:sz w:val="19"/>
+                <w:szCs w:val="19"/>
+              </w:rPr>
+              <w:t xml:space="preserve">Frost or the background resets on every visit</w:t>
+            </w:r>
+          </w:p>
+        </w:tc>
+        <w:tc>
+          <w:tcPr>
+            <w:tcW w:type="dxa" w:w="5826"/>
+            <w:tcBorders>
+              <w:top w:val="single" w:color="BFBFBF" w:sz="4"/>
+              <w:left w:val="single" w:color="BFBFBF" w:sz="4"/>
+              <w:bottom w:val="single" w:color="BFBFBF" w:sz="4"/>
+              <w:right w:val="single" w:color="BFBFBF" w:sz="4"/>
+            </w:tcBorders>
+            <w:tcMar>
+              <w:top w:type="dxa" w:w="60"/>
+              <w:left w:type="dxa" w:w="100"/>
+              <w:bottom w:type="dxa" w:w="60"/>
+              <w:right w:type="dxa" w:w="100"/>
+            </w:tcMar>
+          </w:tcPr>
+          <w:p>
+            <w:r>
+              <w:rPr>
+                <w:b w:val="false"/>
+                <w:bCs w:val="false"/>
+                <w:sz w:val="19"/>
+                <w:szCs w:val="19"/>
+              </w:rPr>
+              <w:t xml:space="preserve">localStorage is blocked or cleared in that browser. Keys: kamui.frost.view|strength|focus and kamui.background.</w:t>
+            </w:r>
+          </w:p>
+        </w:tc>
+      </w:tr>
+      <w:tr>
+        <w:tc>
+          <w:tcPr>
+            <w:tcW w:type="dxa" w:w="3200"/>
+            <w:tcBorders>
+              <w:top w:val="single" w:color="BFBFBF" w:sz="4"/>
+              <w:left w:val="single" w:color="BFBFBF" w:sz="4"/>
+              <w:bottom w:val="single" w:color="BFBFBF" w:sz="4"/>
+              <w:right w:val="single" w:color="BFBFBF" w:sz="4"/>
+            </w:tcBorders>
+            <w:tcMar>
+              <w:top w:type="dxa" w:w="60"/>
+              <w:left w:type="dxa" w:w="100"/>
+              <w:bottom w:type="dxa" w:w="60"/>
+              <w:right w:type="dxa" w:w="100"/>
+            </w:tcMar>
+          </w:tcPr>
+          <w:p>
+            <w:r>
+              <w:rPr>
+                <w:b w:val="false"/>
+                <w:bCs w:val="false"/>
+                <w:sz w:val="19"/>
+                <w:szCs w:val="19"/>
+              </w:rPr>
+              <w:t xml:space="preserve">A new background photo does not appear in the cycler</w:t>
+            </w:r>
+          </w:p>
+        </w:tc>
+        <w:tc>
+          <w:tcPr>
+            <w:tcW w:type="dxa" w:w="5826"/>
+            <w:tcBorders>
+              <w:top w:val="single" w:color="BFBFBF" w:sz="4"/>
+              <w:left w:val="single" w:color="BFBFBF" w:sz="4"/>
+              <w:bottom w:val="single" w:color="BFBFBF" w:sz="4"/>
+              <w:right w:val="single" w:color="BFBFBF" w:sz="4"/>
+            </w:tcBorders>
+            <w:tcMar>
+              <w:top w:type="dxa" w:w="60"/>
+              <w:left w:type="dxa" w:w="100"/>
+              <w:bottom w:type="dxa" w:w="60"/>
+              <w:right w:type="dxa" w:w="100"/>
+            </w:tcMar>
+          </w:tcPr>
+          <w:p>
+            <w:r>
+              <w:rPr>
+                <w:b w:val="false"/>
+                <w:bCs w:val="false"/>
+                <w:sz w:val="19"/>
+                <w:szCs w:val="19"/>
+              </w:rPr>
+              <w:t xml:space="preserve">Put the original in &lt;repo&gt;/images, run npm run backgrounds in web/, and commit web/public/backgrounds.</w:t>
+            </w:r>
+          </w:p>
+        </w:tc>
+      </w:tr>
+      <w:tr>
+        <w:tc>
+          <w:tcPr>
+            <w:tcW w:type="dxa" w:w="3200"/>
+            <w:tcBorders>
+              <w:top w:val="single" w:color="BFBFBF" w:sz="4"/>
+              <w:left w:val="single" w:color="BFBFBF" w:sz="4"/>
+              <w:bottom w:val="single" w:color="BFBFBF" w:sz="4"/>
+              <w:right w:val="single" w:color="BFBFBF" w:sz="4"/>
+            </w:tcBorders>
+            <w:tcMar>
+              <w:top w:type="dxa" w:w="60"/>
+              <w:left w:type="dxa" w:w="100"/>
+              <w:bottom w:type="dxa" w:w="60"/>
+              <w:right w:type="dxa" w:w="100"/>
+            </w:tcMar>
+          </w:tcPr>
+          <w:p>
+            <w:r>
+              <w:rPr>
+                <w:b w:val="false"/>
+                <w:bCs w:val="false"/>
+                <w:sz w:val="19"/>
+                <w:szCs w:val="19"/>
+              </w:rPr>
+              <w:t xml:space="preserve">Homepage new count looks wrong</w:t>
+            </w:r>
+          </w:p>
+        </w:tc>
+        <w:tc>
+          <w:tcPr>
+            <w:tcW w:type="dxa" w:w="5826"/>
+            <w:tcBorders>
+              <w:top w:val="single" w:color="BFBFBF" w:sz="4"/>
+              <w:left w:val="single" w:color="BFBFBF" w:sz="4"/>
+              <w:bottom w:val="single" w:color="BFBFBF" w:sz="4"/>
+              <w:right w:val="single" w:color="BFBFBF" w:sz="4"/>
+            </w:tcBorders>
+            <w:tcMar>
+              <w:top w:type="dxa" w:w="60"/>
+              <w:left w:type="dxa" w:w="100"/>
+              <w:bottom w:type="dxa" w:w="60"/>
+              <w:right w:type="dxa" w:w="100"/>
+            </w:tcMar>
+          </w:tcPr>
+          <w:p>
+            <w:r>
+              <w:rPr>
+                <w:b w:val="false"/>
+                <w:bCs w:val="false"/>
+                <w:sz w:val="19"/>
+                <w:szCs w:val="19"/>
+              </w:rPr>
+              <w:t xml:space="preserve">New = jobs with firstSeen after Battlefield.lastViewedAt, set when Discovery opens. Promoted Explore jobs keep the wave's firstSeen.</w:t>
             </w:r>
           </w:p>
         </w:tc>
@@ -9608,6 +9853,1498 @@
       </w:pPr>
       <w:r>
         <w:t xml:space="preserve">Applied migration 20260924160000_run_heartbeat (additive). No test data kept.</w:t>
+      </w:r>
+    </w:p>
+    <w:p>
+      <w:pPr>
+        <w:pStyle w:val="Heading1"/>
+      </w:pPr>
+      <w:r>
+        <w:t xml:space="preserve">UI rebuild on the KAMUI design system</w:t>
+      </w:r>
+    </w:p>
+    <w:p>
+      <w:pPr>
+        <w:spacing w:after="120"/>
+        <w:rPr>
+          <w:color w:val="666666"/>
+          <w:sz w:val="20"/>
+          <w:szCs w:val="20"/>
+        </w:rPr>
+      </w:pPr>
+      <w:r>
+        <w:rPr>
+          <w:color w:val="666666"/>
+          <w:sz w:val="20"/>
+          <w:szCs w:val="20"/>
+        </w:rPr>
+        <w:t xml:space="preserve">2026-09-25  ·  commit e850750, f9d0c0f, bb6e6f9</w:t>
+      </w:r>
+    </w:p>
+    <w:p>
+      <w:pPr>
+        <w:spacing w:after="120"/>
+      </w:pPr>
+      <w:r>
+        <w:t xml:space="preserve">Rebuilt the whole UI to kamui-design-package/DESIGN-SYSTEM.md: a glass panel over a photograph, the global sidebar with Frost controls, self-hosted fonts, a new homepage, and Discovery, Tracking, Explore and settings in the new style. Added user-requested extras: a background cycler over the user's own photographs, and scaling to any screen size (the reference files were fixed at 1440x980 and did not fill a 4K monitor).</w:t>
+      </w:r>
+    </w:p>
+    <w:p>
+      <w:pPr>
+        <w:pStyle w:val="Heading2"/>
+      </w:pPr>
+      <w:r>
+        <w:t xml:space="preserve">What changed</w:t>
+      </w:r>
+    </w:p>
+    <w:p>
+      <w:pPr>
+        <w:pStyle w:val="ListParagraph"/>
+        <w:numPr>
+          <w:ilvl w:val="0"/>
+          <w:numId w:val="2"/>
+        </w:numPr>
+        <w:spacing w:after="60"/>
+      </w:pPr>
+      <w:r>
+        <w:t xml:space="preserve">Shell in web/app/layout.tsx: fixed photograph, tint, glass panel (frost-panel class reading --frost-* variables), the sidebar (web/app/shell/Sidebar.tsx) and main area. An inline head script (shell/frost.ts bootScript) applies stored Frost and background before first paint.</w:t>
+      </w:r>
+    </w:p>
+    <w:p>
+      <w:pPr>
+        <w:pStyle w:val="ListParagraph"/>
+        <w:numPr>
+          <w:ilvl w:val="0"/>
+          <w:numId w:val="2"/>
+        </w:numPr>
+        <w:spacing w:after="60"/>
+      </w:pPr>
+      <w:r>
+        <w:t xml:space="preserve">Design tokens in web/app/globals.css: palette, grade dots, glass fills, the type scale as text-* tokens in rem, radii, widths, panel shadow, hover fill. Fluid root size clamp(15px, min(1.111vw, 1.633vh), 36px).</w:t>
+      </w:r>
+    </w:p>
+    <w:p>
+      <w:pPr>
+        <w:pStyle w:val="ListParagraph"/>
+        <w:numPr>
+          <w:ilvl w:val="0"/>
+          <w:numId w:val="2"/>
+        </w:numPr>
+        <w:spacing w:after="60"/>
+      </w:pPr>
+      <w:r>
+        <w:t xml:space="preserve">Fonts in web/app/fonts via next/font: Neutralface (Regular, Bold OTF), Aspekta 400-700 (WOFF2); Noto Sans JP and IBM Plex Mono from next/font/google.</w:t>
+      </w:r>
+    </w:p>
+    <w:p>
+      <w:pPr>
+        <w:pStyle w:val="ListParagraph"/>
+        <w:numPr>
+          <w:ilvl w:val="0"/>
+          <w:numId w:val="2"/>
+        </w:numPr>
+        <w:spacing w:after="60"/>
+      </w:pPr>
+      <w:r>
+        <w:t xml:space="preserve">Backgrounds: web/scripts/sync-backgrounds.mjs (npm run backgrounds) resizes &lt;repo&gt;/images to 3840 px progressive JPEGs in web/public/backgrounds (53 MB of originals to 5.3 MB). The sidebar's Next button cycles them; the choice persists in localStorage.</w:t>
+      </w:r>
+    </w:p>
+    <w:p>
+      <w:pPr>
+        <w:pStyle w:val="ListParagraph"/>
+        <w:numPr>
+          <w:ilvl w:val="0"/>
+          <w:numId w:val="2"/>
+        </w:numPr>
+        <w:spacing w:after="60"/>
+      </w:pPr>
+      <w:r>
+        <w:t xml:space="preserve">Routes: Discovery moved from / to /battlefields/&lt;slug&gt;; / is the new homepage; /?battlefield=&lt;slug&gt; redirects. BattlefieldSwitch removed (the sidebar replaces it).</w:t>
+      </w:r>
+    </w:p>
+    <w:p>
+      <w:pPr>
+        <w:pStyle w:val="ListParagraph"/>
+        <w:numPr>
+          <w:ilvl w:val="0"/>
+          <w:numId w:val="2"/>
+        </w:numPr>
+        <w:spacing w:after="60"/>
+      </w:pPr>
+      <w:r>
+        <w:t xml:space="preserve">Homepage (app/page.tsx, Home.tsx): kana banner, Welcome, new-jobs subhead, one tile per Battlefield with new and applied and last searched. Migration 20260925120000_battlefield_last_viewed adds Battlefield.lastViewedAt, set by Discovery on open (markViewed).</w:t>
+      </w:r>
+    </w:p>
+    <w:p>
+      <w:pPr>
+        <w:pStyle w:val="ListParagraph"/>
+        <w:numPr>
+          <w:ilvl w:val="0"/>
+          <w:numId w:val="2"/>
+        </w:numPr>
+        <w:spacing w:after="60"/>
+      </w:pPr>
+      <w:r>
+        <w:t xml:space="preserve">Discovery rebuilt (app/battlefields/[slug]/): header with Rank N and Search New; selected-job card with Open posting, Dismiss, stage buttons and note; Score, Grade and Pay stat cards; Why this grade with the key gap and a description toggle; the job list with grade dots, sort and last-seen filter.</w:t>
+      </w:r>
+    </w:p>
+    <w:p>
+      <w:pPr>
+        <w:pStyle w:val="ListParagraph"/>
+        <w:numPr>
+          <w:ilvl w:val="0"/>
+          <w:numId w:val="2"/>
+        </w:numPr>
+        <w:spacing w:after="60"/>
+      </w:pPr>
+      <w:r>
+        <w:t xml:space="preserve">Tracking, Explore, Battlefield settings and New Battlefield restyled per section 9 with the same behaviour.</w:t>
+      </w:r>
+    </w:p>
+    <w:p>
+      <w:pPr>
+        <w:pStyle w:val="Heading2"/>
+      </w:pPr>
+      <w:r>
+        <w:t xml:space="preserve">Decisions and deviations from the spec</w:t>
+      </w:r>
+    </w:p>
+    <w:tbl>
+      <w:tblPr>
+        <w:tblW w:type="dxa" w:w="9026"/>
+        <w:tblBorders>
+          <w:top w:val="single" w:color="auto" w:sz="4"/>
+          <w:left w:val="single" w:color="auto" w:sz="4"/>
+          <w:bottom w:val="single" w:color="auto" w:sz="4"/>
+          <w:right w:val="single" w:color="auto" w:sz="4"/>
+          <w:insideH w:val="single" w:color="auto" w:sz="4"/>
+          <w:insideV w:val="single" w:color="auto" w:sz="4"/>
+        </w:tblBorders>
+      </w:tblPr>
+      <w:tblGrid>
+        <w:gridCol w:w="2600"/>
+        <w:gridCol w:w="3400"/>
+        <w:gridCol w:w="3026"/>
+      </w:tblGrid>
+      <w:tr>
+        <w:trPr>
+          <w:tblHeader/>
+        </w:trPr>
+        <w:tc>
+          <w:tcPr>
+            <w:tcW w:type="dxa" w:w="2600"/>
+            <w:tcBorders>
+              <w:top w:val="single" w:color="BFBFBF" w:sz="4"/>
+              <w:left w:val="single" w:color="BFBFBF" w:sz="4"/>
+              <w:bottom w:val="single" w:color="BFBFBF" w:sz="4"/>
+              <w:right w:val="single" w:color="BFBFBF" w:sz="4"/>
+            </w:tcBorders>
+            <w:shd w:fill="EDEDED" w:color="auto" w:val="clear"/>
+            <w:tcMar>
+              <w:top w:type="dxa" w:w="60"/>
+              <w:left w:type="dxa" w:w="100"/>
+              <w:bottom w:type="dxa" w:w="60"/>
+              <w:right w:type="dxa" w:w="100"/>
+            </w:tcMar>
+          </w:tcPr>
+          <w:p>
+            <w:r>
+              <w:rPr>
+                <w:b/>
+                <w:bCs/>
+                <w:sz w:val="19"/>
+                <w:szCs w:val="19"/>
+              </w:rPr>
+              <w:t xml:space="preserve">Decision</w:t>
+            </w:r>
+          </w:p>
+        </w:tc>
+        <w:tc>
+          <w:tcPr>
+            <w:tcW w:type="dxa" w:w="3400"/>
+            <w:tcBorders>
+              <w:top w:val="single" w:color="BFBFBF" w:sz="4"/>
+              <w:left w:val="single" w:color="BFBFBF" w:sz="4"/>
+              <w:bottom w:val="single" w:color="BFBFBF" w:sz="4"/>
+              <w:right w:val="single" w:color="BFBFBF" w:sz="4"/>
+            </w:tcBorders>
+            <w:shd w:fill="EDEDED" w:color="auto" w:val="clear"/>
+            <w:tcMar>
+              <w:top w:type="dxa" w:w="60"/>
+              <w:left w:type="dxa" w:w="100"/>
+              <w:bottom w:type="dxa" w:w="60"/>
+              <w:right w:type="dxa" w:w="100"/>
+            </w:tcMar>
+          </w:tcPr>
+          <w:p>
+            <w:r>
+              <w:rPr>
+                <w:b/>
+                <w:bCs/>
+                <w:sz w:val="19"/>
+                <w:szCs w:val="19"/>
+              </w:rPr>
+              <w:t xml:space="preserve">Why</w:t>
+            </w:r>
+          </w:p>
+        </w:tc>
+        <w:tc>
+          <w:tcPr>
+            <w:tcW w:type="dxa" w:w="3026"/>
+            <w:tcBorders>
+              <w:top w:val="single" w:color="BFBFBF" w:sz="4"/>
+              <w:left w:val="single" w:color="BFBFBF" w:sz="4"/>
+              <w:bottom w:val="single" w:color="BFBFBF" w:sz="4"/>
+              <w:right w:val="single" w:color="BFBFBF" w:sz="4"/>
+            </w:tcBorders>
+            <w:shd w:fill="EDEDED" w:color="auto" w:val="clear"/>
+            <w:tcMar>
+              <w:top w:type="dxa" w:w="60"/>
+              <w:left w:type="dxa" w:w="100"/>
+              <w:bottom w:type="dxa" w:w="60"/>
+              <w:right w:type="dxa" w:w="100"/>
+            </w:tcMar>
+          </w:tcPr>
+          <w:p>
+            <w:r>
+              <w:rPr>
+                <w:b/>
+                <w:bCs/>
+                <w:sz w:val="19"/>
+                <w:szCs w:val="19"/>
+              </w:rPr>
+              <w:t xml:space="preserve">Consequence / where</w:t>
+            </w:r>
+          </w:p>
+        </w:tc>
+      </w:tr>
+      <w:tr>
+        <w:tc>
+          <w:tcPr>
+            <w:tcW w:type="dxa" w:w="2600"/>
+            <w:tcBorders>
+              <w:top w:val="single" w:color="BFBFBF" w:sz="4"/>
+              <w:left w:val="single" w:color="BFBFBF" w:sz="4"/>
+              <w:bottom w:val="single" w:color="BFBFBF" w:sz="4"/>
+              <w:right w:val="single" w:color="BFBFBF" w:sz="4"/>
+            </w:tcBorders>
+            <w:tcMar>
+              <w:top w:type="dxa" w:w="60"/>
+              <w:left w:type="dxa" w:w="100"/>
+              <w:bottom w:type="dxa" w:w="60"/>
+              <w:right w:type="dxa" w:w="100"/>
+            </w:tcMar>
+          </w:tcPr>
+          <w:p>
+            <w:r>
+              <w:rPr>
+                <w:b w:val="false"/>
+                <w:bCs w:val="false"/>
+                <w:sz w:val="19"/>
+                <w:szCs w:val="19"/>
+              </w:rPr>
+              <w:t xml:space="preserve">Background images come from &lt;repo&gt;/images, not the package's background-source.jpg</w:t>
+            </w:r>
+          </w:p>
+        </w:tc>
+        <w:tc>
+          <w:tcPr>
+            <w:tcW w:type="dxa" w:w="3400"/>
+            <w:tcBorders>
+              <w:top w:val="single" w:color="BFBFBF" w:sz="4"/>
+              <w:left w:val="single" w:color="BFBFBF" w:sz="4"/>
+              <w:bottom w:val="single" w:color="BFBFBF" w:sz="4"/>
+              <w:right w:val="single" w:color="BFBFBF" w:sz="4"/>
+            </w:tcBorders>
+            <w:tcMar>
+              <w:top w:type="dxa" w:w="60"/>
+              <w:left w:type="dxa" w:w="100"/>
+              <w:bottom w:type="dxa" w:w="60"/>
+              <w:right w:type="dxa" w:w="100"/>
+            </w:tcMar>
+          </w:tcPr>
+          <w:p>
+            <w:r>
+              <w:rPr>
+                <w:b w:val="false"/>
+                <w:bCs w:val="false"/>
+                <w:sz w:val="19"/>
+                <w:szCs w:val="19"/>
+              </w:rPr>
+              <w:t xml:space="preserve">User instruction.</w:t>
+            </w:r>
+          </w:p>
+        </w:tc>
+        <w:tc>
+          <w:tcPr>
+            <w:tcW w:type="dxa" w:w="3026"/>
+            <w:tcBorders>
+              <w:top w:val="single" w:color="BFBFBF" w:sz="4"/>
+              <w:left w:val="single" w:color="BFBFBF" w:sz="4"/>
+              <w:bottom w:val="single" w:color="BFBFBF" w:sz="4"/>
+              <w:right w:val="single" w:color="BFBFBF" w:sz="4"/>
+            </w:tcBorders>
+            <w:tcMar>
+              <w:top w:type="dxa" w:w="60"/>
+              <w:left w:type="dxa" w:w="100"/>
+              <w:bottom w:type="dxa" w:w="60"/>
+              <w:right w:type="dxa" w:w="100"/>
+            </w:tcMar>
+          </w:tcPr>
+          <w:p>
+            <w:r>
+              <w:rPr>
+                <w:b w:val="false"/>
+                <w:bCs w:val="false"/>
+                <w:sz w:val="19"/>
+                <w:szCs w:val="19"/>
+              </w:rPr>
+              <w:t xml:space="preserve">The originals folder is gitignored; only the resized copies are committed.</w:t>
+            </w:r>
+          </w:p>
+        </w:tc>
+      </w:tr>
+      <w:tr>
+        <w:tc>
+          <w:tcPr>
+            <w:tcW w:type="dxa" w:w="2600"/>
+            <w:tcBorders>
+              <w:top w:val="single" w:color="BFBFBF" w:sz="4"/>
+              <w:left w:val="single" w:color="BFBFBF" w:sz="4"/>
+              <w:bottom w:val="single" w:color="BFBFBF" w:sz="4"/>
+              <w:right w:val="single" w:color="BFBFBF" w:sz="4"/>
+            </w:tcBorders>
+            <w:tcMar>
+              <w:top w:type="dxa" w:w="60"/>
+              <w:left w:type="dxa" w:w="100"/>
+              <w:bottom w:type="dxa" w:w="60"/>
+              <w:right w:type="dxa" w:w="100"/>
+            </w:tcMar>
+          </w:tcPr>
+          <w:p>
+            <w:r>
+              <w:rPr>
+                <w:b w:val="false"/>
+                <w:bCs w:val="false"/>
+                <w:sz w:val="19"/>
+                <w:szCs w:val="19"/>
+              </w:rPr>
+              <w:t xml:space="preserve">Everything sized in rem off a fluid root font size</w:t>
+            </w:r>
+          </w:p>
+        </w:tc>
+        <w:tc>
+          <w:tcPr>
+            <w:tcW w:type="dxa" w:w="3400"/>
+            <w:tcBorders>
+              <w:top w:val="single" w:color="BFBFBF" w:sz="4"/>
+              <w:left w:val="single" w:color="BFBFBF" w:sz="4"/>
+              <w:bottom w:val="single" w:color="BFBFBF" w:sz="4"/>
+              <w:right w:val="single" w:color="BFBFBF" w:sz="4"/>
+            </w:tcBorders>
+            <w:tcMar>
+              <w:top w:type="dxa" w:w="60"/>
+              <w:left w:type="dxa" w:w="100"/>
+              <w:bottom w:type="dxa" w:w="60"/>
+              <w:right w:type="dxa" w:w="100"/>
+            </w:tcMar>
+          </w:tcPr>
+          <w:p>
+            <w:r>
+              <w:rPr>
+                <w:b w:val="false"/>
+                <w:bCs w:val="false"/>
+                <w:sz w:val="19"/>
+                <w:szCs w:val="19"/>
+              </w:rPr>
+              <w:t xml:space="preserve">The user's 4K monitor showed the fixed-pixel reference tiny. Scaling by min(width/1440, height/980) keeps the designed proportions on any screen.</w:t>
+            </w:r>
+          </w:p>
+        </w:tc>
+        <w:tc>
+          <w:tcPr>
+            <w:tcW w:type="dxa" w:w="3026"/>
+            <w:tcBorders>
+              <w:top w:val="single" w:color="BFBFBF" w:sz="4"/>
+              <w:left w:val="single" w:color="BFBFBF" w:sz="4"/>
+              <w:bottom w:val="single" w:color="BFBFBF" w:sz="4"/>
+              <w:right w:val="single" w:color="BFBFBF" w:sz="4"/>
+            </w:tcBorders>
+            <w:tcMar>
+              <w:top w:type="dxa" w:w="60"/>
+              <w:left w:type="dxa" w:w="100"/>
+              <w:bottom w:type="dxa" w:w="60"/>
+              <w:right w:type="dxa" w:w="100"/>
+            </w:tcMar>
+          </w:tcPr>
+          <w:p>
+            <w:r>
+              <w:rPr>
+                <w:b w:val="false"/>
+                <w:bCs w:val="false"/>
+                <w:sz w:val="19"/>
+                <w:szCs w:val="19"/>
+              </w:rPr>
+              <w:t xml:space="preserve">The 15px floor keeps the 11px sizes above 10px on small laptops; the 36px cap stops runaway sizes. Native range-slider thumbs do not scale.</w:t>
+            </w:r>
+          </w:p>
+        </w:tc>
+      </w:tr>
+      <w:tr>
+        <w:tc>
+          <w:tcPr>
+            <w:tcW w:type="dxa" w:w="2600"/>
+            <w:tcBorders>
+              <w:top w:val="single" w:color="BFBFBF" w:sz="4"/>
+              <w:left w:val="single" w:color="BFBFBF" w:sz="4"/>
+              <w:bottom w:val="single" w:color="BFBFBF" w:sz="4"/>
+              <w:right w:val="single" w:color="BFBFBF" w:sz="4"/>
+            </w:tcBorders>
+            <w:tcMar>
+              <w:top w:type="dxa" w:w="60"/>
+              <w:left w:type="dxa" w:w="100"/>
+              <w:bottom w:type="dxa" w:w="60"/>
+              <w:right w:type="dxa" w:w="100"/>
+            </w:tcMar>
+          </w:tcPr>
+          <w:p>
+            <w:r>
+              <w:rPr>
+                <w:b w:val="false"/>
+                <w:bCs w:val="false"/>
+                <w:sz w:val="19"/>
+                <w:szCs w:val="19"/>
+              </w:rPr>
+              <w:t xml:space="preserve">Where the reference HTML and the spec disagree, the spec wins</w:t>
+            </w:r>
+          </w:p>
+        </w:tc>
+        <w:tc>
+          <w:tcPr>
+            <w:tcW w:type="dxa" w:w="3400"/>
+            <w:tcBorders>
+              <w:top w:val="single" w:color="BFBFBF" w:sz="4"/>
+              <w:left w:val="single" w:color="BFBFBF" w:sz="4"/>
+              <w:bottom w:val="single" w:color="BFBFBF" w:sz="4"/>
+              <w:right w:val="single" w:color="BFBFBF" w:sz="4"/>
+            </w:tcBorders>
+            <w:tcMar>
+              <w:top w:type="dxa" w:w="60"/>
+              <w:left w:type="dxa" w:w="100"/>
+              <w:bottom w:type="dxa" w:w="60"/>
+              <w:right w:type="dxa" w:w="100"/>
+            </w:tcMar>
+          </w:tcPr>
+          <w:p>
+            <w:r>
+              <w:rPr>
+                <w:b w:val="false"/>
+                <w:bCs w:val="false"/>
+                <w:sz w:val="19"/>
+                <w:szCs w:val="19"/>
+              </w:rPr>
+              <w:t xml:space="preserve">The reference uses 10px labels, grey text (#C2CEDA, #F2F6FA) and pastel dots; the spec forbids all three.</w:t>
+            </w:r>
+          </w:p>
+        </w:tc>
+        <w:tc>
+          <w:tcPr>
+            <w:tcW w:type="dxa" w:w="3026"/>
+            <w:tcBorders>
+              <w:top w:val="single" w:color="BFBFBF" w:sz="4"/>
+              <w:left w:val="single" w:color="BFBFBF" w:sz="4"/>
+              <w:bottom w:val="single" w:color="BFBFBF" w:sz="4"/>
+              <w:right w:val="single" w:color="BFBFBF" w:sz="4"/>
+            </w:tcBorders>
+            <w:tcMar>
+              <w:top w:type="dxa" w:w="60"/>
+              <w:left w:type="dxa" w:w="100"/>
+              <w:bottom w:type="dxa" w:w="60"/>
+              <w:right w:type="dxa" w:w="100"/>
+            </w:tcMar>
+          </w:tcPr>
+          <w:p>
+            <w:r>
+              <w:rPr>
+                <w:b w:val="false"/>
+                <w:bCs w:val="false"/>
+                <w:sz w:val="19"/>
+                <w:szCs w:val="19"/>
+              </w:rPr>
+              <w:t xml:space="preserve">Card labels are 11.5px white at 85% opacity; dots use the spec's traffic-light colours.</w:t>
+            </w:r>
+          </w:p>
+        </w:tc>
+      </w:tr>
+      <w:tr>
+        <w:tc>
+          <w:tcPr>
+            <w:tcW w:type="dxa" w:w="2600"/>
+            <w:tcBorders>
+              <w:top w:val="single" w:color="BFBFBF" w:sz="4"/>
+              <w:left w:val="single" w:color="BFBFBF" w:sz="4"/>
+              <w:bottom w:val="single" w:color="BFBFBF" w:sz="4"/>
+              <w:right w:val="single" w:color="BFBFBF" w:sz="4"/>
+            </w:tcBorders>
+            <w:tcMar>
+              <w:top w:type="dxa" w:w="60"/>
+              <w:left w:type="dxa" w:w="100"/>
+              <w:bottom w:type="dxa" w:w="60"/>
+              <w:right w:type="dxa" w:w="100"/>
+            </w:tcMar>
+          </w:tcPr>
+          <w:p>
+            <w:r>
+              <w:rPr>
+                <w:b w:val="false"/>
+                <w:bCs w:val="false"/>
+                <w:sz w:val="19"/>
+                <w:szCs w:val="19"/>
+              </w:rPr>
+              <w:t xml:space="preserve">Open posting is the primary (autumn) button, not the reference's white button</w:t>
+            </w:r>
+          </w:p>
+        </w:tc>
+        <w:tc>
+          <w:tcPr>
+            <w:tcW w:type="dxa" w:w="3400"/>
+            <w:tcBorders>
+              <w:top w:val="single" w:color="BFBFBF" w:sz="4"/>
+              <w:left w:val="single" w:color="BFBFBF" w:sz="4"/>
+              <w:bottom w:val="single" w:color="BFBFBF" w:sz="4"/>
+              <w:right w:val="single" w:color="BFBFBF" w:sz="4"/>
+            </w:tcBorders>
+            <w:tcMar>
+              <w:top w:type="dxa" w:w="60"/>
+              <w:left w:type="dxa" w:w="100"/>
+              <w:bottom w:type="dxa" w:w="60"/>
+              <w:right w:type="dxa" w:w="100"/>
+            </w:tcMar>
+          </w:tcPr>
+          <w:p>
+            <w:r>
+              <w:rPr>
+                <w:b w:val="false"/>
+                <w:bCs w:val="false"/>
+                <w:sz w:val="19"/>
+                <w:szCs w:val="19"/>
+              </w:rPr>
+              <w:t xml:space="preserve">The spec says dark text on a light ground does not occur.</w:t>
+            </w:r>
+          </w:p>
+        </w:tc>
+        <w:tc>
+          <w:tcPr>
+            <w:tcW w:type="dxa" w:w="3026"/>
+            <w:tcBorders>
+              <w:top w:val="single" w:color="BFBFBF" w:sz="4"/>
+              <w:left w:val="single" w:color="BFBFBF" w:sz="4"/>
+              <w:bottom w:val="single" w:color="BFBFBF" w:sz="4"/>
+              <w:right w:val="single" w:color="BFBFBF" w:sz="4"/>
+            </w:tcBorders>
+            <w:tcMar>
+              <w:top w:type="dxa" w:w="60"/>
+              <w:left w:type="dxa" w:w="100"/>
+              <w:bottom w:type="dxa" w:w="60"/>
+              <w:right w:type="dxa" w:w="100"/>
+            </w:tcMar>
+          </w:tcPr>
+          <w:p>
+            <w:r>
+              <w:rPr>
+                <w:b w:val="false"/>
+                <w:bCs w:val="false"/>
+                <w:sz w:val="19"/>
+                <w:szCs w:val="19"/>
+              </w:rPr>
+              <w:t xml:space="preserve"/>
+            </w:r>
+          </w:p>
+        </w:tc>
+      </w:tr>
+      <w:tr>
+        <w:tc>
+          <w:tcPr>
+            <w:tcW w:type="dxa" w:w="2600"/>
+            <w:tcBorders>
+              <w:top w:val="single" w:color="BFBFBF" w:sz="4"/>
+              <w:left w:val="single" w:color="BFBFBF" w:sz="4"/>
+              <w:bottom w:val="single" w:color="BFBFBF" w:sz="4"/>
+              <w:right w:val="single" w:color="BFBFBF" w:sz="4"/>
+            </w:tcBorders>
+            <w:tcMar>
+              <w:top w:type="dxa" w:w="60"/>
+              <w:left w:type="dxa" w:w="100"/>
+              <w:bottom w:type="dxa" w:w="60"/>
+              <w:right w:type="dxa" w:w="100"/>
+            </w:tcMar>
+          </w:tcPr>
+          <w:p>
+            <w:r>
+              <w:rPr>
+                <w:b w:val="false"/>
+                <w:bCs w:val="false"/>
+                <w:sz w:val="19"/>
+                <w:szCs w:val="19"/>
+              </w:rPr>
+              <w:t xml:space="preserve">Neutralface only for the wordmark, page headings and Battlefield names</w:t>
+            </w:r>
+          </w:p>
+        </w:tc>
+        <w:tc>
+          <w:tcPr>
+            <w:tcW w:type="dxa" w:w="3400"/>
+            <w:tcBorders>
+              <w:top w:val="single" w:color="BFBFBF" w:sz="4"/>
+              <w:left w:val="single" w:color="BFBFBF" w:sz="4"/>
+              <w:bottom w:val="single" w:color="BFBFBF" w:sz="4"/>
+              <w:right w:val="single" w:color="BFBFBF" w:sz="4"/>
+            </w:tcBorders>
+            <w:tcMar>
+              <w:top w:type="dxa" w:w="60"/>
+              <w:left w:type="dxa" w:w="100"/>
+              <w:bottom w:type="dxa" w:w="60"/>
+              <w:right w:type="dxa" w:w="100"/>
+            </w:tcMar>
+          </w:tcPr>
+          <w:p>
+            <w:r>
+              <w:rPr>
+                <w:b w:val="false"/>
+                <w:bCs w:val="false"/>
+                <w:sz w:val="19"/>
+                <w:szCs w:val="19"/>
+              </w:rPr>
+              <w:t xml:space="preserve">It is an all-caps face; job titles in it were heavy and hard to scan.</w:t>
+            </w:r>
+          </w:p>
+        </w:tc>
+        <w:tc>
+          <w:tcPr>
+            <w:tcW w:type="dxa" w:w="3026"/>
+            <w:tcBorders>
+              <w:top w:val="single" w:color="BFBFBF" w:sz="4"/>
+              <w:left w:val="single" w:color="BFBFBF" w:sz="4"/>
+              <w:bottom w:val="single" w:color="BFBFBF" w:sz="4"/>
+              <w:right w:val="single" w:color="BFBFBF" w:sz="4"/>
+            </w:tcBorders>
+            <w:tcMar>
+              <w:top w:type="dxa" w:w="60"/>
+              <w:left w:type="dxa" w:w="100"/>
+              <w:bottom w:type="dxa" w:w="60"/>
+              <w:right w:type="dxa" w:w="100"/>
+            </w:tcMar>
+          </w:tcPr>
+          <w:p>
+            <w:r>
+              <w:rPr>
+                <w:b w:val="false"/>
+                <w:bCs w:val="false"/>
+                <w:sz w:val="19"/>
+                <w:szCs w:val="19"/>
+              </w:rPr>
+              <w:t xml:space="preserve">The selected job's title uses Aspekta at 21px 600.</w:t>
+            </w:r>
+          </w:p>
+        </w:tc>
+      </w:tr>
+      <w:tr>
+        <w:tc>
+          <w:tcPr>
+            <w:tcW w:type="dxa" w:w="2600"/>
+            <w:tcBorders>
+              <w:top w:val="single" w:color="BFBFBF" w:sz="4"/>
+              <w:left w:val="single" w:color="BFBFBF" w:sz="4"/>
+              <w:bottom w:val="single" w:color="BFBFBF" w:sz="4"/>
+              <w:right w:val="single" w:color="BFBFBF" w:sz="4"/>
+            </w:tcBorders>
+            <w:tcMar>
+              <w:top w:type="dxa" w:w="60"/>
+              <w:left w:type="dxa" w:w="100"/>
+              <w:bottom w:type="dxa" w:w="60"/>
+              <w:right w:type="dxa" w:w="100"/>
+            </w:tcMar>
+          </w:tcPr>
+          <w:p>
+            <w:r>
+              <w:rPr>
+                <w:b w:val="false"/>
+                <w:bCs w:val="false"/>
+                <w:sz w:val="19"/>
+                <w:szCs w:val="19"/>
+              </w:rPr>
+              <w:t xml:space="preserve">Status, notes, dismiss and description kept on Discovery inside the new layout</w:t>
+            </w:r>
+          </w:p>
+        </w:tc>
+        <w:tc>
+          <w:tcPr>
+            <w:tcW w:type="dxa" w:w="3400"/>
+            <w:tcBorders>
+              <w:top w:val="single" w:color="BFBFBF" w:sz="4"/>
+              <w:left w:val="single" w:color="BFBFBF" w:sz="4"/>
+              <w:bottom w:val="single" w:color="BFBFBF" w:sz="4"/>
+              <w:right w:val="single" w:color="BFBFBF" w:sz="4"/>
+            </w:tcBorders>
+            <w:tcMar>
+              <w:top w:type="dxa" w:w="60"/>
+              <w:left w:type="dxa" w:w="100"/>
+              <w:bottom w:type="dxa" w:w="60"/>
+              <w:right w:type="dxa" w:w="100"/>
+            </w:tcMar>
+          </w:tcPr>
+          <w:p>
+            <w:r>
+              <w:rPr>
+                <w:b w:val="false"/>
+                <w:bCs w:val="false"/>
+                <w:sz w:val="19"/>
+                <w:szCs w:val="19"/>
+              </w:rPr>
+              <w:t xml:space="preserve">Behaviour had to stay intact, and the reference has no detail panel.</w:t>
+            </w:r>
+          </w:p>
+        </w:tc>
+        <w:tc>
+          <w:tcPr>
+            <w:tcW w:type="dxa" w:w="3026"/>
+            <w:tcBorders>
+              <w:top w:val="single" w:color="BFBFBF" w:sz="4"/>
+              <w:left w:val="single" w:color="BFBFBF" w:sz="4"/>
+              <w:bottom w:val="single" w:color="BFBFBF" w:sz="4"/>
+              <w:right w:val="single" w:color="BFBFBF" w:sz="4"/>
+            </w:tcBorders>
+            <w:tcMar>
+              <w:top w:type="dxa" w:w="60"/>
+              <w:left w:type="dxa" w:w="100"/>
+              <w:bottom w:type="dxa" w:w="60"/>
+              <w:right w:type="dxa" w:w="100"/>
+            </w:tcMar>
+          </w:tcPr>
+          <w:p>
+            <w:r>
+              <w:rPr>
+                <w:b w:val="false"/>
+                <w:bCs w:val="false"/>
+                <w:sz w:val="19"/>
+                <w:szCs w:val="19"/>
+              </w:rPr>
+              <w:t xml:space="preserve">Stage buttons and the note sit in the selected card; the description is behind a toggle in Why this grade.</w:t>
+            </w:r>
+          </w:p>
+        </w:tc>
+      </w:tr>
+      <w:tr>
+        <w:tc>
+          <w:tcPr>
+            <w:tcW w:type="dxa" w:w="2600"/>
+            <w:tcBorders>
+              <w:top w:val="single" w:color="BFBFBF" w:sz="4"/>
+              <w:left w:val="single" w:color="BFBFBF" w:sz="4"/>
+              <w:bottom w:val="single" w:color="BFBFBF" w:sz="4"/>
+              <w:right w:val="single" w:color="BFBFBF" w:sz="4"/>
+            </w:tcBorders>
+            <w:tcMar>
+              <w:top w:type="dxa" w:w="60"/>
+              <w:left w:type="dxa" w:w="100"/>
+              <w:bottom w:type="dxa" w:w="60"/>
+              <w:right w:type="dxa" w:w="100"/>
+            </w:tcMar>
+          </w:tcPr>
+          <w:p>
+            <w:r>
+              <w:rPr>
+                <w:b w:val="false"/>
+                <w:bCs w:val="false"/>
+                <w:sz w:val="19"/>
+                <w:szCs w:val="19"/>
+              </w:rPr>
+              <w:t xml:space="preserve">Pay card only when the posting states a salary</w:t>
+            </w:r>
+          </w:p>
+        </w:tc>
+        <w:tc>
+          <w:tcPr>
+            <w:tcW w:type="dxa" w:w="3400"/>
+            <w:tcBorders>
+              <w:top w:val="single" w:color="BFBFBF" w:sz="4"/>
+              <w:left w:val="single" w:color="BFBFBF" w:sz="4"/>
+              <w:bottom w:val="single" w:color="BFBFBF" w:sz="4"/>
+              <w:right w:val="single" w:color="BFBFBF" w:sz="4"/>
+            </w:tcBorders>
+            <w:tcMar>
+              <w:top w:type="dxa" w:w="60"/>
+              <w:left w:type="dxa" w:w="100"/>
+              <w:bottom w:type="dxa" w:w="60"/>
+              <w:right w:type="dxa" w:w="100"/>
+            </w:tcMar>
+          </w:tcPr>
+          <w:p>
+            <w:r>
+              <w:rPr>
+                <w:b w:val="false"/>
+                <w:bCs w:val="false"/>
+                <w:sz w:val="19"/>
+                <w:szCs w:val="19"/>
+              </w:rPr>
+              <w:t xml:space="preserve">The database has no salary column; 5 of 47 raw payloads carry salaryMin/Max/Currency/Interval.</w:t>
+            </w:r>
+          </w:p>
+        </w:tc>
+        <w:tc>
+          <w:tcPr>
+            <w:tcW w:type="dxa" w:w="3026"/>
+            <w:tcBorders>
+              <w:top w:val="single" w:color="BFBFBF" w:sz="4"/>
+              <w:left w:val="single" w:color="BFBFBF" w:sz="4"/>
+              <w:bottom w:val="single" w:color="BFBFBF" w:sz="4"/>
+              <w:right w:val="single" w:color="BFBFBF" w:sz="4"/>
+            </w:tcBorders>
+            <w:tcMar>
+              <w:top w:type="dxa" w:w="60"/>
+              <w:left w:type="dxa" w:w="100"/>
+              <w:bottom w:type="dxa" w:w="60"/>
+              <w:right w:type="dxa" w:w="100"/>
+            </w:tcMar>
+          </w:tcPr>
+          <w:p>
+            <w:r>
+              <w:rPr>
+                <w:b w:val="false"/>
+                <w:bCs w:val="false"/>
+                <w:sz w:val="19"/>
+                <w:szCs w:val="19"/>
+              </w:rPr>
+              <w:t xml:space="preserve"/>
+            </w:r>
+          </w:p>
+        </w:tc>
+      </w:tr>
+      <w:tr>
+        <w:tc>
+          <w:tcPr>
+            <w:tcW w:type="dxa" w:w="2600"/>
+            <w:tcBorders>
+              <w:top w:val="single" w:color="BFBFBF" w:sz="4"/>
+              <w:left w:val="single" w:color="BFBFBF" w:sz="4"/>
+              <w:bottom w:val="single" w:color="BFBFBF" w:sz="4"/>
+              <w:right w:val="single" w:color="BFBFBF" w:sz="4"/>
+            </w:tcBorders>
+            <w:tcMar>
+              <w:top w:type="dxa" w:w="60"/>
+              <w:left w:type="dxa" w:w="100"/>
+              <w:bottom w:type="dxa" w:w="60"/>
+              <w:right w:type="dxa" w:w="100"/>
+            </w:tcMar>
+          </w:tcPr>
+          <w:p>
+            <w:r>
+              <w:rPr>
+                <w:b w:val="false"/>
+                <w:bCs w:val="false"/>
+                <w:sz w:val="19"/>
+                <w:szCs w:val="19"/>
+              </w:rPr>
+              <w:t xml:space="preserve">New on the homepage = jobs first seen after Battlefield.lastViewedAt</w:t>
+            </w:r>
+          </w:p>
+        </w:tc>
+        <w:tc>
+          <w:tcPr>
+            <w:tcW w:type="dxa" w:w="3400"/>
+            <w:tcBorders>
+              <w:top w:val="single" w:color="BFBFBF" w:sz="4"/>
+              <w:left w:val="single" w:color="BFBFBF" w:sz="4"/>
+              <w:bottom w:val="single" w:color="BFBFBF" w:sz="4"/>
+              <w:right w:val="single" w:color="BFBFBF" w:sz="4"/>
+            </w:tcBorders>
+            <w:tcMar>
+              <w:top w:type="dxa" w:w="60"/>
+              <w:left w:type="dxa" w:w="100"/>
+              <w:bottom w:type="dxa" w:w="60"/>
+              <w:right w:type="dxa" w:w="100"/>
+            </w:tcMar>
+          </w:tcPr>
+          <w:p>
+            <w:r>
+              <w:rPr>
+                <w:b w:val="false"/>
+                <w:bCs w:val="false"/>
+                <w:sz w:val="19"/>
+                <w:szCs w:val="19"/>
+              </w:rPr>
+              <w:t xml:space="preserve">The prompt required a real number. Null (never opened) counts every job as new.</w:t>
+            </w:r>
+          </w:p>
+        </w:tc>
+        <w:tc>
+          <w:tcPr>
+            <w:tcW w:type="dxa" w:w="3026"/>
+            <w:tcBorders>
+              <w:top w:val="single" w:color="BFBFBF" w:sz="4"/>
+              <w:left w:val="single" w:color="BFBFBF" w:sz="4"/>
+              <w:bottom w:val="single" w:color="BFBFBF" w:sz="4"/>
+              <w:right w:val="single" w:color="BFBFBF" w:sz="4"/>
+            </w:tcBorders>
+            <w:tcMar>
+              <w:top w:type="dxa" w:w="60"/>
+              <w:left w:type="dxa" w:w="100"/>
+              <w:bottom w:type="dxa" w:w="60"/>
+              <w:right w:type="dxa" w:w="100"/>
+            </w:tcMar>
+          </w:tcPr>
+          <w:p>
+            <w:r>
+              <w:rPr>
+                <w:b w:val="false"/>
+                <w:bCs w:val="false"/>
+                <w:sz w:val="19"/>
+                <w:szCs w:val="19"/>
+              </w:rPr>
+              <w:t xml:space="preserve">Jobs promoted from Explore keep the wave's firstSeen, so an old wave promoted later may not count as new.</w:t>
+            </w:r>
+          </w:p>
+        </w:tc>
+      </w:tr>
+      <w:tr>
+        <w:tc>
+          <w:tcPr>
+            <w:tcW w:type="dxa" w:w="2600"/>
+            <w:tcBorders>
+              <w:top w:val="single" w:color="BFBFBF" w:sz="4"/>
+              <w:left w:val="single" w:color="BFBFBF" w:sz="4"/>
+              <w:bottom w:val="single" w:color="BFBFBF" w:sz="4"/>
+              <w:right w:val="single" w:color="BFBFBF" w:sz="4"/>
+            </w:tcBorders>
+            <w:tcMar>
+              <w:top w:type="dxa" w:w="60"/>
+              <w:left w:type="dxa" w:w="100"/>
+              <w:bottom w:type="dxa" w:w="60"/>
+              <w:right w:type="dxa" w:w="100"/>
+            </w:tcMar>
+          </w:tcPr>
+          <w:p>
+            <w:r>
+              <w:rPr>
+                <w:b w:val="false"/>
+                <w:bCs w:val="false"/>
+                <w:sz w:val="19"/>
+                <w:szCs w:val="19"/>
+              </w:rPr>
+              <w:t xml:space="preserve">Errors are shown in white with a red underline</w:t>
+            </w:r>
+          </w:p>
+        </w:tc>
+        <w:tc>
+          <w:tcPr>
+            <w:tcW w:type="dxa" w:w="3400"/>
+            <w:tcBorders>
+              <w:top w:val="single" w:color="BFBFBF" w:sz="4"/>
+              <w:left w:val="single" w:color="BFBFBF" w:sz="4"/>
+              <w:bottom w:val="single" w:color="BFBFBF" w:sz="4"/>
+              <w:right w:val="single" w:color="BFBFBF" w:sz="4"/>
+            </w:tcBorders>
+            <w:tcMar>
+              <w:top w:type="dxa" w:w="60"/>
+              <w:left w:type="dxa" w:w="100"/>
+              <w:bottom w:type="dxa" w:w="60"/>
+              <w:right w:type="dxa" w:w="100"/>
+            </w:tcMar>
+          </w:tcPr>
+          <w:p>
+            <w:r>
+              <w:rPr>
+                <w:b w:val="false"/>
+                <w:bCs w:val="false"/>
+                <w:sz w:val="19"/>
+                <w:szCs w:val="19"/>
+              </w:rPr>
+              <w:t xml:space="preserve">All text must be white; colour cannot carry the error.</w:t>
+            </w:r>
+          </w:p>
+        </w:tc>
+        <w:tc>
+          <w:tcPr>
+            <w:tcW w:type="dxa" w:w="3026"/>
+            <w:tcBorders>
+              <w:top w:val="single" w:color="BFBFBF" w:sz="4"/>
+              <w:left w:val="single" w:color="BFBFBF" w:sz="4"/>
+              <w:bottom w:val="single" w:color="BFBFBF" w:sz="4"/>
+              <w:right w:val="single" w:color="BFBFBF" w:sz="4"/>
+            </w:tcBorders>
+            <w:tcMar>
+              <w:top w:type="dxa" w:w="60"/>
+              <w:left w:type="dxa" w:w="100"/>
+              <w:bottom w:type="dxa" w:w="60"/>
+              <w:right w:type="dxa" w:w="100"/>
+            </w:tcMar>
+          </w:tcPr>
+          <w:p>
+            <w:r>
+              <w:rPr>
+                <w:b w:val="false"/>
+                <w:bCs w:val="false"/>
+                <w:sz w:val="19"/>
+                <w:szCs w:val="19"/>
+              </w:rPr>
+              <w:t xml:space="preserve"/>
+            </w:r>
+          </w:p>
+        </w:tc>
+      </w:tr>
+    </w:tbl>
+    <w:p>
+      <w:pPr>
+        <w:spacing w:after="120"/>
+      </w:pPr>
+    </w:p>
+    <w:p>
+      <w:pPr>
+        <w:pStyle w:val="Heading2"/>
+      </w:pPr>
+      <w:r>
+        <w:t xml:space="preserve">Problems found</w:t>
+      </w:r>
+    </w:p>
+    <w:tbl>
+      <w:tblPr>
+        <w:tblW w:type="dxa" w:w="9026"/>
+        <w:tblBorders>
+          <w:top w:val="single" w:color="auto" w:sz="4"/>
+          <w:left w:val="single" w:color="auto" w:sz="4"/>
+          <w:bottom w:val="single" w:color="auto" w:sz="4"/>
+          <w:right w:val="single" w:color="auto" w:sz="4"/>
+          <w:insideH w:val="single" w:color="auto" w:sz="4"/>
+          <w:insideV w:val="single" w:color="auto" w:sz="4"/>
+        </w:tblBorders>
+      </w:tblPr>
+      <w:tblGrid>
+        <w:gridCol w:w="2800"/>
+        <w:gridCol w:w="3300"/>
+        <w:gridCol w:w="2926"/>
+      </w:tblGrid>
+      <w:tr>
+        <w:trPr>
+          <w:tblHeader/>
+        </w:trPr>
+        <w:tc>
+          <w:tcPr>
+            <w:tcW w:type="dxa" w:w="2800"/>
+            <w:tcBorders>
+              <w:top w:val="single" w:color="BFBFBF" w:sz="4"/>
+              <w:left w:val="single" w:color="BFBFBF" w:sz="4"/>
+              <w:bottom w:val="single" w:color="BFBFBF" w:sz="4"/>
+              <w:right w:val="single" w:color="BFBFBF" w:sz="4"/>
+            </w:tcBorders>
+            <w:shd w:fill="EDEDED" w:color="auto" w:val="clear"/>
+            <w:tcMar>
+              <w:top w:type="dxa" w:w="60"/>
+              <w:left w:type="dxa" w:w="100"/>
+              <w:bottom w:type="dxa" w:w="60"/>
+              <w:right w:type="dxa" w:w="100"/>
+            </w:tcMar>
+          </w:tcPr>
+          <w:p>
+            <w:r>
+              <w:rPr>
+                <w:b/>
+                <w:bCs/>
+                <w:sz w:val="19"/>
+                <w:szCs w:val="19"/>
+              </w:rPr>
+              <w:t xml:space="preserve">Symptom</w:t>
+            </w:r>
+          </w:p>
+        </w:tc>
+        <w:tc>
+          <w:tcPr>
+            <w:tcW w:type="dxa" w:w="3300"/>
+            <w:tcBorders>
+              <w:top w:val="single" w:color="BFBFBF" w:sz="4"/>
+              <w:left w:val="single" w:color="BFBFBF" w:sz="4"/>
+              <w:bottom w:val="single" w:color="BFBFBF" w:sz="4"/>
+              <w:right w:val="single" w:color="BFBFBF" w:sz="4"/>
+            </w:tcBorders>
+            <w:shd w:fill="EDEDED" w:color="auto" w:val="clear"/>
+            <w:tcMar>
+              <w:top w:type="dxa" w:w="60"/>
+              <w:left w:type="dxa" w:w="100"/>
+              <w:bottom w:type="dxa" w:w="60"/>
+              <w:right w:type="dxa" w:w="100"/>
+            </w:tcMar>
+          </w:tcPr>
+          <w:p>
+            <w:r>
+              <w:rPr>
+                <w:b/>
+                <w:bCs/>
+                <w:sz w:val="19"/>
+                <w:szCs w:val="19"/>
+              </w:rPr>
+              <w:t xml:space="preserve">Cause</w:t>
+            </w:r>
+          </w:p>
+        </w:tc>
+        <w:tc>
+          <w:tcPr>
+            <w:tcW w:type="dxa" w:w="2926"/>
+            <w:tcBorders>
+              <w:top w:val="single" w:color="BFBFBF" w:sz="4"/>
+              <w:left w:val="single" w:color="BFBFBF" w:sz="4"/>
+              <w:bottom w:val="single" w:color="BFBFBF" w:sz="4"/>
+              <w:right w:val="single" w:color="BFBFBF" w:sz="4"/>
+            </w:tcBorders>
+            <w:shd w:fill="EDEDED" w:color="auto" w:val="clear"/>
+            <w:tcMar>
+              <w:top w:type="dxa" w:w="60"/>
+              <w:left w:type="dxa" w:w="100"/>
+              <w:bottom w:type="dxa" w:w="60"/>
+              <w:right w:type="dxa" w:w="100"/>
+            </w:tcMar>
+          </w:tcPr>
+          <w:p>
+            <w:r>
+              <w:rPr>
+                <w:b/>
+                <w:bCs/>
+                <w:sz w:val="19"/>
+                <w:szCs w:val="19"/>
+              </w:rPr>
+              <w:t xml:space="preserve">Resolution</w:t>
+            </w:r>
+          </w:p>
+        </w:tc>
+      </w:tr>
+      <w:tr>
+        <w:tc>
+          <w:tcPr>
+            <w:tcW w:type="dxa" w:w="2800"/>
+            <w:tcBorders>
+              <w:top w:val="single" w:color="BFBFBF" w:sz="4"/>
+              <w:left w:val="single" w:color="BFBFBF" w:sz="4"/>
+              <w:bottom w:val="single" w:color="BFBFBF" w:sz="4"/>
+              <w:right w:val="single" w:color="BFBFBF" w:sz="4"/>
+            </w:tcBorders>
+            <w:tcMar>
+              <w:top w:type="dxa" w:w="60"/>
+              <w:left w:type="dxa" w:w="100"/>
+              <w:bottom w:type="dxa" w:w="60"/>
+              <w:right w:type="dxa" w:w="100"/>
+            </w:tcMar>
+          </w:tcPr>
+          <w:p>
+            <w:r>
+              <w:rPr>
+                <w:b w:val="false"/>
+                <w:bCs w:val="false"/>
+                <w:sz w:val="19"/>
+                <w:szCs w:val="19"/>
+              </w:rPr>
+              <w:t xml:space="preserve">The first 1366x768 check measured the smallest text at 10.1px.</w:t>
+            </w:r>
+          </w:p>
+        </w:tc>
+        <w:tc>
+          <w:tcPr>
+            <w:tcW w:type="dxa" w:w="3300"/>
+            <w:tcBorders>
+              <w:top w:val="single" w:color="BFBFBF" w:sz="4"/>
+              <w:left w:val="single" w:color="BFBFBF" w:sz="4"/>
+              <w:bottom w:val="single" w:color="BFBFBF" w:sz="4"/>
+              <w:right w:val="single" w:color="BFBFBF" w:sz="4"/>
+            </w:tcBorders>
+            <w:tcMar>
+              <w:top w:type="dxa" w:w="60"/>
+              <w:left w:type="dxa" w:w="100"/>
+              <w:bottom w:type="dxa" w:w="60"/>
+              <w:right w:type="dxa" w:w="100"/>
+            </w:tcMar>
+          </w:tcPr>
+          <w:p>
+            <w:r>
+              <w:rPr>
+                <w:b w:val="false"/>
+                <w:bCs w:val="false"/>
+                <w:sz w:val="19"/>
+                <w:szCs w:val="19"/>
+              </w:rPr>
+              <w:t xml:space="preserve">The root size floor was 14.7px.</w:t>
+            </w:r>
+          </w:p>
+        </w:tc>
+        <w:tc>
+          <w:tcPr>
+            <w:tcW w:type="dxa" w:w="2926"/>
+            <w:tcBorders>
+              <w:top w:val="single" w:color="BFBFBF" w:sz="4"/>
+              <w:left w:val="single" w:color="BFBFBF" w:sz="4"/>
+              <w:bottom w:val="single" w:color="BFBFBF" w:sz="4"/>
+              <w:right w:val="single" w:color="BFBFBF" w:sz="4"/>
+            </w:tcBorders>
+            <w:tcMar>
+              <w:top w:type="dxa" w:w="60"/>
+              <w:left w:type="dxa" w:w="100"/>
+              <w:bottom w:type="dxa" w:w="60"/>
+              <w:right w:type="dxa" w:w="100"/>
+            </w:tcMar>
+          </w:tcPr>
+          <w:p>
+            <w:r>
+              <w:rPr>
+                <w:b w:val="false"/>
+                <w:bCs w:val="false"/>
+                <w:sz w:val="19"/>
+                <w:szCs w:val="19"/>
+              </w:rPr>
+              <w:t xml:space="preserve">Raised the floor to 15px (smallest text 10.3px).</w:t>
+            </w:r>
+          </w:p>
+        </w:tc>
+      </w:tr>
+      <w:tr>
+        <w:tc>
+          <w:tcPr>
+            <w:tcW w:type="dxa" w:w="2800"/>
+            <w:tcBorders>
+              <w:top w:val="single" w:color="BFBFBF" w:sz="4"/>
+              <w:left w:val="single" w:color="BFBFBF" w:sz="4"/>
+              <w:bottom w:val="single" w:color="BFBFBF" w:sz="4"/>
+              <w:right w:val="single" w:color="BFBFBF" w:sz="4"/>
+            </w:tcBorders>
+            <w:tcMar>
+              <w:top w:type="dxa" w:w="60"/>
+              <w:left w:type="dxa" w:w="100"/>
+              <w:bottom w:type="dxa" w:w="60"/>
+              <w:right w:type="dxa" w:w="100"/>
+            </w:tcMar>
+          </w:tcPr>
+          <w:p>
+            <w:r>
+              <w:rPr>
+                <w:b w:val="false"/>
+                <w:bCs w:val="false"/>
+                <w:sz w:val="19"/>
+                <w:szCs w:val="19"/>
+              </w:rPr>
+              <w:t xml:space="preserve">A test lookup for the background Next button also matched the Next.js dev tools button.</w:t>
+            </w:r>
+          </w:p>
+        </w:tc>
+        <w:tc>
+          <w:tcPr>
+            <w:tcW w:type="dxa" w:w="3300"/>
+            <w:tcBorders>
+              <w:top w:val="single" w:color="BFBFBF" w:sz="4"/>
+              <w:left w:val="single" w:color="BFBFBF" w:sz="4"/>
+              <w:bottom w:val="single" w:color="BFBFBF" w:sz="4"/>
+              <w:right w:val="single" w:color="BFBFBF" w:sz="4"/>
+            </w:tcBorders>
+            <w:tcMar>
+              <w:top w:type="dxa" w:w="60"/>
+              <w:left w:type="dxa" w:w="100"/>
+              <w:bottom w:type="dxa" w:w="60"/>
+              <w:right w:type="dxa" w:w="100"/>
+            </w:tcMar>
+          </w:tcPr>
+          <w:p>
+            <w:r>
+              <w:rPr>
+                <w:b w:val="false"/>
+                <w:bCs w:val="false"/>
+                <w:sz w:val="19"/>
+                <w:szCs w:val="19"/>
+              </w:rPr>
+              <w:t xml:space="preserve">Test-only: getByRole('button', {name: 'Next'}) is a substring match.</w:t>
+            </w:r>
+          </w:p>
+        </w:tc>
+        <w:tc>
+          <w:tcPr>
+            <w:tcW w:type="dxa" w:w="2926"/>
+            <w:tcBorders>
+              <w:top w:val="single" w:color="BFBFBF" w:sz="4"/>
+              <w:left w:val="single" w:color="BFBFBF" w:sz="4"/>
+              <w:bottom w:val="single" w:color="BFBFBF" w:sz="4"/>
+              <w:right w:val="single" w:color="BFBFBF" w:sz="4"/>
+            </w:tcBorders>
+            <w:tcMar>
+              <w:top w:type="dxa" w:w="60"/>
+              <w:left w:type="dxa" w:w="100"/>
+              <w:bottom w:type="dxa" w:w="60"/>
+              <w:right w:type="dxa" w:w="100"/>
+            </w:tcMar>
+          </w:tcPr>
+          <w:p>
+            <w:r>
+              <w:rPr>
+                <w:b w:val="false"/>
+                <w:bCs w:val="false"/>
+                <w:sz w:val="19"/>
+                <w:szCs w:val="19"/>
+              </w:rPr>
+              <w:t xml:space="preserve">Used an exact match.</w:t>
+            </w:r>
+          </w:p>
+        </w:tc>
+      </w:tr>
+    </w:tbl>
+    <w:p>
+      <w:pPr>
+        <w:spacing w:after="120"/>
+      </w:pPr>
+    </w:p>
+    <w:p>
+      <w:pPr>
+        <w:pStyle w:val="Heading2"/>
+      </w:pPr>
+      <w:r>
+        <w:t xml:space="preserve">Verification</w:t>
+      </w:r>
+    </w:p>
+    <w:p>
+      <w:pPr>
+        <w:pStyle w:val="ListParagraph"/>
+        <w:numPr>
+          <w:ilvl w:val="0"/>
+          <w:numId w:val="2"/>
+        </w:numPr>
+        <w:spacing w:after="60"/>
+      </w:pPr>
+      <w:r>
+        <w:t xml:space="preserve">tsc, eslint and next build clean.</w:t>
+      </w:r>
+    </w:p>
+    <w:p>
+      <w:pPr>
+        <w:pStyle w:val="ListParagraph"/>
+        <w:numPr>
+          <w:ilvl w:val="0"/>
+          <w:numId w:val="2"/>
+        </w:numPr>
+        <w:spacing w:after="60"/>
+      </w:pPr>
+      <w:r>
+        <w:t xml:space="preserve">Every screen screenshotted at 1366x768, 1440x980, 2560x1440 and 3840x2160: the sidebar fits without scrolling, the page never scrolls, the smallest text is 10.3px or larger, no console errors.</w:t>
+      </w:r>
+    </w:p>
+    <w:p>
+      <w:pPr>
+        <w:pStyle w:val="ListParagraph"/>
+        <w:numPr>
+          <w:ilvl w:val="0"/>
+          <w:numId w:val="2"/>
+        </w:numPr>
+        <w:spacing w:after="60"/>
+      </w:pPr>
+      <w:r>
+        <w:t xml:space="preserve">Persistent-profile browser test: Frost set to 17/88/9 and background 3 of 4 survived closing and reopening the browser and were applied at DOMContentLoaded (no flash); a stored View of 95 was clamped to 68; the rank preview opened and was cancelled; the AI/ML tile went from 34 new to 0 after opening its Discovery.</w:t>
+      </w:r>
+    </w:p>
+    <w:p>
+      <w:pPr>
+        <w:pStyle w:val="ListParagraph"/>
+        <w:numPr>
+          <w:ilvl w:val="0"/>
+          <w:numId w:val="2"/>
+        </w:numPr>
+        <w:spacing w:after="60"/>
+      </w:pPr>
+      <w:r>
+        <w:t xml:space="preserve">Audit (CLAUDE-CODE-PROMPTS Phase 7): no off-scale font sizes, no non-white text beyond the two allowed exceptions, no hex or rgba in components, no text at 10px or below, no grade pills, Frost on every page via the layout.</w:t>
+      </w:r>
+    </w:p>
+    <w:p>
+      <w:pPr>
+        <w:pStyle w:val="Heading2"/>
+      </w:pPr>
+      <w:r>
+        <w:t xml:space="preserve">Known risks left behind</w:t>
+      </w:r>
+    </w:p>
+    <w:p>
+      <w:pPr>
+        <w:pStyle w:val="ListParagraph"/>
+        <w:numPr>
+          <w:ilvl w:val="0"/>
+          <w:numId w:val="2"/>
+        </w:numPr>
+        <w:spacing w:after="60"/>
+      </w:pPr>
+      <w:r>
+        <w:t xml:space="preserve">Search New, status changes, notes and dismiss were not clicked in the new UI during testing (they change data or cost money); their code paths are unchanged from before.</w:t>
+      </w:r>
+    </w:p>
+    <w:p>
+      <w:pPr>
+        <w:pStyle w:val="ListParagraph"/>
+        <w:numPr>
+          <w:ilvl w:val="0"/>
+          <w:numId w:val="2"/>
+        </w:numPr>
+        <w:spacing w:after="60"/>
+      </w:pPr>
+      <w:r>
+        <w:t xml:space="preserve">Native range-slider thumbs keep the browser's fixed size, so they look small on a 4K screen.</w:t>
+      </w:r>
+    </w:p>
+    <w:p>
+      <w:pPr>
+        <w:pStyle w:val="ListParagraph"/>
+        <w:numPr>
+          <w:ilvl w:val="0"/>
+          <w:numId w:val="2"/>
+        </w:numPr>
+        <w:spacing w:after="60"/>
+      </w:pPr>
+      <w:r>
+        <w:t xml:space="preserve">Below about 1100 px wide the fixed sidebar and stat cards crowd the content; phones and tablets are not designed for.</w:t>
+      </w:r>
+    </w:p>
+    <w:p>
+      <w:pPr>
+        <w:pStyle w:val="ListParagraph"/>
+        <w:numPr>
+          <w:ilvl w:val="0"/>
+          <w:numId w:val="2"/>
+        </w:numPr>
+        <w:spacing w:after="60"/>
+      </w:pPr>
+      <w:r>
+        <w:t xml:space="preserve">Next.js loads Noto Sans JP without preloading, so the kana can briefly show in a fallback face on first load.</w:t>
+      </w:r>
+    </w:p>
+    <w:p>
+      <w:pPr>
+        <w:pStyle w:val="Heading2"/>
+      </w:pPr>
+      <w:r>
+        <w:t xml:space="preserve">Production data changes</w:t>
+      </w:r>
+    </w:p>
+    <w:p>
+      <w:pPr>
+        <w:pStyle w:val="ListParagraph"/>
+        <w:numPr>
+          <w:ilvl w:val="0"/>
+          <w:numId w:val="2"/>
+        </w:numPr>
+        <w:spacing w:after="60"/>
+      </w:pPr>
+      <w:r>
+        <w:t xml:space="preserve">Applied migration 20260925120000_battlefield_last_viewed (additive).</w:t>
+      </w:r>
+    </w:p>
+    <w:p>
+      <w:pPr>
+        <w:pStyle w:val="ListParagraph"/>
+        <w:numPr>
+          <w:ilvl w:val="0"/>
+          <w:numId w:val="2"/>
+        </w:numPr>
+        <w:spacing w:after="60"/>
+      </w:pPr>
+      <w:r>
+        <w:t xml:space="preserve">The browser test opened AI/ML's Discovery, which set its lastViewedAt (its homepage "new" count went to 0).</w:t>
       </w:r>
     </w:p>
     <w:sectPr>

</xml_diff>

<commit_message>
Fix Frost blur in production: no hand-written -webkit-backdrop-filter
The production minifier merged backdrop-filter and the hand-written -webkit-backdrop-filter into only the prefixed property, which Chrome and Edge ignore. On Railway the panel and cards had no blur and the Focus slider did nothing; dev builds were fine. Now only the standard property is written and the build emits both. Verified on a production build: .frost-panel has -webkit-backdrop-filter and backdrop-filter, and Focus 0 vs 64 visibly changes the blur.

Co-Authored-By: Claude Opus 5.5 <noreply@anthropic.com>
</commit_message>
<xml_diff>
--- a/docs/KAMUI-postmortem.docx
+++ b/docs/KAMUI-postmortem.docx
@@ -1389,6 +1389,64 @@
                 <w:szCs w:val="19"/>
               </w:rPr>
               <w:t xml:space="preserve">New = jobs with firstSeen after Battlefield.lastViewedAt, set when Discovery opens. Promoted Explore jobs keep the wave's firstSeen.</w:t>
+            </w:r>
+          </w:p>
+        </w:tc>
+      </w:tr>
+      <w:tr>
+        <w:tc>
+          <w:tcPr>
+            <w:tcW w:type="dxa" w:w="3200"/>
+            <w:tcBorders>
+              <w:top w:val="single" w:color="BFBFBF" w:sz="4"/>
+              <w:left w:val="single" w:color="BFBFBF" w:sz="4"/>
+              <w:bottom w:val="single" w:color="BFBFBF" w:sz="4"/>
+              <w:right w:val="single" w:color="BFBFBF" w:sz="4"/>
+            </w:tcBorders>
+            <w:tcMar>
+              <w:top w:type="dxa" w:w="60"/>
+              <w:left w:type="dxa" w:w="100"/>
+              <w:bottom w:type="dxa" w:w="60"/>
+              <w:right w:type="dxa" w:w="100"/>
+            </w:tcMar>
+          </w:tcPr>
+          <w:p>
+            <w:r>
+              <w:rPr>
+                <w:b w:val="false"/>
+                <w:bCs w:val="false"/>
+                <w:sz w:val="19"/>
+                <w:szCs w:val="19"/>
+              </w:rPr>
+              <w:t xml:space="preserve">Frost Focus does nothing / no blur on the deployed site, but fine locally</w:t>
+            </w:r>
+          </w:p>
+        </w:tc>
+        <w:tc>
+          <w:tcPr>
+            <w:tcW w:type="dxa" w:w="5826"/>
+            <w:tcBorders>
+              <w:top w:val="single" w:color="BFBFBF" w:sz="4"/>
+              <w:left w:val="single" w:color="BFBFBF" w:sz="4"/>
+              <w:bottom w:val="single" w:color="BFBFBF" w:sz="4"/>
+              <w:right w:val="single" w:color="BFBFBF" w:sz="4"/>
+            </w:tcBorders>
+            <w:tcMar>
+              <w:top w:type="dxa" w:w="60"/>
+              <w:left w:type="dxa" w:w="100"/>
+              <w:bottom w:type="dxa" w:w="60"/>
+              <w:right w:type="dxa" w:w="100"/>
+            </w:tcMar>
+          </w:tcPr>
+          <w:p>
+            <w:r>
+              <w:rPr>
+                <w:b w:val="false"/>
+                <w:bCs w:val="false"/>
+                <w:sz w:val="19"/>
+                <w:szCs w:val="19"/>
+              </w:rPr>
+              <w:t xml:space="preserve">Check the production CSS for .frost-panel: it must contain an unprefixed backdrop-filter. A hand-written -webkit-backdrop-filter was merged by the minifier into only the prefixed form, which Chrome and Edge ignore (fixed 2026-09-25). Never hand-write -webkit- prefixes.</w:t>
             </w:r>
           </w:p>
         </w:tc>
@@ -11259,6 +11317,19 @@
       </w:pPr>
       <w:r>
         <w:t xml:space="preserve">Known risks left behind</w:t>
+      </w:r>
+    </w:p>
+    <w:p>
+      <w:pPr>
+        <w:pStyle w:val="ListParagraph"/>
+        <w:numPr>
+          <w:ilvl w:val="0"/>
+          <w:numId w:val="2"/>
+        </w:numPr>
+        <w:spacing w:after="60"/>
+      </w:pPr>
+      <w:r>
+        <w:t xml:space="preserve">Found after deploy (fixed the same day): the hand-written -webkit-backdrop-filter in globals.css was merged by the production minifier into only the prefixed property, so on Railway nothing blurred and Frost Focus did nothing. Dev builds were unaffected, which is why the rebuild's tests missed it.</w:t>
       </w:r>
     </w:p>
     <w:p>

</xml_diff>

<commit_message>
Resumes page: versions, PDF/DOCX slots, notes, in-app preview
A Resumes page in the sidebar menu:
- resumes grouped by track (a Battlefield, or any track), each with
  versions A, B, C... shown as small chips;
- per version, a notes box for what makes it different, and a PDF slot
  and a DOCX slot with upload, replace, remove and download;
- a preview taking most of the screen: the browser's PDF viewer for the
  PDF, and the DOCX converted to readable HTML with mammoth (content, not
  exact layout) in a sandboxed frame.

New tables Resume, ResumeVersion and ResumeFile (migration
20260928140000_resumes, new tables only). File bytes are stored in
Postgres because Railway's disk does not survive a redeploy. Uploads go
through an API route (server actions cap bodies at 1 MB), are capped at
10 MB and must really be a PDF or DOCX.

Co-Authored-By: Claude Opus 5.5 <noreply@anthropic.com>
</commit_message>
<xml_diff>
--- a/docs/KAMUI-postmortem.docx
+++ b/docs/KAMUI-postmortem.docx
@@ -21,7 +21,7 @@
         <w:rPr>
           <w:color w:val="666666"/>
         </w:rPr>
-        <w:t xml:space="preserve">Last updated 2026-09-24, after the Auto-Populate scheduler.</w:t>
+        <w:t xml:space="preserve">Last updated 2026-09-24, after the Resumes page.</w:t>
       </w:r>
     </w:p>
     <w:p>
@@ -84,7 +84,7 @@
         <w:pStyle w:val="Heading1"/>
       </w:pPr>
       <w:r>
-        <w:t xml:space="preserve">The system after the Auto-Populate scheduler</w:t>
+        <w:t xml:space="preserve">The system after the Resumes page</w:t>
       </w:r>
     </w:p>
     <w:p>
@@ -1592,6 +1592,122 @@
                 <w:sz w:val="19"/>
                 <w:szCs w:val="19"/>
               </w:rPr>
+              <w:t xml:space="preserve">A resume upload fails or is refused</w:t>
+            </w:r>
+          </w:p>
+        </w:tc>
+        <w:tc>
+          <w:tcPr>
+            <w:tcW w:type="dxa" w:w="5826"/>
+            <w:tcBorders>
+              <w:top w:val="single" w:color="BFBFBF" w:sz="4"/>
+              <w:left w:val="single" w:color="BFBFBF" w:sz="4"/>
+              <w:bottom w:val="single" w:color="BFBFBF" w:sz="4"/>
+              <w:right w:val="single" w:color="BFBFBF" w:sz="4"/>
+            </w:tcBorders>
+            <w:tcMar>
+              <w:top w:type="dxa" w:w="60"/>
+              <w:left w:type="dxa" w:w="100"/>
+              <w:bottom w:type="dxa" w:w="60"/>
+              <w:right w:type="dxa" w:w="100"/>
+            </w:tcMar>
+          </w:tcPr>
+          <w:p>
+            <w:r>
+              <w:rPr>
+                <w:b w:val="false"/>
+                <w:bCs w:val="false"/>
+                <w:sz w:val="19"/>
+                <w:szCs w:val="19"/>
+              </w:rPr>
+              <w:t xml:space="preserve">The slot checks the file really is a PDF (starts with %PDF) or a DOCX (a zip); the cap is 10 MB. Uploads go through /api/resumes/versions/&lt;id&gt;/files, not a server action (1 MB body limit).</w:t>
+            </w:r>
+          </w:p>
+        </w:tc>
+      </w:tr>
+      <w:tr>
+        <w:tc>
+          <w:tcPr>
+            <w:tcW w:type="dxa" w:w="3200"/>
+            <w:tcBorders>
+              <w:top w:val="single" w:color="BFBFBF" w:sz="4"/>
+              <w:left w:val="single" w:color="BFBFBF" w:sz="4"/>
+              <w:bottom w:val="single" w:color="BFBFBF" w:sz="4"/>
+              <w:right w:val="single" w:color="BFBFBF" w:sz="4"/>
+            </w:tcBorders>
+            <w:tcMar>
+              <w:top w:type="dxa" w:w="60"/>
+              <w:left w:type="dxa" w:w="100"/>
+              <w:bottom w:type="dxa" w:w="60"/>
+              <w:right w:type="dxa" w:w="100"/>
+            </w:tcMar>
+          </w:tcPr>
+          <w:p>
+            <w:r>
+              <w:rPr>
+                <w:b w:val="false"/>
+                <w:bCs w:val="false"/>
+                <w:sz w:val="19"/>
+                <w:szCs w:val="19"/>
+              </w:rPr>
+              <w:t xml:space="preserve">The DOCX preview looks different from Word</w:t>
+            </w:r>
+          </w:p>
+        </w:tc>
+        <w:tc>
+          <w:tcPr>
+            <w:tcW w:type="dxa" w:w="5826"/>
+            <w:tcBorders>
+              <w:top w:val="single" w:color="BFBFBF" w:sz="4"/>
+              <w:left w:val="single" w:color="BFBFBF" w:sz="4"/>
+              <w:bottom w:val="single" w:color="BFBFBF" w:sz="4"/>
+              <w:right w:val="single" w:color="BFBFBF" w:sz="4"/>
+            </w:tcBorders>
+            <w:tcMar>
+              <w:top w:type="dxa" w:w="60"/>
+              <w:left w:type="dxa" w:w="100"/>
+              <w:bottom w:type="dxa" w:w="60"/>
+              <w:right w:type="dxa" w:w="100"/>
+            </w:tcMar>
+          </w:tcPr>
+          <w:p>
+            <w:r>
+              <w:rPr>
+                <w:b w:val="false"/>
+                <w:bCs w:val="false"/>
+                <w:sz w:val="19"/>
+                <w:szCs w:val="19"/>
+              </w:rPr>
+              <w:t xml:space="preserve">Expected: it is converted to plain HTML by mammoth, so fonts and layout are not kept. Upload the PDF for an exact preview.</w:t>
+            </w:r>
+          </w:p>
+        </w:tc>
+      </w:tr>
+      <w:tr>
+        <w:tc>
+          <w:tcPr>
+            <w:tcW w:type="dxa" w:w="3200"/>
+            <w:tcBorders>
+              <w:top w:val="single" w:color="BFBFBF" w:sz="4"/>
+              <w:left w:val="single" w:color="BFBFBF" w:sz="4"/>
+              <w:bottom w:val="single" w:color="BFBFBF" w:sz="4"/>
+              <w:right w:val="single" w:color="BFBFBF" w:sz="4"/>
+            </w:tcBorders>
+            <w:tcMar>
+              <w:top w:type="dxa" w:w="60"/>
+              <w:left w:type="dxa" w:w="100"/>
+              <w:bottom w:type="dxa" w:w="60"/>
+              <w:right w:type="dxa" w:w="100"/>
+            </w:tcMar>
+          </w:tcPr>
+          <w:p>
+            <w:r>
+              <w:rPr>
+                <w:b w:val="false"/>
+                <w:bCs w:val="false"/>
+                <w:sz w:val="19"/>
+                <w:szCs w:val="19"/>
+              </w:rPr>
               <w:t xml:space="preserve">Port 3000 already in use</w:t>
             </w:r>
           </w:p>
@@ -1671,6 +1787,19 @@
       </w:pPr>
       <w:r>
         <w:t xml:space="preserve">The B2B rubric contradicts itself on senior individual-contributor roles (Fit vs Possible).</w:t>
+      </w:r>
+    </w:p>
+    <w:p>
+      <w:pPr>
+        <w:pStyle w:val="ListParagraph"/>
+        <w:numPr>
+          <w:ilvl w:val="0"/>
+          <w:numId w:val="2"/>
+        </w:numPr>
+        <w:spacing w:after="60"/>
+      </w:pPr>
+      <w:r>
+        <w:t xml:space="preserve">The app has no login: on the public Railway domain anyone can see Battlefields, notes and, now, download resumes.</w:t>
       </w:r>
     </w:p>
     <w:p>
@@ -12443,6 +12572,742 @@
       </w:pPr>
       <w:r>
         <w:t xml:space="preserve">b2b-content: one real search (13 found, 0 new) and lastAutoRunAt set to 2026-09-28 02:21 UTC by the test; autoPopulate restored to off.</w:t>
+      </w:r>
+    </w:p>
+    <w:p>
+      <w:pPr>
+        <w:pStyle w:val="Heading1"/>
+      </w:pPr>
+      <w:r>
+        <w:t xml:space="preserve">Resumes page</w:t>
+      </w:r>
+    </w:p>
+    <w:p>
+      <w:pPr>
+        <w:spacing w:after="120"/>
+        <w:rPr>
+          <w:color w:val="666666"/>
+          <w:sz w:val="20"/>
+          <w:szCs w:val="20"/>
+        </w:rPr>
+      </w:pPr>
+      <w:r>
+        <w:rPr>
+          <w:color w:val="666666"/>
+          <w:sz w:val="20"/>
+          <w:szCs w:val="20"/>
+        </w:rPr>
+        <w:t xml:space="preserve">2026-09-28  ·  commit see git log: Resumes page</w:t>
+      </w:r>
+    </w:p>
+    <w:p>
+      <w:pPr>
+        <w:spacing w:after="120"/>
+      </w:pPr>
+      <w:r>
+        <w:t xml:space="preserve">A Resumes page in the sidebar: resumes per track, versions A, B, C... with a notes box for what differs, a PDF and a DOCX slot per version with upload, replace, remove and download, and an in-app preview that takes most of the screen.</w:t>
+      </w:r>
+    </w:p>
+    <w:p>
+      <w:pPr>
+        <w:pStyle w:val="Heading2"/>
+      </w:pPr>
+      <w:r>
+        <w:t xml:space="preserve">What changed</w:t>
+      </w:r>
+    </w:p>
+    <w:p>
+      <w:pPr>
+        <w:pStyle w:val="ListParagraph"/>
+        <w:numPr>
+          <w:ilvl w:val="0"/>
+          <w:numId w:val="2"/>
+        </w:numPr>
+        <w:spacing w:after="60"/>
+      </w:pPr>
+      <w:r>
+        <w:t xml:space="preserve">prisma/migrations/20260928140000_resumes: new tables Resume, ResumeVersion, ResumeFile (bytes in Postgres).</w:t>
+      </w:r>
+    </w:p>
+    <w:p>
+      <w:pPr>
+        <w:pStyle w:val="ListParagraph"/>
+        <w:numPr>
+          <w:ilvl w:val="0"/>
+          <w:numId w:val="2"/>
+        </w:numPr>
+        <w:spacing w:after="60"/>
+      </w:pPr>
+      <w:r>
+        <w:t xml:space="preserve">web/app/resumes/: page.tsx (server, never loads file bytes), Resumes.tsx (client), actions.ts (create, rename/retrack, add version, notes, remove file, delete version/resume).</w:t>
+      </w:r>
+    </w:p>
+    <w:p>
+      <w:pPr>
+        <w:pStyle w:val="ListParagraph"/>
+        <w:numPr>
+          <w:ilvl w:val="0"/>
+          <w:numId w:val="2"/>
+        </w:numPr>
+        <w:spacing w:after="60"/>
+      </w:pPr>
+      <w:r>
+        <w:t xml:space="preserve">API routes: upload into a slot (POST /api/resumes/versions/[id]/files), download or inline view (GET /api/resumes/files/[id]), DOCX preview as HTML (GET /api/resumes/files/[id]/preview, via mammoth).</w:t>
+      </w:r>
+    </w:p>
+    <w:p>
+      <w:pPr>
+        <w:pStyle w:val="ListParagraph"/>
+        <w:numPr>
+          <w:ilvl w:val="0"/>
+          <w:numId w:val="2"/>
+        </w:numPr>
+        <w:spacing w:after="60"/>
+      </w:pPr>
+      <w:r>
+        <w:t xml:space="preserve">Sidebar gains Resumes; DESIGN-SYSTEM.md documents the screen and the one allowed light surface (the document preview).</w:t>
+      </w:r>
+    </w:p>
+    <w:p>
+      <w:pPr>
+        <w:pStyle w:val="Heading2"/>
+      </w:pPr>
+      <w:r>
+        <w:t xml:space="preserve">Decisions and deviations from the spec</w:t>
+      </w:r>
+    </w:p>
+    <w:tbl>
+      <w:tblPr>
+        <w:tblW w:type="dxa" w:w="9026"/>
+        <w:tblBorders>
+          <w:top w:val="single" w:color="auto" w:sz="4"/>
+          <w:left w:val="single" w:color="auto" w:sz="4"/>
+          <w:bottom w:val="single" w:color="auto" w:sz="4"/>
+          <w:right w:val="single" w:color="auto" w:sz="4"/>
+          <w:insideH w:val="single" w:color="auto" w:sz="4"/>
+          <w:insideV w:val="single" w:color="auto" w:sz="4"/>
+        </w:tblBorders>
+      </w:tblPr>
+      <w:tblGrid>
+        <w:gridCol w:w="2600"/>
+        <w:gridCol w:w="3400"/>
+        <w:gridCol w:w="3026"/>
+      </w:tblGrid>
+      <w:tr>
+        <w:trPr>
+          <w:tblHeader/>
+        </w:trPr>
+        <w:tc>
+          <w:tcPr>
+            <w:tcW w:type="dxa" w:w="2600"/>
+            <w:tcBorders>
+              <w:top w:val="single" w:color="BFBFBF" w:sz="4"/>
+              <w:left w:val="single" w:color="BFBFBF" w:sz="4"/>
+              <w:bottom w:val="single" w:color="BFBFBF" w:sz="4"/>
+              <w:right w:val="single" w:color="BFBFBF" w:sz="4"/>
+            </w:tcBorders>
+            <w:shd w:fill="EDEDED" w:color="auto" w:val="clear"/>
+            <w:tcMar>
+              <w:top w:type="dxa" w:w="60"/>
+              <w:left w:type="dxa" w:w="100"/>
+              <w:bottom w:type="dxa" w:w="60"/>
+              <w:right w:type="dxa" w:w="100"/>
+            </w:tcMar>
+          </w:tcPr>
+          <w:p>
+            <w:r>
+              <w:rPr>
+                <w:b/>
+                <w:bCs/>
+                <w:sz w:val="19"/>
+                <w:szCs w:val="19"/>
+              </w:rPr>
+              <w:t xml:space="preserve">Decision</w:t>
+            </w:r>
+          </w:p>
+        </w:tc>
+        <w:tc>
+          <w:tcPr>
+            <w:tcW w:type="dxa" w:w="3400"/>
+            <w:tcBorders>
+              <w:top w:val="single" w:color="BFBFBF" w:sz="4"/>
+              <w:left w:val="single" w:color="BFBFBF" w:sz="4"/>
+              <w:bottom w:val="single" w:color="BFBFBF" w:sz="4"/>
+              <w:right w:val="single" w:color="BFBFBF" w:sz="4"/>
+            </w:tcBorders>
+            <w:shd w:fill="EDEDED" w:color="auto" w:val="clear"/>
+            <w:tcMar>
+              <w:top w:type="dxa" w:w="60"/>
+              <w:left w:type="dxa" w:w="100"/>
+              <w:bottom w:type="dxa" w:w="60"/>
+              <w:right w:type="dxa" w:w="100"/>
+            </w:tcMar>
+          </w:tcPr>
+          <w:p>
+            <w:r>
+              <w:rPr>
+                <w:b/>
+                <w:bCs/>
+                <w:sz w:val="19"/>
+                <w:szCs w:val="19"/>
+              </w:rPr>
+              <w:t xml:space="preserve">Why</w:t>
+            </w:r>
+          </w:p>
+        </w:tc>
+        <w:tc>
+          <w:tcPr>
+            <w:tcW w:type="dxa" w:w="3026"/>
+            <w:tcBorders>
+              <w:top w:val="single" w:color="BFBFBF" w:sz="4"/>
+              <w:left w:val="single" w:color="BFBFBF" w:sz="4"/>
+              <w:bottom w:val="single" w:color="BFBFBF" w:sz="4"/>
+              <w:right w:val="single" w:color="BFBFBF" w:sz="4"/>
+            </w:tcBorders>
+            <w:shd w:fill="EDEDED" w:color="auto" w:val="clear"/>
+            <w:tcMar>
+              <w:top w:type="dxa" w:w="60"/>
+              <w:left w:type="dxa" w:w="100"/>
+              <w:bottom w:type="dxa" w:w="60"/>
+              <w:right w:type="dxa" w:w="100"/>
+            </w:tcMar>
+          </w:tcPr>
+          <w:p>
+            <w:r>
+              <w:rPr>
+                <w:b/>
+                <w:bCs/>
+                <w:sz w:val="19"/>
+                <w:szCs w:val="19"/>
+              </w:rPr>
+              <w:t xml:space="preserve">Consequence / where</w:t>
+            </w:r>
+          </w:p>
+        </w:tc>
+      </w:tr>
+      <w:tr>
+        <w:tc>
+          <w:tcPr>
+            <w:tcW w:type="dxa" w:w="2600"/>
+            <w:tcBorders>
+              <w:top w:val="single" w:color="BFBFBF" w:sz="4"/>
+              <w:left w:val="single" w:color="BFBFBF" w:sz="4"/>
+              <w:bottom w:val="single" w:color="BFBFBF" w:sz="4"/>
+              <w:right w:val="single" w:color="BFBFBF" w:sz="4"/>
+            </w:tcBorders>
+            <w:tcMar>
+              <w:top w:type="dxa" w:w="60"/>
+              <w:left w:type="dxa" w:w="100"/>
+              <w:bottom w:type="dxa" w:w="60"/>
+              <w:right w:type="dxa" w:w="100"/>
+            </w:tcMar>
+          </w:tcPr>
+          <w:p>
+            <w:r>
+              <w:rPr>
+                <w:b w:val="false"/>
+                <w:bCs w:val="false"/>
+                <w:sz w:val="19"/>
+                <w:szCs w:val="19"/>
+              </w:rPr>
+              <w:t xml:space="preserve">File bytes stored in Postgres</w:t>
+            </w:r>
+          </w:p>
+        </w:tc>
+        <w:tc>
+          <w:tcPr>
+            <w:tcW w:type="dxa" w:w="3400"/>
+            <w:tcBorders>
+              <w:top w:val="single" w:color="BFBFBF" w:sz="4"/>
+              <w:left w:val="single" w:color="BFBFBF" w:sz="4"/>
+              <w:bottom w:val="single" w:color="BFBFBF" w:sz="4"/>
+              <w:right w:val="single" w:color="BFBFBF" w:sz="4"/>
+            </w:tcBorders>
+            <w:tcMar>
+              <w:top w:type="dxa" w:w="60"/>
+              <w:left w:type="dxa" w:w="100"/>
+              <w:bottom w:type="dxa" w:w="60"/>
+              <w:right w:type="dxa" w:w="100"/>
+            </w:tcMar>
+          </w:tcPr>
+          <w:p>
+            <w:r>
+              <w:rPr>
+                <w:b w:val="false"/>
+                <w:bCs w:val="false"/>
+                <w:sz w:val="19"/>
+                <w:szCs w:val="19"/>
+              </w:rPr>
+              <w:t xml:space="preserve">Railway's filesystem is wiped on redeploy; resumes are small.</w:t>
+            </w:r>
+          </w:p>
+        </w:tc>
+        <w:tc>
+          <w:tcPr>
+            <w:tcW w:type="dxa" w:w="3026"/>
+            <w:tcBorders>
+              <w:top w:val="single" w:color="BFBFBF" w:sz="4"/>
+              <w:left w:val="single" w:color="BFBFBF" w:sz="4"/>
+              <w:bottom w:val="single" w:color="BFBFBF" w:sz="4"/>
+              <w:right w:val="single" w:color="BFBFBF" w:sz="4"/>
+            </w:tcBorders>
+            <w:tcMar>
+              <w:top w:type="dxa" w:w="60"/>
+              <w:left w:type="dxa" w:w="100"/>
+              <w:bottom w:type="dxa" w:w="60"/>
+              <w:right w:type="dxa" w:w="100"/>
+            </w:tcMar>
+          </w:tcPr>
+          <w:p>
+            <w:r>
+              <w:rPr>
+                <w:b w:val="false"/>
+                <w:bCs w:val="false"/>
+                <w:sz w:val="19"/>
+                <w:szCs w:val="19"/>
+              </w:rPr>
+              <w:t xml:space="preserve">List queries must never select the data column.</w:t>
+            </w:r>
+          </w:p>
+        </w:tc>
+      </w:tr>
+      <w:tr>
+        <w:tc>
+          <w:tcPr>
+            <w:tcW w:type="dxa" w:w="2600"/>
+            <w:tcBorders>
+              <w:top w:val="single" w:color="BFBFBF" w:sz="4"/>
+              <w:left w:val="single" w:color="BFBFBF" w:sz="4"/>
+              <w:bottom w:val="single" w:color="BFBFBF" w:sz="4"/>
+              <w:right w:val="single" w:color="BFBFBF" w:sz="4"/>
+            </w:tcBorders>
+            <w:tcMar>
+              <w:top w:type="dxa" w:w="60"/>
+              <w:left w:type="dxa" w:w="100"/>
+              <w:bottom w:type="dxa" w:w="60"/>
+              <w:right w:type="dxa" w:w="100"/>
+            </w:tcMar>
+          </w:tcPr>
+          <w:p>
+            <w:r>
+              <w:rPr>
+                <w:b w:val="false"/>
+                <w:bCs w:val="false"/>
+                <w:sz w:val="19"/>
+                <w:szCs w:val="19"/>
+              </w:rPr>
+              <w:t xml:space="preserve">Uploads through a route handler</w:t>
+            </w:r>
+          </w:p>
+        </w:tc>
+        <w:tc>
+          <w:tcPr>
+            <w:tcW w:type="dxa" w:w="3400"/>
+            <w:tcBorders>
+              <w:top w:val="single" w:color="BFBFBF" w:sz="4"/>
+              <w:left w:val="single" w:color="BFBFBF" w:sz="4"/>
+              <w:bottom w:val="single" w:color="BFBFBF" w:sz="4"/>
+              <w:right w:val="single" w:color="BFBFBF" w:sz="4"/>
+            </w:tcBorders>
+            <w:tcMar>
+              <w:top w:type="dxa" w:w="60"/>
+              <w:left w:type="dxa" w:w="100"/>
+              <w:bottom w:type="dxa" w:w="60"/>
+              <w:right w:type="dxa" w:w="100"/>
+            </w:tcMar>
+          </w:tcPr>
+          <w:p>
+            <w:r>
+              <w:rPr>
+                <w:b w:val="false"/>
+                <w:bCs w:val="false"/>
+                <w:sz w:val="19"/>
+                <w:szCs w:val="19"/>
+              </w:rPr>
+              <w:t xml:space="preserve">Server actions reject bodies over 1 MB; resume PDFs can be larger.</w:t>
+            </w:r>
+          </w:p>
+        </w:tc>
+        <w:tc>
+          <w:tcPr>
+            <w:tcW w:type="dxa" w:w="3026"/>
+            <w:tcBorders>
+              <w:top w:val="single" w:color="BFBFBF" w:sz="4"/>
+              <w:left w:val="single" w:color="BFBFBF" w:sz="4"/>
+              <w:bottom w:val="single" w:color="BFBFBF" w:sz="4"/>
+              <w:right w:val="single" w:color="BFBFBF" w:sz="4"/>
+            </w:tcBorders>
+            <w:tcMar>
+              <w:top w:type="dxa" w:w="60"/>
+              <w:left w:type="dxa" w:w="100"/>
+              <w:bottom w:type="dxa" w:w="60"/>
+              <w:right w:type="dxa" w:w="100"/>
+            </w:tcMar>
+          </w:tcPr>
+          <w:p>
+            <w:r>
+              <w:rPr>
+                <w:b w:val="false"/>
+                <w:bCs w:val="false"/>
+                <w:sz w:val="19"/>
+                <w:szCs w:val="19"/>
+              </w:rPr>
+              <w:t xml:space="preserve">10 MB cap, and the first bytes must match the slot (%PDF, or a zip for DOCX).</w:t>
+            </w:r>
+          </w:p>
+        </w:tc>
+      </w:tr>
+      <w:tr>
+        <w:tc>
+          <w:tcPr>
+            <w:tcW w:type="dxa" w:w="2600"/>
+            <w:tcBorders>
+              <w:top w:val="single" w:color="BFBFBF" w:sz="4"/>
+              <w:left w:val="single" w:color="BFBFBF" w:sz="4"/>
+              <w:bottom w:val="single" w:color="BFBFBF" w:sz="4"/>
+              <w:right w:val="single" w:color="BFBFBF" w:sz="4"/>
+            </w:tcBorders>
+            <w:tcMar>
+              <w:top w:type="dxa" w:w="60"/>
+              <w:left w:type="dxa" w:w="100"/>
+              <w:bottom w:type="dxa" w:w="60"/>
+              <w:right w:type="dxa" w:w="100"/>
+            </w:tcMar>
+          </w:tcPr>
+          <w:p>
+            <w:r>
+              <w:rPr>
+                <w:b w:val="false"/>
+                <w:bCs w:val="false"/>
+                <w:sz w:val="19"/>
+                <w:szCs w:val="19"/>
+              </w:rPr>
+              <w:t xml:space="preserve">PDF preview uses the browser's viewer; DOCX preview is converted to HTML</w:t>
+            </w:r>
+          </w:p>
+        </w:tc>
+        <w:tc>
+          <w:tcPr>
+            <w:tcW w:type="dxa" w:w="3400"/>
+            <w:tcBorders>
+              <w:top w:val="single" w:color="BFBFBF" w:sz="4"/>
+              <w:left w:val="single" w:color="BFBFBF" w:sz="4"/>
+              <w:bottom w:val="single" w:color="BFBFBF" w:sz="4"/>
+              <w:right w:val="single" w:color="BFBFBF" w:sz="4"/>
+            </w:tcBorders>
+            <w:tcMar>
+              <w:top w:type="dxa" w:w="60"/>
+              <w:left w:type="dxa" w:w="100"/>
+              <w:bottom w:type="dxa" w:w="60"/>
+              <w:right w:type="dxa" w:w="100"/>
+            </w:tcMar>
+          </w:tcPr>
+          <w:p>
+            <w:r>
+              <w:rPr>
+                <w:b w:val="false"/>
+                <w:bCs w:val="false"/>
+                <w:sz w:val="19"/>
+                <w:szCs w:val="19"/>
+              </w:rPr>
+              <w:t xml:space="preserve">Browsers cannot display DOCX. mammoth keeps headings, lists, bold, tables and images, not fonts or layout.</w:t>
+            </w:r>
+          </w:p>
+        </w:tc>
+        <w:tc>
+          <w:tcPr>
+            <w:tcW w:type="dxa" w:w="3026"/>
+            <w:tcBorders>
+              <w:top w:val="single" w:color="BFBFBF" w:sz="4"/>
+              <w:left w:val="single" w:color="BFBFBF" w:sz="4"/>
+              <w:bottom w:val="single" w:color="BFBFBF" w:sz="4"/>
+              <w:right w:val="single" w:color="BFBFBF" w:sz="4"/>
+            </w:tcBorders>
+            <w:tcMar>
+              <w:top w:type="dxa" w:w="60"/>
+              <w:left w:type="dxa" w:w="100"/>
+              <w:bottom w:type="dxa" w:w="60"/>
+              <w:right w:type="dxa" w:w="100"/>
+            </w:tcMar>
+          </w:tcPr>
+          <w:p>
+            <w:r>
+              <w:rPr>
+                <w:b w:val="false"/>
+                <w:bCs w:val="false"/>
+                <w:sz w:val="19"/>
+                <w:szCs w:val="19"/>
+              </w:rPr>
+              <w:t xml:space="preserve">PDF is the default preview when a version has both. The DOCX preview is served with a CSP allowing no scripts and shown in a sandboxed iframe.</w:t>
+            </w:r>
+          </w:p>
+        </w:tc>
+      </w:tr>
+      <w:tr>
+        <w:tc>
+          <w:tcPr>
+            <w:tcW w:type="dxa" w:w="2600"/>
+            <w:tcBorders>
+              <w:top w:val="single" w:color="BFBFBF" w:sz="4"/>
+              <w:left w:val="single" w:color="BFBFBF" w:sz="4"/>
+              <w:bottom w:val="single" w:color="BFBFBF" w:sz="4"/>
+              <w:right w:val="single" w:color="BFBFBF" w:sz="4"/>
+            </w:tcBorders>
+            <w:tcMar>
+              <w:top w:type="dxa" w:w="60"/>
+              <w:left w:type="dxa" w:w="100"/>
+              <w:bottom w:type="dxa" w:w="60"/>
+              <w:right w:type="dxa" w:w="100"/>
+            </w:tcMar>
+          </w:tcPr>
+          <w:p>
+            <w:r>
+              <w:rPr>
+                <w:b w:val="false"/>
+                <w:bCs w:val="false"/>
+                <w:sz w:val="19"/>
+                <w:szCs w:val="19"/>
+              </w:rPr>
+              <w:t xml:space="preserve">Selection column narrow (20rem), preview takes the rest</w:t>
+            </w:r>
+          </w:p>
+        </w:tc>
+        <w:tc>
+          <w:tcPr>
+            <w:tcW w:type="dxa" w:w="3400"/>
+            <w:tcBorders>
+              <w:top w:val="single" w:color="BFBFBF" w:sz="4"/>
+              <w:left w:val="single" w:color="BFBFBF" w:sz="4"/>
+              <w:bottom w:val="single" w:color="BFBFBF" w:sz="4"/>
+              <w:right w:val="single" w:color="BFBFBF" w:sz="4"/>
+            </w:tcBorders>
+            <w:tcMar>
+              <w:top w:type="dxa" w:w="60"/>
+              <w:left w:type="dxa" w:w="100"/>
+              <w:bottom w:type="dxa" w:w="60"/>
+              <w:right w:type="dxa" w:w="100"/>
+            </w:tcMar>
+          </w:tcPr>
+          <w:p>
+            <w:r>
+              <w:rPr>
+                <w:b w:val="false"/>
+                <w:bCs w:val="false"/>
+                <w:sz w:val="19"/>
+                <w:szCs w:val="19"/>
+              </w:rPr>
+              <w:t xml:space="preserve">User request: plenty of room for the preview, a neat compact selection.</w:t>
+            </w:r>
+          </w:p>
+        </w:tc>
+        <w:tc>
+          <w:tcPr>
+            <w:tcW w:type="dxa" w:w="3026"/>
+            <w:tcBorders>
+              <w:top w:val="single" w:color="BFBFBF" w:sz="4"/>
+              <w:left w:val="single" w:color="BFBFBF" w:sz="4"/>
+              <w:bottom w:val="single" w:color="BFBFBF" w:sz="4"/>
+              <w:right w:val="single" w:color="BFBFBF" w:sz="4"/>
+            </w:tcBorders>
+            <w:tcMar>
+              <w:top w:type="dxa" w:w="60"/>
+              <w:left w:type="dxa" w:w="100"/>
+              <w:bottom w:type="dxa" w:w="60"/>
+              <w:right w:type="dxa" w:w="100"/>
+            </w:tcMar>
+          </w:tcPr>
+          <w:p>
+            <w:r>
+              <w:rPr>
+                <w:b w:val="false"/>
+                <w:bCs w:val="false"/>
+                <w:sz w:val="19"/>
+                <w:szCs w:val="19"/>
+              </w:rPr>
+              <w:t xml:space="preserve">About 760 x 750 px of preview at 1440x980.</w:t>
+            </w:r>
+          </w:p>
+        </w:tc>
+      </w:tr>
+      <w:tr>
+        <w:tc>
+          <w:tcPr>
+            <w:tcW w:type="dxa" w:w="2600"/>
+            <w:tcBorders>
+              <w:top w:val="single" w:color="BFBFBF" w:sz="4"/>
+              <w:left w:val="single" w:color="BFBFBF" w:sz="4"/>
+              <w:bottom w:val="single" w:color="BFBFBF" w:sz="4"/>
+              <w:right w:val="single" w:color="BFBFBF" w:sz="4"/>
+            </w:tcBorders>
+            <w:tcMar>
+              <w:top w:type="dxa" w:w="60"/>
+              <w:left w:type="dxa" w:w="100"/>
+              <w:bottom w:type="dxa" w:w="60"/>
+              <w:right w:type="dxa" w:w="100"/>
+            </w:tcMar>
+          </w:tcPr>
+          <w:p>
+            <w:r>
+              <w:rPr>
+                <w:b w:val="false"/>
+                <w:bCs w:val="false"/>
+                <w:sz w:val="19"/>
+                <w:szCs w:val="19"/>
+              </w:rPr>
+              <w:t xml:space="preserve">Deleting a resume's last version deletes the resume</w:t>
+            </w:r>
+          </w:p>
+        </w:tc>
+        <w:tc>
+          <w:tcPr>
+            <w:tcW w:type="dxa" w:w="3400"/>
+            <w:tcBorders>
+              <w:top w:val="single" w:color="BFBFBF" w:sz="4"/>
+              <w:left w:val="single" w:color="BFBFBF" w:sz="4"/>
+              <w:bottom w:val="single" w:color="BFBFBF" w:sz="4"/>
+              <w:right w:val="single" w:color="BFBFBF" w:sz="4"/>
+            </w:tcBorders>
+            <w:tcMar>
+              <w:top w:type="dxa" w:w="60"/>
+              <w:left w:type="dxa" w:w="100"/>
+              <w:bottom w:type="dxa" w:w="60"/>
+              <w:right w:type="dxa" w:w="100"/>
+            </w:tcMar>
+          </w:tcPr>
+          <w:p>
+            <w:r>
+              <w:rPr>
+                <w:b w:val="false"/>
+                <w:bCs w:val="false"/>
+                <w:sz w:val="19"/>
+                <w:szCs w:val="19"/>
+              </w:rPr>
+              <w:t xml:space="preserve">A resume with no versions has nothing to show.</w:t>
+            </w:r>
+          </w:p>
+        </w:tc>
+        <w:tc>
+          <w:tcPr>
+            <w:tcW w:type="dxa" w:w="3026"/>
+            <w:tcBorders>
+              <w:top w:val="single" w:color="BFBFBF" w:sz="4"/>
+              <w:left w:val="single" w:color="BFBFBF" w:sz="4"/>
+              <w:bottom w:val="single" w:color="BFBFBF" w:sz="4"/>
+              <w:right w:val="single" w:color="BFBFBF" w:sz="4"/>
+            </w:tcBorders>
+            <w:tcMar>
+              <w:top w:type="dxa" w:w="60"/>
+              <w:left w:type="dxa" w:w="100"/>
+              <w:bottom w:type="dxa" w:w="60"/>
+              <w:right w:type="dxa" w:w="100"/>
+            </w:tcMar>
+          </w:tcPr>
+          <w:p>
+            <w:r>
+              <w:rPr>
+                <w:b w:val="false"/>
+                <w:bCs w:val="false"/>
+                <w:sz w:val="19"/>
+                <w:szCs w:val="19"/>
+              </w:rPr>
+              <w:t xml:space="preserve"/>
+            </w:r>
+          </w:p>
+        </w:tc>
+      </w:tr>
+    </w:tbl>
+    <w:p>
+      <w:pPr>
+        <w:spacing w:after="120"/>
+      </w:pPr>
+    </w:p>
+    <w:p>
+      <w:pPr>
+        <w:pStyle w:val="Heading2"/>
+      </w:pPr>
+      <w:r>
+        <w:t xml:space="preserve">Verification</w:t>
+      </w:r>
+    </w:p>
+    <w:p>
+      <w:pPr>
+        <w:pStyle w:val="ListParagraph"/>
+        <w:numPr>
+          <w:ilvl w:val="0"/>
+          <w:numId w:val="2"/>
+        </w:numPr>
+        <w:spacing w:after="60"/>
+      </w:pPr>
+      <w:r>
+        <w:t xml:space="preserve">tsc and eslint clean.</w:t>
+      </w:r>
+    </w:p>
+    <w:p>
+      <w:pPr>
+        <w:pStyle w:val="ListParagraph"/>
+        <w:numPr>
+          <w:ilvl w:val="0"/>
+          <w:numId w:val="2"/>
+        </w:numPr>
+        <w:spacing w:after="60"/>
+      </w:pPr>
+      <w:r>
+        <w:t xml:space="preserve">Browser walkthrough with a generated test resume (DOCX made with the docx library, PDF exported by Word): Resumes opens from the sidebar; creating a resume makes version A; both slots upload; the PDF preview renders in a 762 x 754 px frame and the DOCX preview renders its text; notes save on blur and survive a reload; the downloaded PDF is byte-identical with attachment headers; a PDF in the DOCX slot is refused; + New version makes B; the sidebar still fits at 1366x768; deleting the resume removes everything. No console errors other than the deliberate 400.</w:t>
+      </w:r>
+    </w:p>
+    <w:p>
+      <w:pPr>
+        <w:pStyle w:val="Heading2"/>
+      </w:pPr>
+      <w:r>
+        <w:t xml:space="preserve">Known risks left behind</w:t>
+      </w:r>
+    </w:p>
+    <w:p>
+      <w:pPr>
+        <w:pStyle w:val="ListParagraph"/>
+        <w:numPr>
+          <w:ilvl w:val="0"/>
+          <w:numId w:val="2"/>
+        </w:numPr>
+        <w:spacing w:after="60"/>
+      </w:pPr>
+      <w:r>
+        <w:t xml:space="preserve">The app has no login. On the public Railway domain anyone who opens /resumes can view and download the resumes, which carry personal details. Add authentication before uploading real resumes there.</w:t>
+      </w:r>
+    </w:p>
+    <w:p>
+      <w:pPr>
+        <w:pStyle w:val="ListParagraph"/>
+        <w:numPr>
+          <w:ilvl w:val="0"/>
+          <w:numId w:val="2"/>
+        </w:numPr>
+        <w:spacing w:after="60"/>
+      </w:pPr>
+      <w:r>
+        <w:t xml:space="preserve">The DOCX preview does not show the real layout; only the PDF preview is exact.</w:t>
+      </w:r>
+    </w:p>
+    <w:p>
+      <w:pPr>
+        <w:pStyle w:val="Heading2"/>
+      </w:pPr>
+      <w:r>
+        <w:t xml:space="preserve">Production data changes</w:t>
+      </w:r>
+    </w:p>
+    <w:p>
+      <w:pPr>
+        <w:pStyle w:val="ListParagraph"/>
+        <w:numPr>
+          <w:ilvl w:val="0"/>
+          <w:numId w:val="2"/>
+        </w:numPr>
+        <w:spacing w:after="60"/>
+      </w:pPr>
+      <w:r>
+        <w:t xml:space="preserve">Applied migration 20260928140000_resumes (new tables). The test resume was deleted; the tables are empty.</w:t>
       </w:r>
     </w:p>
     <w:sectPr>

</xml_diff>

<commit_message>
Battlefield-first Resumes, collapsible Frost for short screens
Sidebar: on a 13-inch screen the Battlefield list was squeezed to
nothing. Frost is now collapsible (collapsed by default, remembered in
kamui.frost.open) with single-row sliders when open, and the Battlefield
list always keeps room for two rows. Fits at 1280x680 with Frost open or
closed; on shorter windows with Frost open the sidebar scrolls instead
of clipping.

Resumes: rebuilt as Battlefield > resume > version. Pick a Battlefield
to see only its resumes; + New resume creates one inside it; the
version chips carry + New in the same row; notes and files appear only
once a version is picked. A resume can no longer be moved to another
Battlefield (updateResume replaced by renameResume), and a version from
another Battlefield in the URL is ignored. Existing resumes and files
are untouched.

Co-Authored-By: Claude Opus 5.5 <noreply@anthropic.com>
</commit_message>
<xml_diff>
--- a/docs/KAMUI-postmortem.docx
+++ b/docs/KAMUI-postmortem.docx
@@ -21,7 +21,7 @@
         <w:rPr>
           <w:color w:val="666666"/>
         </w:rPr>
-        <w:t xml:space="preserve">Last updated 2026-09-24, after the Resumes password lock.</w:t>
+        <w:t xml:space="preserve">Last updated 2026-09-24, after the Battlefield-first Resumes page.</w:t>
       </w:r>
     </w:p>
     <w:p>
@@ -84,7 +84,7 @@
         <w:pStyle w:val="Heading1"/>
       </w:pPr>
       <w:r>
-        <w:t xml:space="preserve">The system after the Resumes password lock</w:t>
+        <w:t xml:space="preserve">The system after the Battlefield-first Resumes page</w:t>
       </w:r>
     </w:p>
     <w:p>
@@ -1853,6 +1853,64 @@
                 <w:szCs w:val="19"/>
               </w:rPr>
               <w:t xml:space="preserve">10 failures per address per 15 minutes, counted in memory: wait, or redeploy/restart the web service to clear it.</w:t>
+            </w:r>
+          </w:p>
+        </w:tc>
+      </w:tr>
+      <w:tr>
+        <w:tc>
+          <w:tcPr>
+            <w:tcW w:type="dxa" w:w="3200"/>
+            <w:tcBorders>
+              <w:top w:val="single" w:color="BFBFBF" w:sz="4"/>
+              <w:left w:val="single" w:color="BFBFBF" w:sz="4"/>
+              <w:bottom w:val="single" w:color="BFBFBF" w:sz="4"/>
+              <w:right w:val="single" w:color="BFBFBF" w:sz="4"/>
+            </w:tcBorders>
+            <w:tcMar>
+              <w:top w:type="dxa" w:w="60"/>
+              <w:left w:type="dxa" w:w="100"/>
+              <w:bottom w:type="dxa" w:w="60"/>
+              <w:right w:type="dxa" w:w="100"/>
+            </w:tcMar>
+          </w:tcPr>
+          <w:p>
+            <w:r>
+              <w:rPr>
+                <w:b w:val="false"/>
+                <w:bCs w:val="false"/>
+                <w:sz w:val="19"/>
+                <w:szCs w:val="19"/>
+              </w:rPr>
+              <w:t xml:space="preserve">The sidebar's Battlefield list is cut short</w:t>
+            </w:r>
+          </w:p>
+        </w:tc>
+        <w:tc>
+          <w:tcPr>
+            <w:tcW w:type="dxa" w:w="5826"/>
+            <w:tcBorders>
+              <w:top w:val="single" w:color="BFBFBF" w:sz="4"/>
+              <w:left w:val="single" w:color="BFBFBF" w:sz="4"/>
+              <w:bottom w:val="single" w:color="BFBFBF" w:sz="4"/>
+              <w:right w:val="single" w:color="BFBFBF" w:sz="4"/>
+            </w:tcBorders>
+            <w:tcMar>
+              <w:top w:type="dxa" w:w="60"/>
+              <w:left w:type="dxa" w:w="100"/>
+              <w:bottom w:type="dxa" w:w="60"/>
+              <w:right w:type="dxa" w:w="100"/>
+            </w:tcMar>
+          </w:tcPr>
+          <w:p>
+            <w:r>
+              <w:rPr>
+                <w:b w:val="false"/>
+                <w:bCs w:val="false"/>
+                <w:sz w:val="19"/>
+                <w:szCs w:val="19"/>
+              </w:rPr>
+              <w:t xml:space="preserve">Frost is probably open on a short screen: collapse it (its header is a toggle). The list always keeps room for two rows and scrolls beyond that.</w:t>
             </w:r>
           </w:p>
         </w:tc>
@@ -14552,6 +14610,779 @@
       </w:pPr>
       <w:r>
         <w:t xml:space="preserve">Applied migration 20260929120000_app_settings (new table). AppSetting holds resumes.signingKey; no password hash is stored (the default applies).</w:t>
+      </w:r>
+    </w:p>
+    <w:p>
+      <w:pPr>
+        <w:pStyle w:val="Heading1"/>
+      </w:pPr>
+      <w:r>
+        <w:t xml:space="preserve">Short-screen sidebar and the Battlefield-first Resumes page</w:t>
+      </w:r>
+    </w:p>
+    <w:p>
+      <w:pPr>
+        <w:spacing w:after="120"/>
+        <w:rPr>
+          <w:color w:val="666666"/>
+          <w:sz w:val="20"/>
+          <w:szCs w:val="20"/>
+        </w:rPr>
+      </w:pPr>
+      <w:r>
+        <w:rPr>
+          <w:color w:val="666666"/>
+          <w:sz w:val="20"/>
+          <w:szCs w:val="20"/>
+        </w:rPr>
+        <w:t xml:space="preserve">2026-09-29  ·  commit see git log: Battlefield-first Resumes, collapsible Frost</w:t>
+      </w:r>
+    </w:p>
+    <w:p>
+      <w:pPr>
+        <w:spacing w:after="120"/>
+      </w:pPr>
+      <w:r>
+        <w:t xml:space="preserve">On the user's 13-inch screen the sidebar's Battlefield list was squeezed to nothing. Frost is now collapsible (collapsed by default) and compact when open, and the list always keeps room for two Battlefields. The Resumes page was rebuilt around the user's hierarchy: Battlefield, then resume, then version (with + New in the version row), then files and notes; resumes cannot be moved between Battlefields.</w:t>
+      </w:r>
+    </w:p>
+    <w:p>
+      <w:pPr>
+        <w:pStyle w:val="Heading2"/>
+      </w:pPr>
+      <w:r>
+        <w:t xml:space="preserve">What changed</w:t>
+      </w:r>
+    </w:p>
+    <w:p>
+      <w:pPr>
+        <w:pStyle w:val="ListParagraph"/>
+        <w:numPr>
+          <w:ilvl w:val="0"/>
+          <w:numId w:val="2"/>
+        </w:numPr>
+        <w:spacing w:after="60"/>
+      </w:pPr>
+      <w:r>
+        <w:t xml:space="preserve">Sidebar: Frost header is a toggle (kamui.frost.open, collapsed by default); sliders are single rows; the Battlefield list has a minimum height of two rows; the sidebar itself scrolls only as a last resort on very short windows with Frost open.</w:t>
+      </w:r>
+    </w:p>
+    <w:p>
+      <w:pPr>
+        <w:pStyle w:val="ListParagraph"/>
+        <w:numPr>
+          <w:ilvl w:val="0"/>
+          <w:numId w:val="2"/>
+        </w:numPr>
+        <w:spacing w:after="60"/>
+      </w:pPr>
+      <w:r>
+        <w:t xml:space="preserve">Resumes page: 1. Battlefield list, 2. that Battlefield's resumes (+ New resume creates it there), 3. the resume's version chips with + New, 4. the selected version's notes, files, rename and delete. The preview names Battlefield, resume and version. URL ?battlefield=&amp;resume=&amp;version=; a version from another Battlefield is ignored.</w:t>
+      </w:r>
+    </w:p>
+    <w:p>
+      <w:pPr>
+        <w:pStyle w:val="ListParagraph"/>
+        <w:numPr>
+          <w:ilvl w:val="0"/>
+          <w:numId w:val="2"/>
+        </w:numPr>
+        <w:spacing w:after="60"/>
+      </w:pPr>
+      <w:r>
+        <w:t xml:space="preserve">Actions: createResume requires the selected Battlefield; updateResume (which could change the Battlefield) replaced by renameResume; every redirect keeps the Battlefield.</w:t>
+      </w:r>
+    </w:p>
+    <w:p>
+      <w:pPr>
+        <w:pStyle w:val="ListParagraph"/>
+        <w:numPr>
+          <w:ilvl w:val="0"/>
+          <w:numId w:val="2"/>
+        </w:numPr>
+        <w:spacing w:after="60"/>
+      </w:pPr>
+      <w:r>
+        <w:t xml:space="preserve">DESIGN-SYSTEM.md sections 4 and 6 updated for the collapsible Frost and the sidebar fitting rule.</w:t>
+      </w:r>
+    </w:p>
+    <w:p>
+      <w:pPr>
+        <w:pStyle w:val="Heading2"/>
+      </w:pPr>
+      <w:r>
+        <w:t xml:space="preserve">Decisions and deviations from the spec</w:t>
+      </w:r>
+    </w:p>
+    <w:tbl>
+      <w:tblPr>
+        <w:tblW w:type="dxa" w:w="9026"/>
+        <w:tblBorders>
+          <w:top w:val="single" w:color="auto" w:sz="4"/>
+          <w:left w:val="single" w:color="auto" w:sz="4"/>
+          <w:bottom w:val="single" w:color="auto" w:sz="4"/>
+          <w:right w:val="single" w:color="auto" w:sz="4"/>
+          <w:insideH w:val="single" w:color="auto" w:sz="4"/>
+          <w:insideV w:val="single" w:color="auto" w:sz="4"/>
+        </w:tblBorders>
+      </w:tblPr>
+      <w:tblGrid>
+        <w:gridCol w:w="2600"/>
+        <w:gridCol w:w="3400"/>
+        <w:gridCol w:w="3026"/>
+      </w:tblGrid>
+      <w:tr>
+        <w:trPr>
+          <w:tblHeader/>
+        </w:trPr>
+        <w:tc>
+          <w:tcPr>
+            <w:tcW w:type="dxa" w:w="2600"/>
+            <w:tcBorders>
+              <w:top w:val="single" w:color="BFBFBF" w:sz="4"/>
+              <w:left w:val="single" w:color="BFBFBF" w:sz="4"/>
+              <w:bottom w:val="single" w:color="BFBFBF" w:sz="4"/>
+              <w:right w:val="single" w:color="BFBFBF" w:sz="4"/>
+            </w:tcBorders>
+            <w:shd w:fill="EDEDED" w:color="auto" w:val="clear"/>
+            <w:tcMar>
+              <w:top w:type="dxa" w:w="60"/>
+              <w:left w:type="dxa" w:w="100"/>
+              <w:bottom w:type="dxa" w:w="60"/>
+              <w:right w:type="dxa" w:w="100"/>
+            </w:tcMar>
+          </w:tcPr>
+          <w:p>
+            <w:r>
+              <w:rPr>
+                <w:b/>
+                <w:bCs/>
+                <w:sz w:val="19"/>
+                <w:szCs w:val="19"/>
+              </w:rPr>
+              <w:t xml:space="preserve">Decision</w:t>
+            </w:r>
+          </w:p>
+        </w:tc>
+        <w:tc>
+          <w:tcPr>
+            <w:tcW w:type="dxa" w:w="3400"/>
+            <w:tcBorders>
+              <w:top w:val="single" w:color="BFBFBF" w:sz="4"/>
+              <w:left w:val="single" w:color="BFBFBF" w:sz="4"/>
+              <w:bottom w:val="single" w:color="BFBFBF" w:sz="4"/>
+              <w:right w:val="single" w:color="BFBFBF" w:sz="4"/>
+            </w:tcBorders>
+            <w:shd w:fill="EDEDED" w:color="auto" w:val="clear"/>
+            <w:tcMar>
+              <w:top w:type="dxa" w:w="60"/>
+              <w:left w:type="dxa" w:w="100"/>
+              <w:bottom w:type="dxa" w:w="60"/>
+              <w:right w:type="dxa" w:w="100"/>
+            </w:tcMar>
+          </w:tcPr>
+          <w:p>
+            <w:r>
+              <w:rPr>
+                <w:b/>
+                <w:bCs/>
+                <w:sz w:val="19"/>
+                <w:szCs w:val="19"/>
+              </w:rPr>
+              <w:t xml:space="preserve">Why</w:t>
+            </w:r>
+          </w:p>
+        </w:tc>
+        <w:tc>
+          <w:tcPr>
+            <w:tcW w:type="dxa" w:w="3026"/>
+            <w:tcBorders>
+              <w:top w:val="single" w:color="BFBFBF" w:sz="4"/>
+              <w:left w:val="single" w:color="BFBFBF" w:sz="4"/>
+              <w:bottom w:val="single" w:color="BFBFBF" w:sz="4"/>
+              <w:right w:val="single" w:color="BFBFBF" w:sz="4"/>
+            </w:tcBorders>
+            <w:shd w:fill="EDEDED" w:color="auto" w:val="clear"/>
+            <w:tcMar>
+              <w:top w:type="dxa" w:w="60"/>
+              <w:left w:type="dxa" w:w="100"/>
+              <w:bottom w:type="dxa" w:w="60"/>
+              <w:right w:type="dxa" w:w="100"/>
+            </w:tcMar>
+          </w:tcPr>
+          <w:p>
+            <w:r>
+              <w:rPr>
+                <w:b/>
+                <w:bCs/>
+                <w:sz w:val="19"/>
+                <w:szCs w:val="19"/>
+              </w:rPr>
+              <w:t xml:space="preserve">Consequence / where</w:t>
+            </w:r>
+          </w:p>
+        </w:tc>
+      </w:tr>
+      <w:tr>
+        <w:tc>
+          <w:tcPr>
+            <w:tcW w:type="dxa" w:w="2600"/>
+            <w:tcBorders>
+              <w:top w:val="single" w:color="BFBFBF" w:sz="4"/>
+              <w:left w:val="single" w:color="BFBFBF" w:sz="4"/>
+              <w:bottom w:val="single" w:color="BFBFBF" w:sz="4"/>
+              <w:right w:val="single" w:color="BFBFBF" w:sz="4"/>
+            </w:tcBorders>
+            <w:tcMar>
+              <w:top w:type="dxa" w:w="60"/>
+              <w:left w:type="dxa" w:w="100"/>
+              <w:bottom w:type="dxa" w:w="60"/>
+              <w:right w:type="dxa" w:w="100"/>
+            </w:tcMar>
+          </w:tcPr>
+          <w:p>
+            <w:r>
+              <w:rPr>
+                <w:b w:val="false"/>
+                <w:bCs w:val="false"/>
+                <w:sz w:val="19"/>
+                <w:szCs w:val="19"/>
+              </w:rPr>
+              <w:t xml:space="preserve">Frost collapses rather than only shrinking</w:t>
+            </w:r>
+          </w:p>
+        </w:tc>
+        <w:tc>
+          <w:tcPr>
+            <w:tcW w:type="dxa" w:w="3400"/>
+            <w:tcBorders>
+              <w:top w:val="single" w:color="BFBFBF" w:sz="4"/>
+              <w:left w:val="single" w:color="BFBFBF" w:sz="4"/>
+              <w:bottom w:val="single" w:color="BFBFBF" w:sz="4"/>
+              <w:right w:val="single" w:color="BFBFBF" w:sz="4"/>
+            </w:tcBorders>
+            <w:tcMar>
+              <w:top w:type="dxa" w:w="60"/>
+              <w:left w:type="dxa" w:w="100"/>
+              <w:bottom w:type="dxa" w:w="60"/>
+              <w:right w:type="dxa" w:w="100"/>
+            </w:tcMar>
+          </w:tcPr>
+          <w:p>
+            <w:r>
+              <w:rPr>
+                <w:b w:val="false"/>
+                <w:bCs w:val="false"/>
+                <w:sz w:val="19"/>
+                <w:szCs w:val="19"/>
+              </w:rPr>
+              <w:t xml:space="preserve">Frost is adjusted rarely; collapsed it costs one row, which is what short screens need.</w:t>
+            </w:r>
+          </w:p>
+        </w:tc>
+        <w:tc>
+          <w:tcPr>
+            <w:tcW w:type="dxa" w:w="3026"/>
+            <w:tcBorders>
+              <w:top w:val="single" w:color="BFBFBF" w:sz="4"/>
+              <w:left w:val="single" w:color="BFBFBF" w:sz="4"/>
+              <w:bottom w:val="single" w:color="BFBFBF" w:sz="4"/>
+              <w:right w:val="single" w:color="BFBFBF" w:sz="4"/>
+            </w:tcBorders>
+            <w:tcMar>
+              <w:top w:type="dxa" w:w="60"/>
+              <w:left w:type="dxa" w:w="100"/>
+              <w:bottom w:type="dxa" w:w="60"/>
+              <w:right w:type="dxa" w:w="100"/>
+            </w:tcMar>
+          </w:tcPr>
+          <w:p>
+            <w:r>
+              <w:rPr>
+                <w:b w:val="false"/>
+                <w:bCs w:val="false"/>
+                <w:sz w:val="19"/>
+                <w:szCs w:val="19"/>
+              </w:rPr>
+              <w:t xml:space="preserve">Open, it still fits at 1280x680; below that the sidebar scrolls instead of clipping.</w:t>
+            </w:r>
+          </w:p>
+        </w:tc>
+      </w:tr>
+      <w:tr>
+        <w:tc>
+          <w:tcPr>
+            <w:tcW w:type="dxa" w:w="2600"/>
+            <w:tcBorders>
+              <w:top w:val="single" w:color="BFBFBF" w:sz="4"/>
+              <w:left w:val="single" w:color="BFBFBF" w:sz="4"/>
+              <w:bottom w:val="single" w:color="BFBFBF" w:sz="4"/>
+              <w:right w:val="single" w:color="BFBFBF" w:sz="4"/>
+            </w:tcBorders>
+            <w:tcMar>
+              <w:top w:type="dxa" w:w="60"/>
+              <w:left w:type="dxa" w:w="100"/>
+              <w:bottom w:type="dxa" w:w="60"/>
+              <w:right w:type="dxa" w:w="100"/>
+            </w:tcMar>
+          </w:tcPr>
+          <w:p>
+            <w:r>
+              <w:rPr>
+                <w:b w:val="false"/>
+                <w:bCs w:val="false"/>
+                <w:sz w:val="19"/>
+                <w:szCs w:val="19"/>
+              </w:rPr>
+              <w:t xml:space="preserve">Moving a resume to another Battlefield removed from the UI and the server</w:t>
+            </w:r>
+          </w:p>
+        </w:tc>
+        <w:tc>
+          <w:tcPr>
+            <w:tcW w:type="dxa" w:w="3400"/>
+            <w:tcBorders>
+              <w:top w:val="single" w:color="BFBFBF" w:sz="4"/>
+              <w:left w:val="single" w:color="BFBFBF" w:sz="4"/>
+              <w:bottom w:val="single" w:color="BFBFBF" w:sz="4"/>
+              <w:right w:val="single" w:color="BFBFBF" w:sz="4"/>
+            </w:tcBorders>
+            <w:tcMar>
+              <w:top w:type="dxa" w:w="60"/>
+              <w:left w:type="dxa" w:w="100"/>
+              <w:bottom w:type="dxa" w:w="60"/>
+              <w:right w:type="dxa" w:w="100"/>
+            </w:tcMar>
+          </w:tcPr>
+          <w:p>
+            <w:r>
+              <w:rPr>
+                <w:b w:val="false"/>
+                <w:bCs w:val="false"/>
+                <w:sz w:val="19"/>
+                <w:szCs w:val="19"/>
+              </w:rPr>
+              <w:t xml:space="preserve">User rule: the Battlefield is superordinate and reassigning is forbidden for now.</w:t>
+            </w:r>
+          </w:p>
+        </w:tc>
+        <w:tc>
+          <w:tcPr>
+            <w:tcW w:type="dxa" w:w="3026"/>
+            <w:tcBorders>
+              <w:top w:val="single" w:color="BFBFBF" w:sz="4"/>
+              <w:left w:val="single" w:color="BFBFBF" w:sz="4"/>
+              <w:bottom w:val="single" w:color="BFBFBF" w:sz="4"/>
+              <w:right w:val="single" w:color="BFBFBF" w:sz="4"/>
+            </w:tcBorders>
+            <w:tcMar>
+              <w:top w:type="dxa" w:w="60"/>
+              <w:left w:type="dxa" w:w="100"/>
+              <w:bottom w:type="dxa" w:w="60"/>
+              <w:right w:type="dxa" w:w="100"/>
+            </w:tcMar>
+          </w:tcPr>
+          <w:p>
+            <w:r>
+              <w:rPr>
+                <w:b w:val="false"/>
+                <w:bCs w:val="false"/>
+                <w:sz w:val="19"/>
+                <w:szCs w:val="19"/>
+              </w:rPr>
+              <w:t xml:space="preserve">Existing resumes kept their Battlefields; nothing was moved or deleted.</w:t>
+            </w:r>
+          </w:p>
+        </w:tc>
+      </w:tr>
+      <w:tr>
+        <w:tc>
+          <w:tcPr>
+            <w:tcW w:type="dxa" w:w="2600"/>
+            <w:tcBorders>
+              <w:top w:val="single" w:color="BFBFBF" w:sz="4"/>
+              <w:left w:val="single" w:color="BFBFBF" w:sz="4"/>
+              <w:bottom w:val="single" w:color="BFBFBF" w:sz="4"/>
+              <w:right w:val="single" w:color="BFBFBF" w:sz="4"/>
+            </w:tcBorders>
+            <w:tcMar>
+              <w:top w:type="dxa" w:w="60"/>
+              <w:left w:type="dxa" w:w="100"/>
+              <w:bottom w:type="dxa" w:w="60"/>
+              <w:right w:type="dxa" w:w="100"/>
+            </w:tcMar>
+          </w:tcPr>
+          <w:p>
+            <w:r>
+              <w:rPr>
+                <w:b w:val="false"/>
+                <w:bCs w:val="false"/>
+                <w:sz w:val="19"/>
+                <w:szCs w:val="19"/>
+              </w:rPr>
+              <w:t xml:space="preserve">Selecting a resume does not pick a version</w:t>
+            </w:r>
+          </w:p>
+        </w:tc>
+        <w:tc>
+          <w:tcPr>
+            <w:tcW w:type="dxa" w:w="3400"/>
+            <w:tcBorders>
+              <w:top w:val="single" w:color="BFBFBF" w:sz="4"/>
+              <w:left w:val="single" w:color="BFBFBF" w:sz="4"/>
+              <w:bottom w:val="single" w:color="BFBFBF" w:sz="4"/>
+              <w:right w:val="single" w:color="BFBFBF" w:sz="4"/>
+            </w:tcBorders>
+            <w:tcMar>
+              <w:top w:type="dxa" w:w="60"/>
+              <w:left w:type="dxa" w:w="100"/>
+              <w:bottom w:type="dxa" w:w="60"/>
+              <w:right w:type="dxa" w:w="100"/>
+            </w:tcMar>
+          </w:tcPr>
+          <w:p>
+            <w:r>
+              <w:rPr>
+                <w:b w:val="false"/>
+                <w:bCs w:val="false"/>
+                <w:sz w:val="19"/>
+                <w:szCs w:val="19"/>
+              </w:rPr>
+              <w:t xml:space="preserve">User rule: files appear only after choosing Battlefield and version.</w:t>
+            </w:r>
+          </w:p>
+        </w:tc>
+        <w:tc>
+          <w:tcPr>
+            <w:tcW w:type="dxa" w:w="3026"/>
+            <w:tcBorders>
+              <w:top w:val="single" w:color="BFBFBF" w:sz="4"/>
+              <w:left w:val="single" w:color="BFBFBF" w:sz="4"/>
+              <w:bottom w:val="single" w:color="BFBFBF" w:sz="4"/>
+              <w:right w:val="single" w:color="BFBFBF" w:sz="4"/>
+            </w:tcBorders>
+            <w:tcMar>
+              <w:top w:type="dxa" w:w="60"/>
+              <w:left w:type="dxa" w:w="100"/>
+              <w:bottom w:type="dxa" w:w="60"/>
+              <w:right w:type="dxa" w:w="100"/>
+            </w:tcMar>
+          </w:tcPr>
+          <w:p>
+            <w:r>
+              <w:rPr>
+                <w:b w:val="false"/>
+                <w:bCs w:val="false"/>
+                <w:sz w:val="19"/>
+                <w:szCs w:val="19"/>
+              </w:rPr>
+              <w:t xml:space="preserve">The preview says which step is next.</w:t>
+            </w:r>
+          </w:p>
+        </w:tc>
+      </w:tr>
+    </w:tbl>
+    <w:p>
+      <w:pPr>
+        <w:spacing w:after="120"/>
+      </w:pPr>
+    </w:p>
+    <w:p>
+      <w:pPr>
+        <w:pStyle w:val="Heading2"/>
+      </w:pPr>
+      <w:r>
+        <w:t xml:space="preserve">Problems found</w:t>
+      </w:r>
+    </w:p>
+    <w:tbl>
+      <w:tblPr>
+        <w:tblW w:type="dxa" w:w="9026"/>
+        <w:tblBorders>
+          <w:top w:val="single" w:color="auto" w:sz="4"/>
+          <w:left w:val="single" w:color="auto" w:sz="4"/>
+          <w:bottom w:val="single" w:color="auto" w:sz="4"/>
+          <w:right w:val="single" w:color="auto" w:sz="4"/>
+          <w:insideH w:val="single" w:color="auto" w:sz="4"/>
+          <w:insideV w:val="single" w:color="auto" w:sz="4"/>
+        </w:tblBorders>
+      </w:tblPr>
+      <w:tblGrid>
+        <w:gridCol w:w="2800"/>
+        <w:gridCol w:w="3300"/>
+        <w:gridCol w:w="2926"/>
+      </w:tblGrid>
+      <w:tr>
+        <w:trPr>
+          <w:tblHeader/>
+        </w:trPr>
+        <w:tc>
+          <w:tcPr>
+            <w:tcW w:type="dxa" w:w="2800"/>
+            <w:tcBorders>
+              <w:top w:val="single" w:color="BFBFBF" w:sz="4"/>
+              <w:left w:val="single" w:color="BFBFBF" w:sz="4"/>
+              <w:bottom w:val="single" w:color="BFBFBF" w:sz="4"/>
+              <w:right w:val="single" w:color="BFBFBF" w:sz="4"/>
+            </w:tcBorders>
+            <w:shd w:fill="EDEDED" w:color="auto" w:val="clear"/>
+            <w:tcMar>
+              <w:top w:type="dxa" w:w="60"/>
+              <w:left w:type="dxa" w:w="100"/>
+              <w:bottom w:type="dxa" w:w="60"/>
+              <w:right w:type="dxa" w:w="100"/>
+            </w:tcMar>
+          </w:tcPr>
+          <w:p>
+            <w:r>
+              <w:rPr>
+                <w:b/>
+                <w:bCs/>
+                <w:sz w:val="19"/>
+                <w:szCs w:val="19"/>
+              </w:rPr>
+              <w:t xml:space="preserve">Symptom</w:t>
+            </w:r>
+          </w:p>
+        </w:tc>
+        <w:tc>
+          <w:tcPr>
+            <w:tcW w:type="dxa" w:w="3300"/>
+            <w:tcBorders>
+              <w:top w:val="single" w:color="BFBFBF" w:sz="4"/>
+              <w:left w:val="single" w:color="BFBFBF" w:sz="4"/>
+              <w:bottom w:val="single" w:color="BFBFBF" w:sz="4"/>
+              <w:right w:val="single" w:color="BFBFBF" w:sz="4"/>
+            </w:tcBorders>
+            <w:shd w:fill="EDEDED" w:color="auto" w:val="clear"/>
+            <w:tcMar>
+              <w:top w:type="dxa" w:w="60"/>
+              <w:left w:type="dxa" w:w="100"/>
+              <w:bottom w:type="dxa" w:w="60"/>
+              <w:right w:type="dxa" w:w="100"/>
+            </w:tcMar>
+          </w:tcPr>
+          <w:p>
+            <w:r>
+              <w:rPr>
+                <w:b/>
+                <w:bCs/>
+                <w:sz w:val="19"/>
+                <w:szCs w:val="19"/>
+              </w:rPr>
+              <w:t xml:space="preserve">Cause</w:t>
+            </w:r>
+          </w:p>
+        </w:tc>
+        <w:tc>
+          <w:tcPr>
+            <w:tcW w:type="dxa" w:w="2926"/>
+            <w:tcBorders>
+              <w:top w:val="single" w:color="BFBFBF" w:sz="4"/>
+              <w:left w:val="single" w:color="BFBFBF" w:sz="4"/>
+              <w:bottom w:val="single" w:color="BFBFBF" w:sz="4"/>
+              <w:right w:val="single" w:color="BFBFBF" w:sz="4"/>
+            </w:tcBorders>
+            <w:shd w:fill="EDEDED" w:color="auto" w:val="clear"/>
+            <w:tcMar>
+              <w:top w:type="dxa" w:w="60"/>
+              <w:left w:type="dxa" w:w="100"/>
+              <w:bottom w:type="dxa" w:w="60"/>
+              <w:right w:type="dxa" w:w="100"/>
+            </w:tcMar>
+          </w:tcPr>
+          <w:p>
+            <w:r>
+              <w:rPr>
+                <w:b/>
+                <w:bCs/>
+                <w:sz w:val="19"/>
+                <w:szCs w:val="19"/>
+              </w:rPr>
+              <w:t xml:space="preserve">Resolution</w:t>
+            </w:r>
+          </w:p>
+        </w:tc>
+      </w:tr>
+      <w:tr>
+        <w:tc>
+          <w:tcPr>
+            <w:tcW w:type="dxa" w:w="2800"/>
+            <w:tcBorders>
+              <w:top w:val="single" w:color="BFBFBF" w:sz="4"/>
+              <w:left w:val="single" w:color="BFBFBF" w:sz="4"/>
+              <w:bottom w:val="single" w:color="BFBFBF" w:sz="4"/>
+              <w:right w:val="single" w:color="BFBFBF" w:sz="4"/>
+            </w:tcBorders>
+            <w:tcMar>
+              <w:top w:type="dxa" w:w="60"/>
+              <w:left w:type="dxa" w:w="100"/>
+              <w:bottom w:type="dxa" w:w="60"/>
+              <w:right w:type="dxa" w:w="100"/>
+            </w:tcMar>
+          </w:tcPr>
+          <w:p>
+            <w:r>
+              <w:rPr>
+                <w:b w:val="false"/>
+                <w:bCs w:val="false"/>
+                <w:sz w:val="19"/>
+                <w:szCs w:val="19"/>
+              </w:rPr>
+              <w:t xml:space="preserve">Battlefield list invisible on a 13-inch screen (reported by the user).</w:t>
+            </w:r>
+          </w:p>
+        </w:tc>
+        <w:tc>
+          <w:tcPr>
+            <w:tcW w:type="dxa" w:w="3300"/>
+            <w:tcBorders>
+              <w:top w:val="single" w:color="BFBFBF" w:sz="4"/>
+              <w:left w:val="single" w:color="BFBFBF" w:sz="4"/>
+              <w:bottom w:val="single" w:color="BFBFBF" w:sz="4"/>
+              <w:right w:val="single" w:color="BFBFBF" w:sz="4"/>
+            </w:tcBorders>
+            <w:tcMar>
+              <w:top w:type="dxa" w:w="60"/>
+              <w:left w:type="dxa" w:w="100"/>
+              <w:bottom w:type="dxa" w:w="60"/>
+              <w:right w:type="dxa" w:w="100"/>
+            </w:tcMar>
+          </w:tcPr>
+          <w:p>
+            <w:r>
+              <w:rPr>
+                <w:b w:val="false"/>
+                <w:bCs w:val="false"/>
+                <w:sz w:val="19"/>
+                <w:szCs w:val="19"/>
+              </w:rPr>
+              <w:t xml:space="preserve">The list was the only part of the sidebar allowed to shrink, and Frost took about 270px.</w:t>
+            </w:r>
+          </w:p>
+        </w:tc>
+        <w:tc>
+          <w:tcPr>
+            <w:tcW w:type="dxa" w:w="2926"/>
+            <w:tcBorders>
+              <w:top w:val="single" w:color="BFBFBF" w:sz="4"/>
+              <w:left w:val="single" w:color="BFBFBF" w:sz="4"/>
+              <w:bottom w:val="single" w:color="BFBFBF" w:sz="4"/>
+              <w:right w:val="single" w:color="BFBFBF" w:sz="4"/>
+            </w:tcBorders>
+            <w:tcMar>
+              <w:top w:type="dxa" w:w="60"/>
+              <w:left w:type="dxa" w:w="100"/>
+              <w:bottom w:type="dxa" w:w="60"/>
+              <w:right w:type="dxa" w:w="100"/>
+            </w:tcMar>
+          </w:tcPr>
+          <w:p>
+            <w:r>
+              <w:rPr>
+                <w:b w:val="false"/>
+                <w:bCs w:val="false"/>
+                <w:sz w:val="19"/>
+                <w:szCs w:val="19"/>
+              </w:rPr>
+              <w:t xml:space="preserve">Collapsible, compact Frost and a two-row minimum for the list.</w:t>
+            </w:r>
+          </w:p>
+        </w:tc>
+      </w:tr>
+    </w:tbl>
+    <w:p>
+      <w:pPr>
+        <w:spacing w:after="120"/>
+      </w:pPr>
+    </w:p>
+    <w:p>
+      <w:pPr>
+        <w:pStyle w:val="Heading2"/>
+      </w:pPr>
+      <w:r>
+        <w:t xml:space="preserve">Verification</w:t>
+      </w:r>
+    </w:p>
+    <w:p>
+      <w:pPr>
+        <w:pStyle w:val="ListParagraph"/>
+        <w:numPr>
+          <w:ilvl w:val="0"/>
+          <w:numId w:val="2"/>
+        </w:numPr>
+        <w:spacing w:after="60"/>
+      </w:pPr>
+      <w:r>
+        <w:t xml:space="preserve">tsc and eslint clean.</w:t>
+      </w:r>
+    </w:p>
+    <w:p>
+      <w:pPr>
+        <w:pStyle w:val="ListParagraph"/>
+        <w:numPr>
+          <w:ilvl w:val="0"/>
+          <w:numId w:val="2"/>
+        </w:numPr>
+        <w:spacing w:after="60"/>
+      </w:pPr>
+      <w:r>
+        <w:t xml:space="preserve">Sidebar at 1440x980, 1280x680 and 1152x620: both Battlefields fully visible with Frost closed and open; the sidebar fits except 1152x620 with Frost open (25px over, scrolls).</w:t>
+      </w:r>
+    </w:p>
+    <w:p>
+      <w:pPr>
+        <w:pStyle w:val="ListParagraph"/>
+        <w:numPr>
+          <w:ilvl w:val="0"/>
+          <w:numId w:val="2"/>
+        </w:numPr>
+        <w:spacing w:after="60"/>
+      </w:pPr>
+      <w:r>
+        <w:t xml:space="preserve">Resumes, read-only against the user's real data at 1280x680: unlock, pick AI/ML Engineer, pick AI-ML Resume (versions A, B, C shown, no preview until a version is picked), pick C: notes and files show and the PDF preview frame fills the space; the same version id under B2B Content is ignored.</w:t>
+      </w:r>
+    </w:p>
+    <w:p>
+      <w:pPr>
+        <w:pStyle w:val="Heading2"/>
+      </w:pPr>
+      <w:r>
+        <w:t xml:space="preserve">Known risks left behind</w:t>
+      </w:r>
+    </w:p>
+    <w:p>
+      <w:pPr>
+        <w:pStyle w:val="ListParagraph"/>
+        <w:numPr>
+          <w:ilvl w:val="0"/>
+          <w:numId w:val="2"/>
+        </w:numPr>
+        <w:spacing w:after="60"/>
+      </w:pPr>
+      <w:r>
+        <w:t xml:space="preserve">'B2B Content Resume' sits in the AI/ML Engineer Battlefield; with reassignment removed it can only be moved in the database or recreated.</w:t>
+      </w:r>
+    </w:p>
+    <w:p>
+      <w:pPr>
+        <w:pStyle w:val="Heading2"/>
+      </w:pPr>
+      <w:r>
+        <w:t xml:space="preserve">Production data changes</w:t>
+      </w:r>
+    </w:p>
+    <w:p>
+      <w:pPr>
+        <w:pStyle w:val="ListParagraph"/>
+        <w:numPr>
+          <w:ilvl w:val="0"/>
+          <w:numId w:val="2"/>
+        </w:numPr>
+        <w:spacing w:after="60"/>
+      </w:pPr>
+      <w:r>
+        <w:t xml:space="preserve">None.</w:t>
       </w:r>
     </w:p>
     <w:sectPr>

</xml_diff>

<commit_message>
Discovery search bar and Stats
Each Battlefield gets a search bar above Search New: terms to include
(prefilled from its defaults) and location chips (All Locations, US, UK,
Australia, Singapore, Malaysia, Remote, + New Location). The job list can
be filtered by country. The Selected column is split: Selected on top,
a Stats card below with a glowing donut of jobs by country or by grade,
found and applied counts, and a grade filter (default Fit to Possible).
Battlefield settings' search card is now "Default settings".

Co-Authored-By: Claude Opus 5.5 <noreply@anthropic.com>
</commit_message>
<xml_diff>
--- a/docs/KAMUI-postmortem.docx
+++ b/docs/KAMUI-postmortem.docx
@@ -21,7 +21,7 @@
         <w:rPr>
           <w:color w:val="666666"/>
         </w:rPr>
-        <w:t xml:space="preserve">Last updated 2026-09-24, after the Battlefield-first Resumes page.</w:t>
+        <w:t xml:space="preserve">Last updated 2026-09-29, after the Discovery search bar and Stats card.</w:t>
       </w:r>
     </w:p>
     <w:p>
@@ -84,7 +84,7 @@
         <w:pStyle w:val="Heading1"/>
       </w:pPr>
       <w:r>
-        <w:t xml:space="preserve">The system after the Battlefield-first Resumes page</w:t>
+        <w:t xml:space="preserve">The system after the Discovery search bar and Stats card</w:t>
       </w:r>
     </w:p>
     <w:p>
@@ -15383,6 +15383,1029 @@
       </w:pPr>
       <w:r>
         <w:t xml:space="preserve">None.</w:t>
+      </w:r>
+    </w:p>
+    <w:p>
+      <w:pPr>
+        <w:pStyle w:val="Heading1"/>
+      </w:pPr>
+      <w:r>
+        <w:t xml:space="preserve">Discovery search bar, country filter and Stats card</w:t>
+      </w:r>
+    </w:p>
+    <w:p>
+      <w:pPr>
+        <w:spacing w:after="120"/>
+        <w:rPr>
+          <w:color w:val="666666"/>
+          <w:sz w:val="20"/>
+          <w:szCs w:val="20"/>
+        </w:rPr>
+      </w:pPr>
+      <w:r>
+        <w:rPr>
+          <w:color w:val="666666"/>
+          <w:sz w:val="20"/>
+          <w:szCs w:val="20"/>
+        </w:rPr>
+        <w:t xml:space="preserve">2026-09-29  ·  commit see git log: Discovery search bar and Stats</w:t>
+      </w:r>
+    </w:p>
+    <w:p>
+      <w:pPr>
+        <w:spacing w:after="120"/>
+      </w:pPr>
+      <w:r>
+        <w:t xml:space="preserve">Each Battlefield's Discovery gained a search bar above Search New (terms to include, prefilled from the Battlefield's defaults, and location chips: All Locations, US, UK, Australia, Singapore, Malaysia, Remote, + New Location). The All jobs list can be filtered by country. The Selected column is split in half: Selected on top, a Stats card below with a glowing hollow donut of jobs found per country (or, for one country, per grade), with found and applied counts and a grade filter defaulting to Fit to Possible. Battlefield settings' search card is now Default settings.</w:t>
+      </w:r>
+    </w:p>
+    <w:p>
+      <w:pPr>
+        <w:pStyle w:val="Heading2"/>
+      </w:pPr>
+      <w:r>
+        <w:t xml:space="preserve">What changed</w:t>
+      </w:r>
+    </w:p>
+    <w:p>
+      <w:pPr>
+        <w:pStyle w:val="ListParagraph"/>
+        <w:numPr>
+          <w:ilvl w:val="0"/>
+          <w:numId w:val="2"/>
+        </w:numPr>
+        <w:spacing w:after="60"/>
+      </w:pPr>
+      <w:r>
+        <w:t xml:space="preserve">prisma/migrations/20260930120000_battlefield_custom_locations: Battlefield.customLocations (text[], default empty) for the + New Location chips.</w:t>
+      </w:r>
+    </w:p>
+    <w:p>
+      <w:pPr>
+        <w:pStyle w:val="ListParagraph"/>
+        <w:numPr>
+          <w:ilvl w:val="0"/>
+          <w:numId w:val="2"/>
+        </w:numPr>
+        <w:spacing w:after="60"/>
+      </w:pPr>
+      <w:r>
+        <w:t xml:space="preserve">web/lib/locations.ts: the preset chips, searchTargets (chips to Apify runs: all = one unfiltered run, remote = remoteOnly run, else a location string), jobCountry (raw.countryDerived, else patterns on the location text), countryLabel, chart colours per country.</w:t>
+      </w:r>
+    </w:p>
+    <w:p>
+      <w:pPr>
+        <w:pStyle w:val="ListParagraph"/>
+        <w:numPr>
+          <w:ilvl w:val="0"/>
+          <w:numId w:val="2"/>
+        </w:numPr>
+        <w:spacing w:after="60"/>
+      </w:pPr>
+      <w:r>
+        <w:t xml:space="preserve">web/lib/apify.ts: startSearch takes SearchTarget[] and passes remoteOnly. web/lib/searchRuns.ts: startBattlefieldSearch(battlefield, { terms, locations }) with fallbacks to the defaults; Auto-Populate calls it unchanged. The search route reads the optional JSON body.</w:t>
+      </w:r>
+    </w:p>
+    <w:p>
+      <w:pPr>
+        <w:pStyle w:val="ListParagraph"/>
+        <w:numPr>
+          <w:ilvl w:val="0"/>
+          <w:numId w:val="2"/>
+        </w:numPr>
+        <w:spacing w:after="60"/>
+      </w:pPr>
+      <w:r>
+        <w:t xml:space="preserve">Toolbar.tsx: SearchBar (terms input with Reset to defaults, exclusive All Locations, custom chips with remove, inline + New Location input); Search New posts { terms, locations }. Server actions addCustomLocation / removeCustomLocation.</w:t>
+      </w:r>
+    </w:p>
+    <w:p>
+      <w:pPr>
+        <w:pStyle w:val="ListParagraph"/>
+        <w:numPr>
+          <w:ilvl w:val="0"/>
+          <w:numId w:val="2"/>
+        </w:numPr>
+        <w:spacing w:after="60"/>
+      </w:pPr>
+      <w:r>
+        <w:t xml:space="preserve">JobBoard.tsx: All jobs label moved below the buttons; a country select beside sort and seen; the middle column holds Selected and Stats at half height each. page.tsx passes each job's country and a stats row per non-dismissed job (applied ones included).</w:t>
+      </w:r>
+    </w:p>
+    <w:p>
+      <w:pPr>
+        <w:pStyle w:val="ListParagraph"/>
+        <w:numPr>
+          <w:ilvl w:val="0"/>
+          <w:numId w:val="2"/>
+        </w:numPr>
+        <w:spacing w:after="60"/>
+      </w:pPr>
+      <w:r>
+        <w:t xml:space="preserve">Stats.tsx: SVG donut (stroke 8, radius 38, 2px gaps, track ring), two blurred copies for the multi-coloured glow (one breathing, off under reduced motion), centre readout and hover, a legend grid that drops the applied column in cards under 18rem.</w:t>
+      </w:r>
+    </w:p>
+    <w:p>
+      <w:pPr>
+        <w:pStyle w:val="ListParagraph"/>
+        <w:numPr>
+          <w:ilvl w:val="0"/>
+          <w:numId w:val="2"/>
+        </w:numPr>
+        <w:spacing w:after="60"/>
+      </w:pPr>
+      <w:r>
+        <w:t xml:space="preserve">globals.css: chart-1..5 tokens and the donut-glow animation. DESIGN-SYSTEM.md: chart palette, the Possible naming rule, the new Discovery layout, the search bar and Stats sections.</w:t>
+      </w:r>
+    </w:p>
+    <w:p>
+      <w:pPr>
+        <w:pStyle w:val="Heading2"/>
+      </w:pPr>
+      <w:r>
+        <w:t xml:space="preserve">Decisions and deviations from the spec</w:t>
+      </w:r>
+    </w:p>
+    <w:tbl>
+      <w:tblPr>
+        <w:tblW w:type="dxa" w:w="9026"/>
+        <w:tblBorders>
+          <w:top w:val="single" w:color="auto" w:sz="4"/>
+          <w:left w:val="single" w:color="auto" w:sz="4"/>
+          <w:bottom w:val="single" w:color="auto" w:sz="4"/>
+          <w:right w:val="single" w:color="auto" w:sz="4"/>
+          <w:insideH w:val="single" w:color="auto" w:sz="4"/>
+          <w:insideV w:val="single" w:color="auto" w:sz="4"/>
+        </w:tblBorders>
+      </w:tblPr>
+      <w:tblGrid>
+        <w:gridCol w:w="2600"/>
+        <w:gridCol w:w="3400"/>
+        <w:gridCol w:w="3026"/>
+      </w:tblGrid>
+      <w:tr>
+        <w:trPr>
+          <w:tblHeader/>
+        </w:trPr>
+        <w:tc>
+          <w:tcPr>
+            <w:tcW w:type="dxa" w:w="2600"/>
+            <w:tcBorders>
+              <w:top w:val="single" w:color="BFBFBF" w:sz="4"/>
+              <w:left w:val="single" w:color="BFBFBF" w:sz="4"/>
+              <w:bottom w:val="single" w:color="BFBFBF" w:sz="4"/>
+              <w:right w:val="single" w:color="BFBFBF" w:sz="4"/>
+            </w:tcBorders>
+            <w:shd w:fill="EDEDED" w:color="auto" w:val="clear"/>
+            <w:tcMar>
+              <w:top w:type="dxa" w:w="60"/>
+              <w:left w:type="dxa" w:w="100"/>
+              <w:bottom w:type="dxa" w:w="60"/>
+              <w:right w:type="dxa" w:w="100"/>
+            </w:tcMar>
+          </w:tcPr>
+          <w:p>
+            <w:r>
+              <w:rPr>
+                <w:b/>
+                <w:bCs/>
+                <w:sz w:val="19"/>
+                <w:szCs w:val="19"/>
+              </w:rPr>
+              <w:t xml:space="preserve">Decision</w:t>
+            </w:r>
+          </w:p>
+        </w:tc>
+        <w:tc>
+          <w:tcPr>
+            <w:tcW w:type="dxa" w:w="3400"/>
+            <w:tcBorders>
+              <w:top w:val="single" w:color="BFBFBF" w:sz="4"/>
+              <w:left w:val="single" w:color="BFBFBF" w:sz="4"/>
+              <w:bottom w:val="single" w:color="BFBFBF" w:sz="4"/>
+              <w:right w:val="single" w:color="BFBFBF" w:sz="4"/>
+            </w:tcBorders>
+            <w:shd w:fill="EDEDED" w:color="auto" w:val="clear"/>
+            <w:tcMar>
+              <w:top w:type="dxa" w:w="60"/>
+              <w:left w:type="dxa" w:w="100"/>
+              <w:bottom w:type="dxa" w:w="60"/>
+              <w:right w:type="dxa" w:w="100"/>
+            </w:tcMar>
+          </w:tcPr>
+          <w:p>
+            <w:r>
+              <w:rPr>
+                <w:b/>
+                <w:bCs/>
+                <w:sz w:val="19"/>
+                <w:szCs w:val="19"/>
+              </w:rPr>
+              <w:t xml:space="preserve">Why</w:t>
+            </w:r>
+          </w:p>
+        </w:tc>
+        <w:tc>
+          <w:tcPr>
+            <w:tcW w:type="dxa" w:w="3026"/>
+            <w:tcBorders>
+              <w:top w:val="single" w:color="BFBFBF" w:sz="4"/>
+              <w:left w:val="single" w:color="BFBFBF" w:sz="4"/>
+              <w:bottom w:val="single" w:color="BFBFBF" w:sz="4"/>
+              <w:right w:val="single" w:color="BFBFBF" w:sz="4"/>
+            </w:tcBorders>
+            <w:shd w:fill="EDEDED" w:color="auto" w:val="clear"/>
+            <w:tcMar>
+              <w:top w:type="dxa" w:w="60"/>
+              <w:left w:type="dxa" w:w="100"/>
+              <w:bottom w:type="dxa" w:w="60"/>
+              <w:right w:type="dxa" w:w="100"/>
+            </w:tcMar>
+          </w:tcPr>
+          <w:p>
+            <w:r>
+              <w:rPr>
+                <w:b/>
+                <w:bCs/>
+                <w:sz w:val="19"/>
+                <w:szCs w:val="19"/>
+              </w:rPr>
+              <w:t xml:space="preserve">Consequence / where</w:t>
+            </w:r>
+          </w:p>
+        </w:tc>
+      </w:tr>
+      <w:tr>
+        <w:tc>
+          <w:tcPr>
+            <w:tcW w:type="dxa" w:w="2600"/>
+            <w:tcBorders>
+              <w:top w:val="single" w:color="BFBFBF" w:sz="4"/>
+              <w:left w:val="single" w:color="BFBFBF" w:sz="4"/>
+              <w:bottom w:val="single" w:color="BFBFBF" w:sz="4"/>
+              <w:right w:val="single" w:color="BFBFBF" w:sz="4"/>
+            </w:tcBorders>
+            <w:tcMar>
+              <w:top w:type="dxa" w:w="60"/>
+              <w:left w:type="dxa" w:w="100"/>
+              <w:bottom w:type="dxa" w:w="60"/>
+              <w:right w:type="dxa" w:w="100"/>
+            </w:tcMar>
+          </w:tcPr>
+          <w:p>
+            <w:r>
+              <w:rPr>
+                <w:b w:val="false"/>
+                <w:bCs w:val="false"/>
+                <w:sz w:val="19"/>
+                <w:szCs w:val="19"/>
+              </w:rPr>
+              <w:t xml:space="preserve">The second grade is labelled Possible, not Probable</w:t>
+            </w:r>
+          </w:p>
+        </w:tc>
+        <w:tc>
+          <w:tcPr>
+            <w:tcW w:type="dxa" w:w="3400"/>
+            <w:tcBorders>
+              <w:top w:val="single" w:color="BFBFBF" w:sz="4"/>
+              <w:left w:val="single" w:color="BFBFBF" w:sz="4"/>
+              <w:bottom w:val="single" w:color="BFBFBF" w:sz="4"/>
+              <w:right w:val="single" w:color="BFBFBF" w:sz="4"/>
+            </w:tcBorders>
+            <w:tcMar>
+              <w:top w:type="dxa" w:w="60"/>
+              <w:left w:type="dxa" w:w="100"/>
+              <w:bottom w:type="dxa" w:w="60"/>
+              <w:right w:type="dxa" w:w="100"/>
+            </w:tcMar>
+          </w:tcPr>
+          <w:p>
+            <w:r>
+              <w:rPr>
+                <w:b w:val="false"/>
+                <w:bCs w:val="false"/>
+                <w:sz w:val="19"/>
+                <w:szCs w:val="19"/>
+              </w:rPr>
+              <w:t xml:space="preserve">KAMUI's grades are Fit, Possible, Improbable, Unfit; the request said Probable. The filter reads Fit to Possible so labels match the grade dots and the judge.</w:t>
+            </w:r>
+          </w:p>
+        </w:tc>
+        <w:tc>
+          <w:tcPr>
+            <w:tcW w:type="dxa" w:w="3026"/>
+            <w:tcBorders>
+              <w:top w:val="single" w:color="BFBFBF" w:sz="4"/>
+              <w:left w:val="single" w:color="BFBFBF" w:sz="4"/>
+              <w:bottom w:val="single" w:color="BFBFBF" w:sz="4"/>
+              <w:right w:val="single" w:color="BFBFBF" w:sz="4"/>
+            </w:tcBorders>
+            <w:tcMar>
+              <w:top w:type="dxa" w:w="60"/>
+              <w:left w:type="dxa" w:w="100"/>
+              <w:bottom w:type="dxa" w:w="60"/>
+              <w:right w:type="dxa" w:w="100"/>
+            </w:tcMar>
+          </w:tcPr>
+          <w:p>
+            <w:r>
+              <w:rPr>
+                <w:b w:val="false"/>
+                <w:bCs w:val="false"/>
+                <w:sz w:val="19"/>
+                <w:szCs w:val="19"/>
+              </w:rPr>
+              <w:t xml:space="preserve">A rename is one word in the filter labels if the user prefers Probable.</w:t>
+            </w:r>
+          </w:p>
+        </w:tc>
+      </w:tr>
+      <w:tr>
+        <w:tc>
+          <w:tcPr>
+            <w:tcW w:type="dxa" w:w="2600"/>
+            <w:tcBorders>
+              <w:top w:val="single" w:color="BFBFBF" w:sz="4"/>
+              <w:left w:val="single" w:color="BFBFBF" w:sz="4"/>
+              <w:bottom w:val="single" w:color="BFBFBF" w:sz="4"/>
+              <w:right w:val="single" w:color="BFBFBF" w:sz="4"/>
+            </w:tcBorders>
+            <w:tcMar>
+              <w:top w:type="dxa" w:w="60"/>
+              <w:left w:type="dxa" w:w="100"/>
+              <w:bottom w:type="dxa" w:w="60"/>
+              <w:right w:type="dxa" w:w="100"/>
+            </w:tcMar>
+          </w:tcPr>
+          <w:p>
+            <w:r>
+              <w:rPr>
+                <w:b w:val="false"/>
+                <w:bCs w:val="false"/>
+                <w:sz w:val="19"/>
+                <w:szCs w:val="19"/>
+              </w:rPr>
+              <w:t xml:space="preserve">New chart palette instead of the brand colours</w:t>
+            </w:r>
+          </w:p>
+        </w:tc>
+        <w:tc>
+          <w:tcPr>
+            <w:tcW w:type="dxa" w:w="3400"/>
+            <w:tcBorders>
+              <w:top w:val="single" w:color="BFBFBF" w:sz="4"/>
+              <w:left w:val="single" w:color="BFBFBF" w:sz="4"/>
+              <w:bottom w:val="single" w:color="BFBFBF" w:sz="4"/>
+              <w:right w:val="single" w:color="BFBFBF" w:sz="4"/>
+            </w:tcBorders>
+            <w:tcMar>
+              <w:top w:type="dxa" w:w="60"/>
+              <w:left w:type="dxa" w:w="100"/>
+              <w:bottom w:type="dxa" w:w="60"/>
+              <w:right w:type="dxa" w:w="100"/>
+            </w:tcMar>
+          </w:tcPr>
+          <w:p>
+            <w:r>
+              <w:rPr>
+                <w:b w:val="false"/>
+                <w:bCs w:val="false"/>
+                <w:sz w:val="19"/>
+                <w:szCs w:val="19"/>
+              </w:rPr>
+              <w:t xml:space="preserve">The autumn, slate, lavender and charcoal set failed the dataviz validator as categories (too alike, too grey). Five hues were validated on the dark glass instead; countries keep a fixed colour and extra countries fold into grey Other.</w:t>
+            </w:r>
+          </w:p>
+        </w:tc>
+        <w:tc>
+          <w:tcPr>
+            <w:tcW w:type="dxa" w:w="3026"/>
+            <w:tcBorders>
+              <w:top w:val="single" w:color="BFBFBF" w:sz="4"/>
+              <w:left w:val="single" w:color="BFBFBF" w:sz="4"/>
+              <w:bottom w:val="single" w:color="BFBFBF" w:sz="4"/>
+              <w:right w:val="single" w:color="BFBFBF" w:sz="4"/>
+            </w:tcBorders>
+            <w:tcMar>
+              <w:top w:type="dxa" w:w="60"/>
+              <w:left w:type="dxa" w:w="100"/>
+              <w:bottom w:type="dxa" w:w="60"/>
+              <w:right w:type="dxa" w:w="100"/>
+            </w:tcMar>
+          </w:tcPr>
+          <w:p>
+            <w:r>
+              <w:rPr>
+                <w:b w:val="false"/>
+                <w:bCs w:val="false"/>
+                <w:sz w:val="19"/>
+                <w:szCs w:val="19"/>
+              </w:rPr>
+              <w:t xml:space="preserve">Grade slices keep the grade dot colours, which fail the checks, so the legend always labels them.</w:t>
+            </w:r>
+          </w:p>
+        </w:tc>
+      </w:tr>
+      <w:tr>
+        <w:tc>
+          <w:tcPr>
+            <w:tcW w:type="dxa" w:w="2600"/>
+            <w:tcBorders>
+              <w:top w:val="single" w:color="BFBFBF" w:sz="4"/>
+              <w:left w:val="single" w:color="BFBFBF" w:sz="4"/>
+              <w:bottom w:val="single" w:color="BFBFBF" w:sz="4"/>
+              <w:right w:val="single" w:color="BFBFBF" w:sz="4"/>
+            </w:tcBorders>
+            <w:tcMar>
+              <w:top w:type="dxa" w:w="60"/>
+              <w:left w:type="dxa" w:w="100"/>
+              <w:bottom w:type="dxa" w:w="60"/>
+              <w:right w:type="dxa" w:w="100"/>
+            </w:tcMar>
+          </w:tcPr>
+          <w:p>
+            <w:r>
+              <w:rPr>
+                <w:b w:val="false"/>
+                <w:bCs w:val="false"/>
+                <w:sz w:val="19"/>
+                <w:szCs w:val="19"/>
+              </w:rPr>
+              <w:t xml:space="preserve">Search-bar choices are per search, not saved</w:t>
+            </w:r>
+          </w:p>
+        </w:tc>
+        <w:tc>
+          <w:tcPr>
+            <w:tcW w:type="dxa" w:w="3400"/>
+            <w:tcBorders>
+              <w:top w:val="single" w:color="BFBFBF" w:sz="4"/>
+              <w:left w:val="single" w:color="BFBFBF" w:sz="4"/>
+              <w:bottom w:val="single" w:color="BFBFBF" w:sz="4"/>
+              <w:right w:val="single" w:color="BFBFBF" w:sz="4"/>
+            </w:tcBorders>
+            <w:tcMar>
+              <w:top w:type="dxa" w:w="60"/>
+              <w:left w:type="dxa" w:w="100"/>
+              <w:bottom w:type="dxa" w:w="60"/>
+              <w:right w:type="dxa" w:w="100"/>
+            </w:tcMar>
+          </w:tcPr>
+          <w:p>
+            <w:r>
+              <w:rPr>
+                <w:b w:val="false"/>
+                <w:bCs w:val="false"/>
+                <w:sz w:val="19"/>
+                <w:szCs w:val="19"/>
+              </w:rPr>
+              <w:t xml:space="preserve">The defaults stay in Default settings (and drive Auto-Populate); the bar only overrides one search. Custom location chips are saved on the Battlefield so they persist.</w:t>
+            </w:r>
+          </w:p>
+        </w:tc>
+        <w:tc>
+          <w:tcPr>
+            <w:tcW w:type="dxa" w:w="3026"/>
+            <w:tcBorders>
+              <w:top w:val="single" w:color="BFBFBF" w:sz="4"/>
+              <w:left w:val="single" w:color="BFBFBF" w:sz="4"/>
+              <w:bottom w:val="single" w:color="BFBFBF" w:sz="4"/>
+              <w:right w:val="single" w:color="BFBFBF" w:sz="4"/>
+            </w:tcBorders>
+            <w:tcMar>
+              <w:top w:type="dxa" w:w="60"/>
+              <w:left w:type="dxa" w:w="100"/>
+              <w:bottom w:type="dxa" w:w="60"/>
+              <w:right w:type="dxa" w:w="100"/>
+            </w:tcMar>
+          </w:tcPr>
+          <w:p>
+            <w:r>
+              <w:rPr>
+                <w:b w:val="false"/>
+                <w:bCs w:val="false"/>
+                <w:sz w:val="19"/>
+                <w:szCs w:val="19"/>
+              </w:rPr>
+              <w:t xml:space="preserve">Reloading the page resets the bar to the defaults and All Locations.</w:t>
+            </w:r>
+          </w:p>
+        </w:tc>
+      </w:tr>
+      <w:tr>
+        <w:tc>
+          <w:tcPr>
+            <w:tcW w:type="dxa" w:w="2600"/>
+            <w:tcBorders>
+              <w:top w:val="single" w:color="BFBFBF" w:sz="4"/>
+              <w:left w:val="single" w:color="BFBFBF" w:sz="4"/>
+              <w:bottom w:val="single" w:color="BFBFBF" w:sz="4"/>
+              <w:right w:val="single" w:color="BFBFBF" w:sz="4"/>
+            </w:tcBorders>
+            <w:tcMar>
+              <w:top w:type="dxa" w:w="60"/>
+              <w:left w:type="dxa" w:w="100"/>
+              <w:bottom w:type="dxa" w:w="60"/>
+              <w:right w:type="dxa" w:w="100"/>
+            </w:tcMar>
+          </w:tcPr>
+          <w:p>
+            <w:r>
+              <w:rPr>
+                <w:b w:val="false"/>
+                <w:bCs w:val="false"/>
+                <w:sz w:val="19"/>
+                <w:szCs w:val="19"/>
+              </w:rPr>
+              <w:t xml:space="preserve">Stats counts applied jobs, the list does not</w:t>
+            </w:r>
+          </w:p>
+        </w:tc>
+        <w:tc>
+          <w:tcPr>
+            <w:tcW w:type="dxa" w:w="3400"/>
+            <w:tcBorders>
+              <w:top w:val="single" w:color="BFBFBF" w:sz="4"/>
+              <w:left w:val="single" w:color="BFBFBF" w:sz="4"/>
+              <w:bottom w:val="single" w:color="BFBFBF" w:sz="4"/>
+              <w:right w:val="single" w:color="BFBFBF" w:sz="4"/>
+            </w:tcBorders>
+            <w:tcMar>
+              <w:top w:type="dxa" w:w="60"/>
+              <w:left w:type="dxa" w:w="100"/>
+              <w:bottom w:type="dxa" w:w="60"/>
+              <w:right w:type="dxa" w:w="100"/>
+            </w:tcMar>
+          </w:tcPr>
+          <w:p>
+            <w:r>
+              <w:rPr>
+                <w:b w:val="false"/>
+                <w:bCs w:val="false"/>
+                <w:sz w:val="19"/>
+                <w:szCs w:val="19"/>
+              </w:rPr>
+              <w:t xml:space="preserve">The user wants how many were applied to; Discovery's list still hides applied jobs.</w:t>
+            </w:r>
+          </w:p>
+        </w:tc>
+        <w:tc>
+          <w:tcPr>
+            <w:tcW w:type="dxa" w:w="3026"/>
+            <w:tcBorders>
+              <w:top w:val="single" w:color="BFBFBF" w:sz="4"/>
+              <w:left w:val="single" w:color="BFBFBF" w:sz="4"/>
+              <w:bottom w:val="single" w:color="BFBFBF" w:sz="4"/>
+              <w:right w:val="single" w:color="BFBFBF" w:sz="4"/>
+            </w:tcBorders>
+            <w:tcMar>
+              <w:top w:type="dxa" w:w="60"/>
+              <w:left w:type="dxa" w:w="100"/>
+              <w:bottom w:type="dxa" w:w="60"/>
+              <w:right w:type="dxa" w:w="100"/>
+            </w:tcMar>
+          </w:tcPr>
+          <w:p>
+            <w:r>
+              <w:rPr>
+                <w:b w:val="false"/>
+                <w:bCs w:val="false"/>
+                <w:sz w:val="19"/>
+                <w:szCs w:val="19"/>
+              </w:rPr>
+              <w:t xml:space="preserve">Stats reads up to the same 500 most recently seen jobs as the list.</w:t>
+            </w:r>
+          </w:p>
+        </w:tc>
+      </w:tr>
+    </w:tbl>
+    <w:p>
+      <w:pPr>
+        <w:spacing w:after="120"/>
+      </w:pPr>
+    </w:p>
+    <w:p>
+      <w:pPr>
+        <w:pStyle w:val="Heading2"/>
+      </w:pPr>
+      <w:r>
+        <w:t xml:space="preserve">Problems found</w:t>
+      </w:r>
+    </w:p>
+    <w:tbl>
+      <w:tblPr>
+        <w:tblW w:type="dxa" w:w="9026"/>
+        <w:tblBorders>
+          <w:top w:val="single" w:color="auto" w:sz="4"/>
+          <w:left w:val="single" w:color="auto" w:sz="4"/>
+          <w:bottom w:val="single" w:color="auto" w:sz="4"/>
+          <w:right w:val="single" w:color="auto" w:sz="4"/>
+          <w:insideH w:val="single" w:color="auto" w:sz="4"/>
+          <w:insideV w:val="single" w:color="auto" w:sz="4"/>
+        </w:tblBorders>
+      </w:tblPr>
+      <w:tblGrid>
+        <w:gridCol w:w="2800"/>
+        <w:gridCol w:w="3300"/>
+        <w:gridCol w:w="2926"/>
+      </w:tblGrid>
+      <w:tr>
+        <w:trPr>
+          <w:tblHeader/>
+        </w:trPr>
+        <w:tc>
+          <w:tcPr>
+            <w:tcW w:type="dxa" w:w="2800"/>
+            <w:tcBorders>
+              <w:top w:val="single" w:color="BFBFBF" w:sz="4"/>
+              <w:left w:val="single" w:color="BFBFBF" w:sz="4"/>
+              <w:bottom w:val="single" w:color="BFBFBF" w:sz="4"/>
+              <w:right w:val="single" w:color="BFBFBF" w:sz="4"/>
+            </w:tcBorders>
+            <w:shd w:fill="EDEDED" w:color="auto" w:val="clear"/>
+            <w:tcMar>
+              <w:top w:type="dxa" w:w="60"/>
+              <w:left w:type="dxa" w:w="100"/>
+              <w:bottom w:type="dxa" w:w="60"/>
+              <w:right w:type="dxa" w:w="100"/>
+            </w:tcMar>
+          </w:tcPr>
+          <w:p>
+            <w:r>
+              <w:rPr>
+                <w:b/>
+                <w:bCs/>
+                <w:sz w:val="19"/>
+                <w:szCs w:val="19"/>
+              </w:rPr>
+              <w:t xml:space="preserve">Symptom</w:t>
+            </w:r>
+          </w:p>
+        </w:tc>
+        <w:tc>
+          <w:tcPr>
+            <w:tcW w:type="dxa" w:w="3300"/>
+            <w:tcBorders>
+              <w:top w:val="single" w:color="BFBFBF" w:sz="4"/>
+              <w:left w:val="single" w:color="BFBFBF" w:sz="4"/>
+              <w:bottom w:val="single" w:color="BFBFBF" w:sz="4"/>
+              <w:right w:val="single" w:color="BFBFBF" w:sz="4"/>
+            </w:tcBorders>
+            <w:shd w:fill="EDEDED" w:color="auto" w:val="clear"/>
+            <w:tcMar>
+              <w:top w:type="dxa" w:w="60"/>
+              <w:left w:type="dxa" w:w="100"/>
+              <w:bottom w:type="dxa" w:w="60"/>
+              <w:right w:type="dxa" w:w="100"/>
+            </w:tcMar>
+          </w:tcPr>
+          <w:p>
+            <w:r>
+              <w:rPr>
+                <w:b/>
+                <w:bCs/>
+                <w:sz w:val="19"/>
+                <w:szCs w:val="19"/>
+              </w:rPr>
+              <w:t xml:space="preserve">Cause</w:t>
+            </w:r>
+          </w:p>
+        </w:tc>
+        <w:tc>
+          <w:tcPr>
+            <w:tcW w:type="dxa" w:w="2926"/>
+            <w:tcBorders>
+              <w:top w:val="single" w:color="BFBFBF" w:sz="4"/>
+              <w:left w:val="single" w:color="BFBFBF" w:sz="4"/>
+              <w:bottom w:val="single" w:color="BFBFBF" w:sz="4"/>
+              <w:right w:val="single" w:color="BFBFBF" w:sz="4"/>
+            </w:tcBorders>
+            <w:shd w:fill="EDEDED" w:color="auto" w:val="clear"/>
+            <w:tcMar>
+              <w:top w:type="dxa" w:w="60"/>
+              <w:left w:type="dxa" w:w="100"/>
+              <w:bottom w:type="dxa" w:w="60"/>
+              <w:right w:type="dxa" w:w="100"/>
+            </w:tcMar>
+          </w:tcPr>
+          <w:p>
+            <w:r>
+              <w:rPr>
+                <w:b/>
+                <w:bCs/>
+                <w:sz w:val="19"/>
+                <w:szCs w:val="19"/>
+              </w:rPr>
+              <w:t xml:space="preserve">Resolution</w:t>
+            </w:r>
+          </w:p>
+        </w:tc>
+      </w:tr>
+      <w:tr>
+        <w:tc>
+          <w:tcPr>
+            <w:tcW w:type="dxa" w:w="2800"/>
+            <w:tcBorders>
+              <w:top w:val="single" w:color="BFBFBF" w:sz="4"/>
+              <w:left w:val="single" w:color="BFBFBF" w:sz="4"/>
+              <w:bottom w:val="single" w:color="BFBFBF" w:sz="4"/>
+              <w:right w:val="single" w:color="BFBFBF" w:sz="4"/>
+            </w:tcBorders>
+            <w:tcMar>
+              <w:top w:type="dxa" w:w="60"/>
+              <w:left w:type="dxa" w:w="100"/>
+              <w:bottom w:type="dxa" w:w="60"/>
+              <w:right w:type="dxa" w:w="100"/>
+            </w:tcMar>
+          </w:tcPr>
+          <w:p>
+            <w:r>
+              <w:rPr>
+                <w:b w:val="false"/>
+                <w:bCs w:val="false"/>
+                <w:sz w:val="19"/>
+                <w:szCs w:val="19"/>
+              </w:rPr>
+              <w:t xml:space="preserve">Discovery returned 500 after the migration.</w:t>
+            </w:r>
+          </w:p>
+        </w:tc>
+        <w:tc>
+          <w:tcPr>
+            <w:tcW w:type="dxa" w:w="3300"/>
+            <w:tcBorders>
+              <w:top w:val="single" w:color="BFBFBF" w:sz="4"/>
+              <w:left w:val="single" w:color="BFBFBF" w:sz="4"/>
+              <w:bottom w:val="single" w:color="BFBFBF" w:sz="4"/>
+              <w:right w:val="single" w:color="BFBFBF" w:sz="4"/>
+            </w:tcBorders>
+            <w:tcMar>
+              <w:top w:type="dxa" w:w="60"/>
+              <w:left w:type="dxa" w:w="100"/>
+              <w:bottom w:type="dxa" w:w="60"/>
+              <w:right w:type="dxa" w:w="100"/>
+            </w:tcMar>
+          </w:tcPr>
+          <w:p>
+            <w:r>
+              <w:rPr>
+                <w:b w:val="false"/>
+                <w:bCs w:val="false"/>
+                <w:sz w:val="19"/>
+                <w:szCs w:val="19"/>
+              </w:rPr>
+              <w:t xml:space="preserve">The running dev server still held the old Prisma client, so battlefield.customLocations was undefined.</w:t>
+            </w:r>
+          </w:p>
+        </w:tc>
+        <w:tc>
+          <w:tcPr>
+            <w:tcW w:type="dxa" w:w="2926"/>
+            <w:tcBorders>
+              <w:top w:val="single" w:color="BFBFBF" w:sz="4"/>
+              <w:left w:val="single" w:color="BFBFBF" w:sz="4"/>
+              <w:bottom w:val="single" w:color="BFBFBF" w:sz="4"/>
+              <w:right w:val="single" w:color="BFBFBF" w:sz="4"/>
+            </w:tcBorders>
+            <w:tcMar>
+              <w:top w:type="dxa" w:w="60"/>
+              <w:left w:type="dxa" w:w="100"/>
+              <w:bottom w:type="dxa" w:w="60"/>
+              <w:right w:type="dxa" w:w="100"/>
+            </w:tcMar>
+          </w:tcPr>
+          <w:p>
+            <w:r>
+              <w:rPr>
+                <w:b w:val="false"/>
+                <w:bCs w:val="false"/>
+                <w:sz w:val="19"/>
+                <w:szCs w:val="19"/>
+              </w:rPr>
+              <w:t xml:space="preserve">Restarted the dev server after prisma generate (a known step, now hit again).</w:t>
+            </w:r>
+          </w:p>
+        </w:tc>
+      </w:tr>
+      <w:tr>
+        <w:tc>
+          <w:tcPr>
+            <w:tcW w:type="dxa" w:w="2800"/>
+            <w:tcBorders>
+              <w:top w:val="single" w:color="BFBFBF" w:sz="4"/>
+              <w:left w:val="single" w:color="BFBFBF" w:sz="4"/>
+              <w:bottom w:val="single" w:color="BFBFBF" w:sz="4"/>
+              <w:right w:val="single" w:color="BFBFBF" w:sz="4"/>
+            </w:tcBorders>
+            <w:tcMar>
+              <w:top w:type="dxa" w:w="60"/>
+              <w:left w:type="dxa" w:w="100"/>
+              <w:bottom w:type="dxa" w:w="60"/>
+              <w:right w:type="dxa" w:w="100"/>
+            </w:tcMar>
+          </w:tcPr>
+          <w:p>
+            <w:r>
+              <w:rPr>
+                <w:b w:val="false"/>
+                <w:bCs w:val="false"/>
+                <w:sz w:val="19"/>
+                <w:szCs w:val="19"/>
+              </w:rPr>
+              <w:t xml:space="preserve">Running Prettier reformatted all of JobBoard.tsx.</w:t>
+            </w:r>
+          </w:p>
+        </w:tc>
+        <w:tc>
+          <w:tcPr>
+            <w:tcW w:type="dxa" w:w="3300"/>
+            <w:tcBorders>
+              <w:top w:val="single" w:color="BFBFBF" w:sz="4"/>
+              <w:left w:val="single" w:color="BFBFBF" w:sz="4"/>
+              <w:bottom w:val="single" w:color="BFBFBF" w:sz="4"/>
+              <w:right w:val="single" w:color="BFBFBF" w:sz="4"/>
+            </w:tcBorders>
+            <w:tcMar>
+              <w:top w:type="dxa" w:w="60"/>
+              <w:left w:type="dxa" w:w="100"/>
+              <w:bottom w:type="dxa" w:w="60"/>
+              <w:right w:type="dxa" w:w="100"/>
+            </w:tcMar>
+          </w:tcPr>
+          <w:p>
+            <w:r>
+              <w:rPr>
+                <w:b w:val="false"/>
+                <w:bCs w:val="false"/>
+                <w:sz w:val="19"/>
+                <w:szCs w:val="19"/>
+              </w:rPr>
+              <w:t xml:space="preserve">The repo has no Prettier config, so it used 80 columns against the code's wider style.</w:t>
+            </w:r>
+          </w:p>
+        </w:tc>
+        <w:tc>
+          <w:tcPr>
+            <w:tcW w:type="dxa" w:w="2926"/>
+            <w:tcBorders>
+              <w:top w:val="single" w:color="BFBFBF" w:sz="4"/>
+              <w:left w:val="single" w:color="BFBFBF" w:sz="4"/>
+              <w:bottom w:val="single" w:color="BFBFBF" w:sz="4"/>
+              <w:right w:val="single" w:color="BFBFBF" w:sz="4"/>
+            </w:tcBorders>
+            <w:tcMar>
+              <w:top w:type="dxa" w:w="60"/>
+              <w:left w:type="dxa" w:w="100"/>
+              <w:bottom w:type="dxa" w:w="60"/>
+              <w:right w:type="dxa" w:w="100"/>
+            </w:tcMar>
+          </w:tcPr>
+          <w:p>
+            <w:r>
+              <w:rPr>
+                <w:b w:val="false"/>
+                <w:bCs w:val="false"/>
+                <w:sz w:val="19"/>
+                <w:szCs w:val="19"/>
+              </w:rPr>
+              <w:t xml:space="preserve">Restored the file and re-applied only the intended edits; do not run Prettier on this repo.</w:t>
+            </w:r>
+          </w:p>
+        </w:tc>
+      </w:tr>
+    </w:tbl>
+    <w:p>
+      <w:pPr>
+        <w:spacing w:after="120"/>
+      </w:pPr>
+    </w:p>
+    <w:p>
+      <w:pPr>
+        <w:pStyle w:val="Heading2"/>
+      </w:pPr>
+      <w:r>
+        <w:t xml:space="preserve">Verification</w:t>
+      </w:r>
+    </w:p>
+    <w:p>
+      <w:pPr>
+        <w:pStyle w:val="ListParagraph"/>
+        <w:numPr>
+          <w:ilvl w:val="0"/>
+          <w:numId w:val="2"/>
+        </w:numPr>
+        <w:spacing w:after="60"/>
+      </w:pPr>
+      <w:r>
+        <w:t xml:space="preserve">tsc and eslint clean.</w:t>
+      </w:r>
+    </w:p>
+    <w:p>
+      <w:pPr>
+        <w:pStyle w:val="ListParagraph"/>
+        <w:numPr>
+          <w:ilvl w:val="0"/>
+          <w:numId w:val="2"/>
+        </w:numPr>
+        <w:spacing w:after="60"/>
+      </w:pPr>
+      <w:r>
+        <w:t xml:space="preserve">Discovery at 1920x1080, 1440x900 and 1280x680: no page overflow, no console errors; the Stats legend fits with labels readable at each size.</w:t>
+      </w:r>
+    </w:p>
+    <w:p>
+      <w:pPr>
+        <w:pStyle w:val="ListParagraph"/>
+        <w:numPr>
+          <w:ilvl w:val="0"/>
+          <w:numId w:val="2"/>
+        </w:numPr>
+        <w:spacing w:after="60"/>
+      </w:pPr>
+      <w:r>
+        <w:t xml:space="preserve">Stats on AI/ML Engineer: default Fit to Possible shows 7 found (US 6, India 1); All categories 37; US by grade Fit 3, Possible 3, Improbable 26, Unfit 1, Unranked 3; hovering the ring shows 26 Improbable in the centre.</w:t>
+      </w:r>
+    </w:p>
+    <w:p>
+      <w:pPr>
+        <w:pStyle w:val="ListParagraph"/>
+        <w:numPr>
+          <w:ilvl w:val="0"/>
+          <w:numId w:val="2"/>
+        </w:numPr>
+        <w:spacing w:after="60"/>
+      </w:pPr>
+      <w:r>
+        <w:t xml:space="preserve">List country filter: 37 rows to 36 for the US.</w:t>
+      </w:r>
+    </w:p>
+    <w:p>
+      <w:pPr>
+        <w:pStyle w:val="ListParagraph"/>
+        <w:numPr>
+          <w:ilvl w:val="0"/>
+          <w:numId w:val="2"/>
+        </w:numPr>
+        <w:spacing w:after="60"/>
+      </w:pPr>
+      <w:r>
+        <w:t xml:space="preserve">Chips: UK then Remote clears All Locations; + New Location adds Berlin and selects it; its x removes it. Search New was intercepted in the browser (never reached Apify) and sent {terms: [AI engineer, ML engineer], locations: [United Kingdom, remote, Berlin]}.</w:t>
+      </w:r>
+    </w:p>
+    <w:p>
+      <w:pPr>
+        <w:pStyle w:val="Heading2"/>
+      </w:pPr>
+      <w:r>
+        <w:t xml:space="preserve">Known risks left behind</w:t>
+      </w:r>
+    </w:p>
+    <w:p>
+      <w:pPr>
+        <w:pStyle w:val="ListParagraph"/>
+        <w:numPr>
+          <w:ilvl w:val="0"/>
+          <w:numId w:val="2"/>
+        </w:numPr>
+        <w:spacing w:after="60"/>
+      </w:pPr>
+      <w:r>
+        <w:t xml:space="preserve">Remote-only searches rely on the actor's remoteOnly input; untested against Apify because it costs a run.</w:t>
+      </w:r>
+    </w:p>
+    <w:p>
+      <w:pPr>
+        <w:pStyle w:val="ListParagraph"/>
+        <w:numPr>
+          <w:ilvl w:val="0"/>
+          <w:numId w:val="2"/>
+        </w:numPr>
+        <w:spacing w:after="60"/>
+      </w:pPr>
+      <w:r>
+        <w:t xml:space="preserve">Country detection is heuristic: about half the jobs have countryDerived; the rest are matched on location text, and anything unmatched is Unknown (left out of the country list, grouped in Other on the chart).</w:t>
+      </w:r>
+    </w:p>
+    <w:p>
+      <w:pPr>
+        <w:pStyle w:val="Heading2"/>
+      </w:pPr>
+      <w:r>
+        <w:t xml:space="preserve">Production data changes</w:t>
+      </w:r>
+    </w:p>
+    <w:p>
+      <w:pPr>
+        <w:pStyle w:val="ListParagraph"/>
+        <w:numPr>
+          <w:ilvl w:val="0"/>
+          <w:numId w:val="2"/>
+        </w:numPr>
+        <w:spacing w:after="60"/>
+      </w:pPr>
+      <w:r>
+        <w:t xml:space="preserve">Battlefield.customLocations column added (empty for existing rows). A test chip (Berlin) was added and removed on AI/ML Engineer.</w:t>
       </w:r>
     </w:p>
     <w:sectPr>

</xml_diff>

<commit_message>
Add jobs to Tracking by hand
"+ Add job" on Tracking adds a posting found elsewhere (mainly LinkedIn)
straight into a stage: link, title, company, location, Battlefield, stage,
optional note and description. LinkedIn links of any shape resolve to the
same job id, so re-adding a job moves it to the new stage instead of
duplicating it.

Co-Authored-By: Claude Opus 5.5 <noreply@anthropic.com>
</commit_message>
<xml_diff>
--- a/docs/KAMUI-postmortem.docx
+++ b/docs/KAMUI-postmortem.docx
@@ -21,7 +21,7 @@
         <w:rPr>
           <w:color w:val="666666"/>
         </w:rPr>
-        <w:t xml:space="preserve">Last updated 2026-09-30, after the Notes page.</w:t>
+        <w:t xml:space="preserve">Last updated 2026-09-30, after adding LinkedIn jobs to Tracking by hand.</w:t>
       </w:r>
     </w:p>
     <w:p>
@@ -84,7 +84,7 @@
         <w:pStyle w:val="Heading1"/>
       </w:pPr>
       <w:r>
-        <w:t xml:space="preserve">The system after the Notes page</w:t>
+        <w:t xml:space="preserve">The system after adding LinkedIn jobs to Tracking by hand</w:t>
       </w:r>
     </w:p>
     <w:p>
@@ -17192,6 +17192,865 @@
       </w:pPr>
       <w:r>
         <w:t xml:space="preserve">Note table added. Test notes created during verification were deleted; the table is empty.</w:t>
+      </w:r>
+    </w:p>
+    <w:p>
+      <w:pPr>
+        <w:pStyle w:val="Heading1"/>
+      </w:pPr>
+      <w:r>
+        <w:t xml:space="preserve">Adding jobs to Tracking by hand (LinkedIn)</w:t>
+      </w:r>
+    </w:p>
+    <w:p>
+      <w:pPr>
+        <w:spacing w:after="120"/>
+        <w:rPr>
+          <w:color w:val="666666"/>
+          <w:sz w:val="20"/>
+          <w:szCs w:val="20"/>
+        </w:rPr>
+      </w:pPr>
+      <w:r>
+        <w:rPr>
+          <w:color w:val="666666"/>
+          <w:sz w:val="20"/>
+          <w:szCs w:val="20"/>
+        </w:rPr>
+        <w:t xml:space="preserve">2026-09-30  ·  commit see git log: Add jobs to Tracking by hand</w:t>
+      </w:r>
+    </w:p>
+    <w:p>
+      <w:pPr>
+        <w:spacing w:after="120"/>
+      </w:pPr>
+      <w:r>
+        <w:t xml:space="preserve">Tracking has a + Add job button for postings found outside KAMUI, mainly on LinkedIn. It takes the link, title, company, location, Battlefield, stage (Aim by default), an optional note for that stage and an optional pasted description, and creates an ordinary job in that Battlefield tracked at that stage.</w:t>
+      </w:r>
+    </w:p>
+    <w:p>
+      <w:pPr>
+        <w:pStyle w:val="Heading2"/>
+      </w:pPr>
+      <w:r>
+        <w:t xml:space="preserve">What changed</w:t>
+      </w:r>
+    </w:p>
+    <w:p>
+      <w:pPr>
+        <w:pStyle w:val="ListParagraph"/>
+        <w:numPr>
+          <w:ilvl w:val="0"/>
+          <w:numId w:val="2"/>
+        </w:numPr>
+        <w:spacing w:after="60"/>
+      </w:pPr>
+      <w:r>
+        <w:t xml:space="preserve">web/app/tracking/actions.ts: addManualJob. LinkedIn links of any shape resolve to the numeric job id (atsJobId linkedin:&lt;id&gt;, url https://www.linkedin.com/jobs/view/&lt;id&gt;/); other links get manual:&lt;sha1 of host+path&gt;. Dedup uses the existing (battlefieldId, atsJobId) key: re-adding a job moves it to the chosen stage (and un-dismisses it) instead of duplicating it.</w:t>
+      </w:r>
+    </w:p>
+    <w:p>
+      <w:pPr>
+        <w:pStyle w:val="ListParagraph"/>
+        <w:numPr>
+          <w:ilvl w:val="0"/>
+          <w:numId w:val="2"/>
+        </w:numPr>
+        <w:spacing w:after="60"/>
+      </w:pPr>
+      <w:r>
+        <w:t xml:space="preserve">TrackingBoard.tsx: + Add job in the header opens the form in place of the selected card; on success the new job is selected and the header says where it went. The fields scroll inside the card on short screens; the buttons stay visible.</w:t>
+      </w:r>
+    </w:p>
+    <w:p>
+      <w:pPr>
+        <w:pStyle w:val="ListParagraph"/>
+        <w:numPr>
+          <w:ilvl w:val="0"/>
+          <w:numId w:val="2"/>
+        </w:numPr>
+        <w:spacing w:after="60"/>
+      </w:pPr>
+      <w:r>
+        <w:t xml:space="preserve">tracking/page.tsx passes the Battlefield list (the one in view is the default).</w:t>
+      </w:r>
+    </w:p>
+    <w:p>
+      <w:pPr>
+        <w:pStyle w:val="ListParagraph"/>
+        <w:numPr>
+          <w:ilvl w:val="0"/>
+          <w:numId w:val="2"/>
+        </w:numPr>
+        <w:spacing w:after="60"/>
+      </w:pPr>
+      <w:r>
+        <w:t xml:space="preserve">DESIGN-SYSTEM.md documents the form (section 9).</w:t>
+      </w:r>
+    </w:p>
+    <w:p>
+      <w:pPr>
+        <w:pStyle w:val="Heading2"/>
+      </w:pPr>
+      <w:r>
+        <w:t xml:space="preserve">Decisions and deviations from the spec</w:t>
+      </w:r>
+    </w:p>
+    <w:tbl>
+      <w:tblPr>
+        <w:tblW w:type="dxa" w:w="9026"/>
+        <w:tblBorders>
+          <w:top w:val="single" w:color="auto" w:sz="4"/>
+          <w:left w:val="single" w:color="auto" w:sz="4"/>
+          <w:bottom w:val="single" w:color="auto" w:sz="4"/>
+          <w:right w:val="single" w:color="auto" w:sz="4"/>
+          <w:insideH w:val="single" w:color="auto" w:sz="4"/>
+          <w:insideV w:val="single" w:color="auto" w:sz="4"/>
+        </w:tblBorders>
+      </w:tblPr>
+      <w:tblGrid>
+        <w:gridCol w:w="2600"/>
+        <w:gridCol w:w="3400"/>
+        <w:gridCol w:w="3026"/>
+      </w:tblGrid>
+      <w:tr>
+        <w:trPr>
+          <w:tblHeader/>
+        </w:trPr>
+        <w:tc>
+          <w:tcPr>
+            <w:tcW w:type="dxa" w:w="2600"/>
+            <w:tcBorders>
+              <w:top w:val="single" w:color="BFBFBF" w:sz="4"/>
+              <w:left w:val="single" w:color="BFBFBF" w:sz="4"/>
+              <w:bottom w:val="single" w:color="BFBFBF" w:sz="4"/>
+              <w:right w:val="single" w:color="BFBFBF" w:sz="4"/>
+            </w:tcBorders>
+            <w:shd w:fill="EDEDED" w:color="auto" w:val="clear"/>
+            <w:tcMar>
+              <w:top w:type="dxa" w:w="60"/>
+              <w:left w:type="dxa" w:w="100"/>
+              <w:bottom w:type="dxa" w:w="60"/>
+              <w:right w:type="dxa" w:w="100"/>
+            </w:tcMar>
+          </w:tcPr>
+          <w:p>
+            <w:r>
+              <w:rPr>
+                <w:b/>
+                <w:bCs/>
+                <w:sz w:val="19"/>
+                <w:szCs w:val="19"/>
+              </w:rPr>
+              <w:t xml:space="preserve">Decision</w:t>
+            </w:r>
+          </w:p>
+        </w:tc>
+        <w:tc>
+          <w:tcPr>
+            <w:tcW w:type="dxa" w:w="3400"/>
+            <w:tcBorders>
+              <w:top w:val="single" w:color="BFBFBF" w:sz="4"/>
+              <w:left w:val="single" w:color="BFBFBF" w:sz="4"/>
+              <w:bottom w:val="single" w:color="BFBFBF" w:sz="4"/>
+              <w:right w:val="single" w:color="BFBFBF" w:sz="4"/>
+            </w:tcBorders>
+            <w:shd w:fill="EDEDED" w:color="auto" w:val="clear"/>
+            <w:tcMar>
+              <w:top w:type="dxa" w:w="60"/>
+              <w:left w:type="dxa" w:w="100"/>
+              <w:bottom w:type="dxa" w:w="60"/>
+              <w:right w:type="dxa" w:w="100"/>
+            </w:tcMar>
+          </w:tcPr>
+          <w:p>
+            <w:r>
+              <w:rPr>
+                <w:b/>
+                <w:bCs/>
+                <w:sz w:val="19"/>
+                <w:szCs w:val="19"/>
+              </w:rPr>
+              <w:t xml:space="preserve">Why</w:t>
+            </w:r>
+          </w:p>
+        </w:tc>
+        <w:tc>
+          <w:tcPr>
+            <w:tcW w:type="dxa" w:w="3026"/>
+            <w:tcBorders>
+              <w:top w:val="single" w:color="BFBFBF" w:sz="4"/>
+              <w:left w:val="single" w:color="BFBFBF" w:sz="4"/>
+              <w:bottom w:val="single" w:color="BFBFBF" w:sz="4"/>
+              <w:right w:val="single" w:color="BFBFBF" w:sz="4"/>
+            </w:tcBorders>
+            <w:shd w:fill="EDEDED" w:color="auto" w:val="clear"/>
+            <w:tcMar>
+              <w:top w:type="dxa" w:w="60"/>
+              <w:left w:type="dxa" w:w="100"/>
+              <w:bottom w:type="dxa" w:w="60"/>
+              <w:right w:type="dxa" w:w="100"/>
+            </w:tcMar>
+          </w:tcPr>
+          <w:p>
+            <w:r>
+              <w:rPr>
+                <w:b/>
+                <w:bCs/>
+                <w:sz w:val="19"/>
+                <w:szCs w:val="19"/>
+              </w:rPr>
+              <w:t xml:space="preserve">Consequence / where</w:t>
+            </w:r>
+          </w:p>
+        </w:tc>
+      </w:tr>
+      <w:tr>
+        <w:tc>
+          <w:tcPr>
+            <w:tcW w:type="dxa" w:w="2600"/>
+            <w:tcBorders>
+              <w:top w:val="single" w:color="BFBFBF" w:sz="4"/>
+              <w:left w:val="single" w:color="BFBFBF" w:sz="4"/>
+              <w:bottom w:val="single" w:color="BFBFBF" w:sz="4"/>
+              <w:right w:val="single" w:color="BFBFBF" w:sz="4"/>
+            </w:tcBorders>
+            <w:tcMar>
+              <w:top w:type="dxa" w:w="60"/>
+              <w:left w:type="dxa" w:w="100"/>
+              <w:bottom w:type="dxa" w:w="60"/>
+              <w:right w:type="dxa" w:w="100"/>
+            </w:tcMar>
+          </w:tcPr>
+          <w:p>
+            <w:r>
+              <w:rPr>
+                <w:b w:val="false"/>
+                <w:bCs w:val="false"/>
+                <w:sz w:val="19"/>
+                <w:szCs w:val="19"/>
+              </w:rPr>
+              <w:t xml:space="preserve">No automatic fetch of the LinkedIn page</w:t>
+            </w:r>
+          </w:p>
+        </w:tc>
+        <w:tc>
+          <w:tcPr>
+            <w:tcW w:type="dxa" w:w="3400"/>
+            <w:tcBorders>
+              <w:top w:val="single" w:color="BFBFBF" w:sz="4"/>
+              <w:left w:val="single" w:color="BFBFBF" w:sz="4"/>
+              <w:bottom w:val="single" w:color="BFBFBF" w:sz="4"/>
+              <w:right w:val="single" w:color="BFBFBF" w:sz="4"/>
+            </w:tcBorders>
+            <w:tcMar>
+              <w:top w:type="dxa" w:w="60"/>
+              <w:left w:type="dxa" w:w="100"/>
+              <w:bottom w:type="dxa" w:w="60"/>
+              <w:right w:type="dxa" w:w="100"/>
+            </w:tcMar>
+          </w:tcPr>
+          <w:p>
+            <w:r>
+              <w:rPr>
+                <w:b w:val="false"/>
+                <w:bCs w:val="false"/>
+                <w:sz w:val="19"/>
+                <w:szCs w:val="19"/>
+              </w:rPr>
+              <w:t xml:space="preserve">LinkedIn blocks server requests from data-centre addresses (status 999 or a login wall), so auto-filling title and company from Railway would be unreliable. The form asks for them instead.</w:t>
+            </w:r>
+          </w:p>
+        </w:tc>
+        <w:tc>
+          <w:tcPr>
+            <w:tcW w:type="dxa" w:w="3026"/>
+            <w:tcBorders>
+              <w:top w:val="single" w:color="BFBFBF" w:sz="4"/>
+              <w:left w:val="single" w:color="BFBFBF" w:sz="4"/>
+              <w:bottom w:val="single" w:color="BFBFBF" w:sz="4"/>
+              <w:right w:val="single" w:color="BFBFBF" w:sz="4"/>
+            </w:tcBorders>
+            <w:tcMar>
+              <w:top w:type="dxa" w:w="60"/>
+              <w:left w:type="dxa" w:w="100"/>
+              <w:bottom w:type="dxa" w:w="60"/>
+              <w:right w:type="dxa" w:w="100"/>
+            </w:tcMar>
+          </w:tcPr>
+          <w:p>
+            <w:r>
+              <w:rPr>
+                <w:b w:val="false"/>
+                <w:bCs w:val="false"/>
+                <w:sz w:val="19"/>
+                <w:szCs w:val="19"/>
+              </w:rPr>
+              <w:t xml:space="preserve">Could be added later as a best-effort button.</w:t>
+            </w:r>
+          </w:p>
+        </w:tc>
+      </w:tr>
+      <w:tr>
+        <w:tc>
+          <w:tcPr>
+            <w:tcW w:type="dxa" w:w="2600"/>
+            <w:tcBorders>
+              <w:top w:val="single" w:color="BFBFBF" w:sz="4"/>
+              <w:left w:val="single" w:color="BFBFBF" w:sz="4"/>
+              <w:bottom w:val="single" w:color="BFBFBF" w:sz="4"/>
+              <w:right w:val="single" w:color="BFBFBF" w:sz="4"/>
+            </w:tcBorders>
+            <w:tcMar>
+              <w:top w:type="dxa" w:w="60"/>
+              <w:left w:type="dxa" w:w="100"/>
+              <w:bottom w:type="dxa" w:w="60"/>
+              <w:right w:type="dxa" w:w="100"/>
+            </w:tcMar>
+          </w:tcPr>
+          <w:p>
+            <w:r>
+              <w:rPr>
+                <w:b w:val="false"/>
+                <w:bCs w:val="false"/>
+                <w:sz w:val="19"/>
+                <w:szCs w:val="19"/>
+              </w:rPr>
+              <w:t xml:space="preserve">A hand-added job is an ordinary Job row</w:t>
+            </w:r>
+          </w:p>
+        </w:tc>
+        <w:tc>
+          <w:tcPr>
+            <w:tcW w:type="dxa" w:w="3400"/>
+            <w:tcBorders>
+              <w:top w:val="single" w:color="BFBFBF" w:sz="4"/>
+              <w:left w:val="single" w:color="BFBFBF" w:sz="4"/>
+              <w:bottom w:val="single" w:color="BFBFBF" w:sz="4"/>
+              <w:right w:val="single" w:color="BFBFBF" w:sz="4"/>
+            </w:tcBorders>
+            <w:tcMar>
+              <w:top w:type="dxa" w:w="60"/>
+              <w:left w:type="dxa" w:w="100"/>
+              <w:bottom w:type="dxa" w:w="60"/>
+              <w:right w:type="dxa" w:w="100"/>
+            </w:tcMar>
+          </w:tcPr>
+          <w:p>
+            <w:r>
+              <w:rPr>
+                <w:b w:val="false"/>
+                <w:bCs w:val="false"/>
+                <w:sz w:val="19"/>
+                <w:szCs w:val="19"/>
+              </w:rPr>
+              <w:t xml:space="preserve">So Discovery, Stats, the closed check and Rank all work on it; pasting the description lets Rank grade it.</w:t>
+            </w:r>
+          </w:p>
+        </w:tc>
+        <w:tc>
+          <w:tcPr>
+            <w:tcW w:type="dxa" w:w="3026"/>
+            <w:tcBorders>
+              <w:top w:val="single" w:color="BFBFBF" w:sz="4"/>
+              <w:left w:val="single" w:color="BFBFBF" w:sz="4"/>
+              <w:bottom w:val="single" w:color="BFBFBF" w:sz="4"/>
+              <w:right w:val="single" w:color="BFBFBF" w:sz="4"/>
+            </w:tcBorders>
+            <w:tcMar>
+              <w:top w:type="dxa" w:w="60"/>
+              <w:left w:type="dxa" w:w="100"/>
+              <w:bottom w:type="dxa" w:w="60"/>
+              <w:right w:type="dxa" w:w="100"/>
+            </w:tcMar>
+          </w:tcPr>
+          <w:p>
+            <w:r>
+              <w:rPr>
+                <w:b w:val="false"/>
+                <w:bCs w:val="false"/>
+                <w:sz w:val="19"/>
+                <w:szCs w:val="19"/>
+              </w:rPr>
+              <w:t xml:space="preserve">At Aim it also shows in Discovery's list; from Applied onward it is hidden there like any applied job.</w:t>
+            </w:r>
+          </w:p>
+        </w:tc>
+      </w:tr>
+      <w:tr>
+        <w:tc>
+          <w:tcPr>
+            <w:tcW w:type="dxa" w:w="2600"/>
+            <w:tcBorders>
+              <w:top w:val="single" w:color="BFBFBF" w:sz="4"/>
+              <w:left w:val="single" w:color="BFBFBF" w:sz="4"/>
+              <w:bottom w:val="single" w:color="BFBFBF" w:sz="4"/>
+              <w:right w:val="single" w:color="BFBFBF" w:sz="4"/>
+            </w:tcBorders>
+            <w:tcMar>
+              <w:top w:type="dxa" w:w="60"/>
+              <w:left w:type="dxa" w:w="100"/>
+              <w:bottom w:type="dxa" w:w="60"/>
+              <w:right w:type="dxa" w:w="100"/>
+            </w:tcMar>
+          </w:tcPr>
+          <w:p>
+            <w:r>
+              <w:rPr>
+                <w:b w:val="false"/>
+                <w:bCs w:val="false"/>
+                <w:sz w:val="19"/>
+                <w:szCs w:val="19"/>
+              </w:rPr>
+              <w:t xml:space="preserve">Default stage is Aim</w:t>
+            </w:r>
+          </w:p>
+        </w:tc>
+        <w:tc>
+          <w:tcPr>
+            <w:tcW w:type="dxa" w:w="3400"/>
+            <w:tcBorders>
+              <w:top w:val="single" w:color="BFBFBF" w:sz="4"/>
+              <w:left w:val="single" w:color="BFBFBF" w:sz="4"/>
+              <w:bottom w:val="single" w:color="BFBFBF" w:sz="4"/>
+              <w:right w:val="single" w:color="BFBFBF" w:sz="4"/>
+            </w:tcBorders>
+            <w:tcMar>
+              <w:top w:type="dxa" w:w="60"/>
+              <w:left w:type="dxa" w:w="100"/>
+              <w:bottom w:type="dxa" w:w="60"/>
+              <w:right w:type="dxa" w:w="100"/>
+            </w:tcMar>
+          </w:tcPr>
+          <w:p>
+            <w:r>
+              <w:rPr>
+                <w:b w:val="false"/>
+                <w:bCs w:val="false"/>
+                <w:sz w:val="19"/>
+                <w:szCs w:val="19"/>
+              </w:rPr>
+              <w:t xml:space="preserve">The first stage; Applied and the rest are one select away.</w:t>
+            </w:r>
+          </w:p>
+        </w:tc>
+        <w:tc>
+          <w:tcPr>
+            <w:tcW w:type="dxa" w:w="3026"/>
+            <w:tcBorders>
+              <w:top w:val="single" w:color="BFBFBF" w:sz="4"/>
+              <w:left w:val="single" w:color="BFBFBF" w:sz="4"/>
+              <w:bottom w:val="single" w:color="BFBFBF" w:sz="4"/>
+              <w:right w:val="single" w:color="BFBFBF" w:sz="4"/>
+            </w:tcBorders>
+            <w:tcMar>
+              <w:top w:type="dxa" w:w="60"/>
+              <w:left w:type="dxa" w:w="100"/>
+              <w:bottom w:type="dxa" w:w="60"/>
+              <w:right w:type="dxa" w:w="100"/>
+            </w:tcMar>
+          </w:tcPr>
+          <w:p>
+            <w:r>
+              <w:rPr>
+                <w:b w:val="false"/>
+                <w:bCs w:val="false"/>
+                <w:sz w:val="19"/>
+                <w:szCs w:val="19"/>
+              </w:rPr>
+              <w:t xml:space="preserve">A job already applied to is one click different.</w:t>
+            </w:r>
+          </w:p>
+        </w:tc>
+      </w:tr>
+    </w:tbl>
+    <w:p>
+      <w:pPr>
+        <w:spacing w:after="120"/>
+      </w:pPr>
+    </w:p>
+    <w:p>
+      <w:pPr>
+        <w:pStyle w:val="Heading2"/>
+      </w:pPr>
+      <w:r>
+        <w:t xml:space="preserve">Problems found</w:t>
+      </w:r>
+    </w:p>
+    <w:tbl>
+      <w:tblPr>
+        <w:tblW w:type="dxa" w:w="9026"/>
+        <w:tblBorders>
+          <w:top w:val="single" w:color="auto" w:sz="4"/>
+          <w:left w:val="single" w:color="auto" w:sz="4"/>
+          <w:bottom w:val="single" w:color="auto" w:sz="4"/>
+          <w:right w:val="single" w:color="auto" w:sz="4"/>
+          <w:insideH w:val="single" w:color="auto" w:sz="4"/>
+          <w:insideV w:val="single" w:color="auto" w:sz="4"/>
+        </w:tblBorders>
+      </w:tblPr>
+      <w:tblGrid>
+        <w:gridCol w:w="2800"/>
+        <w:gridCol w:w="3300"/>
+        <w:gridCol w:w="2926"/>
+      </w:tblGrid>
+      <w:tr>
+        <w:trPr>
+          <w:tblHeader/>
+        </w:trPr>
+        <w:tc>
+          <w:tcPr>
+            <w:tcW w:type="dxa" w:w="2800"/>
+            <w:tcBorders>
+              <w:top w:val="single" w:color="BFBFBF" w:sz="4"/>
+              <w:left w:val="single" w:color="BFBFBF" w:sz="4"/>
+              <w:bottom w:val="single" w:color="BFBFBF" w:sz="4"/>
+              <w:right w:val="single" w:color="BFBFBF" w:sz="4"/>
+            </w:tcBorders>
+            <w:shd w:fill="EDEDED" w:color="auto" w:val="clear"/>
+            <w:tcMar>
+              <w:top w:type="dxa" w:w="60"/>
+              <w:left w:type="dxa" w:w="100"/>
+              <w:bottom w:type="dxa" w:w="60"/>
+              <w:right w:type="dxa" w:w="100"/>
+            </w:tcMar>
+          </w:tcPr>
+          <w:p>
+            <w:r>
+              <w:rPr>
+                <w:b/>
+                <w:bCs/>
+                <w:sz w:val="19"/>
+                <w:szCs w:val="19"/>
+              </w:rPr>
+              <w:t xml:space="preserve">Symptom</w:t>
+            </w:r>
+          </w:p>
+        </w:tc>
+        <w:tc>
+          <w:tcPr>
+            <w:tcW w:type="dxa" w:w="3300"/>
+            <w:tcBorders>
+              <w:top w:val="single" w:color="BFBFBF" w:sz="4"/>
+              <w:left w:val="single" w:color="BFBFBF" w:sz="4"/>
+              <w:bottom w:val="single" w:color="BFBFBF" w:sz="4"/>
+              <w:right w:val="single" w:color="BFBFBF" w:sz="4"/>
+            </w:tcBorders>
+            <w:shd w:fill="EDEDED" w:color="auto" w:val="clear"/>
+            <w:tcMar>
+              <w:top w:type="dxa" w:w="60"/>
+              <w:left w:type="dxa" w:w="100"/>
+              <w:bottom w:type="dxa" w:w="60"/>
+              <w:right w:type="dxa" w:w="100"/>
+            </w:tcMar>
+          </w:tcPr>
+          <w:p>
+            <w:r>
+              <w:rPr>
+                <w:b/>
+                <w:bCs/>
+                <w:sz w:val="19"/>
+                <w:szCs w:val="19"/>
+              </w:rPr>
+              <w:t xml:space="preserve">Cause</w:t>
+            </w:r>
+          </w:p>
+        </w:tc>
+        <w:tc>
+          <w:tcPr>
+            <w:tcW w:type="dxa" w:w="2926"/>
+            <w:tcBorders>
+              <w:top w:val="single" w:color="BFBFBF" w:sz="4"/>
+              <w:left w:val="single" w:color="BFBFBF" w:sz="4"/>
+              <w:bottom w:val="single" w:color="BFBFBF" w:sz="4"/>
+              <w:right w:val="single" w:color="BFBFBF" w:sz="4"/>
+            </w:tcBorders>
+            <w:shd w:fill="EDEDED" w:color="auto" w:val="clear"/>
+            <w:tcMar>
+              <w:top w:type="dxa" w:w="60"/>
+              <w:left w:type="dxa" w:w="100"/>
+              <w:bottom w:type="dxa" w:w="60"/>
+              <w:right w:type="dxa" w:w="100"/>
+            </w:tcMar>
+          </w:tcPr>
+          <w:p>
+            <w:r>
+              <w:rPr>
+                <w:b/>
+                <w:bCs/>
+                <w:sz w:val="19"/>
+                <w:szCs w:val="19"/>
+              </w:rPr>
+              <w:t xml:space="preserve">Resolution</w:t>
+            </w:r>
+          </w:p>
+        </w:tc>
+      </w:tr>
+      <w:tr>
+        <w:tc>
+          <w:tcPr>
+            <w:tcW w:type="dxa" w:w="2800"/>
+            <w:tcBorders>
+              <w:top w:val="single" w:color="BFBFBF" w:sz="4"/>
+              <w:left w:val="single" w:color="BFBFBF" w:sz="4"/>
+              <w:bottom w:val="single" w:color="BFBFBF" w:sz="4"/>
+              <w:right w:val="single" w:color="BFBFBF" w:sz="4"/>
+            </w:tcBorders>
+            <w:tcMar>
+              <w:top w:type="dxa" w:w="60"/>
+              <w:left w:type="dxa" w:w="100"/>
+              <w:bottom w:type="dxa" w:w="60"/>
+              <w:right w:type="dxa" w:w="100"/>
+            </w:tcMar>
+          </w:tcPr>
+          <w:p>
+            <w:r>
+              <w:rPr>
+                <w:b w:val="false"/>
+                <w:bCs w:val="false"/>
+                <w:sz w:val="19"/>
+                <w:szCs w:val="19"/>
+              </w:rPr>
+              <w:t xml:space="preserve">After a rejected submit the form was wiped.</w:t>
+            </w:r>
+          </w:p>
+        </w:tc>
+        <w:tc>
+          <w:tcPr>
+            <w:tcW w:type="dxa" w:w="3300"/>
+            <w:tcBorders>
+              <w:top w:val="single" w:color="BFBFBF" w:sz="4"/>
+              <w:left w:val="single" w:color="BFBFBF" w:sz="4"/>
+              <w:bottom w:val="single" w:color="BFBFBF" w:sz="4"/>
+              <w:right w:val="single" w:color="BFBFBF" w:sz="4"/>
+            </w:tcBorders>
+            <w:tcMar>
+              <w:top w:type="dxa" w:w="60"/>
+              <w:left w:type="dxa" w:w="100"/>
+              <w:bottom w:type="dxa" w:w="60"/>
+              <w:right w:type="dxa" w:w="100"/>
+            </w:tcMar>
+          </w:tcPr>
+          <w:p>
+            <w:r>
+              <w:rPr>
+                <w:b w:val="false"/>
+                <w:bCs w:val="false"/>
+                <w:sz w:val="19"/>
+                <w:szCs w:val="19"/>
+              </w:rPr>
+              <w:t xml:space="preserve">React 19 resets a form after its action finishes, so an error cleared what had been typed and the next submit failed browser validation.</w:t>
+            </w:r>
+          </w:p>
+        </w:tc>
+        <w:tc>
+          <w:tcPr>
+            <w:tcW w:type="dxa" w:w="2926"/>
+            <w:tcBorders>
+              <w:top w:val="single" w:color="BFBFBF" w:sz="4"/>
+              <w:left w:val="single" w:color="BFBFBF" w:sz="4"/>
+              <w:bottom w:val="single" w:color="BFBFBF" w:sz="4"/>
+              <w:right w:val="single" w:color="BFBFBF" w:sz="4"/>
+            </w:tcBorders>
+            <w:tcMar>
+              <w:top w:type="dxa" w:w="60"/>
+              <w:left w:type="dxa" w:w="100"/>
+              <w:bottom w:type="dxa" w:w="60"/>
+              <w:right w:type="dxa" w:w="100"/>
+            </w:tcMar>
+          </w:tcPr>
+          <w:p>
+            <w:r>
+              <w:rPr>
+                <w:b w:val="false"/>
+                <w:bCs w:val="false"/>
+                <w:sz w:val="19"/>
+                <w:szCs w:val="19"/>
+              </w:rPr>
+              <w:t xml:space="preserve">The form uses an onSubmit handler with a transition instead of a form action, so fields survive an error.</w:t>
+            </w:r>
+          </w:p>
+        </w:tc>
+      </w:tr>
+      <w:tr>
+        <w:tc>
+          <w:tcPr>
+            <w:tcW w:type="dxa" w:w="2800"/>
+            <w:tcBorders>
+              <w:top w:val="single" w:color="BFBFBF" w:sz="4"/>
+              <w:left w:val="single" w:color="BFBFBF" w:sz="4"/>
+              <w:bottom w:val="single" w:color="BFBFBF" w:sz="4"/>
+              <w:right w:val="single" w:color="BFBFBF" w:sz="4"/>
+            </w:tcBorders>
+            <w:tcMar>
+              <w:top w:type="dxa" w:w="60"/>
+              <w:left w:type="dxa" w:w="100"/>
+              <w:bottom w:type="dxa" w:w="60"/>
+              <w:right w:type="dxa" w:w="100"/>
+            </w:tcMar>
+          </w:tcPr>
+          <w:p>
+            <w:r>
+              <w:rPr>
+                <w:b w:val="false"/>
+                <w:bCs w:val="false"/>
+                <w:sz w:val="19"/>
+                <w:szCs w:val="19"/>
+              </w:rPr>
+              <w:t xml:space="preserve">At 1280x680 the Add job button was below the fold inside the form.</w:t>
+            </w:r>
+          </w:p>
+        </w:tc>
+        <w:tc>
+          <w:tcPr>
+            <w:tcW w:type="dxa" w:w="3300"/>
+            <w:tcBorders>
+              <w:top w:val="single" w:color="BFBFBF" w:sz="4"/>
+              <w:left w:val="single" w:color="BFBFBF" w:sz="4"/>
+              <w:bottom w:val="single" w:color="BFBFBF" w:sz="4"/>
+              <w:right w:val="single" w:color="BFBFBF" w:sz="4"/>
+            </w:tcBorders>
+            <w:tcMar>
+              <w:top w:type="dxa" w:w="60"/>
+              <w:left w:type="dxa" w:w="100"/>
+              <w:bottom w:type="dxa" w:w="60"/>
+              <w:right w:type="dxa" w:w="100"/>
+            </w:tcMar>
+          </w:tcPr>
+          <w:p>
+            <w:r>
+              <w:rPr>
+                <w:b w:val="false"/>
+                <w:bCs w:val="false"/>
+                <w:sz w:val="19"/>
+                <w:szCs w:val="19"/>
+              </w:rPr>
+              <w:t xml:space="preserve">The whole card scrolled.</w:t>
+            </w:r>
+          </w:p>
+        </w:tc>
+        <w:tc>
+          <w:tcPr>
+            <w:tcW w:type="dxa" w:w="2926"/>
+            <w:tcBorders>
+              <w:top w:val="single" w:color="BFBFBF" w:sz="4"/>
+              <w:left w:val="single" w:color="BFBFBF" w:sz="4"/>
+              <w:bottom w:val="single" w:color="BFBFBF" w:sz="4"/>
+              <w:right w:val="single" w:color="BFBFBF" w:sz="4"/>
+            </w:tcBorders>
+            <w:tcMar>
+              <w:top w:type="dxa" w:w="60"/>
+              <w:left w:type="dxa" w:w="100"/>
+              <w:bottom w:type="dxa" w:w="60"/>
+              <w:right w:type="dxa" w:w="100"/>
+            </w:tcMar>
+          </w:tcPr>
+          <w:p>
+            <w:r>
+              <w:rPr>
+                <w:b w:val="false"/>
+                <w:bCs w:val="false"/>
+                <w:sz w:val="19"/>
+                <w:szCs w:val="19"/>
+              </w:rPr>
+              <w:t xml:space="preserve">Only the fields scroll; the buttons are pinned to the bottom of the card.</w:t>
+            </w:r>
+          </w:p>
+        </w:tc>
+      </w:tr>
+    </w:tbl>
+    <w:p>
+      <w:pPr>
+        <w:spacing w:after="120"/>
+      </w:pPr>
+    </w:p>
+    <w:p>
+      <w:pPr>
+        <w:pStyle w:val="Heading2"/>
+      </w:pPr>
+      <w:r>
+        <w:t xml:space="preserve">Verification</w:t>
+      </w:r>
+    </w:p>
+    <w:p>
+      <w:pPr>
+        <w:pStyle w:val="ListParagraph"/>
+        <w:numPr>
+          <w:ilvl w:val="0"/>
+          <w:numId w:val="2"/>
+        </w:numPr>
+        <w:spacing w:after="60"/>
+      </w:pPr>
+      <w:r>
+        <w:t xml:space="preserve">tsc and eslint clean; production build passes.</w:t>
+      </w:r>
+    </w:p>
+    <w:p>
+      <w:pPr>
+        <w:pStyle w:val="ListParagraph"/>
+        <w:numPr>
+          <w:ilvl w:val="0"/>
+          <w:numId w:val="2"/>
+        </w:numPr>
+        <w:spacing w:after="60"/>
+      </w:pPr>
+      <w:r>
+        <w:t xml:space="preserve">Browser at 1440x900 on AI/ML Engineer: an ftp:// link is refused with a plain error and the typed title stays; a linkedin.com/jobs/search/?currentJobId= link adds the job at Applied with its note, selects it, and Open posting points at the canonical /jobs/view/&lt;id&gt;/; re-adding the same job through a /jobs/view/&lt;slug&gt;-&lt;id&gt;?trk= link reports it is already there and moves it to Interview, still one row. At 1280x680 the form fits with its buttons visible and the page does not overflow. No console errors.</w:t>
+      </w:r>
+    </w:p>
+    <w:p>
+      <w:pPr>
+        <w:pStyle w:val="ListParagraph"/>
+        <w:numPr>
+          <w:ilvl w:val="0"/>
+          <w:numId w:val="2"/>
+        </w:numPr>
+        <w:spacing w:after="60"/>
+      </w:pPr>
+      <w:r>
+        <w:t xml:space="preserve">The closed check cannot mistake a LinkedIn redirect for a closed job: its redirect rule needs the atsJobId in the URL, and linkedin:&lt;id&gt; never is.</w:t>
+      </w:r>
+    </w:p>
+    <w:p>
+      <w:pPr>
+        <w:pStyle w:val="Heading2"/>
+      </w:pPr>
+      <w:r>
+        <w:t xml:space="preserve">Known risks left behind</w:t>
+      </w:r>
+    </w:p>
+    <w:p>
+      <w:pPr>
+        <w:pStyle w:val="ListParagraph"/>
+        <w:numPr>
+          <w:ilvl w:val="0"/>
+          <w:numId w:val="2"/>
+        </w:numPr>
+        <w:spacing w:after="60"/>
+      </w:pPr>
+      <w:r>
+        <w:t xml:space="preserve">LinkedIn often answers bots with status 999 or a login page, so the on-select closed check is usually inconclusive for these jobs (it changes nothing when inconclusive).</w:t>
+      </w:r>
+    </w:p>
+    <w:p>
+      <w:pPr>
+        <w:pStyle w:val="Heading2"/>
+      </w:pPr>
+      <w:r>
+        <w:t xml:space="preserve">Production data changes</w:t>
+      </w:r>
+    </w:p>
+    <w:p>
+      <w:pPr>
+        <w:pStyle w:val="ListParagraph"/>
+        <w:numPr>
+          <w:ilvl w:val="0"/>
+          <w:numId w:val="2"/>
+        </w:numPr>
+        <w:spacing w:after="60"/>
+      </w:pPr>
+      <w:r>
+        <w:t xml:space="preserve">None kept: the test job (linkedin:9999999901) and its application and note were deleted after testing.</w:t>
       </w:r>
     </w:p>
     <w:sectPr>

</xml_diff>